<commit_message>
format manuscript for Digital Discovery (RSC); remove Fig 1 schematic
- removed the conceptual schematic (fig_overview + fig1_src) per review
- renumbered the six data figures Fig. 1-6; updated all inline refs + captions
- RSC superscript citations throughout; reference list reformatted to RSC house style
  (18 refs, real author lists incl. PhononBench Han et al. and CsSnI3 Monacelli & Marzari)
- added author/affiliation block (placeholder), Conflicts of interest, Data availability
  with Zenodo archive (DOI reserved on release), Acknowledgements; SI -> ESI
- .zenodo.json for one-click GitHub->Zenodo deposit
- regenerated manuscript.docx (6 figures embedded, superscript citations) + supplementary.docx
</commit_message>
<xml_diff>
--- a/paper/manuscript.docx
+++ b/paper/manuscript.docx
@@ -10,33 +10,7 @@
         <w:t xml:space="preserve">Finite-temperature dynamic stability is a blind spot of foundation MLIPs</w:t>
       </w:r>
     </w:p>
-    <w:sdt>
-      <w:sdtPr>
-        <w:docPartObj>
-          <w:docPartGallery w:val="Table of Contents"/>
-          <w:docPartUnique/>
-        </w:docPartObj>
-      </w:sdtPr>
-      <w:sdtContent>
-        <w:p>
-          <w:pPr>
-            <w:pStyle w:val="TOCHeading"/>
-          </w:pPr>
-          <w:r>
-            <w:t xml:space="preserve">Table of Contents</w:t>
-          </w:r>
-        </w:p>
-        <w:p>
-          <w:r>
-            <w:fldChar w:fldCharType="begin" w:dirty="true"/>
-            <w:instrText xml:space="preserve">TOC \o "1-3" \h \z \u</w:instrText>
-            <w:fldChar w:fldCharType="separate"/>
-            <w:fldChar w:fldCharType="end"/>
-          </w:r>
-        </w:p>
-      </w:sdtContent>
-    </w:sdt>
-    <w:bookmarkStart w:id="49" w:name="X70ee5b06aaed82dff3ea33fa72d6d866bb3cc17"/>
+    <w:bookmarkStart w:id="48" w:name="X70ee5b06aaed82dff3ea33fa72d6d866bb3cc17"/>
     <w:p>
       <w:pPr>
         <w:pStyle w:val="Heading1"/>
@@ -48,34 +22,272 @@
     <w:p>
       <w:pPr>
         <w:pStyle w:val="FirstParagraph"/>
+      </w:pPr>
+      <w:r>
+        <w:t xml:space="preserve">[First Author]</w:t>
+      </w:r>
+      <w:r>
+        <w:rPr>
+          <w:vertAlign w:val="superscript"/>
+        </w:rPr>
+        <w:t xml:space="preserve">a</w:t>
+      </w:r>
+      <w:r>
+        <w:t xml:space="preserve"> </w:t>
+      </w:r>
+      <w:r>
+        <w:t xml:space="preserve">and [Co-author(s)]</w:t>
+      </w:r>
+      <w:r>
+        <w:rPr>
+          <w:vertAlign w:val="superscript"/>
+        </w:rPr>
+        <w:t xml:space="preserve">a</w:t>
+      </w:r>
+    </w:p>
+    <w:p>
+      <w:pPr>
+        <w:pStyle w:val="BodyText"/>
+      </w:pPr>
+      <w:r>
+        <w:rPr>
+          <w:vertAlign w:val="superscript"/>
+        </w:rPr>
+        <w:t xml:space="preserve">a</w:t>
+      </w:r>
+      <w:r>
+        <w:t xml:space="preserve"> </w:t>
+      </w:r>
+      <w:r>
+        <w:t xml:space="preserve">[Department, Institution, Address, City, Country]. E-mail: frankyc11223@gmail.com</w:t>
+      </w:r>
+    </w:p>
+    <w:p>
+      <w:pPr>
+        <w:pStyle w:val="BodyText"/>
       </w:pPr>
       <w:r>
         <w:rPr>
           <w:i/>
           <w:iCs/>
         </w:rPr>
-        <w:t xml:space="preserve">Post-revision draft (Stage 4, integrity-checked). All quantitative claims verified against</w:t>
+        <w:t xml:space="preserve">Author list and affiliations to be completed before submission.</w:t>
+      </w:r>
+    </w:p>
+    <w:bookmarkStart w:id="9" w:name="abstract"/>
+    <w:p>
+      <w:pPr>
+        <w:pStyle w:val="Heading2"/>
+      </w:pPr>
+      <w:r>
+        <w:t xml:space="preserve">Abstract</w:t>
+      </w:r>
+    </w:p>
+    <w:p>
+      <w:pPr>
+        <w:pStyle w:val="FirstParagraph"/>
+      </w:pPr>
+      <w:r>
+        <w:t xml:space="preserve">Foundation (universal) machine-learning interatomic potentials (MLIPs) are now routine cheap</w:t>
+      </w:r>
+      <w:r>
+        <w:t xml:space="preserve"> </w:t>
+      </w:r>
+      <w:r>
+        <w:t xml:space="preserve">stand-ins for DFT in high-throughput stability screening, yet they are benchmarked almost</w:t>
+      </w:r>
+      <w:r>
+        <w:t xml:space="preserve"> </w:t>
+      </w:r>
+      <w:r>
+        <w:t xml:space="preserve">exclusively against</w:t>
+      </w:r>
+      <w:r>
+        <w:t xml:space="preserve"> </w:t>
+      </w:r>
+      <w:r>
+        <w:rPr>
+          <w:b/>
+          <w:bCs/>
+        </w:rPr>
+        <w:t xml:space="preserve">harmonic</w:t>
+      </w:r>
+      <w:r>
+        <w:t xml:space="preserve"> </w:t>
+      </w:r>
+      <w:r>
+        <w:t xml:space="preserve">(0 K) phonons. Dynamic stability is physically a</w:t>
+      </w:r>
+      <w:r>
+        <w:t xml:space="preserve"> </w:t>
+      </w:r>
+      <w:r>
+        <w:rPr>
+          <w:b/>
+          <w:bCs/>
+        </w:rPr>
+        <w:t xml:space="preserve">finite-temperature</w:t>
+      </w:r>
+      <w:r>
+        <w:t xml:space="preserve"> </w:t>
+      </w:r>
+      <w:r>
+        <w:t xml:space="preserve">property, and an important class of materials — cubic perovskites, bcc</w:t>
+      </w:r>
+      <w:r>
+        <w:t xml:space="preserve"> </w:t>
+      </w:r>
+      <w:r>
+        <w:t xml:space="preserve">refractory metals, cubic fluorites — is</w:t>
+      </w:r>
+      <w:r>
+        <w:t xml:space="preserve"> </w:t>
       </w:r>
       <w:r>
         <w:rPr>
           <w:i/>
           <w:iCs/>
         </w:rPr>
-        <w:t xml:space="preserve"> </w:t>
-      </w:r>
-      <w:r>
-        <w:rPr>
-          <w:rStyle w:val="VerbatimChar"/>
+        <w:t xml:space="preserve">harmonically unstable but thermally stabilised by</w:t>
+      </w:r>
+      <w:r>
+        <w:rPr>
           <w:i/>
           <w:iCs/>
         </w:rPr>
-        <w:t xml:space="preserve">results/ledger.parquet</w:t>
+        <w:t xml:space="preserve"> </w:t>
       </w:r>
       <w:r>
         <w:rPr>
           <w:i/>
           <w:iCs/>
         </w:rPr>
+        <w:t xml:space="preserve">anharmonicity</w:t>
+      </w:r>
+      <w:r>
+        <w:t xml:space="preserve">. We stress-test five foundation MLIPs (MACE-MP-0, CHGNet, ORB-v2, SevenNet-0,</w:t>
+      </w:r>
+      <w:r>
+        <w:t xml:space="preserve"> </w:t>
+      </w:r>
+      <w:r>
+        <w:t xml:space="preserve">MatterSim) on this regime using a curated set of references whose finite-T behaviour is</w:t>
+      </w:r>
+      <w:r>
+        <w:t xml:space="preserve"> </w:t>
+      </w:r>
+      <w:r>
+        <w:t xml:space="preserve">documented in the experimental/DFT literature, so no new DFT ground truth is required. We</w:t>
+      </w:r>
+      <w:r>
+        <w:t xml:space="preserve"> </w:t>
+      </w:r>
+      <w:r>
+        <w:t xml:space="preserve">introduce a cheap single-mode quantum self-consistent-harmonic (SCHA)</w:t>
+      </w:r>
+      <w:r>
+        <w:t xml:space="preserve"> </w:t>
+      </w:r>
+      <w:r>
+        <w:t xml:space="preserve">“soft-mode free energy”</w:t>
+      </w:r>
+      <w:r>
+        <w:t xml:space="preserve"> </w:t>
+      </w:r>
+      <w:r>
+        <w:t xml:space="preserve">screen that resolves the harmonic→finite-T stabilisation, and we cross-validate it against the</w:t>
+      </w:r>
+      <w:r>
+        <w:t xml:space="preserve"> </w:t>
+      </w:r>
+      <w:r>
+        <w:t xml:space="preserve">gold-standard multi-mode stochastic SCHA (SSCHA). Three principal findings (plus an actionable</w:t>
+      </w:r>
+      <w:r>
+        <w:t xml:space="preserve"> </w:t>
+      </w:r>
+      <w:r>
+        <w:t xml:space="preserve">ensemble-disagreement guardrail): (i) at the harmonic level the</w:t>
+      </w:r>
+      <w:r>
+        <w:t xml:space="preserve"> </w:t>
+      </w:r>
+      <w:r>
+        <w:t xml:space="preserve">models split sharply — MatterSim and SevenNet-0 reproduce every documented soft mode (accuracy</w:t>
+      </w:r>
+      <w:r>
+        <w:t xml:space="preserve"> </w:t>
+      </w:r>
+      <w:r>
+        <w:t xml:space="preserve">1.00), while MACE-MP-0, CHGNet and ORB-v2 soften the bcc Zr/Hf instabilities toward zero and</w:t>
+      </w:r>
+      <w:r>
+        <w:t xml:space="preserve"> </w:t>
+      </w:r>
+      <w:r>
+        <w:t xml:space="preserve">carry a 15% false-stable rate; (ii) harmonic accuracy is necessary but</w:t>
+      </w:r>
+      <w:r>
+        <w:t xml:space="preserve"> </w:t>
+      </w:r>
+      <w:r>
+        <w:t xml:space="preserve">not sufficient for finite-T accuracy — the two are only weakly correlated on the matched set, the</w:t>
+      </w:r>
+      <w:r>
+        <w:t xml:space="preserve"> </w:t>
+      </w:r>
+      <w:r>
+        <w:t xml:space="preserve">harmonic leaders (MatterSim, SevenNet-0) are not the finite-T leaders, and the soft-mode screen</w:t>
+      </w:r>
+      <w:r>
+        <w:t xml:space="preserve"> </w:t>
+      </w:r>
+      <w:r>
+        <w:t xml:space="preserve">recovers the displacive instability of cubic ferroelectric perovskites that the models otherwise</w:t>
+      </w:r>
+      <w:r>
+        <w:t xml:space="preserve"> </w:t>
+      </w:r>
+      <w:r>
+        <w:t xml:space="preserve">miss; (iii)</w:t>
+      </w:r>
+      <w:r>
+        <w:t xml:space="preserve"> </w:t>
+      </w:r>
+      <w:r>
+        <w:rPr>
+          <w:b/>
+          <w:bCs/>
+        </w:rPr>
+        <w:t xml:space="preserve">multi-mode SSCHA with an MLIP force engine</w:t>
+      </w:r>
+      <w:r>
+        <w:rPr>
+          <w:b/>
+          <w:bCs/>
+        </w:rPr>
+        <w:t xml:space="preserve"> </w:t>
+      </w:r>
+      <w:r>
+        <w:rPr>
+          <w:b/>
+          <w:bCs/>
+        </w:rPr>
+        <w:t xml:space="preserve">is itself a sharp methodological trap</w:t>
+      </w:r>
+      <w:r>
+        <w:t xml:space="preserve"> </w:t>
+      </w:r>
+      <w:r>
+        <w:t xml:space="preserve">— it is a clean gold standard for the martensitic bcc</w:t>
+      </w:r>
+      <w:r>
+        <w:t xml:space="preserve"> </w:t>
+      </w:r>
+      <w:r>
+        <w:t xml:space="preserve">metals but systematically</w:t>
+      </w:r>
+      <w:r>
         <w:t xml:space="preserve"> </w:t>
       </w:r>
       <w:r>
@@ -83,266 +295,6 @@
           <w:i/>
           <w:iCs/>
         </w:rPr>
-        <w:t xml:space="preserve">and</w:t>
-      </w:r>
-      <w:r>
-        <w:rPr>
-          <w:i/>
-          <w:iCs/>
-        </w:rPr>
-        <w:t xml:space="preserve"> </w:t>
-      </w:r>
-      <w:r>
-        <w:rPr>
-          <w:rStyle w:val="VerbatimChar"/>
-          <w:i/>
-          <w:iCs/>
-        </w:rPr>
-        <w:t xml:space="preserve">results/convergence_study.parquet</w:t>
-      </w:r>
-      <w:r>
-        <w:rPr>
-          <w:i/>
-          <w:iCs/>
-        </w:rPr>
-        <w:t xml:space="preserve">; references finalised with</w:t>
-      </w:r>
-      <w:r>
-        <w:rPr>
-          <w:i/>
-          <w:iCs/>
-        </w:rPr>
-        <w:t xml:space="preserve"> </w:t>
-      </w:r>
-      <w:r>
-        <w:rPr>
-          <w:i/>
-          <w:iCs/>
-        </w:rPr>
-        <w:t xml:space="preserve">DOIs (deep-research pass, June 2026).</w:t>
-      </w:r>
-    </w:p>
-    <w:bookmarkStart w:id="9" w:name="abstract"/>
-    <w:p>
-      <w:pPr>
-        <w:pStyle w:val="Heading2"/>
-      </w:pPr>
-      <w:r>
-        <w:t xml:space="preserve">Abstract</w:t>
-      </w:r>
-    </w:p>
-    <w:p>
-      <w:pPr>
-        <w:pStyle w:val="FirstParagraph"/>
-      </w:pPr>
-      <w:r>
-        <w:t xml:space="preserve">Foundation (universal) machine-learning interatomic potentials (MLIPs) are now routine cheap</w:t>
-      </w:r>
-      <w:r>
-        <w:t xml:space="preserve"> </w:t>
-      </w:r>
-      <w:r>
-        <w:t xml:space="preserve">stand-ins for DFT in high-throughput stability screening, yet they are benchmarked almost</w:t>
-      </w:r>
-      <w:r>
-        <w:t xml:space="preserve"> </w:t>
-      </w:r>
-      <w:r>
-        <w:t xml:space="preserve">exclusively against</w:t>
-      </w:r>
-      <w:r>
-        <w:t xml:space="preserve"> </w:t>
-      </w:r>
-      <w:r>
-        <w:rPr>
-          <w:b/>
-          <w:bCs/>
-        </w:rPr>
-        <w:t xml:space="preserve">harmonic</w:t>
-      </w:r>
-      <w:r>
-        <w:t xml:space="preserve"> </w:t>
-      </w:r>
-      <w:r>
-        <w:t xml:space="preserve">(0 K) phonons. Dynamic stability is physically a</w:t>
-      </w:r>
-      <w:r>
-        <w:t xml:space="preserve"> </w:t>
-      </w:r>
-      <w:r>
-        <w:rPr>
-          <w:b/>
-          <w:bCs/>
-        </w:rPr>
-        <w:t xml:space="preserve">finite-temperature</w:t>
-      </w:r>
-      <w:r>
-        <w:t xml:space="preserve"> </w:t>
-      </w:r>
-      <w:r>
-        <w:t xml:space="preserve">property, and an important class of materials — cubic perovskites, bcc</w:t>
-      </w:r>
-      <w:r>
-        <w:t xml:space="preserve"> </w:t>
-      </w:r>
-      <w:r>
-        <w:t xml:space="preserve">refractory metals, cubic fluorites — is</w:t>
-      </w:r>
-      <w:r>
-        <w:t xml:space="preserve"> </w:t>
-      </w:r>
-      <w:r>
-        <w:rPr>
-          <w:i/>
-          <w:iCs/>
-        </w:rPr>
-        <w:t xml:space="preserve">harmonically unstable but thermally stabilised by</w:t>
-      </w:r>
-      <w:r>
-        <w:rPr>
-          <w:i/>
-          <w:iCs/>
-        </w:rPr>
-        <w:t xml:space="preserve"> </w:t>
-      </w:r>
-      <w:r>
-        <w:rPr>
-          <w:i/>
-          <w:iCs/>
-        </w:rPr>
-        <w:t xml:space="preserve">anharmonicity</w:t>
-      </w:r>
-      <w:r>
-        <w:t xml:space="preserve">. We stress-test five foundation MLIPs (MACE-MP-0, CHGNet, ORB-v2, SevenNet-0,</w:t>
-      </w:r>
-      <w:r>
-        <w:t xml:space="preserve"> </w:t>
-      </w:r>
-      <w:r>
-        <w:t xml:space="preserve">MatterSim) on this regime using a curated set of references whose finite-T behaviour is</w:t>
-      </w:r>
-      <w:r>
-        <w:t xml:space="preserve"> </w:t>
-      </w:r>
-      <w:r>
-        <w:t xml:space="preserve">documented in the experimental/DFT literature, so no new DFT ground truth is required. We</w:t>
-      </w:r>
-      <w:r>
-        <w:t xml:space="preserve"> </w:t>
-      </w:r>
-      <w:r>
-        <w:t xml:space="preserve">introduce a cheap single-mode quantum self-consistent-harmonic (SCHA)</w:t>
-      </w:r>
-      <w:r>
-        <w:t xml:space="preserve"> </w:t>
-      </w:r>
-      <w:r>
-        <w:t xml:space="preserve">“soft-mode free energy”</w:t>
-      </w:r>
-      <w:r>
-        <w:t xml:space="preserve"> </w:t>
-      </w:r>
-      <w:r>
-        <w:t xml:space="preserve">screen that resolves the harmonic→finite-T stabilisation, and we cross-validate it against the</w:t>
-      </w:r>
-      <w:r>
-        <w:t xml:space="preserve"> </w:t>
-      </w:r>
-      <w:r>
-        <w:t xml:space="preserve">gold-standard multi-mode stochastic SCHA (SSCHA). Three principal findings (plus an actionable</w:t>
-      </w:r>
-      <w:r>
-        <w:t xml:space="preserve"> </w:t>
-      </w:r>
-      <w:r>
-        <w:t xml:space="preserve">ensemble-disagreement guardrail): (i) at the harmonic level the</w:t>
-      </w:r>
-      <w:r>
-        <w:t xml:space="preserve"> </w:t>
-      </w:r>
-      <w:r>
-        <w:t xml:space="preserve">models split sharply — MatterSim and SevenNet-0 reproduce every documented soft mode (accuracy</w:t>
-      </w:r>
-      <w:r>
-        <w:t xml:space="preserve"> </w:t>
-      </w:r>
-      <w:r>
-        <w:t xml:space="preserve">1.00), while MACE-MP-0, CHGNet and ORB-v2 soften the bcc Zr/Hf instabilities toward zero and</w:t>
-      </w:r>
-      <w:r>
-        <w:t xml:space="preserve"> </w:t>
-      </w:r>
-      <w:r>
-        <w:t xml:space="preserve">carry a 15% false-stable rate; (ii) harmonic accuracy is necessary but</w:t>
-      </w:r>
-      <w:r>
-        <w:t xml:space="preserve"> </w:t>
-      </w:r>
-      <w:r>
-        <w:t xml:space="preserve">not sufficient for finite-T accuracy — the two are only weakly correlated on the matched set, the</w:t>
-      </w:r>
-      <w:r>
-        <w:t xml:space="preserve"> </w:t>
-      </w:r>
-      <w:r>
-        <w:t xml:space="preserve">harmonic leaders (MatterSim, SevenNet-0) are not the finite-T leaders, and the soft-mode screen</w:t>
-      </w:r>
-      <w:r>
-        <w:t xml:space="preserve"> </w:t>
-      </w:r>
-      <w:r>
-        <w:t xml:space="preserve">recovers the displacive instability of cubic ferroelectric perovskites that the models otherwise</w:t>
-      </w:r>
-      <w:r>
-        <w:t xml:space="preserve"> </w:t>
-      </w:r>
-      <w:r>
-        <w:t xml:space="preserve">miss; (iii)</w:t>
-      </w:r>
-      <w:r>
-        <w:t xml:space="preserve"> </w:t>
-      </w:r>
-      <w:r>
-        <w:rPr>
-          <w:b/>
-          <w:bCs/>
-        </w:rPr>
-        <w:t xml:space="preserve">multi-mode SSCHA with an MLIP force engine</w:t>
-      </w:r>
-      <w:r>
-        <w:rPr>
-          <w:b/>
-          <w:bCs/>
-        </w:rPr>
-        <w:t xml:space="preserve"> </w:t>
-      </w:r>
-      <w:r>
-        <w:rPr>
-          <w:b/>
-          <w:bCs/>
-        </w:rPr>
-        <w:t xml:space="preserve">is itself a sharp methodological trap</w:t>
-      </w:r>
-      <w:r>
-        <w:t xml:space="preserve"> </w:t>
-      </w:r>
-      <w:r>
-        <w:t xml:space="preserve">— it is a clean gold standard for the martensitic bcc</w:t>
-      </w:r>
-      <w:r>
-        <w:t xml:space="preserve"> </w:t>
-      </w:r>
-      <w:r>
-        <w:t xml:space="preserve">metals but systematically</w:t>
-      </w:r>
-      <w:r>
-        <w:t xml:space="preserve"> </w:t>
-      </w:r>
-      <w:r>
-        <w:rPr>
-          <w:i/>
-          <w:iCs/>
-        </w:rPr>
         <w:t xml:space="preserve">false-stabilises</w:t>
       </w:r>
       <w:r>
@@ -406,10 +358,16 @@
         <w:t xml:space="preserve">“Universal MLIPs are ready for phonons”</w:t>
       </w:r>
       <w:r>
-        <w:t xml:space="preserve"> </w:t>
-      </w:r>
-      <w:r>
-        <w:t xml:space="preserve">(npj Comput. Mater., 2025 [1]) benchmarks MLIPs</w:t>
+        <w:rPr>
+          <w:vertAlign w:val="superscript"/>
+        </w:rPr>
+        <w:t xml:space="preserve">1</w:t>
+      </w:r>
+      <w:r>
+        <w:t xml:space="preserve"> </w:t>
+      </w:r>
+      <w:r>
+        <w:t xml:space="preserve">benchmarks MLIPs</w:t>
       </w:r>
       <w:r>
         <w:t xml:space="preserve"> </w:t>
@@ -431,7 +389,19 @@
         <w:t xml:space="preserve"> </w:t>
       </w:r>
       <w:r>
-        <w:t xml:space="preserve">phonon calculations [3] on largely in-distribution materials and</w:t>
+        <w:t xml:space="preserve">phonon calculations</w:t>
+      </w:r>
+      <w:r>
+        <w:rPr>
+          <w:vertAlign w:val="superscript"/>
+        </w:rPr>
+        <w:t xml:space="preserve">3</w:t>
+      </w:r>
+      <w:r>
+        <w:t xml:space="preserve"> </w:t>
+      </w:r>
+      <w:r>
+        <w:t xml:space="preserve">on largely in-distribution materials and</w:t>
       </w:r>
       <w:r>
         <w:t xml:space="preserve"> </w:t>
@@ -443,13 +413,19 @@
         <w:t xml:space="preserve"> </w:t>
       </w:r>
       <w:r>
-        <w:t xml:space="preserve">under-prediction → mode softening → over-estimated stability). PhononBench (arXiv:2512.21227,</w:t>
-      </w:r>
-      <w:r>
-        <w:t xml:space="preserve"> </w:t>
-      </w:r>
-      <w:r>
-        <w:t xml:space="preserve">Dec 2025 [2]) scores ~1.1×10⁵ generated structures for</w:t>
+        <w:t xml:space="preserve">under-prediction → mode softening → over-estimated stability). PhononBench</w:t>
+      </w:r>
+      <w:r>
+        <w:rPr>
+          <w:vertAlign w:val="superscript"/>
+        </w:rPr>
+        <w:t xml:space="preserve">2</w:t>
+      </w:r>
+      <w:r>
+        <w:t xml:space="preserve"> </w:t>
+      </w:r>
+      <w:r>
+        <w:t xml:space="preserve">scores ~1.1×10⁵ generated structures for</w:t>
       </w:r>
       <w:r>
         <w:t xml:space="preserve"> </w:t>
@@ -770,13 +746,7 @@
         <w:t xml:space="preserve"> </w:t>
       </w:r>
       <w:r>
-        <w:t xml:space="preserve">cross-checks should be used; and an actionable ensemble-disagreement guardrail (H3). Figure 1</w:t>
-      </w:r>
-      <w:r>
-        <w:t xml:space="preserve"> </w:t>
-      </w:r>
-      <w:r>
-        <w:t xml:space="preserve">summarises the blind spot, the benchmark, and the principal findings.</w:t>
+        <w:t xml:space="preserve">cross-checks should be used; and an actionable ensemble-disagreement guardrail (H3).</w:t>
       </w:r>
     </w:p>
     <w:bookmarkEnd w:id="10"/>
@@ -846,13 +816,31 @@
         <w:t xml:space="preserve"> </w:t>
       </w:r>
       <w:r>
-        <w:t xml:space="preserve">(4): SrTiO₃ [11], BaTiO₃, PbTiO₃,</w:t>
-      </w:r>
-      <w:r>
-        <w:t xml:space="preserve"> </w:t>
-      </w:r>
-      <w:r>
-        <w:t xml:space="preserve">KNbO₃ [12].</w:t>
+        <w:t xml:space="preserve">(4): SrTiO₃,</w:t>
+      </w:r>
+      <w:r>
+        <w:rPr>
+          <w:vertAlign w:val="superscript"/>
+        </w:rPr>
+        <w:t xml:space="preserve">11</w:t>
+      </w:r>
+      <w:r>
+        <w:t xml:space="preserve"> </w:t>
+      </w:r>
+      <w:r>
+        <w:t xml:space="preserve">BaTiO₃, PbTiO₃,</w:t>
+      </w:r>
+      <w:r>
+        <w:t xml:space="preserve"> </w:t>
+      </w:r>
+      <w:r>
+        <w:t xml:space="preserve">KNbO₃.</w:t>
+      </w:r>
+      <w:r>
+        <w:rPr>
+          <w:vertAlign w:val="superscript"/>
+        </w:rPr>
+        <w:t xml:space="preserve">12</w:t>
       </w:r>
     </w:p>
     <w:p>
@@ -874,7 +862,25 @@
         <w:t xml:space="preserve"> </w:t>
       </w:r>
       <w:r>
-        <w:t xml:space="preserve">(3): CsPbI₃ [13], CsSnBr₃, CsSnI₃ [14].</w:t>
+        <w:t xml:space="preserve">(3): CsPbI₃,</w:t>
+      </w:r>
+      <w:r>
+        <w:rPr>
+          <w:vertAlign w:val="superscript"/>
+        </w:rPr>
+        <w:t xml:space="preserve">13</w:t>
+      </w:r>
+      <w:r>
+        <w:t xml:space="preserve"> </w:t>
+      </w:r>
+      <w:r>
+        <w:t xml:space="preserve">CsSnBr₃, CsSnI₃.</w:t>
+      </w:r>
+      <w:r>
+        <w:rPr>
+          <w:vertAlign w:val="superscript"/>
+        </w:rPr>
+        <w:t xml:space="preserve">14</w:t>
       </w:r>
     </w:p>
     <w:p>
@@ -896,7 +902,13 @@
         <w:t xml:space="preserve"> </w:t>
       </w:r>
       <w:r>
-        <w:t xml:space="preserve">(3): Ti, Zr, Hf (phonon-entropy stabilisation) [15].</w:t>
+        <w:t xml:space="preserve">(3): Ti, Zr, Hf (phonon-entropy stabilisation).</w:t>
+      </w:r>
+      <w:r>
+        <w:rPr>
+          <w:vertAlign w:val="superscript"/>
+        </w:rPr>
+        <w:t xml:space="preserve">15</w:t>
       </w:r>
     </w:p>
     <w:p>
@@ -918,7 +930,13 @@
         <w:t xml:space="preserve"> </w:t>
       </w:r>
       <w:r>
-        <w:t xml:space="preserve">(2): ZrO₂, HfO₂ [16].</w:t>
+        <w:t xml:space="preserve">(2): ZrO₂, HfO₂.</w:t>
+      </w:r>
+      <w:r>
+        <w:rPr>
+          <w:vertAlign w:val="superscript"/>
+        </w:rPr>
+        <w:t xml:space="preserve">16</w:t>
       </w:r>
     </w:p>
     <w:p>
@@ -940,7 +958,13 @@
         <w:t xml:space="preserve"> </w:t>
       </w:r>
       <w:r>
-        <w:t xml:space="preserve">(1): α-AgI [17].</w:t>
+        <w:t xml:space="preserve">(1): α-AgI.</w:t>
+      </w:r>
+      <w:r>
+        <w:rPr>
+          <w:vertAlign w:val="superscript"/>
+        </w:rPr>
+        <w:t xml:space="preserve">17</w:t>
       </w:r>
     </w:p>
     <w:p>
@@ -962,7 +986,13 @@
         <w:t xml:space="preserve"> </w:t>
       </w:r>
       <w:r>
-        <w:t xml:space="preserve">(1): KTaO₃ [18].</w:t>
+        <w:t xml:space="preserve">(1): KTaO₃.</w:t>
+      </w:r>
+      <w:r>
+        <w:rPr>
+          <w:vertAlign w:val="superscript"/>
+        </w:rPr>
+        <w:t xml:space="preserve">18</w:t>
       </w:r>
     </w:p>
     <w:p>
@@ -984,7 +1014,22 @@
         <w:t xml:space="preserve"> </w:t>
       </w:r>
       <w:r>
-        <w:t xml:space="preserve">(6): Si, MgO, NaCl, Cu, diamond, CeO₂ [3].</w:t>
+        <w:t xml:space="preserve">(6): Si, MgO, NaCl, Cu, diamond, CeO₂ (0 K harmonic</w:t>
+      </w:r>
+      <w:r>
+        <w:t xml:space="preserve"> </w:t>
+      </w:r>
+      <w:r>
+        <w:t xml:space="preserve">stability documented in the DFPT phonon database</w:t>
+      </w:r>
+      <w:r>
+        <w:rPr>
+          <w:vertAlign w:val="superscript"/>
+        </w:rPr>
+        <w:t xml:space="preserve">3</w:t>
+      </w:r>
+      <w:r>
+        <w:t xml:space="preserve">).</w:t>
       </w:r>
     </w:p>
     <w:p>
@@ -1079,7 +1124,67 @@
         <w:pStyle w:val="FirstParagraph"/>
       </w:pPr>
       <w:r>
-        <w:t xml:space="preserve">MACE-MP-0 [6], CHGNet [7], ORB-v2 [8], SevenNet-0 [9], MatterSim [10], run through a</w:t>
+        <w:t xml:space="preserve">MACE-MP-0,</w:t>
+      </w:r>
+      <w:r>
+        <w:rPr>
+          <w:vertAlign w:val="superscript"/>
+        </w:rPr>
+        <w:t xml:space="preserve">6</w:t>
+      </w:r>
+      <w:r>
+        <w:t xml:space="preserve"> </w:t>
+      </w:r>
+      <w:r>
+        <w:t xml:space="preserve">CHGNet,</w:t>
+      </w:r>
+      <w:r>
+        <w:rPr>
+          <w:vertAlign w:val="superscript"/>
+        </w:rPr>
+        <w:t xml:space="preserve">7</w:t>
+      </w:r>
+      <w:r>
+        <w:t xml:space="preserve"> </w:t>
+      </w:r>
+      <w:r>
+        <w:t xml:space="preserve">ORB-v2,</w:t>
+      </w:r>
+      <w:r>
+        <w:rPr>
+          <w:vertAlign w:val="superscript"/>
+        </w:rPr>
+        <w:t xml:space="preserve">8</w:t>
+      </w:r>
+      <w:r>
+        <w:t xml:space="preserve"> </w:t>
+      </w:r>
+      <w:r>
+        <w:t xml:space="preserve">SevenNet-0,</w:t>
+      </w:r>
+      <w:r>
+        <w:rPr>
+          <w:vertAlign w:val="superscript"/>
+        </w:rPr>
+        <w:t xml:space="preserve">9</w:t>
+      </w:r>
+      <w:r>
+        <w:t xml:space="preserve"> </w:t>
+      </w:r>
+      <w:r>
+        <w:t xml:space="preserve">MatterSim,</w:t>
+      </w:r>
+      <w:r>
+        <w:rPr>
+          <w:vertAlign w:val="superscript"/>
+        </w:rPr>
+        <w:t xml:space="preserve">10</w:t>
+      </w:r>
+      <w:r>
+        <w:t xml:space="preserve"> </w:t>
+      </w:r>
+      <w:r>
+        <w:t xml:space="preserve">run through a</w:t>
       </w:r>
       <w:r>
         <w:t xml:space="preserve"> </w:t>
@@ -1350,13 +1455,25 @@
         <w:t xml:space="preserve"> </w:t>
       </w:r>
       <w:r>
-        <w:t xml:space="preserve">solve. Earlier finite-T routes (hand-rolled TDEP, one-shot hiPhive, rattled-MD) were</w:t>
-      </w:r>
-      <w:r>
-        <w:t xml:space="preserve"> </w:t>
-      </w:r>
-      <w:r>
-        <w:t xml:space="preserve">implemented and discarded after failing the SrTiO₃ gate (the TDEP route follows refs [5]); see SI.</w:t>
+        <w:t xml:space="preserve">solve. Earlier finite-T routes (hand-rolled TDEP,</w:t>
+      </w:r>
+      <w:r>
+        <w:rPr>
+          <w:vertAlign w:val="superscript"/>
+        </w:rPr>
+        <w:t xml:space="preserve">5</w:t>
+      </w:r>
+      <w:r>
+        <w:t xml:space="preserve"> </w:t>
+      </w:r>
+      <w:r>
+        <w:t xml:space="preserve">one-shot hiPhive, rattled-MD) were</w:t>
+      </w:r>
+      <w:r>
+        <w:t xml:space="preserve"> </w:t>
+      </w:r>
+      <w:r>
+        <w:t xml:space="preserve">implemented and discarded after failing the SrTiO₃ gate; see ESI.</w:t>
       </w:r>
     </w:p>
     <w:p>
@@ -1404,7 +1521,19 @@
         <w:pStyle w:val="FirstParagraph"/>
       </w:pPr>
       <w:r>
-        <w:t xml:space="preserve">The full stochastic SCHA (python-sscha + cellconstructor [4]) with the MLIP as force engine:</w:t>
+        <w:t xml:space="preserve">The full stochastic SCHA (python-sscha + cellconstructor)</w:t>
+      </w:r>
+      <w:r>
+        <w:rPr>
+          <w:vertAlign w:val="superscript"/>
+        </w:rPr>
+        <w:t xml:space="preserve">4</w:t>
+      </w:r>
+      <w:r>
+        <w:t xml:space="preserve"> </w:t>
+      </w:r>
+      <w:r>
+        <w:t xml:space="preserve">with the MLIP as force engine:</w:t>
       </w:r>
       <w:r>
         <w:t xml:space="preserve"> </w:t>
@@ -1915,19 +2044,13 @@
         <w:pStyle w:val="BodyText"/>
       </w:pPr>
       <w:r>
-        <w:t xml:space="preserve">Because every binary call depends on the imaginary tolerance, we sweep it (Fig.</w:t>
-      </w:r>
-      <w:r>
-        <w:t xml:space="preserve"> </w:t>
-      </w:r>
-      <w:r>
-        <w:rPr>
-          <w:rStyle w:val="VerbatimChar"/>
-        </w:rPr>
-        <w:t xml:space="preserve">fig_tolerance_sweep</w:t>
-      </w:r>
-      <w:r>
-        <w:t xml:space="preserve">): a strict tolerance (0 THz) floods false-unstables (29 calls) as</w:t>
+        <w:t xml:space="preserve">Because every binary call depends on the imaginary tolerance, we sweep it (Fig. 1):</w:t>
+      </w:r>
+      <w:r>
+        <w:t xml:space="preserve"> </w:t>
+      </w:r>
+      <w:r>
+        <w:t xml:space="preserve">a strict tolerance (0 THz) floods false-unstables (29 calls) as</w:t>
       </w:r>
       <w:r>
         <w:t xml:space="preserve"> </w:t>
@@ -1969,19 +2092,7 @@
         <w:t xml:space="preserve"> </w:t>
       </w:r>
       <w:r>
-        <w:t xml:space="preserve">frequencies, not binary rates, are the right reporting unit (Fig.</w:t>
-      </w:r>
-      <w:r>
-        <w:t xml:space="preserve"> </w:t>
-      </w:r>
-      <w:r>
-        <w:rPr>
-          <w:rStyle w:val="VerbatimChar"/>
-        </w:rPr>
-        <w:t xml:space="preserve">fig_softmode_heat</w:t>
-      </w:r>
-      <w:r>
-        <w:t xml:space="preserve">). This</w:t>
+        <w:t xml:space="preserve">frequencies, not binary rates, are the right reporting unit (Fig. 2). This</w:t>
       </w:r>
       <w:r>
         <w:t xml:space="preserve"> </w:t>
@@ -2956,19 +3067,7 @@
         <w:t xml:space="preserve"> </w:t>
       </w:r>
       <w:r>
-        <w:t xml:space="preserve">(~1.8 THz) (Fig.</w:t>
-      </w:r>
-      <w:r>
-        <w:t xml:space="preserve"> </w:t>
-      </w:r>
-      <w:r>
-        <w:rPr>
-          <w:rStyle w:val="VerbatimChar"/>
-        </w:rPr>
-        <w:t xml:space="preserve">fig_sscha_bcc</w:t>
-      </w:r>
-      <w:r>
-        <w:t xml:space="preserve">). Critically, the cheap soft-mode screen</w:t>
+        <w:t xml:space="preserve">(~1.8 THz) (Fig. 3). Critically, the cheap soft-mode screen</w:t>
       </w:r>
       <w:r>
         <w:t xml:space="preserve"> </w:t>
@@ -2993,19 +3092,7 @@
         <w:t xml:space="preserve"> </w:t>
       </w:r>
       <w:r>
-        <w:t xml:space="preserve">agreement (Fig.</w:t>
-      </w:r>
-      <w:r>
-        <w:t xml:space="preserve"> </w:t>
-      </w:r>
-      <w:r>
-        <w:rPr>
-          <w:rStyle w:val="VerbatimChar"/>
-        </w:rPr>
-        <w:t xml:space="preserve">fig_method_agreement</w:t>
-      </w:r>
-      <w:r>
-        <w:t xml:space="preserve">). The disagreements are concentrated in ORB-v2’s float32</w:t>
+        <w:t xml:space="preserve">agreement (Fig. 4). The disagreements are concentrated in ORB-v2’s float32</w:t>
       </w:r>
       <w:r>
         <w:t xml:space="preserve"> </w:t>
@@ -3109,19 +3196,7 @@
         <w:t xml:space="preserve"> </w:t>
       </w:r>
       <w:r>
-        <w:t xml:space="preserve">generative-CSP outputs (Fig.</w:t>
-      </w:r>
-      <w:r>
-        <w:t xml:space="preserve"> </w:t>
-      </w:r>
-      <w:r>
-        <w:rPr>
-          <w:rStyle w:val="VerbatimChar"/>
-        </w:rPr>
-        <w:t xml:space="preserve">fig_displacive_recall</w:t>
-      </w:r>
-      <w:r>
-        <w:t xml:space="preserve">).</w:t>
+        <w:t xml:space="preserve">generative-CSP outputs (Fig. 5).</w:t>
       </w:r>
     </w:p>
     <w:p>
@@ -3561,19 +3636,7 @@
         <w:t xml:space="preserve"> </w:t>
       </w:r>
       <w:r>
-        <w:t xml:space="preserve">Fig.</w:t>
-      </w:r>
-      <w:r>
-        <w:t xml:space="preserve"> </w:t>
-      </w:r>
-      <w:r>
-        <w:rPr>
-          <w:rStyle w:val="VerbatimChar"/>
-        </w:rPr>
-        <w:t xml:space="preserve">fig_ensemble_guardrail</w:t>
-      </w:r>
-      <w:r>
-        <w:t xml:space="preserve">).</w:t>
+        <w:t xml:space="preserve">Fig. 6).</w:t>
       </w:r>
     </w:p>
     <w:p>
@@ -3983,13 +4046,13 @@
       </w:r>
     </w:p>
     <w:bookmarkEnd w:id="23"/>
-    <w:bookmarkStart w:id="24" w:name="conclusion"/>
+    <w:bookmarkStart w:id="24" w:name="conclusions"/>
     <w:p>
       <w:pPr>
         <w:pStyle w:val="Heading2"/>
       </w:pPr>
       <w:r>
-        <w:t xml:space="preserve">5. Conclusion</w:t>
+        <w:t xml:space="preserve">5. Conclusions</w:t>
       </w:r>
     </w:p>
     <w:p>
@@ -4031,7 +4094,964 @@
       </w:r>
     </w:p>
     <w:bookmarkEnd w:id="24"/>
-    <w:bookmarkStart w:id="46" w:name="figures"/>
+    <w:bookmarkStart w:id="25" w:name="conflicts-of-interest"/>
+    <w:p>
+      <w:pPr>
+        <w:pStyle w:val="Heading2"/>
+      </w:pPr>
+      <w:r>
+        <w:t xml:space="preserve">Conflicts of interest</w:t>
+      </w:r>
+    </w:p>
+    <w:p>
+      <w:pPr>
+        <w:pStyle w:val="FirstParagraph"/>
+      </w:pPr>
+      <w:r>
+        <w:t xml:space="preserve">There are no conflicts to declare.</w:t>
+      </w:r>
+    </w:p>
+    <w:bookmarkEnd w:id="25"/>
+    <w:bookmarkStart w:id="26" w:name="data-availability"/>
+    <w:p>
+      <w:pPr>
+        <w:pStyle w:val="Heading2"/>
+      </w:pPr>
+      <w:r>
+        <w:t xml:space="preserve">Data availability</w:t>
+      </w:r>
+    </w:p>
+    <w:p>
+      <w:pPr>
+        <w:pStyle w:val="FirstParagraph"/>
+      </w:pPr>
+      <w:r>
+        <w:t xml:space="preserve">The code supporting this article, together with the per-unit results ledger, is openly available</w:t>
+      </w:r>
+      <w:r>
+        <w:t xml:space="preserve"> </w:t>
+      </w:r>
+      <w:r>
+        <w:t xml:space="preserve">in the repository at https://github.com/fronkt/mlip-dynamic-stability and archived at Zenodo at</w:t>
+      </w:r>
+      <w:r>
+        <w:t xml:space="preserve"> </w:t>
+      </w:r>
+      <w:r>
+        <w:t xml:space="preserve">DOI: 10.5281/zenodo.XXXXXXX</w:t>
+      </w:r>
+      <w:r>
+        <w:t xml:space="preserve"> </w:t>
+      </w:r>
+      <w:r>
+        <w:rPr>
+          <w:i/>
+          <w:iCs/>
+        </w:rPr>
+        <w:t xml:space="preserve">(DOI reserved on release; to be inserted on acceptance)</w:t>
+      </w:r>
+      <w:r>
+        <w:t xml:space="preserve">. The</w:t>
+      </w:r>
+      <w:r>
+        <w:t xml:space="preserve"> </w:t>
+      </w:r>
+      <w:r>
+        <w:t xml:space="preserve">production results regenerate from</w:t>
+      </w:r>
+      <w:r>
+        <w:t xml:space="preserve"> </w:t>
+      </w:r>
+      <w:r>
+        <w:rPr>
+          <w:rStyle w:val="VerbatimChar"/>
+        </w:rPr>
+        <w:t xml:space="preserve">results/ledger.parquet</w:t>
+      </w:r>
+      <w:r>
+        <w:t xml:space="preserve"> </w:t>
+      </w:r>
+      <w:r>
+        <w:t xml:space="preserve">(per-unit hashed, resumable) and the</w:t>
+      </w:r>
+      <w:r>
+        <w:t xml:space="preserve"> </w:t>
+      </w:r>
+      <w:r>
+        <w:t xml:space="preserve">finite-size runs from</w:t>
+      </w:r>
+      <w:r>
+        <w:t xml:space="preserve"> </w:t>
+      </w:r>
+      <w:r>
+        <w:rPr>
+          <w:rStyle w:val="VerbatimChar"/>
+        </w:rPr>
+        <w:t xml:space="preserve">results/convergence_study.parquet</w:t>
+      </w:r>
+      <w:r>
+        <w:t xml:space="preserve">; figures via</w:t>
+      </w:r>
+      <w:r>
+        <w:t xml:space="preserve"> </w:t>
+      </w:r>
+      <w:r>
+        <w:rPr>
+          <w:rStyle w:val="VerbatimChar"/>
+        </w:rPr>
+        <w:t xml:space="preserve">scripts/make_figures.py</w:t>
+      </w:r>
+      <w:r>
+        <w:t xml:space="preserve">,</w:t>
+      </w:r>
+      <w:r>
+        <w:t xml:space="preserve"> </w:t>
+      </w:r>
+      <w:r>
+        <w:t xml:space="preserve">analysis in</w:t>
+      </w:r>
+      <w:r>
+        <w:t xml:space="preserve"> </w:t>
+      </w:r>
+      <w:r>
+        <w:rPr>
+          <w:rStyle w:val="VerbatimChar"/>
+        </w:rPr>
+        <w:t xml:space="preserve">mlip_dynstab/analysis.py</w:t>
+      </w:r>
+      <w:r>
+        <w:t xml:space="preserve">, the SSCHA root-cause diagnostic in</w:t>
+      </w:r>
+      <w:r>
+        <w:t xml:space="preserve"> </w:t>
+      </w:r>
+      <w:r>
+        <w:rPr>
+          <w:rStyle w:val="VerbatimChar"/>
+        </w:rPr>
+        <w:t xml:space="preserve">scripts/sscha_v4_diag.py</w:t>
+      </w:r>
+      <w:r>
+        <w:t xml:space="preserve">, and the stochastic-reproducibility study (§3.5) via</w:t>
+      </w:r>
+      <w:r>
+        <w:t xml:space="preserve"> </w:t>
+      </w:r>
+      <w:r>
+        <w:rPr>
+          <w:rStyle w:val="VerbatimChar"/>
+        </w:rPr>
+        <w:t xml:space="preserve">scripts/sscha_repro.py</w:t>
+      </w:r>
+      <w:r>
+        <w:t xml:space="preserve"> </w:t>
+      </w:r>
+      <w:r>
+        <w:t xml:space="preserve">(its per-seed frequencies print to the run log rather than to the</w:t>
+      </w:r>
+      <w:r>
+        <w:t xml:space="preserve"> </w:t>
+      </w:r>
+      <w:r>
+        <w:t xml:space="preserve">ledger).</w:t>
+      </w:r>
+    </w:p>
+    <w:bookmarkEnd w:id="26"/>
+    <w:bookmarkStart w:id="27" w:name="acknowledgements"/>
+    <w:p>
+      <w:pPr>
+        <w:pStyle w:val="Heading2"/>
+      </w:pPr>
+      <w:r>
+        <w:t xml:space="preserve">Acknowledgements</w:t>
+      </w:r>
+    </w:p>
+    <w:p>
+      <w:pPr>
+        <w:pStyle w:val="FirstParagraph"/>
+      </w:pPr>
+      <w:r>
+        <w:rPr>
+          <w:i/>
+          <w:iCs/>
+        </w:rPr>
+        <w:t xml:space="preserve">Funding sources and computational resources to be acknowledged before submission.</w:t>
+      </w:r>
+    </w:p>
+    <w:bookmarkEnd w:id="27"/>
+    <w:bookmarkStart w:id="28" w:name="references"/>
+    <w:p>
+      <w:pPr>
+        <w:pStyle w:val="Heading2"/>
+      </w:pPr>
+      <w:r>
+        <w:t xml:space="preserve">References</w:t>
+      </w:r>
+    </w:p>
+    <w:p>
+      <w:pPr>
+        <w:pStyle w:val="Compact"/>
+        <w:numPr>
+          <w:ilvl w:val="0"/>
+          <w:numId w:val="1003"/>
+        </w:numPr>
+      </w:pPr>
+      <w:r>
+        <w:t xml:space="preserve">A. Loew, D. Sun, H.-C. Wang, S. Botti and M. A. L. Marques,</w:t>
+      </w:r>
+      <w:r>
+        <w:t xml:space="preserve"> </w:t>
+      </w:r>
+      <w:r>
+        <w:rPr>
+          <w:i/>
+          <w:iCs/>
+        </w:rPr>
+        <w:t xml:space="preserve">npj Comput. Mater.</w:t>
+      </w:r>
+      <w:r>
+        <w:t xml:space="preserve">, 2025,</w:t>
+      </w:r>
+      <w:r>
+        <w:t xml:space="preserve"> </w:t>
+      </w:r>
+      <w:r>
+        <w:rPr>
+          <w:b/>
+          <w:bCs/>
+        </w:rPr>
+        <w:t xml:space="preserve">11</w:t>
+      </w:r>
+      <w:r>
+        <w:t xml:space="preserve">, 178.</w:t>
+      </w:r>
+    </w:p>
+    <w:p>
+      <w:pPr>
+        <w:pStyle w:val="Compact"/>
+        <w:numPr>
+          <w:ilvl w:val="0"/>
+          <w:numId w:val="1003"/>
+        </w:numPr>
+      </w:pPr>
+      <w:r>
+        <w:t xml:space="preserve">X.-Q. Han, P.-J. Guo, Z.-F. Gao, W.-K. Li and Z.-Y. Lu,</w:t>
+      </w:r>
+      <w:r>
+        <w:t xml:space="preserve"> </w:t>
+      </w:r>
+      <w:r>
+        <w:rPr>
+          <w:i/>
+          <w:iCs/>
+        </w:rPr>
+        <w:t xml:space="preserve">arXiv</w:t>
+      </w:r>
+      <w:r>
+        <w:t xml:space="preserve">, 2025, arXiv:2512.21227.</w:t>
+      </w:r>
+    </w:p>
+    <w:p>
+      <w:pPr>
+        <w:pStyle w:val="Compact"/>
+        <w:numPr>
+          <w:ilvl w:val="0"/>
+          <w:numId w:val="1003"/>
+        </w:numPr>
+      </w:pPr>
+      <w:r>
+        <w:t xml:space="preserve">G. Petretto, S. Dwaraknath, H. P. C. Miranda, D. Winston, M. Giantomassi, M. J. van Setten, X. Gonze, K. A. Persson, G. Hautier and G.-M. Rignanese,</w:t>
+      </w:r>
+      <w:r>
+        <w:t xml:space="preserve"> </w:t>
+      </w:r>
+      <w:r>
+        <w:rPr>
+          <w:i/>
+          <w:iCs/>
+        </w:rPr>
+        <w:t xml:space="preserve">Sci. Data</w:t>
+      </w:r>
+      <w:r>
+        <w:t xml:space="preserve">, 2018,</w:t>
+      </w:r>
+      <w:r>
+        <w:t xml:space="preserve"> </w:t>
+      </w:r>
+      <w:r>
+        <w:rPr>
+          <w:b/>
+          <w:bCs/>
+        </w:rPr>
+        <w:t xml:space="preserve">5</w:t>
+      </w:r>
+      <w:r>
+        <w:t xml:space="preserve">, 180065.</w:t>
+      </w:r>
+    </w:p>
+    <w:p>
+      <w:pPr>
+        <w:pStyle w:val="Compact"/>
+        <w:numPr>
+          <w:ilvl w:val="0"/>
+          <w:numId w:val="1003"/>
+        </w:numPr>
+      </w:pPr>
+      <w:r>
+        <w:t xml:space="preserve">L. Monacelli, R. Bianco, M. Cherubini, M. Calandra, I. Errea and F. Mauri,</w:t>
+      </w:r>
+      <w:r>
+        <w:t xml:space="preserve"> </w:t>
+      </w:r>
+      <w:r>
+        <w:rPr>
+          <w:i/>
+          <w:iCs/>
+        </w:rPr>
+        <w:t xml:space="preserve">J. Phys.: Condens. Matter</w:t>
+      </w:r>
+      <w:r>
+        <w:t xml:space="preserve">, 2021,</w:t>
+      </w:r>
+      <w:r>
+        <w:t xml:space="preserve"> </w:t>
+      </w:r>
+      <w:r>
+        <w:rPr>
+          <w:b/>
+          <w:bCs/>
+        </w:rPr>
+        <w:t xml:space="preserve">33</w:t>
+      </w:r>
+      <w:r>
+        <w:t xml:space="preserve">, 363001.</w:t>
+      </w:r>
+    </w:p>
+    <w:p>
+      <w:pPr>
+        <w:pStyle w:val="Compact"/>
+        <w:numPr>
+          <w:ilvl w:val="0"/>
+          <w:numId w:val="1003"/>
+        </w:numPr>
+      </w:pPr>
+      <w:r>
+        <w:t xml:space="preserve">O. Hellman, I. A. Abrikosov and S. I. Simak,</w:t>
+      </w:r>
+      <w:r>
+        <w:t xml:space="preserve"> </w:t>
+      </w:r>
+      <w:r>
+        <w:rPr>
+          <w:i/>
+          <w:iCs/>
+        </w:rPr>
+        <w:t xml:space="preserve">Phys. Rev. B</w:t>
+      </w:r>
+      <w:r>
+        <w:t xml:space="preserve">, 2011,</w:t>
+      </w:r>
+      <w:r>
+        <w:t xml:space="preserve"> </w:t>
+      </w:r>
+      <w:r>
+        <w:rPr>
+          <w:b/>
+          <w:bCs/>
+        </w:rPr>
+        <w:t xml:space="preserve">84</w:t>
+      </w:r>
+      <w:r>
+        <w:t xml:space="preserve">, 180301(R); O. Hellman, P. Steneteg, I. A. Abrikosov and S. I. Simak,</w:t>
+      </w:r>
+      <w:r>
+        <w:t xml:space="preserve"> </w:t>
+      </w:r>
+      <w:r>
+        <w:rPr>
+          <w:i/>
+          <w:iCs/>
+        </w:rPr>
+        <w:t xml:space="preserve">Phys. Rev. B</w:t>
+      </w:r>
+      <w:r>
+        <w:t xml:space="preserve">, 2013,</w:t>
+      </w:r>
+      <w:r>
+        <w:t xml:space="preserve"> </w:t>
+      </w:r>
+      <w:r>
+        <w:rPr>
+          <w:b/>
+          <w:bCs/>
+        </w:rPr>
+        <w:t xml:space="preserve">87</w:t>
+      </w:r>
+      <w:r>
+        <w:t xml:space="preserve">, 104111.</w:t>
+      </w:r>
+    </w:p>
+    <w:p>
+      <w:pPr>
+        <w:pStyle w:val="Compact"/>
+        <w:numPr>
+          <w:ilvl w:val="0"/>
+          <w:numId w:val="1003"/>
+        </w:numPr>
+      </w:pPr>
+      <w:r>
+        <w:t xml:space="preserve">I. Batatia, P. Benner, Y. Chiang, A. M. Elena, D. P. Kovács, J. Riebesell</w:t>
+      </w:r>
+      <w:r>
+        <w:t xml:space="preserve"> </w:t>
+      </w:r>
+      <w:r>
+        <w:rPr>
+          <w:i/>
+          <w:iCs/>
+        </w:rPr>
+        <w:t xml:space="preserve">et al.</w:t>
+      </w:r>
+      <w:r>
+        <w:t xml:space="preserve">,</w:t>
+      </w:r>
+      <w:r>
+        <w:t xml:space="preserve"> </w:t>
+      </w:r>
+      <w:r>
+        <w:rPr>
+          <w:i/>
+          <w:iCs/>
+        </w:rPr>
+        <w:t xml:space="preserve">arXiv</w:t>
+      </w:r>
+      <w:r>
+        <w:t xml:space="preserve">, 2023, arXiv:2401.00096.</w:t>
+      </w:r>
+    </w:p>
+    <w:p>
+      <w:pPr>
+        <w:pStyle w:val="Compact"/>
+        <w:numPr>
+          <w:ilvl w:val="0"/>
+          <w:numId w:val="1003"/>
+        </w:numPr>
+      </w:pPr>
+      <w:r>
+        <w:t xml:space="preserve">B. Deng, P. Zhong, K. Jun</w:t>
+      </w:r>
+      <w:r>
+        <w:t xml:space="preserve"> </w:t>
+      </w:r>
+      <w:r>
+        <w:rPr>
+          <w:i/>
+          <w:iCs/>
+        </w:rPr>
+        <w:t xml:space="preserve">et al.</w:t>
+      </w:r>
+      <w:r>
+        <w:t xml:space="preserve">,</w:t>
+      </w:r>
+      <w:r>
+        <w:t xml:space="preserve"> </w:t>
+      </w:r>
+      <w:r>
+        <w:rPr>
+          <w:i/>
+          <w:iCs/>
+        </w:rPr>
+        <w:t xml:space="preserve">Nat. Mach. Intell.</w:t>
+      </w:r>
+      <w:r>
+        <w:t xml:space="preserve">, 2023,</w:t>
+      </w:r>
+      <w:r>
+        <w:t xml:space="preserve"> </w:t>
+      </w:r>
+      <w:r>
+        <w:rPr>
+          <w:b/>
+          <w:bCs/>
+        </w:rPr>
+        <w:t xml:space="preserve">5</w:t>
+      </w:r>
+      <w:r>
+        <w:t xml:space="preserve">, 1031.</w:t>
+      </w:r>
+    </w:p>
+    <w:p>
+      <w:pPr>
+        <w:pStyle w:val="Compact"/>
+        <w:numPr>
+          <w:ilvl w:val="0"/>
+          <w:numId w:val="1003"/>
+        </w:numPr>
+      </w:pPr>
+      <w:r>
+        <w:t xml:space="preserve">M. Neumann, J. Gin, B. Rhodes, S. Bennett, Z. Li, H. Choubisa, A. Hussey and J. Godwin,</w:t>
+      </w:r>
+      <w:r>
+        <w:t xml:space="preserve"> </w:t>
+      </w:r>
+      <w:r>
+        <w:rPr>
+          <w:i/>
+          <w:iCs/>
+        </w:rPr>
+        <w:t xml:space="preserve">arXiv</w:t>
+      </w:r>
+      <w:r>
+        <w:t xml:space="preserve">, 2024, arXiv:2410.22570.</w:t>
+      </w:r>
+    </w:p>
+    <w:p>
+      <w:pPr>
+        <w:pStyle w:val="Compact"/>
+        <w:numPr>
+          <w:ilvl w:val="0"/>
+          <w:numId w:val="1003"/>
+        </w:numPr>
+      </w:pPr>
+      <w:r>
+        <w:t xml:space="preserve">Y. Park, J. Kim, S. Hwang and S. Han,</w:t>
+      </w:r>
+      <w:r>
+        <w:t xml:space="preserve"> </w:t>
+      </w:r>
+      <w:r>
+        <w:rPr>
+          <w:i/>
+          <w:iCs/>
+        </w:rPr>
+        <w:t xml:space="preserve">J. Chem. Theory Comput.</w:t>
+      </w:r>
+      <w:r>
+        <w:t xml:space="preserve">, 2024,</w:t>
+      </w:r>
+      <w:r>
+        <w:t xml:space="preserve"> </w:t>
+      </w:r>
+      <w:r>
+        <w:rPr>
+          <w:b/>
+          <w:bCs/>
+        </w:rPr>
+        <w:t xml:space="preserve">20</w:t>
+      </w:r>
+      <w:r>
+        <w:t xml:space="preserve">, 4857.</w:t>
+      </w:r>
+    </w:p>
+    <w:p>
+      <w:pPr>
+        <w:pStyle w:val="Compact"/>
+        <w:numPr>
+          <w:ilvl w:val="0"/>
+          <w:numId w:val="1003"/>
+        </w:numPr>
+      </w:pPr>
+      <w:r>
+        <w:t xml:space="preserve">H. Yang, C. Hu, Y. Zhou</w:t>
+      </w:r>
+      <w:r>
+        <w:t xml:space="preserve"> </w:t>
+      </w:r>
+      <w:r>
+        <w:rPr>
+          <w:i/>
+          <w:iCs/>
+        </w:rPr>
+        <w:t xml:space="preserve">et al.</w:t>
+      </w:r>
+      <w:r>
+        <w:t xml:space="preserve">,</w:t>
+      </w:r>
+      <w:r>
+        <w:t xml:space="preserve"> </w:t>
+      </w:r>
+      <w:r>
+        <w:rPr>
+          <w:i/>
+          <w:iCs/>
+        </w:rPr>
+        <w:t xml:space="preserve">arXiv</w:t>
+      </w:r>
+      <w:r>
+        <w:t xml:space="preserve">, 2024, arXiv:2405.04967.</w:t>
+      </w:r>
+    </w:p>
+    <w:p>
+      <w:pPr>
+        <w:pStyle w:val="Compact"/>
+        <w:numPr>
+          <w:ilvl w:val="0"/>
+          <w:numId w:val="1003"/>
+        </w:numPr>
+      </w:pPr>
+      <w:r>
+        <w:t xml:space="preserve">T. Tadano and S. Tsuneyuki,</w:t>
+      </w:r>
+      <w:r>
+        <w:t xml:space="preserve"> </w:t>
+      </w:r>
+      <w:r>
+        <w:rPr>
+          <w:i/>
+          <w:iCs/>
+        </w:rPr>
+        <w:t xml:space="preserve">Phys. Rev. B</w:t>
+      </w:r>
+      <w:r>
+        <w:t xml:space="preserve">, 2015,</w:t>
+      </w:r>
+      <w:r>
+        <w:t xml:space="preserve"> </w:t>
+      </w:r>
+      <w:r>
+        <w:rPr>
+          <w:b/>
+          <w:bCs/>
+        </w:rPr>
+        <w:t xml:space="preserve">92</w:t>
+      </w:r>
+      <w:r>
+        <w:t xml:space="preserve">, 054301.</w:t>
+      </w:r>
+    </w:p>
+    <w:p>
+      <w:pPr>
+        <w:pStyle w:val="Compact"/>
+        <w:numPr>
+          <w:ilvl w:val="0"/>
+          <w:numId w:val="1003"/>
+        </w:numPr>
+      </w:pPr>
+      <w:r>
+        <w:t xml:space="preserve">W. Zhong, D. Vanderbilt and K. M. Rabe,</w:t>
+      </w:r>
+      <w:r>
+        <w:t xml:space="preserve"> </w:t>
+      </w:r>
+      <w:r>
+        <w:rPr>
+          <w:i/>
+          <w:iCs/>
+        </w:rPr>
+        <w:t xml:space="preserve">Phys. Rev. Lett.</w:t>
+      </w:r>
+      <w:r>
+        <w:t xml:space="preserve">, 1994,</w:t>
+      </w:r>
+      <w:r>
+        <w:t xml:space="preserve"> </w:t>
+      </w:r>
+      <w:r>
+        <w:rPr>
+          <w:b/>
+          <w:bCs/>
+        </w:rPr>
+        <w:t xml:space="preserve">73</w:t>
+      </w:r>
+      <w:r>
+        <w:t xml:space="preserve">, 1861.</w:t>
+      </w:r>
+    </w:p>
+    <w:p>
+      <w:pPr>
+        <w:pStyle w:val="Compact"/>
+        <w:numPr>
+          <w:ilvl w:val="0"/>
+          <w:numId w:val="1003"/>
+        </w:numPr>
+      </w:pPr>
+      <w:r>
+        <w:t xml:space="preserve">A. Marronnier</w:t>
+      </w:r>
+      <w:r>
+        <w:t xml:space="preserve"> </w:t>
+      </w:r>
+      <w:r>
+        <w:rPr>
+          <w:i/>
+          <w:iCs/>
+        </w:rPr>
+        <w:t xml:space="preserve">et al.</w:t>
+      </w:r>
+      <w:r>
+        <w:t xml:space="preserve">,</w:t>
+      </w:r>
+      <w:r>
+        <w:t xml:space="preserve"> </w:t>
+      </w:r>
+      <w:r>
+        <w:rPr>
+          <w:i/>
+          <w:iCs/>
+        </w:rPr>
+        <w:t xml:space="preserve">ACS Nano</w:t>
+      </w:r>
+      <w:r>
+        <w:t xml:space="preserve">, 2018,</w:t>
+      </w:r>
+      <w:r>
+        <w:t xml:space="preserve"> </w:t>
+      </w:r>
+      <w:r>
+        <w:rPr>
+          <w:b/>
+          <w:bCs/>
+        </w:rPr>
+        <w:t xml:space="preserve">12</w:t>
+      </w:r>
+      <w:r>
+        <w:t xml:space="preserve">, 3477.</w:t>
+      </w:r>
+    </w:p>
+    <w:p>
+      <w:pPr>
+        <w:pStyle w:val="Compact"/>
+        <w:numPr>
+          <w:ilvl w:val="0"/>
+          <w:numId w:val="1003"/>
+        </w:numPr>
+      </w:pPr>
+      <w:r>
+        <w:t xml:space="preserve">L. Monacelli and N. Marzari,</w:t>
+      </w:r>
+      <w:r>
+        <w:t xml:space="preserve"> </w:t>
+      </w:r>
+      <w:r>
+        <w:rPr>
+          <w:i/>
+          <w:iCs/>
+        </w:rPr>
+        <w:t xml:space="preserve">Chem. Mater.</w:t>
+      </w:r>
+      <w:r>
+        <w:t xml:space="preserve">, 2023, DOI: 10.1021/acs.chemmater.2c03475.</w:t>
+      </w:r>
+    </w:p>
+    <w:p>
+      <w:pPr>
+        <w:pStyle w:val="Compact"/>
+        <w:numPr>
+          <w:ilvl w:val="0"/>
+          <w:numId w:val="1003"/>
+        </w:numPr>
+      </w:pPr>
+      <w:r>
+        <w:t xml:space="preserve">W. Petry</w:t>
+      </w:r>
+      <w:r>
+        <w:t xml:space="preserve"> </w:t>
+      </w:r>
+      <w:r>
+        <w:rPr>
+          <w:i/>
+          <w:iCs/>
+        </w:rPr>
+        <w:t xml:space="preserve">et al.</w:t>
+      </w:r>
+      <w:r>
+        <w:t xml:space="preserve">,</w:t>
+      </w:r>
+      <w:r>
+        <w:t xml:space="preserve"> </w:t>
+      </w:r>
+      <w:r>
+        <w:rPr>
+          <w:i/>
+          <w:iCs/>
+        </w:rPr>
+        <w:t xml:space="preserve">Phys. Rev. B</w:t>
+      </w:r>
+      <w:r>
+        <w:t xml:space="preserve">, 1991,</w:t>
+      </w:r>
+      <w:r>
+        <w:t xml:space="preserve"> </w:t>
+      </w:r>
+      <w:r>
+        <w:rPr>
+          <w:b/>
+          <w:bCs/>
+        </w:rPr>
+        <w:t xml:space="preserve">43</w:t>
+      </w:r>
+      <w:r>
+        <w:t xml:space="preserve">, 10933; A. Heiming</w:t>
+      </w:r>
+      <w:r>
+        <w:t xml:space="preserve"> </w:t>
+      </w:r>
+      <w:r>
+        <w:rPr>
+          <w:i/>
+          <w:iCs/>
+        </w:rPr>
+        <w:t xml:space="preserve">et al.</w:t>
+      </w:r>
+      <w:r>
+        <w:t xml:space="preserve">,</w:t>
+      </w:r>
+      <w:r>
+        <w:t xml:space="preserve"> </w:t>
+      </w:r>
+      <w:r>
+        <w:rPr>
+          <w:i/>
+          <w:iCs/>
+        </w:rPr>
+        <w:t xml:space="preserve">Phys. Rev. B</w:t>
+      </w:r>
+      <w:r>
+        <w:t xml:space="preserve">, 1991,</w:t>
+      </w:r>
+      <w:r>
+        <w:t xml:space="preserve"> </w:t>
+      </w:r>
+      <w:r>
+        <w:rPr>
+          <w:b/>
+          <w:bCs/>
+        </w:rPr>
+        <w:t xml:space="preserve">43</w:t>
+      </w:r>
+      <w:r>
+        <w:t xml:space="preserve">, 10948.</w:t>
+      </w:r>
+    </w:p>
+    <w:p>
+      <w:pPr>
+        <w:pStyle w:val="Compact"/>
+        <w:numPr>
+          <w:ilvl w:val="0"/>
+          <w:numId w:val="1003"/>
+        </w:numPr>
+      </w:pPr>
+      <w:r>
+        <w:t xml:space="preserve">K. Parlinski, Z. Q. Li and Y. Kawazoe,</w:t>
+      </w:r>
+      <w:r>
+        <w:t xml:space="preserve"> </w:t>
+      </w:r>
+      <w:r>
+        <w:rPr>
+          <w:i/>
+          <w:iCs/>
+        </w:rPr>
+        <w:t xml:space="preserve">Phys. Rev. Lett.</w:t>
+      </w:r>
+      <w:r>
+        <w:t xml:space="preserve">, 1997,</w:t>
+      </w:r>
+      <w:r>
+        <w:t xml:space="preserve"> </w:t>
+      </w:r>
+      <w:r>
+        <w:rPr>
+          <w:b/>
+          <w:bCs/>
+        </w:rPr>
+        <w:t xml:space="preserve">78</w:t>
+      </w:r>
+      <w:r>
+        <w:t xml:space="preserve">, 4063.</w:t>
+      </w:r>
+    </w:p>
+    <w:p>
+      <w:pPr>
+        <w:pStyle w:val="Compact"/>
+        <w:numPr>
+          <w:ilvl w:val="0"/>
+          <w:numId w:val="1003"/>
+        </w:numPr>
+      </w:pPr>
+      <w:r>
+        <w:t xml:space="preserve">D. A. Wood and N. Marzari,</w:t>
+      </w:r>
+      <w:r>
+        <w:t xml:space="preserve"> </w:t>
+      </w:r>
+      <w:r>
+        <w:rPr>
+          <w:i/>
+          <w:iCs/>
+        </w:rPr>
+        <w:t xml:space="preserve">Phys. Rev. B</w:t>
+      </w:r>
+      <w:r>
+        <w:t xml:space="preserve">, 2007,</w:t>
+      </w:r>
+      <w:r>
+        <w:t xml:space="preserve"> </w:t>
+      </w:r>
+      <w:r>
+        <w:rPr>
+          <w:b/>
+          <w:bCs/>
+        </w:rPr>
+        <w:t xml:space="preserve">76</w:t>
+      </w:r>
+      <w:r>
+        <w:t xml:space="preserve">, 134301.</w:t>
+      </w:r>
+    </w:p>
+    <w:p>
+      <w:pPr>
+        <w:pStyle w:val="Compact"/>
+        <w:numPr>
+          <w:ilvl w:val="0"/>
+          <w:numId w:val="1003"/>
+        </w:numPr>
+      </w:pPr>
+      <w:r>
+        <w:t xml:space="preserve">A. Ranalli</w:t>
+      </w:r>
+      <w:r>
+        <w:t xml:space="preserve"> </w:t>
+      </w:r>
+      <w:r>
+        <w:rPr>
+          <w:i/>
+          <w:iCs/>
+        </w:rPr>
+        <w:t xml:space="preserve">et al.</w:t>
+      </w:r>
+      <w:r>
+        <w:t xml:space="preserve">,</w:t>
+      </w:r>
+      <w:r>
+        <w:t xml:space="preserve"> </w:t>
+      </w:r>
+      <w:r>
+        <w:rPr>
+          <w:i/>
+          <w:iCs/>
+        </w:rPr>
+        <w:t xml:space="preserve">Adv. Quantum Technol.</w:t>
+      </w:r>
+      <w:r>
+        <w:t xml:space="preserve">, 2023,</w:t>
+      </w:r>
+      <w:r>
+        <w:t xml:space="preserve"> </w:t>
+      </w:r>
+      <w:r>
+        <w:rPr>
+          <w:b/>
+          <w:bCs/>
+        </w:rPr>
+        <w:t xml:space="preserve">6</w:t>
+      </w:r>
+      <w:r>
+        <w:t xml:space="preserve">, 2200131.</w:t>
+      </w:r>
+    </w:p>
+    <w:bookmarkEnd w:id="28"/>
+    <w:bookmarkStart w:id="47" w:name="figures"/>
     <w:p>
       <w:pPr>
         <w:pStyle w:val="Heading2"/>
@@ -4047,198 +5067,20 @@
       <w:r>
         <w:drawing>
           <wp:inline>
-            <wp:extent cx="5334000" cy="2193845"/>
+            <wp:extent cx="4784784" cy="3864633"/>
             <wp:effectExtent b="0" l="0" r="0" t="0"/>
-            <wp:docPr descr="Figure 1 · Overview. Left — the finite-temperature blind spot. Along a soft mode the harmonic energy E(Q) is a double well; at the high-symmetry point Q=0 its curvature is negative (imaginary mode), so 0 K phonon benchmarks call the phase dynamically unstable, whereas the finite-temperature free energy F(Q;T) is a single well, so the cubic phase is in fact stable above T_c — the regime current MLIP phonon benchmarks stop short of. Middle — the benchmark. Twenty literature-curated reference systems and five foundation MLIPs feed a harmonic baseline (Layer 1, validation anchor) and the single-mode quantum soft-mode free-energy screen (Layer 2, this work; cubic stable ⇔ Q₀≈0 is the global minimum of F), cross-checked against multi-mode SSCHA. Right — findings. H1–H3 plus the SSCHA trap: the gold standard false-stabilises deep displacive instabilities (recall 0.23 vs the screen’s 0.77)." title="" id="26" name="Picture"/>
+            <wp:docPr descr="Fig. 1 Harmonic false-stable and false-unstable call counts versus the imaginary-frequency tolerance (§3.1). The default −0.1 THz sits in the stable basin between the false-unstable flood at strict tolerance and the false-stable inflation at loose tolerance." title="" id="30" name="Picture"/>
             <a:graphic>
               <a:graphicData uri="http://schemas.openxmlformats.org/drawingml/2006/picture">
                 <pic:pic>
                   <pic:nvPicPr>
-                    <pic:cNvPr descr="../results/figures/fig_overview.png" id="27" name="Picture"/>
+                    <pic:cNvPr descr="../results/figures/fig_tolerance_sweep.png" id="31" name="Picture"/>
                     <pic:cNvPicPr>
                       <a:picLocks noChangeArrowheads="1" noChangeAspect="1"/>
                     </pic:cNvPicPr>
                   </pic:nvPicPr>
                   <pic:blipFill>
-                    <a:blip r:embed="rId25"/>
-                    <a:stretch>
-                      <a:fillRect/>
-                    </a:stretch>
-                  </pic:blipFill>
-                  <pic:spPr bwMode="auto">
-                    <a:xfrm>
-                      <a:off x="0" y="0"/>
-                      <a:ext cx="5334000" cy="2193845"/>
-                    </a:xfrm>
-                    <a:prstGeom prst="rect">
-                      <a:avLst/>
-                    </a:prstGeom>
-                    <a:noFill/>
-                    <a:ln w="9525">
-                      <a:noFill/>
-                      <a:headEnd/>
-                      <a:tailEnd/>
-                    </a:ln>
-                  </pic:spPr>
-                </pic:pic>
-              </a:graphicData>
-            </a:graphic>
-          </wp:inline>
-        </w:drawing>
-      </w:r>
-    </w:p>
-    <w:p>
-      <w:pPr>
-        <w:pStyle w:val="ImageCaption"/>
-      </w:pPr>
-      <w:r>
-        <w:rPr>
-          <w:b/>
-          <w:bCs/>
-        </w:rPr>
-        <w:t xml:space="preserve">Figure 1 · Overview.</w:t>
-      </w:r>
-      <w:r>
-        <w:t xml:space="preserve"> </w:t>
-      </w:r>
-      <w:r>
-        <w:rPr>
-          <w:i/>
-          <w:iCs/>
-        </w:rPr>
-        <w:t xml:space="preserve">Left — the finite-temperature blind spot.</w:t>
-      </w:r>
-      <w:r>
-        <w:t xml:space="preserve"> </w:t>
-      </w:r>
-      <w:r>
-        <w:t xml:space="preserve">Along a soft mode the</w:t>
-      </w:r>
-      <w:r>
-        <w:t xml:space="preserve"> </w:t>
-      </w:r>
-      <w:r>
-        <w:t xml:space="preserve">harmonic energy E(Q) is a double well; at the high-symmetry point Q=0 its curvature is negative</w:t>
-      </w:r>
-      <w:r>
-        <w:t xml:space="preserve"> </w:t>
-      </w:r>
-      <w:r>
-        <w:t xml:space="preserve">(imaginary mode), so 0 K phonon benchmarks call the phase dynamically</w:t>
-      </w:r>
-      <w:r>
-        <w:t xml:space="preserve"> </w:t>
-      </w:r>
-      <w:r>
-        <w:rPr>
-          <w:i/>
-          <w:iCs/>
-        </w:rPr>
-        <w:t xml:space="preserve">unstable</w:t>
-      </w:r>
-      <w:r>
-        <w:t xml:space="preserve">, whereas the</w:t>
-      </w:r>
-      <w:r>
-        <w:t xml:space="preserve"> </w:t>
-      </w:r>
-      <w:r>
-        <w:t xml:space="preserve">finite-temperature free energy F(Q;T) is a single well, so the cubic phase is in fact</w:t>
-      </w:r>
-      <w:r>
-        <w:t xml:space="preserve"> </w:t>
-      </w:r>
-      <w:r>
-        <w:rPr>
-          <w:i/>
-          <w:iCs/>
-        </w:rPr>
-        <w:t xml:space="preserve">stable</w:t>
-      </w:r>
-      <w:r>
-        <w:t xml:space="preserve"> </w:t>
-      </w:r>
-      <w:r>
-        <w:t xml:space="preserve">above T_c — the regime current MLIP phonon benchmarks stop short of.</w:t>
-      </w:r>
-      <w:r>
-        <w:t xml:space="preserve"> </w:t>
-      </w:r>
-      <w:r>
-        <w:rPr>
-          <w:i/>
-          <w:iCs/>
-        </w:rPr>
-        <w:t xml:space="preserve">Middle — the benchmark.</w:t>
-      </w:r>
-      <w:r>
-        <w:t xml:space="preserve"> </w:t>
-      </w:r>
-      <w:r>
-        <w:t xml:space="preserve">Twenty literature-curated reference systems and five foundation MLIPs feed a harmonic baseline</w:t>
-      </w:r>
-      <w:r>
-        <w:t xml:space="preserve"> </w:t>
-      </w:r>
-      <w:r>
-        <w:t xml:space="preserve">(Layer 1, validation anchor) and the single-mode quantum soft-mode free-energy screen (Layer 2,</w:t>
-      </w:r>
-      <w:r>
-        <w:t xml:space="preserve"> </w:t>
-      </w:r>
-      <w:r>
-        <w:t xml:space="preserve">this work; cubic stable ⇔ Q₀≈0 is the global minimum of F), cross-checked against multi-mode</w:t>
-      </w:r>
-      <w:r>
-        <w:t xml:space="preserve"> </w:t>
-      </w:r>
-      <w:r>
-        <w:t xml:space="preserve">SSCHA.</w:t>
-      </w:r>
-      <w:r>
-        <w:t xml:space="preserve"> </w:t>
-      </w:r>
-      <w:r>
-        <w:rPr>
-          <w:i/>
-          <w:iCs/>
-        </w:rPr>
-        <w:t xml:space="preserve">Right — findings.</w:t>
-      </w:r>
-      <w:r>
-        <w:t xml:space="preserve"> </w:t>
-      </w:r>
-      <w:r>
-        <w:t xml:space="preserve">H1–H3 plus the SSCHA trap: the gold standard false-stabilises deep</w:t>
-      </w:r>
-      <w:r>
-        <w:t xml:space="preserve"> </w:t>
-      </w:r>
-      <w:r>
-        <w:t xml:space="preserve">displacive instabilities (recall 0.23 vs the screen’s 0.77).</w:t>
-      </w:r>
-    </w:p>
-    <w:p>
-      <w:pPr>
-        <w:pStyle w:val="CaptionedFigure"/>
-      </w:pPr>
-      <w:r>
-        <w:drawing>
-          <wp:inline>
-            <wp:extent cx="4784784" cy="3864633"/>
-            <wp:effectExtent b="0" l="0" r="0" t="0"/>
-            <wp:docPr descr="fig_tolerance_sweep — Harmonic false-stable and false-unstable call counts versus the imaginary-frequency tolerance (§3.1). The default −0.1 THz sits in the stable basin between the false-unstable flood at strict tolerance and the false-stable inflation at loose tolerance." title="" id="29" name="Picture"/>
-            <a:graphic>
-              <a:graphicData uri="http://schemas.openxmlformats.org/drawingml/2006/picture">
-                <pic:pic>
-                  <pic:nvPicPr>
-                    <pic:cNvPr descr="../results/figures/fig_tolerance_sweep.png" id="30" name="Picture"/>
-                    <pic:cNvPicPr>
-                      <a:picLocks noChangeArrowheads="1" noChangeAspect="1"/>
-                    </pic:cNvPicPr>
-                  </pic:nvPicPr>
-                  <pic:blipFill>
-                    <a:blip r:embed="rId28"/>
+                    <a:blip r:embed="rId29"/>
                     <a:stretch>
                       <a:fillRect/>
                     </a:stretch>
@@ -4274,13 +5116,13 @@
           <w:b/>
           <w:bCs/>
         </w:rPr>
-        <w:t xml:space="preserve">fig_tolerance_sweep</w:t>
-      </w:r>
-      <w:r>
-        <w:t xml:space="preserve"> </w:t>
-      </w:r>
-      <w:r>
-        <w:t xml:space="preserve">— Harmonic false-stable and false-unstable call counts versus the</w:t>
+        <w:t xml:space="preserve">Fig. 1</w:t>
+      </w:r>
+      <w:r>
+        <w:t xml:space="preserve"> </w:t>
+      </w:r>
+      <w:r>
+        <w:t xml:space="preserve">Harmonic false-stable and false-unstable call counts versus the</w:t>
       </w:r>
       <w:r>
         <w:t xml:space="preserve"> </w:t>
@@ -4304,18 +5146,18 @@
           <wp:inline>
             <wp:extent cx="5334000" cy="5744307"/>
             <wp:effectExtent b="0" l="0" r="0" t="0"/>
-            <wp:docPr descr="fig_softmode_heat — Per-system minimum effective frequency across the five models (§3.1–3.2). The “softening toward zero” of the harmonically-unstable systems is the physics; per-system minima, not binary rates, are the right reporting unit." title="" id="32" name="Picture"/>
+            <wp:docPr descr="Fig. 2 Per-system minimum effective frequency across the five models (§3.1–3.2). The “softening toward zero” of the harmonically-unstable systems is the physics; per-system minima, not binary rates, are the right reporting unit." title="" id="33" name="Picture"/>
             <a:graphic>
               <a:graphicData uri="http://schemas.openxmlformats.org/drawingml/2006/picture">
                 <pic:pic>
                   <pic:nvPicPr>
-                    <pic:cNvPr descr="../results/figures/fig_softmode_heat.png" id="33" name="Picture"/>
+                    <pic:cNvPr descr="../results/figures/fig_softmode_heat.png" id="34" name="Picture"/>
                     <pic:cNvPicPr>
                       <a:picLocks noChangeArrowheads="1" noChangeAspect="1"/>
                     </pic:cNvPicPr>
                   </pic:nvPicPr>
                   <pic:blipFill>
-                    <a:blip r:embed="rId31"/>
+                    <a:blip r:embed="rId32"/>
                     <a:stretch>
                       <a:fillRect/>
                     </a:stretch>
@@ -4351,13 +5193,13 @@
           <w:b/>
           <w:bCs/>
         </w:rPr>
-        <w:t xml:space="preserve">fig_softmode_heat</w:t>
-      </w:r>
-      <w:r>
-        <w:t xml:space="preserve"> </w:t>
-      </w:r>
-      <w:r>
-        <w:t xml:space="preserve">— Per-system minimum effective frequency across the five models (§3.1–3.2).</w:t>
+        <w:t xml:space="preserve">Fig. 2</w:t>
+      </w:r>
+      <w:r>
+        <w:t xml:space="preserve"> </w:t>
+      </w:r>
+      <w:r>
+        <w:t xml:space="preserve">Per-system minimum effective frequency across the five models (§3.1–3.2).</w:t>
       </w:r>
       <w:r>
         <w:t xml:space="preserve"> </w:t>
@@ -4393,18 +5235,18 @@
           <wp:inline>
             <wp:extent cx="5334000" cy="1866899"/>
             <wp:effectExtent b="0" l="0" r="0" t="0"/>
-            <wp:docPr descr="fig_sscha_bcc — Multi-mode SSCHA dynamic-stabilisation curves for bcc Ti/Zr/Hf, five models, versus temperature (§3.3). All models stabilise the bcc phase by ≤50 K; the margin to the stability boundary (MatterSim/ORB-v2 hugging ~0.4 THz, MACE-MP-0 firmly stable ~1.8 THz) discriminates the models." title="" id="35" name="Picture"/>
+            <wp:docPr descr="Fig. 3 Multi-mode SSCHA dynamic-stabilisation curves for bcc Ti/Zr/Hf, five models, versus temperature (§3.3). All models stabilise the bcc phase by ≤50 K; the margin to the stability boundary (MatterSim/ORB-v2 hugging ~0.4 THz, MACE-MP-0 firmly stable ~1.8 THz) discriminates the models." title="" id="36" name="Picture"/>
             <a:graphic>
               <a:graphicData uri="http://schemas.openxmlformats.org/drawingml/2006/picture">
                 <pic:pic>
                   <pic:nvPicPr>
-                    <pic:cNvPr descr="../results/figures/fig_sscha_bcc.png" id="36" name="Picture"/>
+                    <pic:cNvPr descr="../results/figures/fig_sscha_bcc.png" id="37" name="Picture"/>
                     <pic:cNvPicPr>
                       <a:picLocks noChangeArrowheads="1" noChangeAspect="1"/>
                     </pic:cNvPicPr>
                   </pic:nvPicPr>
                   <pic:blipFill>
-                    <a:blip r:embed="rId34"/>
+                    <a:blip r:embed="rId35"/>
                     <a:stretch>
                       <a:fillRect/>
                     </a:stretch>
@@ -4440,13 +5282,13 @@
           <w:b/>
           <w:bCs/>
         </w:rPr>
-        <w:t xml:space="preserve">fig_sscha_bcc</w:t>
-      </w:r>
-      <w:r>
-        <w:t xml:space="preserve"> </w:t>
-      </w:r>
-      <w:r>
-        <w:t xml:space="preserve">— Multi-mode SSCHA dynamic-stabilisation curves for bcc Ti/Zr/Hf, five models,</w:t>
+        <w:t xml:space="preserve">Fig. 3</w:t>
+      </w:r>
+      <w:r>
+        <w:t xml:space="preserve"> </w:t>
+      </w:r>
+      <w:r>
+        <w:t xml:space="preserve">Multi-mode SSCHA dynamic-stabilisation curves for bcc Ti/Zr/Hf, five models,</w:t>
       </w:r>
       <w:r>
         <w:t xml:space="preserve"> </w:t>
@@ -4476,18 +5318,18 @@
           <wp:inline>
             <wp:extent cx="5334000" cy="5156200"/>
             <wp:effectExtent b="0" l="0" r="0" t="0"/>
-            <wp:docPr descr="fig_method_agreement — Soft-mode screen vs gold-standard SSCHA minimum frequency on bcc (§3.3): the cheap screen tracks SSCHA on the family where the gold standard is trustworthy." title="" id="38" name="Picture"/>
+            <wp:docPr descr="Fig. 4 Soft-mode screen vs gold-standard SSCHA minimum frequency on bcc (§3.3): the cheap screen tracks SSCHA on the family where the gold standard is trustworthy." title="" id="39" name="Picture"/>
             <a:graphic>
               <a:graphicData uri="http://schemas.openxmlformats.org/drawingml/2006/picture">
                 <pic:pic>
                   <pic:nvPicPr>
-                    <pic:cNvPr descr="../results/figures/fig_method_agreement.png" id="39" name="Picture"/>
+                    <pic:cNvPr descr="../results/figures/fig_method_agreement.png" id="40" name="Picture"/>
                     <pic:cNvPicPr>
                       <a:picLocks noChangeArrowheads="1" noChangeAspect="1"/>
                     </pic:cNvPicPr>
                   </pic:nvPicPr>
                   <pic:blipFill>
-                    <a:blip r:embed="rId37"/>
+                    <a:blip r:embed="rId38"/>
                     <a:stretch>
                       <a:fillRect/>
                     </a:stretch>
@@ -4523,13 +5365,13 @@
           <w:b/>
           <w:bCs/>
         </w:rPr>
-        <w:t xml:space="preserve">fig_method_agreement</w:t>
-      </w:r>
-      <w:r>
-        <w:t xml:space="preserve"> </w:t>
-      </w:r>
-      <w:r>
-        <w:t xml:space="preserve">— Soft-mode screen vs gold-standard SSCHA minimum frequency on bcc</w:t>
+        <w:t xml:space="preserve">Fig. 4</w:t>
+      </w:r>
+      <w:r>
+        <w:t xml:space="preserve"> </w:t>
+      </w:r>
+      <w:r>
+        <w:t xml:space="preserve">Soft-mode screen vs gold-standard SSCHA minimum frequency on bcc</w:t>
       </w:r>
       <w:r>
         <w:t xml:space="preserve"> </w:t>
@@ -4553,18 +5395,18 @@
           <wp:inline>
             <wp:extent cx="4232694" cy="4232694"/>
             <wp:effectExtent b="0" l="0" r="0" t="0"/>
-            <wp:docPr descr="fig_displacive_recall — Recall of the displacive (ferroelectric-perovskite) instability at T ≤ 300 K: the cheap soft-mode screen (0.77) versus the expensive SSCHA (0.23) (§3.3). The cautionary result — the gold standard is less reliable than the screen in the regime that matters most." title="" id="41" name="Picture"/>
+            <wp:docPr descr="Fig. 5 Recall of the displacive (ferroelectric-perovskite) instability at T ≤ 300 K: the cheap soft-mode screen (0.77) versus the expensive SSCHA (0.23) (§3.3). The cautionary result — the gold standard is less reliable than the screen in the regime that matters most." title="" id="42" name="Picture"/>
             <a:graphic>
               <a:graphicData uri="http://schemas.openxmlformats.org/drawingml/2006/picture">
                 <pic:pic>
                   <pic:nvPicPr>
-                    <pic:cNvPr descr="../results/figures/fig_displacive_recall.png" id="42" name="Picture"/>
+                    <pic:cNvPr descr="../results/figures/fig_displacive_recall.png" id="43" name="Picture"/>
                     <pic:cNvPicPr>
                       <a:picLocks noChangeArrowheads="1" noChangeAspect="1"/>
                     </pic:cNvPicPr>
                   </pic:nvPicPr>
                   <pic:blipFill>
-                    <a:blip r:embed="rId40"/>
+                    <a:blip r:embed="rId41"/>
                     <a:stretch>
                       <a:fillRect/>
                     </a:stretch>
@@ -4600,13 +5442,13 @@
           <w:b/>
           <w:bCs/>
         </w:rPr>
-        <w:t xml:space="preserve">fig_displacive_recall</w:t>
-      </w:r>
-      <w:r>
-        <w:t xml:space="preserve"> </w:t>
-      </w:r>
-      <w:r>
-        <w:t xml:space="preserve">— Recall of the displacive (ferroelectric-perovskite) instability at</w:t>
+        <w:t xml:space="preserve">Fig. 5</w:t>
+      </w:r>
+      <w:r>
+        <w:t xml:space="preserve"> </w:t>
+      </w:r>
+      <w:r>
+        <w:t xml:space="preserve">Recall of the displacive (ferroelectric-perovskite) instability at</w:t>
       </w:r>
       <w:r>
         <w:t xml:space="preserve"> </w:t>
@@ -4652,18 +5494,18 @@
           <wp:inline>
             <wp:extent cx="4232694" cy="4232694"/>
             <wp:effectExtent b="0" l="0" r="0" t="0"/>
-            <wp:docPr descr="fig_ensemble_guardrail — Ensemble-disagreement guardrail (§3.4): the discrete inter-model vote split predicts consensus error (AUC 0.75) while the continuous cross-model frequency spread does not (AUC 0.52)." title="" id="44" name="Picture"/>
+            <wp:docPr descr="Fig. 6 Ensemble-disagreement guardrail (§3.4): the discrete inter-model vote split predicts consensus error (AUC 0.75) while the continuous cross-model frequency spread does not (AUC 0.52)." title="" id="45" name="Picture"/>
             <a:graphic>
               <a:graphicData uri="http://schemas.openxmlformats.org/drawingml/2006/picture">
                 <pic:pic>
                   <pic:nvPicPr>
-                    <pic:cNvPr descr="../results/figures/fig_ensemble_guardrail.png" id="45" name="Picture"/>
+                    <pic:cNvPr descr="../results/figures/fig_ensemble_guardrail.png" id="46" name="Picture"/>
                     <pic:cNvPicPr>
                       <a:picLocks noChangeArrowheads="1" noChangeAspect="1"/>
                     </pic:cNvPicPr>
                   </pic:nvPicPr>
                   <pic:blipFill>
-                    <a:blip r:embed="rId43"/>
+                    <a:blip r:embed="rId44"/>
                     <a:stretch>
                       <a:fillRect/>
                     </a:stretch>
@@ -4699,13 +5541,13 @@
           <w:b/>
           <w:bCs/>
         </w:rPr>
-        <w:t xml:space="preserve">fig_ensemble_guardrail</w:t>
-      </w:r>
-      <w:r>
-        <w:t xml:space="preserve"> </w:t>
-      </w:r>
-      <w:r>
-        <w:t xml:space="preserve">— Ensemble-disagreement guardrail (§3.4): the discrete inter-model</w:t>
+        <w:t xml:space="preserve">Fig. 6</w:t>
+      </w:r>
+      <w:r>
+        <w:t xml:space="preserve"> </w:t>
+      </w:r>
+      <w:r>
+        <w:t xml:space="preserve">Ensemble-disagreement guardrail (§3.4): the discrete inter-model</w:t>
       </w:r>
       <w:r>
         <w:t xml:space="preserve"> </w:t>
@@ -4720,1099 +5562,8 @@
         <w:t xml:space="preserve">does not (AUC 0.52).</w:t>
       </w:r>
     </w:p>
-    <w:bookmarkEnd w:id="46"/>
-    <w:bookmarkStart w:id="47" w:name="data-and-code-availability"/>
-    <w:p>
-      <w:pPr>
-        <w:pStyle w:val="Heading2"/>
-      </w:pPr>
-      <w:r>
-        <w:t xml:space="preserve">Data and code availability</w:t>
-      </w:r>
-    </w:p>
-    <w:p>
-      <w:pPr>
-        <w:pStyle w:val="FirstParagraph"/>
-      </w:pPr>
-      <w:r>
-        <w:t xml:space="preserve">The production results regenerate from</w:t>
-      </w:r>
-      <w:r>
-        <w:t xml:space="preserve"> </w:t>
-      </w:r>
-      <w:r>
-        <w:rPr>
-          <w:rStyle w:val="VerbatimChar"/>
-        </w:rPr>
-        <w:t xml:space="preserve">results/ledger.parquet</w:t>
-      </w:r>
-      <w:r>
-        <w:t xml:space="preserve"> </w:t>
-      </w:r>
-      <w:r>
-        <w:t xml:space="preserve">(per-unit hashed, resumable) and</w:t>
-      </w:r>
-      <w:r>
-        <w:t xml:space="preserve"> </w:t>
-      </w:r>
-      <w:r>
-        <w:t xml:space="preserve">the finite-size runs from</w:t>
-      </w:r>
-      <w:r>
-        <w:t xml:space="preserve"> </w:t>
-      </w:r>
-      <w:r>
-        <w:rPr>
-          <w:rStyle w:val="VerbatimChar"/>
-        </w:rPr>
-        <w:t xml:space="preserve">results/convergence_study.parquet</w:t>
-      </w:r>
-      <w:r>
-        <w:t xml:space="preserve">. Figures via</w:t>
-      </w:r>
-      <w:r>
-        <w:t xml:space="preserve"> </w:t>
-      </w:r>
-      <w:r>
-        <w:rPr>
-          <w:rStyle w:val="VerbatimChar"/>
-        </w:rPr>
-        <w:t xml:space="preserve">scripts/make_figures.py</w:t>
-      </w:r>
-      <w:r>
-        <w:t xml:space="preserve">; analysis in</w:t>
-      </w:r>
-      <w:r>
-        <w:t xml:space="preserve"> </w:t>
-      </w:r>
-      <w:r>
-        <w:rPr>
-          <w:rStyle w:val="VerbatimChar"/>
-        </w:rPr>
-        <w:t xml:space="preserve">mlip_dynstab/analysis.py</w:t>
-      </w:r>
-      <w:r>
-        <w:t xml:space="preserve">; the SSCHA root-cause</w:t>
-      </w:r>
-      <w:r>
-        <w:t xml:space="preserve"> </w:t>
-      </w:r>
-      <w:r>
-        <w:t xml:space="preserve">diagnostic in</w:t>
-      </w:r>
-      <w:r>
-        <w:t xml:space="preserve"> </w:t>
-      </w:r>
-      <w:r>
-        <w:rPr>
-          <w:rStyle w:val="VerbatimChar"/>
-        </w:rPr>
-        <w:t xml:space="preserve">scripts/sscha_v4_diag.py</w:t>
-      </w:r>
-      <w:r>
-        <w:t xml:space="preserve">; the stochastic-reproducibility study (§3.5) via</w:t>
-      </w:r>
-      <w:r>
-        <w:t xml:space="preserve"> </w:t>
-      </w:r>
-      <w:r>
-        <w:rPr>
-          <w:rStyle w:val="VerbatimChar"/>
-        </w:rPr>
-        <w:t xml:space="preserve">scripts/sscha_repro.py</w:t>
-      </w:r>
-      <w:r>
-        <w:t xml:space="preserve"> </w:t>
-      </w:r>
-      <w:r>
-        <w:t xml:space="preserve">(its per-seed frequencies print to the run log rather than to the</w:t>
-      </w:r>
-      <w:r>
-        <w:t xml:space="preserve"> </w:t>
-      </w:r>
-      <w:r>
-        <w:t xml:space="preserve">ledger). Repository: github.com/fronkt/mlip-dynamic-stability.</w:t>
-      </w:r>
-    </w:p>
     <w:bookmarkEnd w:id="47"/>
-    <w:bookmarkStart w:id="48" w:name="references"/>
-    <w:p>
-      <w:pPr>
-        <w:pStyle w:val="Heading2"/>
-      </w:pPr>
-      <w:r>
-        <w:t xml:space="preserve">References</w:t>
-      </w:r>
-    </w:p>
-    <w:p>
-      <w:pPr>
-        <w:pStyle w:val="FirstParagraph"/>
-      </w:pPr>
-      <w:r>
-        <w:rPr>
-          <w:i/>
-          <w:iCs/>
-        </w:rPr>
-        <w:t xml:space="preserve">Benchmarks and methods</w:t>
-      </w:r>
-    </w:p>
-    <w:p>
-      <w:pPr>
-        <w:pStyle w:val="Compact"/>
-        <w:numPr>
-          <w:ilvl w:val="0"/>
-          <w:numId w:val="1003"/>
-        </w:numPr>
-      </w:pPr>
-      <w:r>
-        <w:t xml:space="preserve">A. Loew, D. Sun, H.-C. Wang, S. Botti, M. A. L. Marques. Universal machine learning</w:t>
-      </w:r>
-      <w:r>
-        <w:t xml:space="preserve"> </w:t>
-      </w:r>
-      <w:r>
-        <w:t xml:space="preserve">interatomic potentials are ready for phonons.</w:t>
-      </w:r>
-      <w:r>
-        <w:t xml:space="preserve"> </w:t>
-      </w:r>
-      <w:r>
-        <w:rPr>
-          <w:i/>
-          <w:iCs/>
-        </w:rPr>
-        <w:t xml:space="preserve">npj Comput. Mater.</w:t>
-      </w:r>
-      <w:r>
-        <w:t xml:space="preserve"> </w:t>
-      </w:r>
-      <w:r>
-        <w:rPr>
-          <w:b/>
-          <w:bCs/>
-        </w:rPr>
-        <w:t xml:space="preserve">11</w:t>
-      </w:r>
-      <w:r>
-        <w:t xml:space="preserve">, 178 (2025).</w:t>
-      </w:r>
-      <w:r>
-        <w:t xml:space="preserve"> </w:t>
-      </w:r>
-      <w:r>
-        <w:t xml:space="preserve">doi:10.1038/s41524-025-01650-1. (arXiv:2412.16551)</w:t>
-      </w:r>
-    </w:p>
-    <w:p>
-      <w:pPr>
-        <w:pStyle w:val="Compact"/>
-        <w:numPr>
-          <w:ilvl w:val="0"/>
-          <w:numId w:val="1003"/>
-        </w:numPr>
-      </w:pPr>
-      <w:r>
-        <w:t xml:space="preserve">PhononBench: A Large-Scale Phonon-Based Benchmark for Dynamical Stability in Crystal</w:t>
-      </w:r>
-      <w:r>
-        <w:t xml:space="preserve"> </w:t>
-      </w:r>
-      <w:r>
-        <w:t xml:space="preserve">Generation. arXiv:2512.21227 (2025).</w:t>
-      </w:r>
-    </w:p>
-    <w:p>
-      <w:pPr>
-        <w:pStyle w:val="Compact"/>
-        <w:numPr>
-          <w:ilvl w:val="0"/>
-          <w:numId w:val="1003"/>
-        </w:numPr>
-      </w:pPr>
-      <w:r>
-        <w:t xml:space="preserve">G. Petretto, S. Dwaraknath, H. P. C. Miranda, D. Winston, M. Giantomassi, M. J. van Setten,</w:t>
-      </w:r>
-      <w:r>
-        <w:t xml:space="preserve"> </w:t>
-      </w:r>
-      <w:r>
-        <w:t xml:space="preserve">X. Gonze, K. A. Persson, G. Hautier, G.-M. Rignanese. High-throughput density-functional</w:t>
-      </w:r>
-      <w:r>
-        <w:t xml:space="preserve"> </w:t>
-      </w:r>
-      <w:r>
-        <w:t xml:space="preserve">perturbation theory phonons for inorganic materials.</w:t>
-      </w:r>
-      <w:r>
-        <w:t xml:space="preserve"> </w:t>
-      </w:r>
-      <w:r>
-        <w:rPr>
-          <w:i/>
-          <w:iCs/>
-        </w:rPr>
-        <w:t xml:space="preserve">Sci. Data</w:t>
-      </w:r>
-      <w:r>
-        <w:t xml:space="preserve"> </w:t>
-      </w:r>
-      <w:r>
-        <w:rPr>
-          <w:b/>
-          <w:bCs/>
-        </w:rPr>
-        <w:t xml:space="preserve">5</w:t>
-      </w:r>
-      <w:r>
-        <w:t xml:space="preserve">, 180065 (2018).</w:t>
-      </w:r>
-      <w:r>
-        <w:t xml:space="preserve"> </w:t>
-      </w:r>
-      <w:r>
-        <w:t xml:space="preserve">doi:10.1038/sdata.2018.65.</w:t>
-      </w:r>
-    </w:p>
-    <w:p>
-      <w:pPr>
-        <w:pStyle w:val="Compact"/>
-        <w:numPr>
-          <w:ilvl w:val="0"/>
-          <w:numId w:val="1003"/>
-        </w:numPr>
-      </w:pPr>
-      <w:r>
-        <w:t xml:space="preserve">L. Monacelli, R. Bianco, M. Cherubini, M. Calandra, I. Errea, F. Mauri. The stochastic</w:t>
-      </w:r>
-      <w:r>
-        <w:t xml:space="preserve"> </w:t>
-      </w:r>
-      <w:r>
-        <w:t xml:space="preserve">self-consistent harmonic approximation: calculating vibrational properties of materials with</w:t>
-      </w:r>
-      <w:r>
-        <w:t xml:space="preserve"> </w:t>
-      </w:r>
-      <w:r>
-        <w:t xml:space="preserve">full quantum and anharmonic effects.</w:t>
-      </w:r>
-      <w:r>
-        <w:t xml:space="preserve"> </w:t>
-      </w:r>
-      <w:r>
-        <w:rPr>
-          <w:i/>
-          <w:iCs/>
-        </w:rPr>
-        <w:t xml:space="preserve">J. Phys.: Condens. Matter</w:t>
-      </w:r>
-      <w:r>
-        <w:t xml:space="preserve"> </w:t>
-      </w:r>
-      <w:r>
-        <w:rPr>
-          <w:b/>
-          <w:bCs/>
-        </w:rPr>
-        <w:t xml:space="preserve">33</w:t>
-      </w:r>
-      <w:r>
-        <w:t xml:space="preserve">, 363001 (2021).</w:t>
-      </w:r>
-      <w:r>
-        <w:t xml:space="preserve"> </w:t>
-      </w:r>
-      <w:r>
-        <w:t xml:space="preserve">doi:10.1088/1361-648X/ac066b.</w:t>
-      </w:r>
-    </w:p>
-    <w:p>
-      <w:pPr>
-        <w:pStyle w:val="Compact"/>
-        <w:numPr>
-          <w:ilvl w:val="0"/>
-          <w:numId w:val="1003"/>
-        </w:numPr>
-      </w:pPr>
-      <w:r>
-        <w:t xml:space="preserve">O. Hellman, I. A. Abrikosov, S. I. Simak. Lattice dynamics of anharmonic solids from first</w:t>
-      </w:r>
-      <w:r>
-        <w:t xml:space="preserve"> </w:t>
-      </w:r>
-      <w:r>
-        <w:t xml:space="preserve">principles.</w:t>
-      </w:r>
-      <w:r>
-        <w:t xml:space="preserve"> </w:t>
-      </w:r>
-      <w:r>
-        <w:rPr>
-          <w:i/>
-          <w:iCs/>
-        </w:rPr>
-        <w:t xml:space="preserve">Phys. Rev. B</w:t>
-      </w:r>
-      <w:r>
-        <w:t xml:space="preserve"> </w:t>
-      </w:r>
-      <w:r>
-        <w:rPr>
-          <w:b/>
-          <w:bCs/>
-        </w:rPr>
-        <w:t xml:space="preserve">84</w:t>
-      </w:r>
-      <w:r>
-        <w:t xml:space="preserve">, 180301(R) (2011). doi:10.1103/PhysRevB.84.180301;</w:t>
-      </w:r>
-      <w:r>
-        <w:t xml:space="preserve"> </w:t>
-      </w:r>
-      <w:r>
-        <w:t xml:space="preserve">O. Hellman, P. Steneteg, I. A. Abrikosov, S. I. Simak.</w:t>
-      </w:r>
-      <w:r>
-        <w:t xml:space="preserve"> </w:t>
-      </w:r>
-      <w:r>
-        <w:rPr>
-          <w:i/>
-          <w:iCs/>
-        </w:rPr>
-        <w:t xml:space="preserve">Phys. Rev. B</w:t>
-      </w:r>
-      <w:r>
-        <w:t xml:space="preserve"> </w:t>
-      </w:r>
-      <w:r>
-        <w:rPr>
-          <w:b/>
-          <w:bCs/>
-        </w:rPr>
-        <w:t xml:space="preserve">87</w:t>
-      </w:r>
-      <w:r>
-        <w:t xml:space="preserve">, 104111 (2013).</w:t>
-      </w:r>
-      <w:r>
-        <w:t xml:space="preserve"> </w:t>
-      </w:r>
-      <w:r>
-        <w:t xml:space="preserve">doi:10.1103/PhysRevB.87.104111.</w:t>
-      </w:r>
-    </w:p>
-    <w:p>
-      <w:pPr>
-        <w:pStyle w:val="FirstParagraph"/>
-      </w:pPr>
-      <w:r>
-        <w:rPr>
-          <w:i/>
-          <w:iCs/>
-        </w:rPr>
-        <w:t xml:space="preserve">Foundation MLIPs benchmarked</w:t>
-      </w:r>
-    </w:p>
-    <w:p>
-      <w:pPr>
-        <w:pStyle w:val="Compact"/>
-        <w:numPr>
-          <w:ilvl w:val="0"/>
-          <w:numId w:val="1004"/>
-        </w:numPr>
-      </w:pPr>
-      <w:r>
-        <w:t xml:space="preserve">I. Batatia et al. A foundation model for atomistic materials chemistry (MACE-MP-0).</w:t>
-      </w:r>
-      <w:r>
-        <w:t xml:space="preserve"> </w:t>
-      </w:r>
-      <w:r>
-        <w:t xml:space="preserve">arXiv:2401.00096 (2023).</w:t>
-      </w:r>
-    </w:p>
-    <w:p>
-      <w:pPr>
-        <w:pStyle w:val="Compact"/>
-        <w:numPr>
-          <w:ilvl w:val="0"/>
-          <w:numId w:val="1004"/>
-        </w:numPr>
-      </w:pPr>
-      <w:r>
-        <w:t xml:space="preserve">B. Deng, P. Zhong, K. Jun, et al. CHGNet as a pretrained universal neural network potential</w:t>
-      </w:r>
-      <w:r>
-        <w:t xml:space="preserve"> </w:t>
-      </w:r>
-      <w:r>
-        <w:t xml:space="preserve">for charge-informed atomistic modelling.</w:t>
-      </w:r>
-      <w:r>
-        <w:t xml:space="preserve"> </w:t>
-      </w:r>
-      <w:r>
-        <w:rPr>
-          <w:i/>
-          <w:iCs/>
-        </w:rPr>
-        <w:t xml:space="preserve">Nat. Mach. Intell.</w:t>
-      </w:r>
-      <w:r>
-        <w:t xml:space="preserve"> </w:t>
-      </w:r>
-      <w:r>
-        <w:rPr>
-          <w:b/>
-          <w:bCs/>
-        </w:rPr>
-        <w:t xml:space="preserve">5</w:t>
-      </w:r>
-      <w:r>
-        <w:t xml:space="preserve">, 1031–1041 (2023).</w:t>
-      </w:r>
-      <w:r>
-        <w:t xml:space="preserve"> </w:t>
-      </w:r>
-      <w:r>
-        <w:t xml:space="preserve">doi:10.1038/s42256-023-00716-3.</w:t>
-      </w:r>
-    </w:p>
-    <w:p>
-      <w:pPr>
-        <w:pStyle w:val="Compact"/>
-        <w:numPr>
-          <w:ilvl w:val="0"/>
-          <w:numId w:val="1004"/>
-        </w:numPr>
-      </w:pPr>
-      <w:r>
-        <w:t xml:space="preserve">M. Neumann, J. Gin, B. Rhodes, et al. Orb: A Fast, Scalable Neural Network Potential.</w:t>
-      </w:r>
-      <w:r>
-        <w:t xml:space="preserve"> </w:t>
-      </w:r>
-      <w:r>
-        <w:t xml:space="preserve">arXiv:2410.22570 (2024).</w:t>
-      </w:r>
-    </w:p>
-    <w:p>
-      <w:pPr>
-        <w:pStyle w:val="Compact"/>
-        <w:numPr>
-          <w:ilvl w:val="0"/>
-          <w:numId w:val="1004"/>
-        </w:numPr>
-      </w:pPr>
-      <w:r>
-        <w:t xml:space="preserve">Y. Park, J. Kim, S. Hwang, S. Han. Scalable Parallel Algorithm for Graph Neural Network</w:t>
-      </w:r>
-      <w:r>
-        <w:t xml:space="preserve"> </w:t>
-      </w:r>
-      <w:r>
-        <w:t xml:space="preserve">Interatomic Potentials in Molecular Dynamics Simulations (SevenNet).</w:t>
-      </w:r>
-      <w:r>
-        <w:t xml:space="preserve"> </w:t>
-      </w:r>
-      <w:r>
-        <w:rPr>
-          <w:i/>
-          <w:iCs/>
-        </w:rPr>
-        <w:t xml:space="preserve">J. Chem. Theory Comput.</w:t>
-      </w:r>
-      <w:r>
-        <w:t xml:space="preserve"> </w:t>
-      </w:r>
-      <w:r>
-        <w:rPr>
-          <w:b/>
-          <w:bCs/>
-        </w:rPr>
-        <w:t xml:space="preserve">20</w:t>
-      </w:r>
-      <w:r>
-        <w:t xml:space="preserve">, 4857–4868 (2024). doi:10.1021/acs.jctc.4c00190.</w:t>
-      </w:r>
-    </w:p>
-    <w:p>
-      <w:pPr>
-        <w:pStyle w:val="Compact"/>
-        <w:numPr>
-          <w:ilvl w:val="0"/>
-          <w:numId w:val="1004"/>
-        </w:numPr>
-      </w:pPr>
-      <w:r>
-        <w:t xml:space="preserve">H. Yang et al. MatterSim: A Deep Learning Atomistic Model Across Elements, Temperatures and</w:t>
-      </w:r>
-      <w:r>
-        <w:t xml:space="preserve"> </w:t>
-      </w:r>
-      <w:r>
-        <w:t xml:space="preserve">Pressures. arXiv:2405.04967 (2024).</w:t>
-      </w:r>
-    </w:p>
-    <w:p>
-      <w:pPr>
-        <w:pStyle w:val="FirstParagraph"/>
-      </w:pPr>
-      <w:r>
-        <w:rPr>
-          <w:i/>
-          <w:iCs/>
-        </w:rPr>
-        <w:t xml:space="preserve">Per-system finite-T ground truth (the harmonic-unstable → thermally-stabilised labels)</w:t>
-      </w:r>
-    </w:p>
-    <w:p>
-      <w:pPr>
-        <w:pStyle w:val="Compact"/>
-        <w:numPr>
-          <w:ilvl w:val="0"/>
-          <w:numId w:val="1005"/>
-        </w:numPr>
-      </w:pPr>
-      <w:r>
-        <w:rPr>
-          <w:b/>
-          <w:bCs/>
-        </w:rPr>
-        <w:t xml:space="preserve">SrTiO₃</w:t>
-      </w:r>
-      <w:r>
-        <w:t xml:space="preserve"> </w:t>
-      </w:r>
-      <w:r>
-        <w:t xml:space="preserve">(antiferrodistortive R-point soft mode; cubic→I4/mcm at ≈105 K): T. Tadano,</w:t>
-      </w:r>
-      <w:r>
-        <w:t xml:space="preserve"> </w:t>
-      </w:r>
-      <w:r>
-        <w:t xml:space="preserve">S. Tsuneyuki. Self-consistent phonon calculations of lattice dynamical properties in cubic</w:t>
-      </w:r>
-      <w:r>
-        <w:t xml:space="preserve"> </w:t>
-      </w:r>
-      <w:r>
-        <w:t xml:space="preserve">SrTiO₃ with first-principles anharmonic force constants.</w:t>
-      </w:r>
-      <w:r>
-        <w:t xml:space="preserve"> </w:t>
-      </w:r>
-      <w:r>
-        <w:rPr>
-          <w:i/>
-          <w:iCs/>
-        </w:rPr>
-        <w:t xml:space="preserve">Phys. Rev. B</w:t>
-      </w:r>
-      <w:r>
-        <w:t xml:space="preserve"> </w:t>
-      </w:r>
-      <w:r>
-        <w:rPr>
-          <w:b/>
-          <w:bCs/>
-        </w:rPr>
-        <w:t xml:space="preserve">92</w:t>
-      </w:r>
-      <w:r>
-        <w:t xml:space="preserve">, 054301 (2015).</w:t>
-      </w:r>
-      <w:r>
-        <w:t xml:space="preserve"> </w:t>
-      </w:r>
-      <w:r>
-        <w:t xml:space="preserve">doi:10.1103/PhysRevB.92.054301.</w:t>
-      </w:r>
-    </w:p>
-    <w:p>
-      <w:pPr>
-        <w:pStyle w:val="Compact"/>
-        <w:numPr>
-          <w:ilvl w:val="0"/>
-          <w:numId w:val="1005"/>
-        </w:numPr>
-      </w:pPr>
-      <w:r>
-        <w:rPr>
-          <w:b/>
-          <w:bCs/>
-        </w:rPr>
-        <w:t xml:space="preserve">BaTiO₃, KNbO₃, PbTiO₃</w:t>
-      </w:r>
-      <w:r>
-        <w:t xml:space="preserve"> </w:t>
-      </w:r>
-      <w:r>
-        <w:t xml:space="preserve">(Γ ferroelectric soft mode; displacive + order-disorder): W. Zhong,</w:t>
-      </w:r>
-      <w:r>
-        <w:t xml:space="preserve"> </w:t>
-      </w:r>
-      <w:r>
-        <w:t xml:space="preserve">D. Vanderbilt, K. M. Rabe. Phase transitions in BaTiO₃ from first principles.</w:t>
-      </w:r>
-      <w:r>
-        <w:t xml:space="preserve"> </w:t>
-      </w:r>
-      <w:r>
-        <w:rPr>
-          <w:i/>
-          <w:iCs/>
-        </w:rPr>
-        <w:t xml:space="preserve">Phys. Rev.</w:t>
-      </w:r>
-      <w:r>
-        <w:rPr>
-          <w:i/>
-          <w:iCs/>
-        </w:rPr>
-        <w:t xml:space="preserve"> </w:t>
-      </w:r>
-      <w:r>
-        <w:rPr>
-          <w:i/>
-          <w:iCs/>
-        </w:rPr>
-        <w:t xml:space="preserve">Lett.</w:t>
-      </w:r>
-      <w:r>
-        <w:t xml:space="preserve"> </w:t>
-      </w:r>
-      <w:r>
-        <w:rPr>
-          <w:b/>
-          <w:bCs/>
-        </w:rPr>
-        <w:t xml:space="preserve">73</w:t>
-      </w:r>
-      <w:r>
-        <w:t xml:space="preserve">, 1861 (1994). doi:10.1103/PhysRevLett.73.1861.</w:t>
-      </w:r>
-    </w:p>
-    <w:p>
-      <w:pPr>
-        <w:pStyle w:val="Compact"/>
-        <w:numPr>
-          <w:ilvl w:val="0"/>
-          <w:numId w:val="1005"/>
-        </w:numPr>
-      </w:pPr>
-      <w:r>
-        <w:rPr>
-          <w:b/>
-          <w:bCs/>
-        </w:rPr>
-        <w:t xml:space="preserve">CsPbI₃</w:t>
-      </w:r>
-      <w:r>
-        <w:t xml:space="preserve"> </w:t>
-      </w:r>
-      <w:r>
-        <w:t xml:space="preserve">(zone-boundary octahedral-tilt double wells; anharmonic cubic stabilisation):</w:t>
-      </w:r>
-      <w:r>
-        <w:t xml:space="preserve"> </w:t>
-      </w:r>
-      <w:r>
-        <w:t xml:space="preserve">A. Marronnier et al. Anharmonicity and Disorder in the Black Phases of Cesium Lead Iodide.</w:t>
-      </w:r>
-      <w:r>
-        <w:t xml:space="preserve"> </w:t>
-      </w:r>
-      <w:r>
-        <w:rPr>
-          <w:i/>
-          <w:iCs/>
-        </w:rPr>
-        <w:t xml:space="preserve">ACS Nano</w:t>
-      </w:r>
-      <w:r>
-        <w:t xml:space="preserve"> </w:t>
-      </w:r>
-      <w:r>
-        <w:rPr>
-          <w:b/>
-          <w:bCs/>
-        </w:rPr>
-        <w:t xml:space="preserve">12</w:t>
-      </w:r>
-      <w:r>
-        <w:t xml:space="preserve">, 3477–3486 (2018). doi:10.1021/acsnano.8b00267.</w:t>
-      </w:r>
-    </w:p>
-    <w:p>
-      <w:pPr>
-        <w:pStyle w:val="Compact"/>
-        <w:numPr>
-          <w:ilvl w:val="0"/>
-          <w:numId w:val="1005"/>
-        </w:numPr>
-      </w:pPr>
-      <w:r>
-        <w:rPr>
-          <w:b/>
-          <w:bCs/>
-        </w:rPr>
-        <w:t xml:space="preserve">CsSnI₃, CsSnBr₃</w:t>
-      </w:r>
-      <w:r>
-        <w:t xml:space="preserve"> </w:t>
-      </w:r>
-      <w:r>
-        <w:t xml:space="preserve">(tilt transitions; quantum + anharmonic fluctuations stabilise the cubic</w:t>
-      </w:r>
-      <w:r>
-        <w:t xml:space="preserve"> </w:t>
-      </w:r>
-      <w:r>
-        <w:t xml:space="preserve">phase): First-Principles Thermodynamics of CsSnI₃.</w:t>
-      </w:r>
-      <w:r>
-        <w:t xml:space="preserve"> </w:t>
-      </w:r>
-      <w:r>
-        <w:rPr>
-          <w:i/>
-          <w:iCs/>
-        </w:rPr>
-        <w:t xml:space="preserve">Chem. Mater.</w:t>
-      </w:r>
-      <w:r>
-        <w:t xml:space="preserve"> </w:t>
-      </w:r>
-      <w:r>
-        <w:t xml:space="preserve">(2023).</w:t>
-      </w:r>
-      <w:r>
-        <w:t xml:space="preserve"> </w:t>
-      </w:r>
-      <w:r>
-        <w:t xml:space="preserve">doi:10.1021/acs.chemmater.2c03475. (arXiv:2301.10071)</w:t>
-      </w:r>
-    </w:p>
-    <w:p>
-      <w:pPr>
-        <w:pStyle w:val="Compact"/>
-        <w:numPr>
-          <w:ilvl w:val="0"/>
-          <w:numId w:val="1005"/>
-        </w:numPr>
-      </w:pPr>
-      <w:r>
-        <w:rPr>
-          <w:b/>
-          <w:bCs/>
-        </w:rPr>
-        <w:t xml:space="preserve">bcc Ti/Zr/Hf</w:t>
-      </w:r>
-      <w:r>
-        <w:t xml:space="preserve"> </w:t>
-      </w:r>
-      <w:r>
-        <w:t xml:space="preserve">(phonon-entropy stabilisation; overdamped N and ⅔⟨111⟩ ω-precursor modes):</w:t>
-      </w:r>
-      <w:r>
-        <w:t xml:space="preserve"> </w:t>
-      </w:r>
-      <w:r>
-        <w:t xml:space="preserve">W. Petry et al. Phonon dispersion of the bcc phase of group-IV metals. I. bcc titanium.</w:t>
-      </w:r>
-      <w:r>
-        <w:t xml:space="preserve"> </w:t>
-      </w:r>
-      <w:r>
-        <w:rPr>
-          <w:i/>
-          <w:iCs/>
-        </w:rPr>
-        <w:t xml:space="preserve">Phys. Rev. B</w:t>
-      </w:r>
-      <w:r>
-        <w:t xml:space="preserve"> </w:t>
-      </w:r>
-      <w:r>
-        <w:rPr>
-          <w:b/>
-          <w:bCs/>
-        </w:rPr>
-        <w:t xml:space="preserve">43</w:t>
-      </w:r>
-      <w:r>
-        <w:t xml:space="preserve">, 10933 (1991), doi:10.1103/PhysRevB.43.10933; A. Heiming et al. II. bcc</w:t>
-      </w:r>
-      <w:r>
-        <w:t xml:space="preserve"> </w:t>
-      </w:r>
-      <w:r>
-        <w:t xml:space="preserve">zirconium.</w:t>
-      </w:r>
-      <w:r>
-        <w:t xml:space="preserve"> </w:t>
-      </w:r>
-      <w:r>
-        <w:rPr>
-          <w:i/>
-          <w:iCs/>
-        </w:rPr>
-        <w:t xml:space="preserve">Phys. Rev. B</w:t>
-      </w:r>
-      <w:r>
-        <w:t xml:space="preserve"> </w:t>
-      </w:r>
-      <w:r>
-        <w:rPr>
-          <w:b/>
-          <w:bCs/>
-        </w:rPr>
-        <w:t xml:space="preserve">43</w:t>
-      </w:r>
-      <w:r>
-        <w:t xml:space="preserve">, 10948 (1991), doi:10.1103/PhysRevB.43.10948.</w:t>
-      </w:r>
-    </w:p>
-    <w:p>
-      <w:pPr>
-        <w:pStyle w:val="Compact"/>
-        <w:numPr>
-          <w:ilvl w:val="0"/>
-          <w:numId w:val="1005"/>
-        </w:numPr>
-      </w:pPr>
-      <w:r>
-        <w:rPr>
-          <w:b/>
-          <w:bCs/>
-        </w:rPr>
-        <w:t xml:space="preserve">Cubic ZrO₂ / HfO₂</w:t>
-      </w:r>
-      <w:r>
-        <w:t xml:space="preserve"> </w:t>
-      </w:r>
-      <w:r>
-        <w:t xml:space="preserve">(X-point oxygen soft mode; anharmonic + entropic high-T stabilisation):</w:t>
-      </w:r>
-      <w:r>
-        <w:t xml:space="preserve"> </w:t>
-      </w:r>
-      <w:r>
-        <w:t xml:space="preserve">K. Parlinski, Z. Q. Li, Y. Kawazoe. First-Principles Determination of the Soft Mode in Cubic</w:t>
-      </w:r>
-      <w:r>
-        <w:t xml:space="preserve"> </w:t>
-      </w:r>
-      <w:r>
-        <w:t xml:space="preserve">ZrO₂.</w:t>
-      </w:r>
-      <w:r>
-        <w:t xml:space="preserve"> </w:t>
-      </w:r>
-      <w:r>
-        <w:rPr>
-          <w:i/>
-          <w:iCs/>
-        </w:rPr>
-        <w:t xml:space="preserve">Phys. Rev. Lett.</w:t>
-      </w:r>
-      <w:r>
-        <w:t xml:space="preserve"> </w:t>
-      </w:r>
-      <w:r>
-        <w:rPr>
-          <w:b/>
-          <w:bCs/>
-        </w:rPr>
-        <w:t xml:space="preserve">78</w:t>
-      </w:r>
-      <w:r>
-        <w:t xml:space="preserve">, 4063 (1997), doi:10.1103/PhysRevLett.78.4063; Exploring the</w:t>
-      </w:r>
-      <w:r>
-        <w:t xml:space="preserve"> </w:t>
-      </w:r>
-      <w:r>
-        <w:t xml:space="preserve">High-Temperature Stabilization of Cubic Zirconia from Anharmonic Lattice Dynamics.</w:t>
-      </w:r>
-      <w:r>
-        <w:t xml:space="preserve"> </w:t>
-      </w:r>
-      <w:r>
-        <w:rPr>
-          <w:i/>
-          <w:iCs/>
-        </w:rPr>
-        <w:t xml:space="preserve">Cryst.</w:t>
-      </w:r>
-      <w:r>
-        <w:rPr>
-          <w:i/>
-          <w:iCs/>
-        </w:rPr>
-        <w:t xml:space="preserve"> </w:t>
-      </w:r>
-      <w:r>
-        <w:rPr>
-          <w:i/>
-          <w:iCs/>
-        </w:rPr>
-        <w:t xml:space="preserve">Growth Des.</w:t>
-      </w:r>
-      <w:r>
-        <w:t xml:space="preserve"> </w:t>
-      </w:r>
-      <w:r>
-        <w:t xml:space="preserve">(2023), doi:10.1021/acs.cgd.2c01458.</w:t>
-      </w:r>
-    </w:p>
-    <w:p>
-      <w:pPr>
-        <w:pStyle w:val="Compact"/>
-        <w:numPr>
-          <w:ilvl w:val="0"/>
-          <w:numId w:val="1005"/>
-        </w:numPr>
-      </w:pPr>
-      <w:r>
-        <w:rPr>
-          <w:b/>
-          <w:bCs/>
-        </w:rPr>
-        <w:t xml:space="preserve">α-AgI</w:t>
-      </w:r>
-      <w:r>
-        <w:t xml:space="preserve"> </w:t>
-      </w:r>
-      <w:r>
-        <w:t xml:space="preserve">(superionic; bcc iodine framework with molten Ag sublattice above ≈420 K, strong</w:t>
-      </w:r>
-      <w:r>
-        <w:t xml:space="preserve"> </w:t>
-      </w:r>
-      <w:r>
-        <w:t xml:space="preserve">host anharmonicity): D. A. Wood, N. Marzari. Dynamical structure, bonding, and thermodynamics</w:t>
-      </w:r>
-      <w:r>
-        <w:t xml:space="preserve"> </w:t>
-      </w:r>
-      <w:r>
-        <w:t xml:space="preserve">of the superionic sublattice in α-AgI.</w:t>
-      </w:r>
-      <w:r>
-        <w:t xml:space="preserve"> </w:t>
-      </w:r>
-      <w:r>
-        <w:rPr>
-          <w:i/>
-          <w:iCs/>
-        </w:rPr>
-        <w:t xml:space="preserve">Phys. Rev. B</w:t>
-      </w:r>
-      <w:r>
-        <w:t xml:space="preserve"> </w:t>
-      </w:r>
-      <w:r>
-        <w:rPr>
-          <w:b/>
-          <w:bCs/>
-        </w:rPr>
-        <w:t xml:space="preserve">76</w:t>
-      </w:r>
-      <w:r>
-        <w:t xml:space="preserve">, 134301 (2007).</w:t>
-      </w:r>
-      <w:r>
-        <w:t xml:space="preserve"> </w:t>
-      </w:r>
-      <w:r>
-        <w:t xml:space="preserve">(arXiv:cond-mat/0603670)</w:t>
-      </w:r>
-    </w:p>
-    <w:p>
-      <w:pPr>
-        <w:pStyle w:val="Compact"/>
-        <w:numPr>
-          <w:ilvl w:val="0"/>
-          <w:numId w:val="1005"/>
-        </w:numPr>
-      </w:pPr>
-      <w:r>
-        <w:rPr>
-          <w:b/>
-          <w:bCs/>
-        </w:rPr>
-        <w:t xml:space="preserve">KTaO₃</w:t>
-      </w:r>
-      <w:r>
-        <w:t xml:space="preserve"> </w:t>
-      </w:r>
-      <w:r>
-        <w:t xml:space="preserve">(quantum paraelectric / incipient ferroelectric; soft TO mode held up by quantum</w:t>
-      </w:r>
-      <w:r>
-        <w:t xml:space="preserve"> </w:t>
-      </w:r>
-      <w:r>
-        <w:t xml:space="preserve">fluctuations — basis for the borderline label): A. Ranalli et al. Temperature-Dependent</w:t>
-      </w:r>
-      <w:r>
-        <w:t xml:space="preserve"> </w:t>
-      </w:r>
-      <w:r>
-        <w:t xml:space="preserve">Anharmonic Phonons in Quantum Paraelectric KTaO₃ by First Principles and Machine-Learned</w:t>
-      </w:r>
-      <w:r>
-        <w:t xml:space="preserve"> </w:t>
-      </w:r>
-      <w:r>
-        <w:t xml:space="preserve">Force Fields.</w:t>
-      </w:r>
-      <w:r>
-        <w:t xml:space="preserve"> </w:t>
-      </w:r>
-      <w:r>
-        <w:rPr>
-          <w:i/>
-          <w:iCs/>
-        </w:rPr>
-        <w:t xml:space="preserve">Adv. Quantum Technol.</w:t>
-      </w:r>
-      <w:r>
-        <w:t xml:space="preserve"> </w:t>
-      </w:r>
-      <w:r>
-        <w:rPr>
-          <w:b/>
-          <w:bCs/>
-        </w:rPr>
-        <w:t xml:space="preserve">6</w:t>
-      </w:r>
-      <w:r>
-        <w:t xml:space="preserve">, 2200131 (2023). doi:10.1002/qute.202200131.</w:t>
-      </w:r>
-    </w:p>
-    <w:p>
-      <w:pPr>
-        <w:pStyle w:val="FirstParagraph"/>
-      </w:pPr>
-      <w:r>
-        <w:t xml:space="preserve">The harmonically-stable controls (Si, C, Cu, MgO, NaCl, CeO₂) have no imaginary modes at any</w:t>
-      </w:r>
-      <w:r>
-        <w:t xml:space="preserve"> </w:t>
-      </w:r>
-      <w:r>
-        <w:t xml:space="preserve">temperature; their 0 K harmonic stability is documented in the DFPT phonon database [3].</w:t>
-      </w:r>
-    </w:p>
     <w:bookmarkEnd w:id="48"/>
-    <w:bookmarkEnd w:id="49"/>
     <w:sectPr>
       <w:footnotePr>
         <w:numRestart w:val="eachSect"/>
@@ -6103,176 +5854,6 @@
     </w:lvl>
     <w:lvl w:ilvl="8">
       <w:start w:val="1"/>
-      <w:numFmt w:val="decimal"/>
-      <w:lvlText w:val="%9."/>
-      <w:lvlJc w:val="left"/>
-      <w:pPr>
-        <w:ind w:left="6480" w:hanging="360"/>
-      </w:pPr>
-    </w:lvl>
-  </w:abstractNum>
-  <w:abstractNum w:abstractNumId="99416">
-    <w:nsid w:val="00A99416"/>
-    <w:multiLevelType w:val="multilevel"/>
-    <w:lvl w:ilvl="0">
-      <w:start w:val="6"/>
-      <w:numFmt w:val="decimal"/>
-      <w:lvlText w:val="%1."/>
-      <w:lvlJc w:val="left"/>
-      <w:pPr>
-        <w:ind w:left="720" w:hanging="360"/>
-      </w:pPr>
-    </w:lvl>
-    <w:lvl w:ilvl="1">
-      <w:start w:val="6"/>
-      <w:numFmt w:val="decimal"/>
-      <w:lvlText w:val="%2."/>
-      <w:lvlJc w:val="left"/>
-      <w:pPr>
-        <w:ind w:left="1440" w:hanging="360"/>
-      </w:pPr>
-    </w:lvl>
-    <w:lvl w:ilvl="2">
-      <w:start w:val="6"/>
-      <w:numFmt w:val="decimal"/>
-      <w:lvlText w:val="%3."/>
-      <w:lvlJc w:val="left"/>
-      <w:pPr>
-        <w:ind w:left="2160" w:hanging="360"/>
-      </w:pPr>
-    </w:lvl>
-    <w:lvl w:ilvl="3">
-      <w:start w:val="6"/>
-      <w:numFmt w:val="decimal"/>
-      <w:lvlText w:val="%4."/>
-      <w:lvlJc w:val="left"/>
-      <w:pPr>
-        <w:ind w:left="2880" w:hanging="360"/>
-      </w:pPr>
-    </w:lvl>
-    <w:lvl w:ilvl="4">
-      <w:start w:val="6"/>
-      <w:numFmt w:val="decimal"/>
-      <w:lvlText w:val="%5."/>
-      <w:lvlJc w:val="left"/>
-      <w:pPr>
-        <w:ind w:left="3600" w:hanging="360"/>
-      </w:pPr>
-    </w:lvl>
-    <w:lvl w:ilvl="5">
-      <w:start w:val="6"/>
-      <w:numFmt w:val="decimal"/>
-      <w:lvlText w:val="%6."/>
-      <w:lvlJc w:val="left"/>
-      <w:pPr>
-        <w:ind w:left="4320" w:hanging="360"/>
-      </w:pPr>
-    </w:lvl>
-    <w:lvl w:ilvl="6">
-      <w:start w:val="6"/>
-      <w:numFmt w:val="decimal"/>
-      <w:lvlText w:val="%7."/>
-      <w:lvlJc w:val="left"/>
-      <w:pPr>
-        <w:ind w:left="5040" w:hanging="360"/>
-      </w:pPr>
-    </w:lvl>
-    <w:lvl w:ilvl="7">
-      <w:start w:val="6"/>
-      <w:numFmt w:val="decimal"/>
-      <w:lvlText w:val="%8."/>
-      <w:lvlJc w:val="left"/>
-      <w:pPr>
-        <w:ind w:left="5760" w:hanging="360"/>
-      </w:pPr>
-    </w:lvl>
-    <w:lvl w:ilvl="8">
-      <w:start w:val="6"/>
-      <w:numFmt w:val="decimal"/>
-      <w:lvlText w:val="%9."/>
-      <w:lvlJc w:val="left"/>
-      <w:pPr>
-        <w:ind w:left="6480" w:hanging="360"/>
-      </w:pPr>
-    </w:lvl>
-  </w:abstractNum>
-  <w:abstractNum w:abstractNumId="994111">
-    <w:nsid w:val="0A994111"/>
-    <w:multiLevelType w:val="multilevel"/>
-    <w:lvl w:ilvl="0">
-      <w:start w:val="11"/>
-      <w:numFmt w:val="decimal"/>
-      <w:lvlText w:val="%1."/>
-      <w:lvlJc w:val="left"/>
-      <w:pPr>
-        <w:ind w:left="720" w:hanging="360"/>
-      </w:pPr>
-    </w:lvl>
-    <w:lvl w:ilvl="1">
-      <w:start w:val="11"/>
-      <w:numFmt w:val="decimal"/>
-      <w:lvlText w:val="%2."/>
-      <w:lvlJc w:val="left"/>
-      <w:pPr>
-        <w:ind w:left="1440" w:hanging="360"/>
-      </w:pPr>
-    </w:lvl>
-    <w:lvl w:ilvl="2">
-      <w:start w:val="11"/>
-      <w:numFmt w:val="decimal"/>
-      <w:lvlText w:val="%3."/>
-      <w:lvlJc w:val="left"/>
-      <w:pPr>
-        <w:ind w:left="2160" w:hanging="360"/>
-      </w:pPr>
-    </w:lvl>
-    <w:lvl w:ilvl="3">
-      <w:start w:val="11"/>
-      <w:numFmt w:val="decimal"/>
-      <w:lvlText w:val="%4."/>
-      <w:lvlJc w:val="left"/>
-      <w:pPr>
-        <w:ind w:left="2880" w:hanging="360"/>
-      </w:pPr>
-    </w:lvl>
-    <w:lvl w:ilvl="4">
-      <w:start w:val="11"/>
-      <w:numFmt w:val="decimal"/>
-      <w:lvlText w:val="%5."/>
-      <w:lvlJc w:val="left"/>
-      <w:pPr>
-        <w:ind w:left="3600" w:hanging="360"/>
-      </w:pPr>
-    </w:lvl>
-    <w:lvl w:ilvl="5">
-      <w:start w:val="11"/>
-      <w:numFmt w:val="decimal"/>
-      <w:lvlText w:val="%6."/>
-      <w:lvlJc w:val="left"/>
-      <w:pPr>
-        <w:ind w:left="4320" w:hanging="360"/>
-      </w:pPr>
-    </w:lvl>
-    <w:lvl w:ilvl="6">
-      <w:start w:val="11"/>
-      <w:numFmt w:val="decimal"/>
-      <w:lvlText w:val="%7."/>
-      <w:lvlJc w:val="left"/>
-      <w:pPr>
-        <w:ind w:left="5040" w:hanging="360"/>
-      </w:pPr>
-    </w:lvl>
-    <w:lvl w:ilvl="7">
-      <w:start w:val="11"/>
-      <w:numFmt w:val="decimal"/>
-      <w:lvlText w:val="%8."/>
-      <w:lvlJc w:val="left"/>
-      <w:pPr>
-        <w:ind w:left="5760" w:hanging="360"/>
-      </w:pPr>
-    </w:lvl>
-    <w:lvl w:ilvl="8">
-      <w:start w:val="11"/>
       <w:numFmt w:val="decimal"/>
       <w:lvlText w:val="%9."/>
       <w:lvlJc w:val="left"/>
@@ -6318,66 +5899,6 @@
     </w:lvlOverride>
     <w:lvlOverride w:ilvl="8">
       <w:startOverride w:val="1"/>
-    </w:lvlOverride>
-  </w:num>
-  <w:num w:numId="1004">
-    <w:abstractNumId w:val="99416"/>
-    <w:lvlOverride w:ilvl="0">
-      <w:startOverride w:val="6"/>
-    </w:lvlOverride>
-    <w:lvlOverride w:ilvl="1">
-      <w:startOverride w:val="6"/>
-    </w:lvlOverride>
-    <w:lvlOverride w:ilvl="2">
-      <w:startOverride w:val="6"/>
-    </w:lvlOverride>
-    <w:lvlOverride w:ilvl="3">
-      <w:startOverride w:val="6"/>
-    </w:lvlOverride>
-    <w:lvlOverride w:ilvl="4">
-      <w:startOverride w:val="6"/>
-    </w:lvlOverride>
-    <w:lvlOverride w:ilvl="5">
-      <w:startOverride w:val="6"/>
-    </w:lvlOverride>
-    <w:lvlOverride w:ilvl="6">
-      <w:startOverride w:val="6"/>
-    </w:lvlOverride>
-    <w:lvlOverride w:ilvl="7">
-      <w:startOverride w:val="6"/>
-    </w:lvlOverride>
-    <w:lvlOverride w:ilvl="8">
-      <w:startOverride w:val="6"/>
-    </w:lvlOverride>
-  </w:num>
-  <w:num w:numId="1005">
-    <w:abstractNumId w:val="994111"/>
-    <w:lvlOverride w:ilvl="0">
-      <w:startOverride w:val="11"/>
-    </w:lvlOverride>
-    <w:lvlOverride w:ilvl="1">
-      <w:startOverride w:val="11"/>
-    </w:lvlOverride>
-    <w:lvlOverride w:ilvl="2">
-      <w:startOverride w:val="11"/>
-    </w:lvlOverride>
-    <w:lvlOverride w:ilvl="3">
-      <w:startOverride w:val="11"/>
-    </w:lvlOverride>
-    <w:lvlOverride w:ilvl="4">
-      <w:startOverride w:val="11"/>
-    </w:lvlOverride>
-    <w:lvlOverride w:ilvl="5">
-      <w:startOverride w:val="11"/>
-    </w:lvlOverride>
-    <w:lvlOverride w:ilvl="6">
-      <w:startOverride w:val="11"/>
-    </w:lvlOverride>
-    <w:lvlOverride w:ilvl="7">
-      <w:startOverride w:val="11"/>
-    </w:lvlOverride>
-    <w:lvlOverride w:ilvl="8">
-      <w:startOverride w:val="11"/>
     </w:lvlOverride>
   </w:num>
 </w:numbering>

</xml_diff>

<commit_message>
inline figures: place Fig. 1-6 at first citation in Results, remove end Figures section
</commit_message>
<xml_diff>
--- a/paper/manuscript.docx
+++ b/paper/manuscript.docx
@@ -10,7 +10,7 @@
         <w:t xml:space="preserve">Finite-temperature dynamic stability is a blind spot of foundation MLIPs</w:t>
       </w:r>
     </w:p>
-    <w:bookmarkStart w:id="48" w:name="X70ee5b06aaed82dff3ea33fa72d6d866bb3cc17"/>
+    <w:bookmarkStart w:id="47" w:name="X70ee5b06aaed82dff3ea33fa72d6d866bb3cc17"/>
     <w:p>
       <w:pPr>
         <w:pStyle w:val="Heading1"/>
@@ -1595,7 +1595,7 @@
     </w:p>
     <w:bookmarkEnd w:id="15"/>
     <w:bookmarkEnd w:id="16"/>
-    <w:bookmarkStart w:id="22" w:name="results"/>
+    <w:bookmarkStart w:id="40" w:name="results"/>
     <w:p>
       <w:pPr>
         <w:pStyle w:val="Heading2"/>
@@ -1604,7 +1604,7 @@
         <w:t xml:space="preserve">3. Results</w:t>
       </w:r>
     </w:p>
-    <w:bookmarkStart w:id="17" w:name="harmonic-baseline-the-models-split-h1"/>
+    <w:bookmarkStart w:id="23" w:name="harmonic-baseline-the-models-split-h1"/>
     <w:p>
       <w:pPr>
         <w:pStyle w:val="Heading3"/>
@@ -2101,8 +2101,174 @@
         <w:t xml:space="preserve">reproduces the published picture and validates the harness.</w:t>
       </w:r>
     </w:p>
-    <w:bookmarkEnd w:id="17"/>
-    <w:bookmarkStart w:id="18" w:name="X313c0a2a4f96726263bcc133565de0efc38b532"/>
+    <w:p>
+      <w:pPr>
+        <w:pStyle w:val="CaptionedFigure"/>
+      </w:pPr>
+      <w:r>
+        <w:drawing>
+          <wp:inline>
+            <wp:extent cx="4784784" cy="3864633"/>
+            <wp:effectExtent b="0" l="0" r="0" t="0"/>
+            <wp:docPr descr="Fig. 1 Harmonic false-stable and false-unstable call counts versus the imaginary-frequency tolerance (§3.1). The default −0.1 THz sits in the stable basin between the false-unstable flood at strict tolerance and the false-stable inflation at loose tolerance." title="" id="18" name="Picture"/>
+            <a:graphic>
+              <a:graphicData uri="http://schemas.openxmlformats.org/drawingml/2006/picture">
+                <pic:pic>
+                  <pic:nvPicPr>
+                    <pic:cNvPr descr="../results/figures/fig_tolerance_sweep.png" id="19" name="Picture"/>
+                    <pic:cNvPicPr>
+                      <a:picLocks noChangeArrowheads="1" noChangeAspect="1"/>
+                    </pic:cNvPicPr>
+                  </pic:nvPicPr>
+                  <pic:blipFill>
+                    <a:blip r:embed="rId17"/>
+                    <a:stretch>
+                      <a:fillRect/>
+                    </a:stretch>
+                  </pic:blipFill>
+                  <pic:spPr bwMode="auto">
+                    <a:xfrm>
+                      <a:off x="0" y="0"/>
+                      <a:ext cx="4784784" cy="3864633"/>
+                    </a:xfrm>
+                    <a:prstGeom prst="rect">
+                      <a:avLst/>
+                    </a:prstGeom>
+                    <a:noFill/>
+                    <a:ln w="9525">
+                      <a:noFill/>
+                      <a:headEnd/>
+                      <a:tailEnd/>
+                    </a:ln>
+                  </pic:spPr>
+                </pic:pic>
+              </a:graphicData>
+            </a:graphic>
+          </wp:inline>
+        </w:drawing>
+      </w:r>
+    </w:p>
+    <w:p>
+      <w:pPr>
+        <w:pStyle w:val="ImageCaption"/>
+      </w:pPr>
+      <w:r>
+        <w:rPr>
+          <w:b/>
+          <w:bCs/>
+        </w:rPr>
+        <w:t xml:space="preserve">Fig. 1</w:t>
+      </w:r>
+      <w:r>
+        <w:t xml:space="preserve"> </w:t>
+      </w:r>
+      <w:r>
+        <w:t xml:space="preserve">Harmonic false-stable and false-unstable call counts versus the</w:t>
+      </w:r>
+      <w:r>
+        <w:t xml:space="preserve"> </w:t>
+      </w:r>
+      <w:r>
+        <w:t xml:space="preserve">imaginary-frequency tolerance (§3.1). The default −0.1 THz sits in the stable basin between the</w:t>
+      </w:r>
+      <w:r>
+        <w:t xml:space="preserve"> </w:t>
+      </w:r>
+      <w:r>
+        <w:t xml:space="preserve">false-unstable flood at strict tolerance and the false-stable inflation at loose tolerance.</w:t>
+      </w:r>
+    </w:p>
+    <w:p>
+      <w:pPr>
+        <w:pStyle w:val="CaptionedFigure"/>
+      </w:pPr>
+      <w:r>
+        <w:drawing>
+          <wp:inline>
+            <wp:extent cx="5334000" cy="5744307"/>
+            <wp:effectExtent b="0" l="0" r="0" t="0"/>
+            <wp:docPr descr="Fig. 2 Per-system minimum effective frequency across the five models (§3.1–3.2). The “softening toward zero” of the harmonically-unstable systems is the physics; per-system minima, not binary rates, are the right reporting unit." title="" id="21" name="Picture"/>
+            <a:graphic>
+              <a:graphicData uri="http://schemas.openxmlformats.org/drawingml/2006/picture">
+                <pic:pic>
+                  <pic:nvPicPr>
+                    <pic:cNvPr descr="../results/figures/fig_softmode_heat.png" id="22" name="Picture"/>
+                    <pic:cNvPicPr>
+                      <a:picLocks noChangeArrowheads="1" noChangeAspect="1"/>
+                    </pic:cNvPicPr>
+                  </pic:nvPicPr>
+                  <pic:blipFill>
+                    <a:blip r:embed="rId20"/>
+                    <a:stretch>
+                      <a:fillRect/>
+                    </a:stretch>
+                  </pic:blipFill>
+                  <pic:spPr bwMode="auto">
+                    <a:xfrm>
+                      <a:off x="0" y="0"/>
+                      <a:ext cx="5334000" cy="5744307"/>
+                    </a:xfrm>
+                    <a:prstGeom prst="rect">
+                      <a:avLst/>
+                    </a:prstGeom>
+                    <a:noFill/>
+                    <a:ln w="9525">
+                      <a:noFill/>
+                      <a:headEnd/>
+                      <a:tailEnd/>
+                    </a:ln>
+                  </pic:spPr>
+                </pic:pic>
+              </a:graphicData>
+            </a:graphic>
+          </wp:inline>
+        </w:drawing>
+      </w:r>
+    </w:p>
+    <w:p>
+      <w:pPr>
+        <w:pStyle w:val="ImageCaption"/>
+      </w:pPr>
+      <w:r>
+        <w:rPr>
+          <w:b/>
+          <w:bCs/>
+        </w:rPr>
+        <w:t xml:space="preserve">Fig. 2</w:t>
+      </w:r>
+      <w:r>
+        <w:t xml:space="preserve"> </w:t>
+      </w:r>
+      <w:r>
+        <w:t xml:space="preserve">Per-system minimum effective frequency across the five models (§3.1–3.2).</w:t>
+      </w:r>
+      <w:r>
+        <w:t xml:space="preserve"> </w:t>
+      </w:r>
+      <w:r>
+        <w:t xml:space="preserve">The</w:t>
+      </w:r>
+      <w:r>
+        <w:t xml:space="preserve"> </w:t>
+      </w:r>
+      <w:r>
+        <w:t xml:space="preserve">“softening toward zero”</w:t>
+      </w:r>
+      <w:r>
+        <w:t xml:space="preserve"> </w:t>
+      </w:r>
+      <w:r>
+        <w:t xml:space="preserve">of the harmonically-unstable systems is the physics; per-system minima,</w:t>
+      </w:r>
+      <w:r>
+        <w:t xml:space="preserve"> </w:t>
+      </w:r>
+      <w:r>
+        <w:t xml:space="preserve">not binary rates, are the right reporting unit.</w:t>
+      </w:r>
+    </w:p>
+    <w:bookmarkEnd w:id="23"/>
+    <w:bookmarkStart w:id="24" w:name="X313c0a2a4f96726263bcc133565de0efc38b532"/>
     <w:p>
       <w:pPr>
         <w:pStyle w:val="Heading3"/>
@@ -2833,8 +2999,8 @@
         <w:t xml:space="preserve">failure in §3.3.</w:t>
       </w:r>
     </w:p>
-    <w:bookmarkEnd w:id="18"/>
-    <w:bookmarkStart w:id="19" w:name="X3071391ad62650abdc1b0484b081a86a9e497c1"/>
+    <w:bookmarkEnd w:id="24"/>
+    <w:bookmarkStart w:id="34" w:name="X3071391ad62650abdc1b0484b081a86a9e497c1"/>
     <w:p>
       <w:pPr>
         <w:pStyle w:val="Heading3"/>
@@ -3121,2132 +3287,25 @@
     </w:p>
     <w:p>
       <w:pPr>
-        <w:pStyle w:val="BodyText"/>
-      </w:pPr>
-      <w:r>
-        <w:rPr>
-          <w:b/>
-          <w:bCs/>
-        </w:rPr>
-        <w:t xml:space="preserve">Ferroelectric perovskites — SSCHA systematically false-stabilises.</w:t>
-      </w:r>
-      <w:r>
-        <w:t xml:space="preserve"> </w:t>
-      </w:r>
-      <w:r>
-        <w:t xml:space="preserve">On the same FE</w:t>
-      </w:r>
-      <w:r>
-        <w:t xml:space="preserve"> </w:t>
-      </w:r>
-      <w:r>
-        <w:t xml:space="preserve">perovskites at T ≤ 300 K where the screen achieves 0.77 recall, SSCHA correctly identifies the</w:t>
-      </w:r>
-      <w:r>
-        <w:t xml:space="preserve"> </w:t>
-      </w:r>
-      <w:r>
-        <w:t xml:space="preserve">instability in only</w:t>
-      </w:r>
-      <w:r>
-        <w:t xml:space="preserve"> </w:t>
-      </w:r>
-      <w:r>
-        <w:rPr>
-          <w:b/>
-          <w:bCs/>
-        </w:rPr>
-        <w:t xml:space="preserve">7 of 30</w:t>
-      </w:r>
-      <w:r>
-        <w:t xml:space="preserve"> </w:t>
-      </w:r>
-      <w:r>
-        <w:t xml:space="preserve">units (recall 0.23), and the perovskite SSCHA runs include six</w:t>
-      </w:r>
-      <w:r>
-        <w:t xml:space="preserve"> </w:t>
-      </w:r>
-      <w:r>
-        <w:t xml:space="preserve">numerical blow-ups (minimum frequencies down to −2×10⁶ THz, concentrated in the float32 ORB-v2</w:t>
-      </w:r>
-      <w:r>
-        <w:t xml:space="preserve"> </w:t>
-      </w:r>
-      <w:r>
-        <w:t xml:space="preserve">runs). The contrast is the cautionary result: the expensive gold standard is</w:t>
-      </w:r>
-      <w:r>
-        <w:t xml:space="preserve"> </w:t>
-      </w:r>
-      <w:r>
-        <w:rPr>
-          <w:i/>
-          <w:iCs/>
-        </w:rPr>
-        <w:t xml:space="preserve">less</w:t>
-      </w:r>
-      <w:r>
-        <w:t xml:space="preserve"> </w:t>
-      </w:r>
-      <w:r>
-        <w:t xml:space="preserve">reliable than the cheap screen in exactly the displacive regime that dominates</w:t>
-      </w:r>
-      <w:r>
-        <w:t xml:space="preserve"> </w:t>
-      </w:r>
-      <w:r>
-        <w:t xml:space="preserve">generative-CSP outputs (Fig. 5).</w:t>
-      </w:r>
-    </w:p>
-    <w:p>
-      <w:pPr>
-        <w:pStyle w:val="BodyText"/>
-      </w:pPr>
-      <w:r>
-        <w:rPr>
-          <w:b/>
-          <w:bCs/>
-        </w:rPr>
-        <w:t xml:space="preserve">Root cause.</w:t>
-      </w:r>
-      <w:r>
-        <w:t xml:space="preserve"> </w:t>
-      </w:r>
-      <w:r>
-        <w:t xml:space="preserve">A controlled diagnostic on cubic BaTiO₃ (MACE-MP-0, 100 K) isolates the</w:t>
-      </w:r>
-      <w:r>
-        <w:t xml:space="preserve"> </w:t>
-      </w:r>
-      <w:r>
-        <w:t xml:space="preserve">mechanism. The harmonic soft mode is −5.6 THz (correctly unstable), but</w:t>
-      </w:r>
-      <w:r>
-        <w:t xml:space="preserve"> </w:t>
-      </w:r>
-      <w:r>
-        <w:rPr>
-          <w:rStyle w:val="VerbatimChar"/>
-        </w:rPr>
-        <w:t xml:space="preserve">ForcePositiveDefinite</w:t>
-      </w:r>
-      <w:r>
-        <w:t xml:space="preserve"> </w:t>
-      </w:r>
-      <w:r>
-        <w:t xml:space="preserve">at initialisation erases it (+2.88 THz); the SCHA auxiliary matrix then stays stuck at +2.89</w:t>
-      </w:r>
-      <w:r>
-        <w:t xml:space="preserve"> </w:t>
-      </w:r>
-      <w:r>
-        <w:t xml:space="preserve">THz because at low temperature its narrow Gaussian width never samples the anharmonic</w:t>
-      </w:r>
-      <w:r>
-        <w:t xml:space="preserve"> </w:t>
-      </w:r>
-      <w:r>
-        <w:t xml:space="preserve">double-well; and the free-energy Hessian without the fourth-order term echoes that positive</w:t>
-      </w:r>
-      <w:r>
-        <w:t xml:space="preserve"> </w:t>
-      </w:r>
-      <w:r>
-        <w:t xml:space="preserve">curvature (+2.87 THz) → false-stable. Enabling the fourth-order term (</w:t>
-      </w:r>
-      <w:r>
-        <w:rPr>
-          <w:rStyle w:val="VerbatimChar"/>
-        </w:rPr>
-        <w:t xml:space="preserve">include_v4=True</w:t>
-      </w:r>
-      <w:r>
-        <w:t xml:space="preserve">) is the</w:t>
-      </w:r>
-      <w:r>
-        <w:t xml:space="preserve"> </w:t>
-      </w:r>
-      <w:r>
-        <w:t xml:space="preserve">only route that could recover the instability, but it ran &gt;18 min on a</w:t>
-      </w:r>
-      <w:r>
-        <w:t xml:space="preserve"> </w:t>
-      </w:r>
-      <w:r>
-        <w:rPr>
-          <w:i/>
-          <w:iCs/>
-        </w:rPr>
-        <w:t xml:space="preserve">single</w:t>
-      </w:r>
-      <w:r>
-        <w:t xml:space="preserve"> </w:t>
-      </w:r>
-      <w:r>
-        <w:t xml:space="preserve">unit without</w:t>
-      </w:r>
-      <w:r>
-        <w:t xml:space="preserve"> </w:t>
-      </w:r>
-      <w:r>
-        <w:t xml:space="preserve">finishing (≈tens of hours per unit at grid scale) and is numerically viable only in float64.</w:t>
-      </w:r>
-      <w:r>
-        <w:t xml:space="preserve"> </w:t>
-      </w:r>
-      <w:r>
-        <w:t xml:space="preserve">The physically correct SSCHA treatment of a deep displacive instability is to relax the</w:t>
-      </w:r>
-      <w:r>
-        <w:t xml:space="preserve"> </w:t>
-      </w:r>
-      <w:r>
-        <w:rPr>
-          <w:i/>
-          <w:iCs/>
-        </w:rPr>
-        <w:t xml:space="preserve">structure</w:t>
-      </w:r>
-      <w:r>
-        <w:t xml:space="preserve"> </w:t>
-      </w:r>
-      <w:r>
-        <w:t xml:space="preserve">into the distorted phase — which changes the question from</w:t>
-      </w:r>
-      <w:r>
-        <w:t xml:space="preserve"> </w:t>
-      </w:r>
-      <w:r>
-        <w:t xml:space="preserve">“is the cubic phase</w:t>
-      </w:r>
-      <w:r>
-        <w:t xml:space="preserve"> </w:t>
-      </w:r>
-      <w:r>
-        <w:t xml:space="preserve">dynamically stable”</w:t>
-      </w:r>
-      <w:r>
-        <w:t xml:space="preserve"> </w:t>
-      </w:r>
-      <w:r>
-        <w:t xml:space="preserve">to</w:t>
-      </w:r>
-      <w:r>
-        <w:t xml:space="preserve"> </w:t>
-      </w:r>
-      <w:r>
-        <w:t xml:space="preserve">“what is the ground state,”</w:t>
-      </w:r>
-      <w:r>
-        <w:t xml:space="preserve"> </w:t>
-      </w:r>
-      <w:r>
-        <w:t xml:space="preserve">and so cannot serve as the benchmark</w:t>
-      </w:r>
-      <w:r>
-        <w:t xml:space="preserve"> </w:t>
-      </w:r>
-      <w:r>
-        <w:t xml:space="preserve">criterion. We therefore use SSCHA as the bcc gold standard and the experimental transition</w:t>
-      </w:r>
-      <w:r>
-        <w:t xml:space="preserve"> </w:t>
-      </w:r>
-      <w:r>
-        <w:t xml:space="preserve">temperature (the SrTiO₃ gate, §2.4) as the validation for the perovskite screen.</w:t>
-      </w:r>
-    </w:p>
-    <w:p>
-      <w:pPr>
-        <w:pStyle w:val="BodyText"/>
-      </w:pPr>
-      <w:r>
-        <w:rPr>
-          <w:b/>
-          <w:bCs/>
-        </w:rPr>
-        <w:t xml:space="preserve">Cubic fluorites confirm the failure is systematic, not numerical.</w:t>
-      </w:r>
-      <w:r>
-        <w:t xml:space="preserve"> </w:t>
-      </w:r>
-      <w:r>
-        <w:t xml:space="preserve">Cubic ZrO₂ (the &gt;2600 K</w:t>
-      </w:r>
-      <w:r>
-        <w:t xml:space="preserve"> </w:t>
-      </w:r>
-      <w:r>
-        <w:t xml:space="preserve">phase; harmonically unstable via the X-point oxygen mode at all temperatures studied) is a</w:t>
-      </w:r>
-      <w:r>
-        <w:t xml:space="preserve"> </w:t>
-      </w:r>
-      <w:r>
-        <w:t xml:space="preserve">cleaner test because its instability is shallower than the FE perovskites and does not trigger</w:t>
-      </w:r>
-      <w:r>
-        <w:t xml:space="preserve"> </w:t>
-      </w:r>
-      <w:r>
-        <w:t xml:space="preserve">the float32 blow-ups. The soft-mode screen returns roughly −6.4 to −8 THz for all five models at</w:t>
-      </w:r>
-      <w:r>
-        <w:t xml:space="preserve"> </w:t>
-      </w:r>
-      <w:r>
-        <w:t xml:space="preserve">every temperature (100–900 K) — correctly and consistently unstable. SSCHA instead returns ≈ +3 THz</w:t>
-      </w:r>
-      <w:r>
-        <w:t xml:space="preserve"> </w:t>
-      </w:r>
-      <w:r>
-        <w:t xml:space="preserve">at 100 K for all five models (</w:t>
-      </w:r>
-      <w:r>
-        <w:rPr>
-          <w:b/>
-          <w:bCs/>
-        </w:rPr>
-        <w:t xml:space="preserve">false-stable</w:t>
-      </w:r>
-      <w:r>
-        <w:t xml:space="preserve">) and then, perversely,</w:t>
-      </w:r>
-      <w:r>
-        <w:t xml:space="preserve"> </w:t>
-      </w:r>
-      <w:r>
-        <w:rPr>
-          <w:i/>
-          <w:iCs/>
-        </w:rPr>
-        <w:t xml:space="preserve">destabilises</w:t>
-      </w:r>
-      <w:r>
-        <w:t xml:space="preserve"> </w:t>
-      </w:r>
-      <w:r>
-        <w:t xml:space="preserve">with</w:t>
-      </w:r>
-      <w:r>
-        <w:t xml:space="preserve"> </w:t>
-      </w:r>
-      <w:r>
-        <w:t xml:space="preserve">temperature (e.g. MACE-MP-0 −4.6 THz, ORB-v2 −10.2 THz at 900 K) — both the wrong sign at low T</w:t>
-      </w:r>
-      <w:r>
-        <w:t xml:space="preserve"> </w:t>
-      </w:r>
-      <w:r>
-        <w:t xml:space="preserve">and the wrong temperature trend. That SSCHA fails the same way on a numerically well-behaved,</w:t>
-      </w:r>
-      <w:r>
-        <w:t xml:space="preserve"> </w:t>
-      </w:r>
-      <w:r>
-        <w:t xml:space="preserve">shallower instability shows the false-stable behaviour is intrinsic to the fixed-reference SSCHA</w:t>
-      </w:r>
-      <w:r>
-        <w:t xml:space="preserve"> </w:t>
-      </w:r>
-      <w:r>
-        <w:t xml:space="preserve">deployment (§ root cause), not an artifact of the deepest perovskite wells. HfO₂ shows the same</w:t>
-      </w:r>
-      <w:r>
-        <w:t xml:space="preserve"> </w:t>
-      </w:r>
-      <w:r>
-        <w:t xml:space="preserve">SSCHA false-stable pattern (all models +2.0 to +2.6 THz at 100 K, then destabilising to</w:t>
-      </w:r>
-      <w:r>
-        <w:t xml:space="preserve"> </w:t>
-      </w:r>
-      <w:r>
-        <w:t xml:space="preserve">−4.3/−7.2 THz for CHGNet/ORB-v2 by 900 K). Across both fluorites SSCHA produced</w:t>
-      </w:r>
-      <w:r>
-        <w:t xml:space="preserve"> </w:t>
-      </w:r>
-      <w:r>
-        <w:rPr>
-          <w:b/>
-          <w:bCs/>
-        </w:rPr>
-        <w:t xml:space="preserve">zero</w:t>
-      </w:r>
-      <w:r>
-        <w:t xml:space="preserve"> </w:t>
-      </w:r>
-      <w:r>
-        <w:t xml:space="preserve">numerical blow-ups yet</w:t>
-      </w:r>
-      <w:r>
-        <w:t xml:space="preserve"> </w:t>
-      </w:r>
-      <w:r>
-        <w:t xml:space="preserve">the same systematic false-stable, confirming the failure is a methodological trap, not a</w:t>
-      </w:r>
-      <w:r>
-        <w:t xml:space="preserve"> </w:t>
-      </w:r>
-      <w:r>
-        <w:t xml:space="preserve">numerical one.</w:t>
-      </w:r>
-    </w:p>
-    <w:bookmarkEnd w:id="19"/>
-    <w:bookmarkStart w:id="20" w:name="ensemble-disagreement-as-a-guardrail-h3"/>
-    <w:p>
-      <w:pPr>
-        <w:pStyle w:val="Heading3"/>
-      </w:pPr>
-      <w:r>
-        <w:t xml:space="preserve">3.4 Ensemble disagreement as a guardrail (H3)</w:t>
-      </w:r>
-    </w:p>
-    <w:p>
-      <w:pPr>
-        <w:pStyle w:val="FirstParagraph"/>
-      </w:pPr>
-      <w:r>
-        <w:t xml:space="preserve">Because no single model is reliable across the set, we test whether</w:t>
-      </w:r>
-      <w:r>
-        <w:t xml:space="preserve"> </w:t>
-      </w:r>
-      <w:r>
-        <w:rPr>
-          <w:i/>
-          <w:iCs/>
-        </w:rPr>
-        <w:t xml:space="preserve">cross-model disagreement</w:t>
-      </w:r>
-      <w:r>
-        <w:t xml:space="preserve"> </w:t>
-      </w:r>
-      <w:r>
-        <w:t xml:space="preserve">flags the units where the consensus (majority-vote) finite-T call is wrong. On the non-bcc,</w:t>
-      </w:r>
-      <w:r>
-        <w:t xml:space="preserve"> </w:t>
-      </w:r>
-      <w:r>
-        <w:t xml:space="preserve">non-borderline soft-mode units (n = 60; bcc excluded because its thermodynamic-T_c label is the</w:t>
-      </w:r>
-      <w:r>
-        <w:t xml:space="preserve"> </w:t>
-      </w:r>
-      <w:r>
-        <w:t xml:space="preserve">wrong reference for dynamic stability, §3.3), the majority-vote consensus is wrong on 16.7% of</w:t>
-      </w:r>
-      <w:r>
-        <w:t xml:space="preserve"> </w:t>
-      </w:r>
-      <w:r>
-        <w:t xml:space="preserve">units. The disagreement signal separates these sharply: on the 18 units where the five models</w:t>
-      </w:r>
-      <w:r>
-        <w:t xml:space="preserve"> </w:t>
-      </w:r>
-      <w:r>
-        <w:rPr>
-          <w:b/>
-          <w:bCs/>
-        </w:rPr>
-        <w:t xml:space="preserve">split</w:t>
-      </w:r>
-      <w:r>
-        <w:t xml:space="preserve"> </w:t>
-      </w:r>
-      <w:r>
-        <w:t xml:space="preserve">on the stable/unstable call, the consensus error rate is</w:t>
-      </w:r>
-      <w:r>
-        <w:t xml:space="preserve"> </w:t>
-      </w:r>
-      <w:r>
-        <w:rPr>
-          <w:b/>
-          <w:bCs/>
-        </w:rPr>
-        <w:t xml:space="preserve">0.39</w:t>
-      </w:r>
-      <w:r>
-        <w:t xml:space="preserve">, versus</w:t>
-      </w:r>
-      <w:r>
-        <w:t xml:space="preserve"> </w:t>
-      </w:r>
-      <w:r>
-        <w:rPr>
-          <w:b/>
-          <w:bCs/>
-        </w:rPr>
-        <w:t xml:space="preserve">0.07</w:t>
-      </w:r>
-      <w:r>
-        <w:t xml:space="preserve"> </w:t>
-      </w:r>
-      <w:r>
-        <w:t xml:space="preserve">on</w:t>
-      </w:r>
-      <w:r>
-        <w:t xml:space="preserve"> </w:t>
-      </w:r>
-      <w:r>
-        <w:t xml:space="preserve">the 42 unanimous units — a 5.5× enrichment. As a ranked predictor of consensus error, the</w:t>
-      </w:r>
-      <w:r>
-        <w:t xml:space="preserve"> </w:t>
-      </w:r>
-      <w:r>
-        <w:t xml:space="preserve">binary stable/unstable</w:t>
-      </w:r>
-      <w:r>
-        <w:t xml:space="preserve"> </w:t>
-      </w:r>
-      <w:r>
-        <w:rPr>
-          <w:b/>
-          <w:bCs/>
-        </w:rPr>
-        <w:t xml:space="preserve">vote split achieves AUC 0.75</w:t>
-      </w:r>
-      <w:r>
-        <w:t xml:space="preserve">, whereas the continuous cross-model</w:t>
-      </w:r>
-      <w:r>
-        <w:t xml:space="preserve"> </w:t>
-      </w:r>
-      <w:r>
-        <w:t xml:space="preserve">frequency standard deviation is uninformative (</w:t>
-      </w:r>
-      <w:r>
-        <w:rPr>
-          <w:b/>
-          <w:bCs/>
-        </w:rPr>
-        <w:t xml:space="preserve">AUC 0.52</w:t>
-      </w:r>
-      <w:r>
-        <w:t xml:space="preserve">, no better than chance;</w:t>
-      </w:r>
-      <w:r>
-        <w:t xml:space="preserve"> </w:t>
-      </w:r>
-      <w:r>
-        <w:t xml:space="preserve">Fig. 6).</w:t>
-      </w:r>
-    </w:p>
-    <w:p>
-      <w:pPr>
-        <w:pStyle w:val="BodyText"/>
-      </w:pPr>
-      <w:r>
-        <w:t xml:space="preserve">This refines H3 into an actionable rule with a caveat: the</w:t>
-      </w:r>
-      <w:r>
-        <w:t xml:space="preserve"> </w:t>
-      </w:r>
-      <w:r>
-        <w:rPr>
-          <w:i/>
-          <w:iCs/>
-        </w:rPr>
-        <w:t xml:space="preserve">discrete</w:t>
-      </w:r>
-      <w:r>
-        <w:t xml:space="preserve"> </w:t>
-      </w:r>
-      <w:r>
-        <w:t xml:space="preserve">inter-model vote split is</w:t>
-      </w:r>
-      <w:r>
-        <w:t xml:space="preserve"> </w:t>
-      </w:r>
-      <w:r>
-        <w:t xml:space="preserve">a useful, cheap guardrail — flag any candidate on which the foundation-MLIP ensemble disagrees —</w:t>
-      </w:r>
-      <w:r>
-        <w:t xml:space="preserve"> </w:t>
-      </w:r>
-      <w:r>
-        <w:t xml:space="preserve">but the</w:t>
-      </w:r>
-      <w:r>
-        <w:t xml:space="preserve"> </w:t>
-      </w:r>
-      <w:r>
-        <w:rPr>
-          <w:i/>
-          <w:iCs/>
-        </w:rPr>
-        <w:t xml:space="preserve">continuous</w:t>
-      </w:r>
-      <w:r>
-        <w:t xml:space="preserve"> </w:t>
-      </w:r>
-      <w:r>
-        <w:t xml:space="preserve">frequency spread that one might naively threshold is not. The physical</w:t>
-      </w:r>
-      <w:r>
-        <w:t xml:space="preserve"> </w:t>
-      </w:r>
-      <w:r>
-        <w:t xml:space="preserve">reading is that disagreement is concentrated near the stability boundary (split votes coincide</w:t>
-      </w:r>
-      <w:r>
-        <w:t xml:space="preserve"> </w:t>
-      </w:r>
-      <w:r>
-        <w:t xml:space="preserve">with frequencies straddling zero), where the call is both most uncertain and most error-prone.</w:t>
-      </w:r>
-    </w:p>
-    <w:bookmarkEnd w:id="20"/>
-    <w:bookmarkStart w:id="21" w:name="X054d2a2ddcea26a90d40f6d7c1de66d35e8d344"/>
-    <w:p>
-      <w:pPr>
-        <w:pStyle w:val="Heading3"/>
-      </w:pPr>
-      <w:r>
-        <w:t xml:space="preserve">3.5 Robustness: stochastic noise and finite size</w:t>
-      </w:r>
-    </w:p>
-    <w:p>
-      <w:pPr>
-        <w:pStyle w:val="FirstParagraph"/>
-      </w:pPr>
-      <w:r>
-        <w:rPr>
-          <w:b/>
-          <w:bCs/>
-        </w:rPr>
-        <w:t xml:space="preserve">Stochastic reproducibility.</w:t>
-      </w:r>
-      <w:r>
-        <w:t xml:space="preserve"> </w:t>
-      </w:r>
-      <w:r>
-        <w:t xml:space="preserve">Repeating the bcc-Zr / MACE-MP-0 / 100 K SSCHA with four</w:t>
-      </w:r>
-      <w:r>
-        <w:t xml:space="preserve"> </w:t>
-      </w:r>
-      <w:r>
-        <w:t xml:space="preserve">independent random seeds gives a minimum free-energy-Hessian frequency of +1.798 ± 0.001 THz</w:t>
-      </w:r>
-      <w:r>
-        <w:t xml:space="preserve"> </w:t>
-      </w:r>
-      <w:r>
-        <w:t xml:space="preserve">(range [+1.797, +1.800]). The stochastic noise (≈0.001 THz) is two-to-three orders of magnitude</w:t>
-      </w:r>
-      <w:r>
-        <w:t xml:space="preserve"> </w:t>
-      </w:r>
-      <w:r>
-        <w:t xml:space="preserve">smaller than the cross-model bcc margins (~0.4 THz spread, §3.3), so those margins are real</w:t>
-      </w:r>
-      <w:r>
-        <w:t xml:space="preserve"> </w:t>
-      </w:r>
-      <w:r>
-        <w:t xml:space="preserve">signal, not sampling noise.</w:t>
-      </w:r>
-    </w:p>
-    <w:p>
-      <w:pPr>
-        <w:pStyle w:val="BodyText"/>
-      </w:pPr>
-      <w:r>
-        <w:rPr>
-          <w:b/>
-          <w:bCs/>
-        </w:rPr>
-        <w:t xml:space="preserve">Finite size.</w:t>
-      </w:r>
-      <w:r>
-        <w:t xml:space="preserve"> </w:t>
-      </w:r>
-      <w:r>
-        <w:t xml:space="preserve">The stability</w:t>
-      </w:r>
-      <w:r>
-        <w:t xml:space="preserve"> </w:t>
-      </w:r>
-      <w:r>
-        <w:rPr>
-          <w:i/>
-          <w:iCs/>
-        </w:rPr>
-        <w:t xml:space="preserve">call</w:t>
-      </w:r>
-      <w:r>
-        <w:t xml:space="preserve"> </w:t>
-      </w:r>
-      <w:r>
-        <w:t xml:space="preserve">is robust to supercell size on the cases where the test is</w:t>
-      </w:r>
-      <w:r>
-        <w:t xml:space="preserve"> </w:t>
-      </w:r>
-      <w:r>
-        <w:t xml:space="preserve">well-posed (</w:t>
-      </w:r>
-      <w:r>
-        <w:rPr>
-          <w:rStyle w:val="VerbatimChar"/>
-        </w:rPr>
-        <w:t xml:space="preserve">results/convergence_study.parquet</w:t>
-      </w:r>
-      <w:r>
-        <w:t xml:space="preserve">). For bcc-Zr the dynamic-stabilisation verdict</w:t>
-      </w:r>
-      <w:r>
-        <w:t xml:space="preserve"> </w:t>
-      </w:r>
-      <w:r>
-        <w:t xml:space="preserve">holds from 2×2×2 to 3×3×3 (SSCHA +1.80 → +1.56 THz at 100 K, +1.80 → +1.55 at 300 K; soft-mode</w:t>
-      </w:r>
-      <w:r>
-        <w:t xml:space="preserve"> </w:t>
-      </w:r>
-      <w:r>
-        <w:t xml:space="preserve">screen +0.92 → +1.58 THz — stable throughout, the margin shifting by ≤0.25 THz). For the</w:t>
-      </w:r>
-      <w:r>
-        <w:t xml:space="preserve"> </w:t>
-      </w:r>
-      <w:r>
-        <w:t xml:space="preserve">Γ-centred ferroelectric mode of BaTiO₃ the soft-mode screen stays unstable across cell size</w:t>
-      </w:r>
-      <w:r>
-        <w:t xml:space="preserve"> </w:t>
-      </w:r>
-      <w:r>
-        <w:t xml:space="preserve">(−8.5 → −7.3 THz at 100 K). One caveat is intrinsic to the physics rather than the method: the</w:t>
-      </w:r>
-      <w:r>
-        <w:t xml:space="preserve"> </w:t>
-      </w:r>
-      <w:r>
-        <w:t xml:space="preserve">SrTiO₃ antiferrodistortive instability lives at the zone-boundary R point = (½,½,½), which is</w:t>
-      </w:r>
-      <w:r>
-        <w:t xml:space="preserve"> </w:t>
-      </w:r>
-      <w:r>
-        <w:t xml:space="preserve">commensurate only with</w:t>
-      </w:r>
-      <w:r>
-        <w:t xml:space="preserve"> </w:t>
-      </w:r>
-      <w:r>
-        <w:rPr>
-          <w:i/>
-          <w:iCs/>
-        </w:rPr>
-        <w:t xml:space="preserve">even</w:t>
-      </w:r>
-      <w:r>
-        <w:t xml:space="preserve"> </w:t>
-      </w:r>
-      <w:r>
-        <w:t xml:space="preserve">supercells, so a 3×3×3 cell is blind to it by construction (the</w:t>
-      </w:r>
-      <w:r>
-        <w:t xml:space="preserve"> </w:t>
-      </w:r>
-      <w:r>
-        <w:t xml:space="preserve">screen there reports the Γ value, +0.0 THz, not the R instability at −2.8). A 2×2×2↔3×3×3</w:t>
-      </w:r>
-      <w:r>
-        <w:t xml:space="preserve"> </w:t>
-      </w:r>
-      <w:r>
-        <w:t xml:space="preserve">comparison is therefore not a valid convergence test for R-point systems; the definitive even-cell</w:t>
-      </w:r>
-      <w:r>
-        <w:t xml:space="preserve"> </w:t>
-      </w:r>
-      <w:r>
-        <w:t xml:space="preserve">test (4×4×4, a ~320-atom SSCHA) is left to future work. Importantly, the §3.3 SSCHA false-stable</w:t>
-      </w:r>
-      <w:r>
-        <w:t xml:space="preserve"> </w:t>
-      </w:r>
-      <w:r>
-        <w:t xml:space="preserve">is</w:t>
-      </w:r>
-      <w:r>
-        <w:t xml:space="preserve"> </w:t>
-      </w:r>
-      <w:r>
-        <w:rPr>
-          <w:i/>
-          <w:iCs/>
-        </w:rPr>
-        <w:t xml:space="preserve">not</w:t>
-      </w:r>
-      <w:r>
-        <w:t xml:space="preserve"> </w:t>
-      </w:r>
-      <w:r>
-        <w:t xml:space="preserve">a missing-q artifact: it occurs for the Γ ferroelectric mode of BaTiO₃, which is present</w:t>
-      </w:r>
-      <w:r>
-        <w:t xml:space="preserve"> </w:t>
-      </w:r>
-      <w:r>
-        <w:t xml:space="preserve">in every cell including the 2×2×2 used, so the failure is the initialisation/Gaussian-width</w:t>
-      </w:r>
-      <w:r>
-        <w:t xml:space="preserve"> </w:t>
-      </w:r>
-      <w:r>
-        <w:t xml:space="preserve">mechanism of the root-cause diagnostic, not finite size.</w:t>
-      </w:r>
-    </w:p>
-    <w:bookmarkEnd w:id="21"/>
-    <w:bookmarkEnd w:id="22"/>
-    <w:bookmarkStart w:id="23" w:name="discussion"/>
-    <w:p>
-      <w:pPr>
-        <w:pStyle w:val="Heading2"/>
-      </w:pPr>
-      <w:r>
-        <w:t xml:space="preserve">4. Discussion</w:t>
-      </w:r>
-    </w:p>
-    <w:p>
-      <w:pPr>
-        <w:pStyle w:val="FirstParagraph"/>
-      </w:pPr>
-      <w:r>
-        <w:t xml:space="preserve">The harmonic layer (§3.1) reproduces the literature and confirms H1: PES softening produces a</w:t>
-      </w:r>
-      <w:r>
-        <w:t xml:space="preserve"> </w:t>
-      </w:r>
-      <w:r>
-        <w:t xml:space="preserve">real false-stable rate, localised to specific instabilities (bcc Zr/Hf) rather than uniform.</w:t>
-      </w:r>
-      <w:r>
-        <w:t xml:space="preserve"> </w:t>
-      </w:r>
-      <w:r>
-        <w:t xml:space="preserve">The finite-T results confirm H2 in a strong form: not only is harmonic accuracy non-predictive</w:t>
-      </w:r>
-      <w:r>
-        <w:t xml:space="preserve"> </w:t>
-      </w:r>
-      <w:r>
-        <w:t xml:space="preserve">of finite-T accuracy, but the standard escalation —</w:t>
-      </w:r>
-      <w:r>
-        <w:t xml:space="preserve"> </w:t>
-      </w:r>
-      <w:r>
-        <w:t xml:space="preserve">“if in doubt, run SSCHA”</w:t>
-      </w:r>
-      <w:r>
-        <w:t xml:space="preserve"> </w:t>
-      </w:r>
-      <w:r>
-        <w:t xml:space="preserve">—</w:t>
-      </w:r>
-      <w:r>
-        <w:t xml:space="preserve"> </w:t>
-      </w:r>
-      <w:r>
-        <w:rPr>
-          <w:i/>
-          <w:iCs/>
-        </w:rPr>
-        <w:t xml:space="preserve">fails</w:t>
-      </w:r>
-      <w:r>
-        <w:t xml:space="preserve"> </w:t>
-      </w:r>
-      <w:r>
-        <w:t xml:space="preserve">on the</w:t>
-      </w:r>
-      <w:r>
-        <w:t xml:space="preserve"> </w:t>
-      </w:r>
-      <w:r>
-        <w:t xml:space="preserve">displacive regime, because SSCHA driven by an MLIP false-stabilises deep double wells. The</w:t>
-      </w:r>
-      <w:r>
-        <w:t xml:space="preserve"> </w:t>
-      </w:r>
-      <w:r>
-        <w:t xml:space="preserve">practical recommendation inverts the usual cost/accuracy intuition: for screening</w:t>
-      </w:r>
-      <w:r>
-        <w:t xml:space="preserve"> </w:t>
-      </w:r>
-      <w:r>
-        <w:t xml:space="preserve">harmonically-unstable displacive candidates, the cheap single-mode soft-mode free energy is the</w:t>
-      </w:r>
-      <w:r>
-        <w:t xml:space="preserve"> </w:t>
-      </w:r>
-      <w:r>
-        <w:t xml:space="preserve">more reliable indicator, and SSCHA should be reserved for martensitic/entropy-stabilised cases</w:t>
-      </w:r>
-      <w:r>
-        <w:t xml:space="preserve"> </w:t>
-      </w:r>
-      <w:r>
-        <w:t xml:space="preserve">where its ansatz is sound.</w:t>
-      </w:r>
-    </w:p>
-    <w:p>
-      <w:pPr>
-        <w:pStyle w:val="BodyText"/>
-      </w:pPr>
-      <w:r>
-        <w:rPr>
-          <w:b/>
-          <w:bCs/>
-        </w:rPr>
-        <w:t xml:space="preserve">Limitations.</w:t>
-      </w:r>
-      <w:r>
-        <w:t xml:space="preserve"> </w:t>
-      </w:r>
-      <w:r>
-        <w:t xml:space="preserve">Ground-truth transition temperatures are approximate and scoring is</w:t>
-      </w:r>
-      <w:r>
-        <w:t xml:space="preserve"> </w:t>
-      </w:r>
-      <w:r>
-        <w:t xml:space="preserve">qualitative. SSCHA cells are 2×2×2 (finite-size), so dynamic-stabilisation temperatures are</w:t>
-      </w:r>
-      <w:r>
-        <w:t xml:space="preserve"> </w:t>
-      </w:r>
-      <w:r>
-        <w:t xml:space="preserve">approximate though the cross-model comparison at fixed cell is valid. ORB-v2’s float32-only</w:t>
-      </w:r>
-      <w:r>
-        <w:t xml:space="preserve"> </w:t>
-      </w:r>
-      <w:r>
-        <w:t xml:space="preserve">direct architecture is an outlier in both layers and is flagged throughout rather than</w:t>
-      </w:r>
-      <w:r>
-        <w:t xml:space="preserve"> </w:t>
-      </w:r>
-      <w:r>
-        <w:t xml:space="preserve">excluded.</w:t>
-      </w:r>
-    </w:p>
-    <w:bookmarkEnd w:id="23"/>
-    <w:bookmarkStart w:id="24" w:name="conclusions"/>
-    <w:p>
-      <w:pPr>
-        <w:pStyle w:val="Heading2"/>
-      </w:pPr>
-      <w:r>
-        <w:t xml:space="preserve">5. Conclusions</w:t>
-      </w:r>
-    </w:p>
-    <w:p>
-      <w:pPr>
-        <w:pStyle w:val="FirstParagraph"/>
-      </w:pPr>
-      <w:r>
-        <w:t xml:space="preserve">Finite-temperature dynamic stability is a blind spot of foundation MLIPs and of the harmonic</w:t>
-      </w:r>
-      <w:r>
-        <w:t xml:space="preserve"> </w:t>
-      </w:r>
-      <w:r>
-        <w:t xml:space="preserve">benchmarks used to certify them. A cheap quantum soft-mode free-energy screen recovers the</w:t>
-      </w:r>
-      <w:r>
-        <w:t xml:space="preserve"> </w:t>
-      </w:r>
-      <w:r>
-        <w:t xml:space="preserve">finite-T stabilisation that harmonic accuracy does not predict, and — unlike MLIP-driven SSCHA</w:t>
-      </w:r>
-      <w:r>
-        <w:t xml:space="preserve"> </w:t>
-      </w:r>
-      <w:r>
-        <w:t xml:space="preserve">— remains reliable on the deep displacive instabilities that dominate generative-CSP screening.</w:t>
-      </w:r>
-      <w:r>
-        <w:t xml:space="preserve"> </w:t>
-      </w:r>
-      <w:r>
-        <w:t xml:space="preserve">Harmonic accuracy does not certify a model for finite-T use, and neither does an unexamined</w:t>
-      </w:r>
-      <w:r>
-        <w:t xml:space="preserve"> </w:t>
-      </w:r>
-      <w:r>
-        <w:t xml:space="preserve">SSCHA cross-check.</w:t>
-      </w:r>
-    </w:p>
-    <w:bookmarkEnd w:id="24"/>
-    <w:bookmarkStart w:id="25" w:name="conflicts-of-interest"/>
-    <w:p>
-      <w:pPr>
-        <w:pStyle w:val="Heading2"/>
-      </w:pPr>
-      <w:r>
-        <w:t xml:space="preserve">Conflicts of interest</w:t>
-      </w:r>
-    </w:p>
-    <w:p>
-      <w:pPr>
-        <w:pStyle w:val="FirstParagraph"/>
-      </w:pPr>
-      <w:r>
-        <w:t xml:space="preserve">There are no conflicts to declare.</w:t>
-      </w:r>
-    </w:p>
-    <w:bookmarkEnd w:id="25"/>
-    <w:bookmarkStart w:id="26" w:name="data-availability"/>
-    <w:p>
-      <w:pPr>
-        <w:pStyle w:val="Heading2"/>
-      </w:pPr>
-      <w:r>
-        <w:t xml:space="preserve">Data availability</w:t>
-      </w:r>
-    </w:p>
-    <w:p>
-      <w:pPr>
-        <w:pStyle w:val="FirstParagraph"/>
-      </w:pPr>
-      <w:r>
-        <w:t xml:space="preserve">The code supporting this article, together with the per-unit results ledger, is openly available</w:t>
-      </w:r>
-      <w:r>
-        <w:t xml:space="preserve"> </w:t>
-      </w:r>
-      <w:r>
-        <w:t xml:space="preserve">in the repository at https://github.com/fronkt/mlip-dynamic-stability and archived at Zenodo at</w:t>
-      </w:r>
-      <w:r>
-        <w:t xml:space="preserve"> </w:t>
-      </w:r>
-      <w:r>
-        <w:t xml:space="preserve">DOI: 10.5281/zenodo.XXXXXXX</w:t>
-      </w:r>
-      <w:r>
-        <w:t xml:space="preserve"> </w:t>
-      </w:r>
-      <w:r>
-        <w:rPr>
-          <w:i/>
-          <w:iCs/>
-        </w:rPr>
-        <w:t xml:space="preserve">(DOI reserved on release; to be inserted on acceptance)</w:t>
-      </w:r>
-      <w:r>
-        <w:t xml:space="preserve">. The</w:t>
-      </w:r>
-      <w:r>
-        <w:t xml:space="preserve"> </w:t>
-      </w:r>
-      <w:r>
-        <w:t xml:space="preserve">production results regenerate from</w:t>
-      </w:r>
-      <w:r>
-        <w:t xml:space="preserve"> </w:t>
-      </w:r>
-      <w:r>
-        <w:rPr>
-          <w:rStyle w:val="VerbatimChar"/>
-        </w:rPr>
-        <w:t xml:space="preserve">results/ledger.parquet</w:t>
-      </w:r>
-      <w:r>
-        <w:t xml:space="preserve"> </w:t>
-      </w:r>
-      <w:r>
-        <w:t xml:space="preserve">(per-unit hashed, resumable) and the</w:t>
-      </w:r>
-      <w:r>
-        <w:t xml:space="preserve"> </w:t>
-      </w:r>
-      <w:r>
-        <w:t xml:space="preserve">finite-size runs from</w:t>
-      </w:r>
-      <w:r>
-        <w:t xml:space="preserve"> </w:t>
-      </w:r>
-      <w:r>
-        <w:rPr>
-          <w:rStyle w:val="VerbatimChar"/>
-        </w:rPr>
-        <w:t xml:space="preserve">results/convergence_study.parquet</w:t>
-      </w:r>
-      <w:r>
-        <w:t xml:space="preserve">; figures via</w:t>
-      </w:r>
-      <w:r>
-        <w:t xml:space="preserve"> </w:t>
-      </w:r>
-      <w:r>
-        <w:rPr>
-          <w:rStyle w:val="VerbatimChar"/>
-        </w:rPr>
-        <w:t xml:space="preserve">scripts/make_figures.py</w:t>
-      </w:r>
-      <w:r>
-        <w:t xml:space="preserve">,</w:t>
-      </w:r>
-      <w:r>
-        <w:t xml:space="preserve"> </w:t>
-      </w:r>
-      <w:r>
-        <w:t xml:space="preserve">analysis in</w:t>
-      </w:r>
-      <w:r>
-        <w:t xml:space="preserve"> </w:t>
-      </w:r>
-      <w:r>
-        <w:rPr>
-          <w:rStyle w:val="VerbatimChar"/>
-        </w:rPr>
-        <w:t xml:space="preserve">mlip_dynstab/analysis.py</w:t>
-      </w:r>
-      <w:r>
-        <w:t xml:space="preserve">, the SSCHA root-cause diagnostic in</w:t>
-      </w:r>
-      <w:r>
-        <w:t xml:space="preserve"> </w:t>
-      </w:r>
-      <w:r>
-        <w:rPr>
-          <w:rStyle w:val="VerbatimChar"/>
-        </w:rPr>
-        <w:t xml:space="preserve">scripts/sscha_v4_diag.py</w:t>
-      </w:r>
-      <w:r>
-        <w:t xml:space="preserve">, and the stochastic-reproducibility study (§3.5) via</w:t>
-      </w:r>
-      <w:r>
-        <w:t xml:space="preserve"> </w:t>
-      </w:r>
-      <w:r>
-        <w:rPr>
-          <w:rStyle w:val="VerbatimChar"/>
-        </w:rPr>
-        <w:t xml:space="preserve">scripts/sscha_repro.py</w:t>
-      </w:r>
-      <w:r>
-        <w:t xml:space="preserve"> </w:t>
-      </w:r>
-      <w:r>
-        <w:t xml:space="preserve">(its per-seed frequencies print to the run log rather than to the</w:t>
-      </w:r>
-      <w:r>
-        <w:t xml:space="preserve"> </w:t>
-      </w:r>
-      <w:r>
-        <w:t xml:space="preserve">ledger).</w:t>
-      </w:r>
-    </w:p>
-    <w:bookmarkEnd w:id="26"/>
-    <w:bookmarkStart w:id="27" w:name="acknowledgements"/>
-    <w:p>
-      <w:pPr>
-        <w:pStyle w:val="Heading2"/>
-      </w:pPr>
-      <w:r>
-        <w:t xml:space="preserve">Acknowledgements</w:t>
-      </w:r>
-    </w:p>
-    <w:p>
-      <w:pPr>
-        <w:pStyle w:val="FirstParagraph"/>
-      </w:pPr>
-      <w:r>
-        <w:rPr>
-          <w:i/>
-          <w:iCs/>
-        </w:rPr>
-        <w:t xml:space="preserve">Funding sources and computational resources to be acknowledged before submission.</w:t>
-      </w:r>
-    </w:p>
-    <w:bookmarkEnd w:id="27"/>
-    <w:bookmarkStart w:id="28" w:name="references"/>
-    <w:p>
-      <w:pPr>
-        <w:pStyle w:val="Heading2"/>
-      </w:pPr>
-      <w:r>
-        <w:t xml:space="preserve">References</w:t>
-      </w:r>
-    </w:p>
-    <w:p>
-      <w:pPr>
-        <w:pStyle w:val="Compact"/>
-        <w:numPr>
-          <w:ilvl w:val="0"/>
-          <w:numId w:val="1003"/>
-        </w:numPr>
-      </w:pPr>
-      <w:r>
-        <w:t xml:space="preserve">A. Loew, D. Sun, H.-C. Wang, S. Botti and M. A. L. Marques,</w:t>
-      </w:r>
-      <w:r>
-        <w:t xml:space="preserve"> </w:t>
-      </w:r>
-      <w:r>
-        <w:rPr>
-          <w:i/>
-          <w:iCs/>
-        </w:rPr>
-        <w:t xml:space="preserve">npj Comput. Mater.</w:t>
-      </w:r>
-      <w:r>
-        <w:t xml:space="preserve">, 2025,</w:t>
-      </w:r>
-      <w:r>
-        <w:t xml:space="preserve"> </w:t>
-      </w:r>
-      <w:r>
-        <w:rPr>
-          <w:b/>
-          <w:bCs/>
-        </w:rPr>
-        <w:t xml:space="preserve">11</w:t>
-      </w:r>
-      <w:r>
-        <w:t xml:space="preserve">, 178.</w:t>
-      </w:r>
-    </w:p>
-    <w:p>
-      <w:pPr>
-        <w:pStyle w:val="Compact"/>
-        <w:numPr>
-          <w:ilvl w:val="0"/>
-          <w:numId w:val="1003"/>
-        </w:numPr>
-      </w:pPr>
-      <w:r>
-        <w:t xml:space="preserve">X.-Q. Han, P.-J. Guo, Z.-F. Gao, W.-K. Li and Z.-Y. Lu,</w:t>
-      </w:r>
-      <w:r>
-        <w:t xml:space="preserve"> </w:t>
-      </w:r>
-      <w:r>
-        <w:rPr>
-          <w:i/>
-          <w:iCs/>
-        </w:rPr>
-        <w:t xml:space="preserve">arXiv</w:t>
-      </w:r>
-      <w:r>
-        <w:t xml:space="preserve">, 2025, arXiv:2512.21227.</w:t>
-      </w:r>
-    </w:p>
-    <w:p>
-      <w:pPr>
-        <w:pStyle w:val="Compact"/>
-        <w:numPr>
-          <w:ilvl w:val="0"/>
-          <w:numId w:val="1003"/>
-        </w:numPr>
-      </w:pPr>
-      <w:r>
-        <w:t xml:space="preserve">G. Petretto, S. Dwaraknath, H. P. C. Miranda, D. Winston, M. Giantomassi, M. J. van Setten, X. Gonze, K. A. Persson, G. Hautier and G.-M. Rignanese,</w:t>
-      </w:r>
-      <w:r>
-        <w:t xml:space="preserve"> </w:t>
-      </w:r>
-      <w:r>
-        <w:rPr>
-          <w:i/>
-          <w:iCs/>
-        </w:rPr>
-        <w:t xml:space="preserve">Sci. Data</w:t>
-      </w:r>
-      <w:r>
-        <w:t xml:space="preserve">, 2018,</w:t>
-      </w:r>
-      <w:r>
-        <w:t xml:space="preserve"> </w:t>
-      </w:r>
-      <w:r>
-        <w:rPr>
-          <w:b/>
-          <w:bCs/>
-        </w:rPr>
-        <w:t xml:space="preserve">5</w:t>
-      </w:r>
-      <w:r>
-        <w:t xml:space="preserve">, 180065.</w:t>
-      </w:r>
-    </w:p>
-    <w:p>
-      <w:pPr>
-        <w:pStyle w:val="Compact"/>
-        <w:numPr>
-          <w:ilvl w:val="0"/>
-          <w:numId w:val="1003"/>
-        </w:numPr>
-      </w:pPr>
-      <w:r>
-        <w:t xml:space="preserve">L. Monacelli, R. Bianco, M. Cherubini, M. Calandra, I. Errea and F. Mauri,</w:t>
-      </w:r>
-      <w:r>
-        <w:t xml:space="preserve"> </w:t>
-      </w:r>
-      <w:r>
-        <w:rPr>
-          <w:i/>
-          <w:iCs/>
-        </w:rPr>
-        <w:t xml:space="preserve">J. Phys.: Condens. Matter</w:t>
-      </w:r>
-      <w:r>
-        <w:t xml:space="preserve">, 2021,</w:t>
-      </w:r>
-      <w:r>
-        <w:t xml:space="preserve"> </w:t>
-      </w:r>
-      <w:r>
-        <w:rPr>
-          <w:b/>
-          <w:bCs/>
-        </w:rPr>
-        <w:t xml:space="preserve">33</w:t>
-      </w:r>
-      <w:r>
-        <w:t xml:space="preserve">, 363001.</w:t>
-      </w:r>
-    </w:p>
-    <w:p>
-      <w:pPr>
-        <w:pStyle w:val="Compact"/>
-        <w:numPr>
-          <w:ilvl w:val="0"/>
-          <w:numId w:val="1003"/>
-        </w:numPr>
-      </w:pPr>
-      <w:r>
-        <w:t xml:space="preserve">O. Hellman, I. A. Abrikosov and S. I. Simak,</w:t>
-      </w:r>
-      <w:r>
-        <w:t xml:space="preserve"> </w:t>
-      </w:r>
-      <w:r>
-        <w:rPr>
-          <w:i/>
-          <w:iCs/>
-        </w:rPr>
-        <w:t xml:space="preserve">Phys. Rev. B</w:t>
-      </w:r>
-      <w:r>
-        <w:t xml:space="preserve">, 2011,</w:t>
-      </w:r>
-      <w:r>
-        <w:t xml:space="preserve"> </w:t>
-      </w:r>
-      <w:r>
-        <w:rPr>
-          <w:b/>
-          <w:bCs/>
-        </w:rPr>
-        <w:t xml:space="preserve">84</w:t>
-      </w:r>
-      <w:r>
-        <w:t xml:space="preserve">, 180301(R); O. Hellman, P. Steneteg, I. A. Abrikosov and S. I. Simak,</w:t>
-      </w:r>
-      <w:r>
-        <w:t xml:space="preserve"> </w:t>
-      </w:r>
-      <w:r>
-        <w:rPr>
-          <w:i/>
-          <w:iCs/>
-        </w:rPr>
-        <w:t xml:space="preserve">Phys. Rev. B</w:t>
-      </w:r>
-      <w:r>
-        <w:t xml:space="preserve">, 2013,</w:t>
-      </w:r>
-      <w:r>
-        <w:t xml:space="preserve"> </w:t>
-      </w:r>
-      <w:r>
-        <w:rPr>
-          <w:b/>
-          <w:bCs/>
-        </w:rPr>
-        <w:t xml:space="preserve">87</w:t>
-      </w:r>
-      <w:r>
-        <w:t xml:space="preserve">, 104111.</w:t>
-      </w:r>
-    </w:p>
-    <w:p>
-      <w:pPr>
-        <w:pStyle w:val="Compact"/>
-        <w:numPr>
-          <w:ilvl w:val="0"/>
-          <w:numId w:val="1003"/>
-        </w:numPr>
-      </w:pPr>
-      <w:r>
-        <w:t xml:space="preserve">I. Batatia, P. Benner, Y. Chiang, A. M. Elena, D. P. Kovács, J. Riebesell</w:t>
-      </w:r>
-      <w:r>
-        <w:t xml:space="preserve"> </w:t>
-      </w:r>
-      <w:r>
-        <w:rPr>
-          <w:i/>
-          <w:iCs/>
-        </w:rPr>
-        <w:t xml:space="preserve">et al.</w:t>
-      </w:r>
-      <w:r>
-        <w:t xml:space="preserve">,</w:t>
-      </w:r>
-      <w:r>
-        <w:t xml:space="preserve"> </w:t>
-      </w:r>
-      <w:r>
-        <w:rPr>
-          <w:i/>
-          <w:iCs/>
-        </w:rPr>
-        <w:t xml:space="preserve">arXiv</w:t>
-      </w:r>
-      <w:r>
-        <w:t xml:space="preserve">, 2023, arXiv:2401.00096.</w:t>
-      </w:r>
-    </w:p>
-    <w:p>
-      <w:pPr>
-        <w:pStyle w:val="Compact"/>
-        <w:numPr>
-          <w:ilvl w:val="0"/>
-          <w:numId w:val="1003"/>
-        </w:numPr>
-      </w:pPr>
-      <w:r>
-        <w:t xml:space="preserve">B. Deng, P. Zhong, K. Jun</w:t>
-      </w:r>
-      <w:r>
-        <w:t xml:space="preserve"> </w:t>
-      </w:r>
-      <w:r>
-        <w:rPr>
-          <w:i/>
-          <w:iCs/>
-        </w:rPr>
-        <w:t xml:space="preserve">et al.</w:t>
-      </w:r>
-      <w:r>
-        <w:t xml:space="preserve">,</w:t>
-      </w:r>
-      <w:r>
-        <w:t xml:space="preserve"> </w:t>
-      </w:r>
-      <w:r>
-        <w:rPr>
-          <w:i/>
-          <w:iCs/>
-        </w:rPr>
-        <w:t xml:space="preserve">Nat. Mach. Intell.</w:t>
-      </w:r>
-      <w:r>
-        <w:t xml:space="preserve">, 2023,</w:t>
-      </w:r>
-      <w:r>
-        <w:t xml:space="preserve"> </w:t>
-      </w:r>
-      <w:r>
-        <w:rPr>
-          <w:b/>
-          <w:bCs/>
-        </w:rPr>
-        <w:t xml:space="preserve">5</w:t>
-      </w:r>
-      <w:r>
-        <w:t xml:space="preserve">, 1031.</w:t>
-      </w:r>
-    </w:p>
-    <w:p>
-      <w:pPr>
-        <w:pStyle w:val="Compact"/>
-        <w:numPr>
-          <w:ilvl w:val="0"/>
-          <w:numId w:val="1003"/>
-        </w:numPr>
-      </w:pPr>
-      <w:r>
-        <w:t xml:space="preserve">M. Neumann, J. Gin, B. Rhodes, S. Bennett, Z. Li, H. Choubisa, A. Hussey and J. Godwin,</w:t>
-      </w:r>
-      <w:r>
-        <w:t xml:space="preserve"> </w:t>
-      </w:r>
-      <w:r>
-        <w:rPr>
-          <w:i/>
-          <w:iCs/>
-        </w:rPr>
-        <w:t xml:space="preserve">arXiv</w:t>
-      </w:r>
-      <w:r>
-        <w:t xml:space="preserve">, 2024, arXiv:2410.22570.</w:t>
-      </w:r>
-    </w:p>
-    <w:p>
-      <w:pPr>
-        <w:pStyle w:val="Compact"/>
-        <w:numPr>
-          <w:ilvl w:val="0"/>
-          <w:numId w:val="1003"/>
-        </w:numPr>
-      </w:pPr>
-      <w:r>
-        <w:t xml:space="preserve">Y. Park, J. Kim, S. Hwang and S. Han,</w:t>
-      </w:r>
-      <w:r>
-        <w:t xml:space="preserve"> </w:t>
-      </w:r>
-      <w:r>
-        <w:rPr>
-          <w:i/>
-          <w:iCs/>
-        </w:rPr>
-        <w:t xml:space="preserve">J. Chem. Theory Comput.</w:t>
-      </w:r>
-      <w:r>
-        <w:t xml:space="preserve">, 2024,</w:t>
-      </w:r>
-      <w:r>
-        <w:t xml:space="preserve"> </w:t>
-      </w:r>
-      <w:r>
-        <w:rPr>
-          <w:b/>
-          <w:bCs/>
-        </w:rPr>
-        <w:t xml:space="preserve">20</w:t>
-      </w:r>
-      <w:r>
-        <w:t xml:space="preserve">, 4857.</w:t>
-      </w:r>
-    </w:p>
-    <w:p>
-      <w:pPr>
-        <w:pStyle w:val="Compact"/>
-        <w:numPr>
-          <w:ilvl w:val="0"/>
-          <w:numId w:val="1003"/>
-        </w:numPr>
-      </w:pPr>
-      <w:r>
-        <w:t xml:space="preserve">H. Yang, C. Hu, Y. Zhou</w:t>
-      </w:r>
-      <w:r>
-        <w:t xml:space="preserve"> </w:t>
-      </w:r>
-      <w:r>
-        <w:rPr>
-          <w:i/>
-          <w:iCs/>
-        </w:rPr>
-        <w:t xml:space="preserve">et al.</w:t>
-      </w:r>
-      <w:r>
-        <w:t xml:space="preserve">,</w:t>
-      </w:r>
-      <w:r>
-        <w:t xml:space="preserve"> </w:t>
-      </w:r>
-      <w:r>
-        <w:rPr>
-          <w:i/>
-          <w:iCs/>
-        </w:rPr>
-        <w:t xml:space="preserve">arXiv</w:t>
-      </w:r>
-      <w:r>
-        <w:t xml:space="preserve">, 2024, arXiv:2405.04967.</w:t>
-      </w:r>
-    </w:p>
-    <w:p>
-      <w:pPr>
-        <w:pStyle w:val="Compact"/>
-        <w:numPr>
-          <w:ilvl w:val="0"/>
-          <w:numId w:val="1003"/>
-        </w:numPr>
-      </w:pPr>
-      <w:r>
-        <w:t xml:space="preserve">T. Tadano and S. Tsuneyuki,</w:t>
-      </w:r>
-      <w:r>
-        <w:t xml:space="preserve"> </w:t>
-      </w:r>
-      <w:r>
-        <w:rPr>
-          <w:i/>
-          <w:iCs/>
-        </w:rPr>
-        <w:t xml:space="preserve">Phys. Rev. B</w:t>
-      </w:r>
-      <w:r>
-        <w:t xml:space="preserve">, 2015,</w:t>
-      </w:r>
-      <w:r>
-        <w:t xml:space="preserve"> </w:t>
-      </w:r>
-      <w:r>
-        <w:rPr>
-          <w:b/>
-          <w:bCs/>
-        </w:rPr>
-        <w:t xml:space="preserve">92</w:t>
-      </w:r>
-      <w:r>
-        <w:t xml:space="preserve">, 054301.</w:t>
-      </w:r>
-    </w:p>
-    <w:p>
-      <w:pPr>
-        <w:pStyle w:val="Compact"/>
-        <w:numPr>
-          <w:ilvl w:val="0"/>
-          <w:numId w:val="1003"/>
-        </w:numPr>
-      </w:pPr>
-      <w:r>
-        <w:t xml:space="preserve">W. Zhong, D. Vanderbilt and K. M. Rabe,</w:t>
-      </w:r>
-      <w:r>
-        <w:t xml:space="preserve"> </w:t>
-      </w:r>
-      <w:r>
-        <w:rPr>
-          <w:i/>
-          <w:iCs/>
-        </w:rPr>
-        <w:t xml:space="preserve">Phys. Rev. Lett.</w:t>
-      </w:r>
-      <w:r>
-        <w:t xml:space="preserve">, 1994,</w:t>
-      </w:r>
-      <w:r>
-        <w:t xml:space="preserve"> </w:t>
-      </w:r>
-      <w:r>
-        <w:rPr>
-          <w:b/>
-          <w:bCs/>
-        </w:rPr>
-        <w:t xml:space="preserve">73</w:t>
-      </w:r>
-      <w:r>
-        <w:t xml:space="preserve">, 1861.</w:t>
-      </w:r>
-    </w:p>
-    <w:p>
-      <w:pPr>
-        <w:pStyle w:val="Compact"/>
-        <w:numPr>
-          <w:ilvl w:val="0"/>
-          <w:numId w:val="1003"/>
-        </w:numPr>
-      </w:pPr>
-      <w:r>
-        <w:t xml:space="preserve">A. Marronnier</w:t>
-      </w:r>
-      <w:r>
-        <w:t xml:space="preserve"> </w:t>
-      </w:r>
-      <w:r>
-        <w:rPr>
-          <w:i/>
-          <w:iCs/>
-        </w:rPr>
-        <w:t xml:space="preserve">et al.</w:t>
-      </w:r>
-      <w:r>
-        <w:t xml:space="preserve">,</w:t>
-      </w:r>
-      <w:r>
-        <w:t xml:space="preserve"> </w:t>
-      </w:r>
-      <w:r>
-        <w:rPr>
-          <w:i/>
-          <w:iCs/>
-        </w:rPr>
-        <w:t xml:space="preserve">ACS Nano</w:t>
-      </w:r>
-      <w:r>
-        <w:t xml:space="preserve">, 2018,</w:t>
-      </w:r>
-      <w:r>
-        <w:t xml:space="preserve"> </w:t>
-      </w:r>
-      <w:r>
-        <w:rPr>
-          <w:b/>
-          <w:bCs/>
-        </w:rPr>
-        <w:t xml:space="preserve">12</w:t>
-      </w:r>
-      <w:r>
-        <w:t xml:space="preserve">, 3477.</w:t>
-      </w:r>
-    </w:p>
-    <w:p>
-      <w:pPr>
-        <w:pStyle w:val="Compact"/>
-        <w:numPr>
-          <w:ilvl w:val="0"/>
-          <w:numId w:val="1003"/>
-        </w:numPr>
-      </w:pPr>
-      <w:r>
-        <w:t xml:space="preserve">L. Monacelli and N. Marzari,</w:t>
-      </w:r>
-      <w:r>
-        <w:t xml:space="preserve"> </w:t>
-      </w:r>
-      <w:r>
-        <w:rPr>
-          <w:i/>
-          <w:iCs/>
-        </w:rPr>
-        <w:t xml:space="preserve">Chem. Mater.</w:t>
-      </w:r>
-      <w:r>
-        <w:t xml:space="preserve">, 2023, DOI: 10.1021/acs.chemmater.2c03475.</w:t>
-      </w:r>
-    </w:p>
-    <w:p>
-      <w:pPr>
-        <w:pStyle w:val="Compact"/>
-        <w:numPr>
-          <w:ilvl w:val="0"/>
-          <w:numId w:val="1003"/>
-        </w:numPr>
-      </w:pPr>
-      <w:r>
-        <w:t xml:space="preserve">W. Petry</w:t>
-      </w:r>
-      <w:r>
-        <w:t xml:space="preserve"> </w:t>
-      </w:r>
-      <w:r>
-        <w:rPr>
-          <w:i/>
-          <w:iCs/>
-        </w:rPr>
-        <w:t xml:space="preserve">et al.</w:t>
-      </w:r>
-      <w:r>
-        <w:t xml:space="preserve">,</w:t>
-      </w:r>
-      <w:r>
-        <w:t xml:space="preserve"> </w:t>
-      </w:r>
-      <w:r>
-        <w:rPr>
-          <w:i/>
-          <w:iCs/>
-        </w:rPr>
-        <w:t xml:space="preserve">Phys. Rev. B</w:t>
-      </w:r>
-      <w:r>
-        <w:t xml:space="preserve">, 1991,</w:t>
-      </w:r>
-      <w:r>
-        <w:t xml:space="preserve"> </w:t>
-      </w:r>
-      <w:r>
-        <w:rPr>
-          <w:b/>
-          <w:bCs/>
-        </w:rPr>
-        <w:t xml:space="preserve">43</w:t>
-      </w:r>
-      <w:r>
-        <w:t xml:space="preserve">, 10933; A. Heiming</w:t>
-      </w:r>
-      <w:r>
-        <w:t xml:space="preserve"> </w:t>
-      </w:r>
-      <w:r>
-        <w:rPr>
-          <w:i/>
-          <w:iCs/>
-        </w:rPr>
-        <w:t xml:space="preserve">et al.</w:t>
-      </w:r>
-      <w:r>
-        <w:t xml:space="preserve">,</w:t>
-      </w:r>
-      <w:r>
-        <w:t xml:space="preserve"> </w:t>
-      </w:r>
-      <w:r>
-        <w:rPr>
-          <w:i/>
-          <w:iCs/>
-        </w:rPr>
-        <w:t xml:space="preserve">Phys. Rev. B</w:t>
-      </w:r>
-      <w:r>
-        <w:t xml:space="preserve">, 1991,</w:t>
-      </w:r>
-      <w:r>
-        <w:t xml:space="preserve"> </w:t>
-      </w:r>
-      <w:r>
-        <w:rPr>
-          <w:b/>
-          <w:bCs/>
-        </w:rPr>
-        <w:t xml:space="preserve">43</w:t>
-      </w:r>
-      <w:r>
-        <w:t xml:space="preserve">, 10948.</w:t>
-      </w:r>
-    </w:p>
-    <w:p>
-      <w:pPr>
-        <w:pStyle w:val="Compact"/>
-        <w:numPr>
-          <w:ilvl w:val="0"/>
-          <w:numId w:val="1003"/>
-        </w:numPr>
-      </w:pPr>
-      <w:r>
-        <w:t xml:space="preserve">K. Parlinski, Z. Q. Li and Y. Kawazoe,</w:t>
-      </w:r>
-      <w:r>
-        <w:t xml:space="preserve"> </w:t>
-      </w:r>
-      <w:r>
-        <w:rPr>
-          <w:i/>
-          <w:iCs/>
-        </w:rPr>
-        <w:t xml:space="preserve">Phys. Rev. Lett.</w:t>
-      </w:r>
-      <w:r>
-        <w:t xml:space="preserve">, 1997,</w:t>
-      </w:r>
-      <w:r>
-        <w:t xml:space="preserve"> </w:t>
-      </w:r>
-      <w:r>
-        <w:rPr>
-          <w:b/>
-          <w:bCs/>
-        </w:rPr>
-        <w:t xml:space="preserve">78</w:t>
-      </w:r>
-      <w:r>
-        <w:t xml:space="preserve">, 4063.</w:t>
-      </w:r>
-    </w:p>
-    <w:p>
-      <w:pPr>
-        <w:pStyle w:val="Compact"/>
-        <w:numPr>
-          <w:ilvl w:val="0"/>
-          <w:numId w:val="1003"/>
-        </w:numPr>
-      </w:pPr>
-      <w:r>
-        <w:t xml:space="preserve">D. A. Wood and N. Marzari,</w:t>
-      </w:r>
-      <w:r>
-        <w:t xml:space="preserve"> </w:t>
-      </w:r>
-      <w:r>
-        <w:rPr>
-          <w:i/>
-          <w:iCs/>
-        </w:rPr>
-        <w:t xml:space="preserve">Phys. Rev. B</w:t>
-      </w:r>
-      <w:r>
-        <w:t xml:space="preserve">, 2007,</w:t>
-      </w:r>
-      <w:r>
-        <w:t xml:space="preserve"> </w:t>
-      </w:r>
-      <w:r>
-        <w:rPr>
-          <w:b/>
-          <w:bCs/>
-        </w:rPr>
-        <w:t xml:space="preserve">76</w:t>
-      </w:r>
-      <w:r>
-        <w:t xml:space="preserve">, 134301.</w:t>
-      </w:r>
-    </w:p>
-    <w:p>
-      <w:pPr>
-        <w:pStyle w:val="Compact"/>
-        <w:numPr>
-          <w:ilvl w:val="0"/>
-          <w:numId w:val="1003"/>
-        </w:numPr>
-      </w:pPr>
-      <w:r>
-        <w:t xml:space="preserve">A. Ranalli</w:t>
-      </w:r>
-      <w:r>
-        <w:t xml:space="preserve"> </w:t>
-      </w:r>
-      <w:r>
-        <w:rPr>
-          <w:i/>
-          <w:iCs/>
-        </w:rPr>
-        <w:t xml:space="preserve">et al.</w:t>
-      </w:r>
-      <w:r>
-        <w:t xml:space="preserve">,</w:t>
-      </w:r>
-      <w:r>
-        <w:t xml:space="preserve"> </w:t>
-      </w:r>
-      <w:r>
-        <w:rPr>
-          <w:i/>
-          <w:iCs/>
-        </w:rPr>
-        <w:t xml:space="preserve">Adv. Quantum Technol.</w:t>
-      </w:r>
-      <w:r>
-        <w:t xml:space="preserve">, 2023,</w:t>
-      </w:r>
-      <w:r>
-        <w:t xml:space="preserve"> </w:t>
-      </w:r>
-      <w:r>
-        <w:rPr>
-          <w:b/>
-          <w:bCs/>
-        </w:rPr>
-        <w:t xml:space="preserve">6</w:t>
-      </w:r>
-      <w:r>
-        <w:t xml:space="preserve">, 2200131.</w:t>
-      </w:r>
-    </w:p>
-    <w:bookmarkEnd w:id="28"/>
-    <w:bookmarkStart w:id="47" w:name="figures"/>
-    <w:p>
-      <w:pPr>
-        <w:pStyle w:val="Heading2"/>
-      </w:pPr>
-      <w:r>
-        <w:t xml:space="preserve">Figures</w:t>
-      </w:r>
-    </w:p>
-    <w:p>
-      <w:pPr>
         <w:pStyle w:val="CaptionedFigure"/>
       </w:pPr>
       <w:r>
         <w:drawing>
           <wp:inline>
-            <wp:extent cx="4784784" cy="3864633"/>
+            <wp:extent cx="5334000" cy="1866899"/>
             <wp:effectExtent b="0" l="0" r="0" t="0"/>
-            <wp:docPr descr="Fig. 1 Harmonic false-stable and false-unstable call counts versus the imaginary-frequency tolerance (§3.1). The default −0.1 THz sits in the stable basin between the false-unstable flood at strict tolerance and the false-stable inflation at loose tolerance." title="" id="30" name="Picture"/>
+            <wp:docPr descr="Fig. 3 Multi-mode SSCHA dynamic-stabilisation curves for bcc Ti/Zr/Hf, five models, versus temperature (§3.3). All models stabilise the bcc phase by ≤50 K; the margin to the stability boundary (MatterSim/ORB-v2 hugging ~0.4 THz, MACE-MP-0 firmly stable ~1.8 THz) discriminates the models." title="" id="26" name="Picture"/>
             <a:graphic>
               <a:graphicData uri="http://schemas.openxmlformats.org/drawingml/2006/picture">
                 <pic:pic>
                   <pic:nvPicPr>
-                    <pic:cNvPr descr="../results/figures/fig_tolerance_sweep.png" id="31" name="Picture"/>
+                    <pic:cNvPr descr="../results/figures/fig_sscha_bcc.png" id="27" name="Picture"/>
                     <pic:cNvPicPr>
                       <a:picLocks noChangeArrowheads="1" noChangeAspect="1"/>
                     </pic:cNvPicPr>
                   </pic:nvPicPr>
                   <pic:blipFill>
-                    <a:blip r:embed="rId29"/>
-                    <a:stretch>
-                      <a:fillRect/>
-                    </a:stretch>
-                  </pic:blipFill>
-                  <pic:spPr bwMode="auto">
-                    <a:xfrm>
-                      <a:off x="0" y="0"/>
-                      <a:ext cx="4784784" cy="3864633"/>
-                    </a:xfrm>
-                    <a:prstGeom prst="rect">
-                      <a:avLst/>
-                    </a:prstGeom>
-                    <a:noFill/>
-                    <a:ln w="9525">
-                      <a:noFill/>
-                      <a:headEnd/>
-                      <a:tailEnd/>
-                    </a:ln>
-                  </pic:spPr>
-                </pic:pic>
-              </a:graphicData>
-            </a:graphic>
-          </wp:inline>
-        </w:drawing>
-      </w:r>
-    </w:p>
-    <w:p>
-      <w:pPr>
-        <w:pStyle w:val="ImageCaption"/>
-      </w:pPr>
-      <w:r>
-        <w:rPr>
-          <w:b/>
-          <w:bCs/>
-        </w:rPr>
-        <w:t xml:space="preserve">Fig. 1</w:t>
-      </w:r>
-      <w:r>
-        <w:t xml:space="preserve"> </w:t>
-      </w:r>
-      <w:r>
-        <w:t xml:space="preserve">Harmonic false-stable and false-unstable call counts versus the</w:t>
-      </w:r>
-      <w:r>
-        <w:t xml:space="preserve"> </w:t>
-      </w:r>
-      <w:r>
-        <w:t xml:space="preserve">imaginary-frequency tolerance (§3.1). The default −0.1 THz sits in the stable basin between the</w:t>
-      </w:r>
-      <w:r>
-        <w:t xml:space="preserve"> </w:t>
-      </w:r>
-      <w:r>
-        <w:t xml:space="preserve">false-unstable flood at strict tolerance and the false-stable inflation at loose tolerance.</w:t>
-      </w:r>
-    </w:p>
-    <w:p>
-      <w:pPr>
-        <w:pStyle w:val="CaptionedFigure"/>
-      </w:pPr>
-      <w:r>
-        <w:drawing>
-          <wp:inline>
-            <wp:extent cx="5334000" cy="5744307"/>
-            <wp:effectExtent b="0" l="0" r="0" t="0"/>
-            <wp:docPr descr="Fig. 2 Per-system minimum effective frequency across the five models (§3.1–3.2). The “softening toward zero” of the harmonically-unstable systems is the physics; per-system minima, not binary rates, are the right reporting unit." title="" id="33" name="Picture"/>
-            <a:graphic>
-              <a:graphicData uri="http://schemas.openxmlformats.org/drawingml/2006/picture">
-                <pic:pic>
-                  <pic:nvPicPr>
-                    <pic:cNvPr descr="../results/figures/fig_softmode_heat.png" id="34" name="Picture"/>
-                    <pic:cNvPicPr>
-                      <a:picLocks noChangeArrowheads="1" noChangeAspect="1"/>
-                    </pic:cNvPicPr>
-                  </pic:nvPicPr>
-                  <pic:blipFill>
-                    <a:blip r:embed="rId32"/>
-                    <a:stretch>
-                      <a:fillRect/>
-                    </a:stretch>
-                  </pic:blipFill>
-                  <pic:spPr bwMode="auto">
-                    <a:xfrm>
-                      <a:off x="0" y="0"/>
-                      <a:ext cx="5334000" cy="5744307"/>
-                    </a:xfrm>
-                    <a:prstGeom prst="rect">
-                      <a:avLst/>
-                    </a:prstGeom>
-                    <a:noFill/>
-                    <a:ln w="9525">
-                      <a:noFill/>
-                      <a:headEnd/>
-                      <a:tailEnd/>
-                    </a:ln>
-                  </pic:spPr>
-                </pic:pic>
-              </a:graphicData>
-            </a:graphic>
-          </wp:inline>
-        </w:drawing>
-      </w:r>
-    </w:p>
-    <w:p>
-      <w:pPr>
-        <w:pStyle w:val="ImageCaption"/>
-      </w:pPr>
-      <w:r>
-        <w:rPr>
-          <w:b/>
-          <w:bCs/>
-        </w:rPr>
-        <w:t xml:space="preserve">Fig. 2</w:t>
-      </w:r>
-      <w:r>
-        <w:t xml:space="preserve"> </w:t>
-      </w:r>
-      <w:r>
-        <w:t xml:space="preserve">Per-system minimum effective frequency across the five models (§3.1–3.2).</w:t>
-      </w:r>
-      <w:r>
-        <w:t xml:space="preserve"> </w:t>
-      </w:r>
-      <w:r>
-        <w:t xml:space="preserve">The</w:t>
-      </w:r>
-      <w:r>
-        <w:t xml:space="preserve"> </w:t>
-      </w:r>
-      <w:r>
-        <w:t xml:space="preserve">“softening toward zero”</w:t>
-      </w:r>
-      <w:r>
-        <w:t xml:space="preserve"> </w:t>
-      </w:r>
-      <w:r>
-        <w:t xml:space="preserve">of the harmonically-unstable systems is the physics; per-system minima,</w:t>
-      </w:r>
-      <w:r>
-        <w:t xml:space="preserve"> </w:t>
-      </w:r>
-      <w:r>
-        <w:t xml:space="preserve">not binary rates, are the right reporting unit.</w:t>
-      </w:r>
-    </w:p>
-    <w:p>
-      <w:pPr>
-        <w:pStyle w:val="CaptionedFigure"/>
-      </w:pPr>
-      <w:r>
-        <w:drawing>
-          <wp:inline>
-            <wp:extent cx="5334000" cy="1866899"/>
-            <wp:effectExtent b="0" l="0" r="0" t="0"/>
-            <wp:docPr descr="Fig. 3 Multi-mode SSCHA dynamic-stabilisation curves for bcc Ti/Zr/Hf, five models, versus temperature (§3.3). All models stabilise the bcc phase by ≤50 K; the margin to the stability boundary (MatterSim/ORB-v2 hugging ~0.4 THz, MACE-MP-0 firmly stable ~1.8 THz) discriminates the models." title="" id="36" name="Picture"/>
-            <a:graphic>
-              <a:graphicData uri="http://schemas.openxmlformats.org/drawingml/2006/picture">
-                <pic:pic>
-                  <pic:nvPicPr>
-                    <pic:cNvPr descr="../results/figures/fig_sscha_bcc.png" id="37" name="Picture"/>
-                    <pic:cNvPicPr>
-                      <a:picLocks noChangeArrowheads="1" noChangeAspect="1"/>
-                    </pic:cNvPicPr>
-                  </pic:nvPicPr>
-                  <pic:blipFill>
-                    <a:blip r:embed="rId35"/>
+                    <a:blip r:embed="rId25"/>
                     <a:stretch>
                       <a:fillRect/>
                     </a:stretch>
@@ -5318,18 +3377,18 @@
           <wp:inline>
             <wp:extent cx="5334000" cy="5156200"/>
             <wp:effectExtent b="0" l="0" r="0" t="0"/>
-            <wp:docPr descr="Fig. 4 Soft-mode screen vs gold-standard SSCHA minimum frequency on bcc (§3.3): the cheap screen tracks SSCHA on the family where the gold standard is trustworthy." title="" id="39" name="Picture"/>
+            <wp:docPr descr="Fig. 4 Soft-mode screen vs gold-standard SSCHA minimum frequency on bcc (§3.3): the cheap screen tracks SSCHA on the family where the gold standard is trustworthy." title="" id="29" name="Picture"/>
             <a:graphic>
               <a:graphicData uri="http://schemas.openxmlformats.org/drawingml/2006/picture">
                 <pic:pic>
                   <pic:nvPicPr>
-                    <pic:cNvPr descr="../results/figures/fig_method_agreement.png" id="40" name="Picture"/>
+                    <pic:cNvPr descr="../results/figures/fig_method_agreement.png" id="30" name="Picture"/>
                     <pic:cNvPicPr>
                       <a:picLocks noChangeArrowheads="1" noChangeAspect="1"/>
                     </pic:cNvPicPr>
                   </pic:nvPicPr>
                   <pic:blipFill>
-                    <a:blip r:embed="rId38"/>
+                    <a:blip r:embed="rId28"/>
                     <a:stretch>
                       <a:fillRect/>
                     </a:stretch>
@@ -5388,6 +3447,86 @@
     </w:p>
     <w:p>
       <w:pPr>
+        <w:pStyle w:val="BodyText"/>
+      </w:pPr>
+      <w:r>
+        <w:rPr>
+          <w:b/>
+          <w:bCs/>
+        </w:rPr>
+        <w:t xml:space="preserve">Ferroelectric perovskites — SSCHA systematically false-stabilises.</w:t>
+      </w:r>
+      <w:r>
+        <w:t xml:space="preserve"> </w:t>
+      </w:r>
+      <w:r>
+        <w:t xml:space="preserve">On the same FE</w:t>
+      </w:r>
+      <w:r>
+        <w:t xml:space="preserve"> </w:t>
+      </w:r>
+      <w:r>
+        <w:t xml:space="preserve">perovskites at T ≤ 300 K where the screen achieves 0.77 recall, SSCHA correctly identifies the</w:t>
+      </w:r>
+      <w:r>
+        <w:t xml:space="preserve"> </w:t>
+      </w:r>
+      <w:r>
+        <w:t xml:space="preserve">instability in only</w:t>
+      </w:r>
+      <w:r>
+        <w:t xml:space="preserve"> </w:t>
+      </w:r>
+      <w:r>
+        <w:rPr>
+          <w:b/>
+          <w:bCs/>
+        </w:rPr>
+        <w:t xml:space="preserve">7 of 30</w:t>
+      </w:r>
+      <w:r>
+        <w:t xml:space="preserve"> </w:t>
+      </w:r>
+      <w:r>
+        <w:t xml:space="preserve">units (recall 0.23), and the perovskite SSCHA runs include six</w:t>
+      </w:r>
+      <w:r>
+        <w:t xml:space="preserve"> </w:t>
+      </w:r>
+      <w:r>
+        <w:t xml:space="preserve">numerical blow-ups (minimum frequencies down to −2×10⁶ THz, concentrated in the float32 ORB-v2</w:t>
+      </w:r>
+      <w:r>
+        <w:t xml:space="preserve"> </w:t>
+      </w:r>
+      <w:r>
+        <w:t xml:space="preserve">runs). The contrast is the cautionary result: the expensive gold standard is</w:t>
+      </w:r>
+      <w:r>
+        <w:t xml:space="preserve"> </w:t>
+      </w:r>
+      <w:r>
+        <w:rPr>
+          <w:i/>
+          <w:iCs/>
+        </w:rPr>
+        <w:t xml:space="preserve">less</w:t>
+      </w:r>
+      <w:r>
+        <w:t xml:space="preserve"> </w:t>
+      </w:r>
+      <w:r>
+        <w:t xml:space="preserve">reliable than the cheap screen in exactly the displacive regime that dominates</w:t>
+      </w:r>
+      <w:r>
+        <w:t xml:space="preserve"> </w:t>
+      </w:r>
+      <w:r>
+        <w:t xml:space="preserve">generative-CSP outputs (Fig. 5).</w:t>
+      </w:r>
+    </w:p>
+    <w:p>
+      <w:pPr>
         <w:pStyle w:val="CaptionedFigure"/>
       </w:pPr>
       <w:r>
@@ -5395,18 +3534,18 @@
           <wp:inline>
             <wp:extent cx="4232694" cy="4232694"/>
             <wp:effectExtent b="0" l="0" r="0" t="0"/>
-            <wp:docPr descr="Fig. 5 Recall of the displacive (ferroelectric-perovskite) instability at T ≤ 300 K: the cheap soft-mode screen (0.77) versus the expensive SSCHA (0.23) (§3.3). The cautionary result — the gold standard is less reliable than the screen in the regime that matters most." title="" id="42" name="Picture"/>
+            <wp:docPr descr="Fig. 5 Recall of the displacive (ferroelectric-perovskite) instability at T ≤ 300 K: the cheap soft-mode screen (0.77) versus the expensive SSCHA (0.23) (§3.3). The cautionary result — the gold standard is less reliable than the screen in the regime that matters most." title="" id="32" name="Picture"/>
             <a:graphic>
               <a:graphicData uri="http://schemas.openxmlformats.org/drawingml/2006/picture">
                 <pic:pic>
                   <pic:nvPicPr>
-                    <pic:cNvPr descr="../results/figures/fig_displacive_recall.png" id="43" name="Picture"/>
+                    <pic:cNvPr descr="../results/figures/fig_displacive_recall.png" id="33" name="Picture"/>
                     <pic:cNvPicPr>
                       <a:picLocks noChangeArrowheads="1" noChangeAspect="1"/>
                     </pic:cNvPicPr>
                   </pic:nvPicPr>
                   <pic:blipFill>
-                    <a:blip r:embed="rId41"/>
+                    <a:blip r:embed="rId31"/>
                     <a:stretch>
                       <a:fillRect/>
                     </a:stretch>
@@ -5487,6 +3626,446 @@
     </w:p>
     <w:p>
       <w:pPr>
+        <w:pStyle w:val="BodyText"/>
+      </w:pPr>
+      <w:r>
+        <w:rPr>
+          <w:b/>
+          <w:bCs/>
+        </w:rPr>
+        <w:t xml:space="preserve">Root cause.</w:t>
+      </w:r>
+      <w:r>
+        <w:t xml:space="preserve"> </w:t>
+      </w:r>
+      <w:r>
+        <w:t xml:space="preserve">A controlled diagnostic on cubic BaTiO₃ (MACE-MP-0, 100 K) isolates the</w:t>
+      </w:r>
+      <w:r>
+        <w:t xml:space="preserve"> </w:t>
+      </w:r>
+      <w:r>
+        <w:t xml:space="preserve">mechanism. The harmonic soft mode is −5.6 THz (correctly unstable), but</w:t>
+      </w:r>
+      <w:r>
+        <w:t xml:space="preserve"> </w:t>
+      </w:r>
+      <w:r>
+        <w:rPr>
+          <w:rStyle w:val="VerbatimChar"/>
+        </w:rPr>
+        <w:t xml:space="preserve">ForcePositiveDefinite</w:t>
+      </w:r>
+      <w:r>
+        <w:t xml:space="preserve"> </w:t>
+      </w:r>
+      <w:r>
+        <w:t xml:space="preserve">at initialisation erases it (+2.88 THz); the SCHA auxiliary matrix then stays stuck at +2.89</w:t>
+      </w:r>
+      <w:r>
+        <w:t xml:space="preserve"> </w:t>
+      </w:r>
+      <w:r>
+        <w:t xml:space="preserve">THz because at low temperature its narrow Gaussian width never samples the anharmonic</w:t>
+      </w:r>
+      <w:r>
+        <w:t xml:space="preserve"> </w:t>
+      </w:r>
+      <w:r>
+        <w:t xml:space="preserve">double-well; and the free-energy Hessian without the fourth-order term echoes that positive</w:t>
+      </w:r>
+      <w:r>
+        <w:t xml:space="preserve"> </w:t>
+      </w:r>
+      <w:r>
+        <w:t xml:space="preserve">curvature (+2.87 THz) → false-stable. Enabling the fourth-order term (</w:t>
+      </w:r>
+      <w:r>
+        <w:rPr>
+          <w:rStyle w:val="VerbatimChar"/>
+        </w:rPr>
+        <w:t xml:space="preserve">include_v4=True</w:t>
+      </w:r>
+      <w:r>
+        <w:t xml:space="preserve">) is the</w:t>
+      </w:r>
+      <w:r>
+        <w:t xml:space="preserve"> </w:t>
+      </w:r>
+      <w:r>
+        <w:t xml:space="preserve">only route that could recover the instability, but it ran &gt;18 min on a</w:t>
+      </w:r>
+      <w:r>
+        <w:t xml:space="preserve"> </w:t>
+      </w:r>
+      <w:r>
+        <w:rPr>
+          <w:i/>
+          <w:iCs/>
+        </w:rPr>
+        <w:t xml:space="preserve">single</w:t>
+      </w:r>
+      <w:r>
+        <w:t xml:space="preserve"> </w:t>
+      </w:r>
+      <w:r>
+        <w:t xml:space="preserve">unit without</w:t>
+      </w:r>
+      <w:r>
+        <w:t xml:space="preserve"> </w:t>
+      </w:r>
+      <w:r>
+        <w:t xml:space="preserve">finishing (≈tens of hours per unit at grid scale) and is numerically viable only in float64.</w:t>
+      </w:r>
+      <w:r>
+        <w:t xml:space="preserve"> </w:t>
+      </w:r>
+      <w:r>
+        <w:t xml:space="preserve">The physically correct SSCHA treatment of a deep displacive instability is to relax the</w:t>
+      </w:r>
+      <w:r>
+        <w:t xml:space="preserve"> </w:t>
+      </w:r>
+      <w:r>
+        <w:rPr>
+          <w:i/>
+          <w:iCs/>
+        </w:rPr>
+        <w:t xml:space="preserve">structure</w:t>
+      </w:r>
+      <w:r>
+        <w:t xml:space="preserve"> </w:t>
+      </w:r>
+      <w:r>
+        <w:t xml:space="preserve">into the distorted phase — which changes the question from</w:t>
+      </w:r>
+      <w:r>
+        <w:t xml:space="preserve"> </w:t>
+      </w:r>
+      <w:r>
+        <w:t xml:space="preserve">“is the cubic phase</w:t>
+      </w:r>
+      <w:r>
+        <w:t xml:space="preserve"> </w:t>
+      </w:r>
+      <w:r>
+        <w:t xml:space="preserve">dynamically stable”</w:t>
+      </w:r>
+      <w:r>
+        <w:t xml:space="preserve"> </w:t>
+      </w:r>
+      <w:r>
+        <w:t xml:space="preserve">to</w:t>
+      </w:r>
+      <w:r>
+        <w:t xml:space="preserve"> </w:t>
+      </w:r>
+      <w:r>
+        <w:t xml:space="preserve">“what is the ground state,”</w:t>
+      </w:r>
+      <w:r>
+        <w:t xml:space="preserve"> </w:t>
+      </w:r>
+      <w:r>
+        <w:t xml:space="preserve">and so cannot serve as the benchmark</w:t>
+      </w:r>
+      <w:r>
+        <w:t xml:space="preserve"> </w:t>
+      </w:r>
+      <w:r>
+        <w:t xml:space="preserve">criterion. We therefore use SSCHA as the bcc gold standard and the experimental transition</w:t>
+      </w:r>
+      <w:r>
+        <w:t xml:space="preserve"> </w:t>
+      </w:r>
+      <w:r>
+        <w:t xml:space="preserve">temperature (the SrTiO₃ gate, §2.4) as the validation for the perovskite screen.</w:t>
+      </w:r>
+    </w:p>
+    <w:p>
+      <w:pPr>
+        <w:pStyle w:val="BodyText"/>
+      </w:pPr>
+      <w:r>
+        <w:rPr>
+          <w:b/>
+          <w:bCs/>
+        </w:rPr>
+        <w:t xml:space="preserve">Cubic fluorites confirm the failure is systematic, not numerical.</w:t>
+      </w:r>
+      <w:r>
+        <w:t xml:space="preserve"> </w:t>
+      </w:r>
+      <w:r>
+        <w:t xml:space="preserve">Cubic ZrO₂ (the &gt;2600 K</w:t>
+      </w:r>
+      <w:r>
+        <w:t xml:space="preserve"> </w:t>
+      </w:r>
+      <w:r>
+        <w:t xml:space="preserve">phase; harmonically unstable via the X-point oxygen mode at all temperatures studied) is a</w:t>
+      </w:r>
+      <w:r>
+        <w:t xml:space="preserve"> </w:t>
+      </w:r>
+      <w:r>
+        <w:t xml:space="preserve">cleaner test because its instability is shallower than the FE perovskites and does not trigger</w:t>
+      </w:r>
+      <w:r>
+        <w:t xml:space="preserve"> </w:t>
+      </w:r>
+      <w:r>
+        <w:t xml:space="preserve">the float32 blow-ups. The soft-mode screen returns roughly −6.4 to −8 THz for all five models at</w:t>
+      </w:r>
+      <w:r>
+        <w:t xml:space="preserve"> </w:t>
+      </w:r>
+      <w:r>
+        <w:t xml:space="preserve">every temperature (100–900 K) — correctly and consistently unstable. SSCHA instead returns ≈ +3 THz</w:t>
+      </w:r>
+      <w:r>
+        <w:t xml:space="preserve"> </w:t>
+      </w:r>
+      <w:r>
+        <w:t xml:space="preserve">at 100 K for all five models (</w:t>
+      </w:r>
+      <w:r>
+        <w:rPr>
+          <w:b/>
+          <w:bCs/>
+        </w:rPr>
+        <w:t xml:space="preserve">false-stable</w:t>
+      </w:r>
+      <w:r>
+        <w:t xml:space="preserve">) and then, perversely,</w:t>
+      </w:r>
+      <w:r>
+        <w:t xml:space="preserve"> </w:t>
+      </w:r>
+      <w:r>
+        <w:rPr>
+          <w:i/>
+          <w:iCs/>
+        </w:rPr>
+        <w:t xml:space="preserve">destabilises</w:t>
+      </w:r>
+      <w:r>
+        <w:t xml:space="preserve"> </w:t>
+      </w:r>
+      <w:r>
+        <w:t xml:space="preserve">with</w:t>
+      </w:r>
+      <w:r>
+        <w:t xml:space="preserve"> </w:t>
+      </w:r>
+      <w:r>
+        <w:t xml:space="preserve">temperature (e.g. MACE-MP-0 −4.6 THz, ORB-v2 −10.2 THz at 900 K) — both the wrong sign at low T</w:t>
+      </w:r>
+      <w:r>
+        <w:t xml:space="preserve"> </w:t>
+      </w:r>
+      <w:r>
+        <w:t xml:space="preserve">and the wrong temperature trend. That SSCHA fails the same way on a numerically well-behaved,</w:t>
+      </w:r>
+      <w:r>
+        <w:t xml:space="preserve"> </w:t>
+      </w:r>
+      <w:r>
+        <w:t xml:space="preserve">shallower instability shows the false-stable behaviour is intrinsic to the fixed-reference SSCHA</w:t>
+      </w:r>
+      <w:r>
+        <w:t xml:space="preserve"> </w:t>
+      </w:r>
+      <w:r>
+        <w:t xml:space="preserve">deployment (§ root cause), not an artifact of the deepest perovskite wells. HfO₂ shows the same</w:t>
+      </w:r>
+      <w:r>
+        <w:t xml:space="preserve"> </w:t>
+      </w:r>
+      <w:r>
+        <w:t xml:space="preserve">SSCHA false-stable pattern (all models +2.0 to +2.6 THz at 100 K, then destabilising to</w:t>
+      </w:r>
+      <w:r>
+        <w:t xml:space="preserve"> </w:t>
+      </w:r>
+      <w:r>
+        <w:t xml:space="preserve">−4.3/−7.2 THz for CHGNet/ORB-v2 by 900 K). Across both fluorites SSCHA produced</w:t>
+      </w:r>
+      <w:r>
+        <w:t xml:space="preserve"> </w:t>
+      </w:r>
+      <w:r>
+        <w:rPr>
+          <w:b/>
+          <w:bCs/>
+        </w:rPr>
+        <w:t xml:space="preserve">zero</w:t>
+      </w:r>
+      <w:r>
+        <w:t xml:space="preserve"> </w:t>
+      </w:r>
+      <w:r>
+        <w:t xml:space="preserve">numerical blow-ups yet</w:t>
+      </w:r>
+      <w:r>
+        <w:t xml:space="preserve"> </w:t>
+      </w:r>
+      <w:r>
+        <w:t xml:space="preserve">the same systematic false-stable, confirming the failure is a methodological trap, not a</w:t>
+      </w:r>
+      <w:r>
+        <w:t xml:space="preserve"> </w:t>
+      </w:r>
+      <w:r>
+        <w:t xml:space="preserve">numerical one.</w:t>
+      </w:r>
+    </w:p>
+    <w:bookmarkEnd w:id="34"/>
+    <w:bookmarkStart w:id="38" w:name="ensemble-disagreement-as-a-guardrail-h3"/>
+    <w:p>
+      <w:pPr>
+        <w:pStyle w:val="Heading3"/>
+      </w:pPr>
+      <w:r>
+        <w:t xml:space="preserve">3.4 Ensemble disagreement as a guardrail (H3)</w:t>
+      </w:r>
+    </w:p>
+    <w:p>
+      <w:pPr>
+        <w:pStyle w:val="FirstParagraph"/>
+      </w:pPr>
+      <w:r>
+        <w:t xml:space="preserve">Because no single model is reliable across the set, we test whether</w:t>
+      </w:r>
+      <w:r>
+        <w:t xml:space="preserve"> </w:t>
+      </w:r>
+      <w:r>
+        <w:rPr>
+          <w:i/>
+          <w:iCs/>
+        </w:rPr>
+        <w:t xml:space="preserve">cross-model disagreement</w:t>
+      </w:r>
+      <w:r>
+        <w:t xml:space="preserve"> </w:t>
+      </w:r>
+      <w:r>
+        <w:t xml:space="preserve">flags the units where the consensus (majority-vote) finite-T call is wrong. On the non-bcc,</w:t>
+      </w:r>
+      <w:r>
+        <w:t xml:space="preserve"> </w:t>
+      </w:r>
+      <w:r>
+        <w:t xml:space="preserve">non-borderline soft-mode units (n = 60; bcc excluded because its thermodynamic-T_c label is the</w:t>
+      </w:r>
+      <w:r>
+        <w:t xml:space="preserve"> </w:t>
+      </w:r>
+      <w:r>
+        <w:t xml:space="preserve">wrong reference for dynamic stability, §3.3), the majority-vote consensus is wrong on 16.7% of</w:t>
+      </w:r>
+      <w:r>
+        <w:t xml:space="preserve"> </w:t>
+      </w:r>
+      <w:r>
+        <w:t xml:space="preserve">units. The disagreement signal separates these sharply: on the 18 units where the five models</w:t>
+      </w:r>
+      <w:r>
+        <w:t xml:space="preserve"> </w:t>
+      </w:r>
+      <w:r>
+        <w:rPr>
+          <w:b/>
+          <w:bCs/>
+        </w:rPr>
+        <w:t xml:space="preserve">split</w:t>
+      </w:r>
+      <w:r>
+        <w:t xml:space="preserve"> </w:t>
+      </w:r>
+      <w:r>
+        <w:t xml:space="preserve">on the stable/unstable call, the consensus error rate is</w:t>
+      </w:r>
+      <w:r>
+        <w:t xml:space="preserve"> </w:t>
+      </w:r>
+      <w:r>
+        <w:rPr>
+          <w:b/>
+          <w:bCs/>
+        </w:rPr>
+        <w:t xml:space="preserve">0.39</w:t>
+      </w:r>
+      <w:r>
+        <w:t xml:space="preserve">, versus</w:t>
+      </w:r>
+      <w:r>
+        <w:t xml:space="preserve"> </w:t>
+      </w:r>
+      <w:r>
+        <w:rPr>
+          <w:b/>
+          <w:bCs/>
+        </w:rPr>
+        <w:t xml:space="preserve">0.07</w:t>
+      </w:r>
+      <w:r>
+        <w:t xml:space="preserve"> </w:t>
+      </w:r>
+      <w:r>
+        <w:t xml:space="preserve">on</w:t>
+      </w:r>
+      <w:r>
+        <w:t xml:space="preserve"> </w:t>
+      </w:r>
+      <w:r>
+        <w:t xml:space="preserve">the 42 unanimous units — a 5.5× enrichment. As a ranked predictor of consensus error, the</w:t>
+      </w:r>
+      <w:r>
+        <w:t xml:space="preserve"> </w:t>
+      </w:r>
+      <w:r>
+        <w:t xml:space="preserve">binary stable/unstable</w:t>
+      </w:r>
+      <w:r>
+        <w:t xml:space="preserve"> </w:t>
+      </w:r>
+      <w:r>
+        <w:rPr>
+          <w:b/>
+          <w:bCs/>
+        </w:rPr>
+        <w:t xml:space="preserve">vote split achieves AUC 0.75</w:t>
+      </w:r>
+      <w:r>
+        <w:t xml:space="preserve">, whereas the continuous cross-model</w:t>
+      </w:r>
+      <w:r>
+        <w:t xml:space="preserve"> </w:t>
+      </w:r>
+      <w:r>
+        <w:t xml:space="preserve">frequency standard deviation is uninformative (</w:t>
+      </w:r>
+      <w:r>
+        <w:rPr>
+          <w:b/>
+          <w:bCs/>
+        </w:rPr>
+        <w:t xml:space="preserve">AUC 0.52</w:t>
+      </w:r>
+      <w:r>
+        <w:t xml:space="preserve">, no better than chance;</w:t>
+      </w:r>
+      <w:r>
+        <w:t xml:space="preserve"> </w:t>
+      </w:r>
+      <w:r>
+        <w:t xml:space="preserve">Fig. 6).</w:t>
+      </w:r>
+    </w:p>
+    <w:p>
+      <w:pPr>
         <w:pStyle w:val="CaptionedFigure"/>
       </w:pPr>
       <w:r>
@@ -5494,18 +4073,18 @@
           <wp:inline>
             <wp:extent cx="4232694" cy="4232694"/>
             <wp:effectExtent b="0" l="0" r="0" t="0"/>
-            <wp:docPr descr="Fig. 6 Ensemble-disagreement guardrail (§3.4): the discrete inter-model vote split predicts consensus error (AUC 0.75) while the continuous cross-model frequency spread does not (AUC 0.52)." title="" id="45" name="Picture"/>
+            <wp:docPr descr="Fig. 6 Ensemble-disagreement guardrail (§3.4): the discrete inter-model vote split predicts consensus error (AUC 0.75) while the continuous cross-model frequency spread does not (AUC 0.52)." title="" id="36" name="Picture"/>
             <a:graphic>
               <a:graphicData uri="http://schemas.openxmlformats.org/drawingml/2006/picture">
                 <pic:pic>
                   <pic:nvPicPr>
-                    <pic:cNvPr descr="../results/figures/fig_ensemble_guardrail.png" id="46" name="Picture"/>
+                    <pic:cNvPr descr="../results/figures/fig_ensemble_guardrail.png" id="37" name="Picture"/>
                     <pic:cNvPicPr>
                       <a:picLocks noChangeArrowheads="1" noChangeAspect="1"/>
                     </pic:cNvPicPr>
                   </pic:nvPicPr>
                   <pic:blipFill>
-                    <a:blip r:embed="rId44"/>
+                    <a:blip r:embed="rId35"/>
                     <a:stretch>
                       <a:fillRect/>
                     </a:stretch>
@@ -5562,8 +4141,1419 @@
         <w:t xml:space="preserve">does not (AUC 0.52).</w:t>
       </w:r>
     </w:p>
+    <w:p>
+      <w:pPr>
+        <w:pStyle w:val="BodyText"/>
+      </w:pPr>
+      <w:r>
+        <w:t xml:space="preserve">This refines H3 into an actionable rule with a caveat: the</w:t>
+      </w:r>
+      <w:r>
+        <w:t xml:space="preserve"> </w:t>
+      </w:r>
+      <w:r>
+        <w:rPr>
+          <w:i/>
+          <w:iCs/>
+        </w:rPr>
+        <w:t xml:space="preserve">discrete</w:t>
+      </w:r>
+      <w:r>
+        <w:t xml:space="preserve"> </w:t>
+      </w:r>
+      <w:r>
+        <w:t xml:space="preserve">inter-model vote split is</w:t>
+      </w:r>
+      <w:r>
+        <w:t xml:space="preserve"> </w:t>
+      </w:r>
+      <w:r>
+        <w:t xml:space="preserve">a useful, cheap guardrail — flag any candidate on which the foundation-MLIP ensemble disagrees —</w:t>
+      </w:r>
+      <w:r>
+        <w:t xml:space="preserve"> </w:t>
+      </w:r>
+      <w:r>
+        <w:t xml:space="preserve">but the</w:t>
+      </w:r>
+      <w:r>
+        <w:t xml:space="preserve"> </w:t>
+      </w:r>
+      <w:r>
+        <w:rPr>
+          <w:i/>
+          <w:iCs/>
+        </w:rPr>
+        <w:t xml:space="preserve">continuous</w:t>
+      </w:r>
+      <w:r>
+        <w:t xml:space="preserve"> </w:t>
+      </w:r>
+      <w:r>
+        <w:t xml:space="preserve">frequency spread that one might naively threshold is not. The physical</w:t>
+      </w:r>
+      <w:r>
+        <w:t xml:space="preserve"> </w:t>
+      </w:r>
+      <w:r>
+        <w:t xml:space="preserve">reading is that disagreement is concentrated near the stability boundary (split votes coincide</w:t>
+      </w:r>
+      <w:r>
+        <w:t xml:space="preserve"> </w:t>
+      </w:r>
+      <w:r>
+        <w:t xml:space="preserve">with frequencies straddling zero), where the call is both most uncertain and most error-prone.</w:t>
+      </w:r>
+    </w:p>
+    <w:bookmarkEnd w:id="38"/>
+    <w:bookmarkStart w:id="39" w:name="X054d2a2ddcea26a90d40f6d7c1de66d35e8d344"/>
+    <w:p>
+      <w:pPr>
+        <w:pStyle w:val="Heading3"/>
+      </w:pPr>
+      <w:r>
+        <w:t xml:space="preserve">3.5 Robustness: stochastic noise and finite size</w:t>
+      </w:r>
+    </w:p>
+    <w:p>
+      <w:pPr>
+        <w:pStyle w:val="FirstParagraph"/>
+      </w:pPr>
+      <w:r>
+        <w:rPr>
+          <w:b/>
+          <w:bCs/>
+        </w:rPr>
+        <w:t xml:space="preserve">Stochastic reproducibility.</w:t>
+      </w:r>
+      <w:r>
+        <w:t xml:space="preserve"> </w:t>
+      </w:r>
+      <w:r>
+        <w:t xml:space="preserve">Repeating the bcc-Zr / MACE-MP-0 / 100 K SSCHA with four</w:t>
+      </w:r>
+      <w:r>
+        <w:t xml:space="preserve"> </w:t>
+      </w:r>
+      <w:r>
+        <w:t xml:space="preserve">independent random seeds gives a minimum free-energy-Hessian frequency of +1.798 ± 0.001 THz</w:t>
+      </w:r>
+      <w:r>
+        <w:t xml:space="preserve"> </w:t>
+      </w:r>
+      <w:r>
+        <w:t xml:space="preserve">(range [+1.797, +1.800]). The stochastic noise (≈0.001 THz) is two-to-three orders of magnitude</w:t>
+      </w:r>
+      <w:r>
+        <w:t xml:space="preserve"> </w:t>
+      </w:r>
+      <w:r>
+        <w:t xml:space="preserve">smaller than the cross-model bcc margins (~0.4 THz spread, §3.3), so those margins are real</w:t>
+      </w:r>
+      <w:r>
+        <w:t xml:space="preserve"> </w:t>
+      </w:r>
+      <w:r>
+        <w:t xml:space="preserve">signal, not sampling noise.</w:t>
+      </w:r>
+    </w:p>
+    <w:p>
+      <w:pPr>
+        <w:pStyle w:val="BodyText"/>
+      </w:pPr>
+      <w:r>
+        <w:rPr>
+          <w:b/>
+          <w:bCs/>
+        </w:rPr>
+        <w:t xml:space="preserve">Finite size.</w:t>
+      </w:r>
+      <w:r>
+        <w:t xml:space="preserve"> </w:t>
+      </w:r>
+      <w:r>
+        <w:t xml:space="preserve">The stability</w:t>
+      </w:r>
+      <w:r>
+        <w:t xml:space="preserve"> </w:t>
+      </w:r>
+      <w:r>
+        <w:rPr>
+          <w:i/>
+          <w:iCs/>
+        </w:rPr>
+        <w:t xml:space="preserve">call</w:t>
+      </w:r>
+      <w:r>
+        <w:t xml:space="preserve"> </w:t>
+      </w:r>
+      <w:r>
+        <w:t xml:space="preserve">is robust to supercell size on the cases where the test is</w:t>
+      </w:r>
+      <w:r>
+        <w:t xml:space="preserve"> </w:t>
+      </w:r>
+      <w:r>
+        <w:t xml:space="preserve">well-posed (</w:t>
+      </w:r>
+      <w:r>
+        <w:rPr>
+          <w:rStyle w:val="VerbatimChar"/>
+        </w:rPr>
+        <w:t xml:space="preserve">results/convergence_study.parquet</w:t>
+      </w:r>
+      <w:r>
+        <w:t xml:space="preserve">). For bcc-Zr the dynamic-stabilisation verdict</w:t>
+      </w:r>
+      <w:r>
+        <w:t xml:space="preserve"> </w:t>
+      </w:r>
+      <w:r>
+        <w:t xml:space="preserve">holds from 2×2×2 to 3×3×3 (SSCHA +1.80 → +1.56 THz at 100 K, +1.80 → +1.55 at 300 K; soft-mode</w:t>
+      </w:r>
+      <w:r>
+        <w:t xml:space="preserve"> </w:t>
+      </w:r>
+      <w:r>
+        <w:t xml:space="preserve">screen +0.92 → +1.58 THz — stable throughout, the margin shifting by ≤0.25 THz). For the</w:t>
+      </w:r>
+      <w:r>
+        <w:t xml:space="preserve"> </w:t>
+      </w:r>
+      <w:r>
+        <w:t xml:space="preserve">Γ-centred ferroelectric mode of BaTiO₃ the soft-mode screen stays unstable across cell size</w:t>
+      </w:r>
+      <w:r>
+        <w:t xml:space="preserve"> </w:t>
+      </w:r>
+      <w:r>
+        <w:t xml:space="preserve">(−8.5 → −7.3 THz at 100 K). One caveat is intrinsic to the physics rather than the method: the</w:t>
+      </w:r>
+      <w:r>
+        <w:t xml:space="preserve"> </w:t>
+      </w:r>
+      <w:r>
+        <w:t xml:space="preserve">SrTiO₃ antiferrodistortive instability lives at the zone-boundary R point = (½,½,½), which is</w:t>
+      </w:r>
+      <w:r>
+        <w:t xml:space="preserve"> </w:t>
+      </w:r>
+      <w:r>
+        <w:t xml:space="preserve">commensurate only with</w:t>
+      </w:r>
+      <w:r>
+        <w:t xml:space="preserve"> </w:t>
+      </w:r>
+      <w:r>
+        <w:rPr>
+          <w:i/>
+          <w:iCs/>
+        </w:rPr>
+        <w:t xml:space="preserve">even</w:t>
+      </w:r>
+      <w:r>
+        <w:t xml:space="preserve"> </w:t>
+      </w:r>
+      <w:r>
+        <w:t xml:space="preserve">supercells, so a 3×3×3 cell is blind to it by construction (the</w:t>
+      </w:r>
+      <w:r>
+        <w:t xml:space="preserve"> </w:t>
+      </w:r>
+      <w:r>
+        <w:t xml:space="preserve">screen there reports the Γ value, +0.0 THz, not the R instability at −2.8). A 2×2×2↔3×3×3</w:t>
+      </w:r>
+      <w:r>
+        <w:t xml:space="preserve"> </w:t>
+      </w:r>
+      <w:r>
+        <w:t xml:space="preserve">comparison is therefore not a valid convergence test for R-point systems; the definitive even-cell</w:t>
+      </w:r>
+      <w:r>
+        <w:t xml:space="preserve"> </w:t>
+      </w:r>
+      <w:r>
+        <w:t xml:space="preserve">test (4×4×4, a ~320-atom SSCHA) is left to future work. Importantly, the §3.3 SSCHA false-stable</w:t>
+      </w:r>
+      <w:r>
+        <w:t xml:space="preserve"> </w:t>
+      </w:r>
+      <w:r>
+        <w:t xml:space="preserve">is</w:t>
+      </w:r>
+      <w:r>
+        <w:t xml:space="preserve"> </w:t>
+      </w:r>
+      <w:r>
+        <w:rPr>
+          <w:i/>
+          <w:iCs/>
+        </w:rPr>
+        <w:t xml:space="preserve">not</w:t>
+      </w:r>
+      <w:r>
+        <w:t xml:space="preserve"> </w:t>
+      </w:r>
+      <w:r>
+        <w:t xml:space="preserve">a missing-q artifact: it occurs for the Γ ferroelectric mode of BaTiO₃, which is present</w:t>
+      </w:r>
+      <w:r>
+        <w:t xml:space="preserve"> </w:t>
+      </w:r>
+      <w:r>
+        <w:t xml:space="preserve">in every cell including the 2×2×2 used, so the failure is the initialisation/Gaussian-width</w:t>
+      </w:r>
+      <w:r>
+        <w:t xml:space="preserve"> </w:t>
+      </w:r>
+      <w:r>
+        <w:t xml:space="preserve">mechanism of the root-cause diagnostic, not finite size.</w:t>
+      </w:r>
+    </w:p>
+    <w:bookmarkEnd w:id="39"/>
+    <w:bookmarkEnd w:id="40"/>
+    <w:bookmarkStart w:id="41" w:name="discussion"/>
+    <w:p>
+      <w:pPr>
+        <w:pStyle w:val="Heading2"/>
+      </w:pPr>
+      <w:r>
+        <w:t xml:space="preserve">4. Discussion</w:t>
+      </w:r>
+    </w:p>
+    <w:p>
+      <w:pPr>
+        <w:pStyle w:val="FirstParagraph"/>
+      </w:pPr>
+      <w:r>
+        <w:t xml:space="preserve">The harmonic layer (§3.1) reproduces the literature and confirms H1: PES softening produces a</w:t>
+      </w:r>
+      <w:r>
+        <w:t xml:space="preserve"> </w:t>
+      </w:r>
+      <w:r>
+        <w:t xml:space="preserve">real false-stable rate, localised to specific instabilities (bcc Zr/Hf) rather than uniform.</w:t>
+      </w:r>
+      <w:r>
+        <w:t xml:space="preserve"> </w:t>
+      </w:r>
+      <w:r>
+        <w:t xml:space="preserve">The finite-T results confirm H2 in a strong form: not only is harmonic accuracy non-predictive</w:t>
+      </w:r>
+      <w:r>
+        <w:t xml:space="preserve"> </w:t>
+      </w:r>
+      <w:r>
+        <w:t xml:space="preserve">of finite-T accuracy, but the standard escalation —</w:t>
+      </w:r>
+      <w:r>
+        <w:t xml:space="preserve"> </w:t>
+      </w:r>
+      <w:r>
+        <w:t xml:space="preserve">“if in doubt, run SSCHA”</w:t>
+      </w:r>
+      <w:r>
+        <w:t xml:space="preserve"> </w:t>
+      </w:r>
+      <w:r>
+        <w:t xml:space="preserve">—</w:t>
+      </w:r>
+      <w:r>
+        <w:t xml:space="preserve"> </w:t>
+      </w:r>
+      <w:r>
+        <w:rPr>
+          <w:i/>
+          <w:iCs/>
+        </w:rPr>
+        <w:t xml:space="preserve">fails</w:t>
+      </w:r>
+      <w:r>
+        <w:t xml:space="preserve"> </w:t>
+      </w:r>
+      <w:r>
+        <w:t xml:space="preserve">on the</w:t>
+      </w:r>
+      <w:r>
+        <w:t xml:space="preserve"> </w:t>
+      </w:r>
+      <w:r>
+        <w:t xml:space="preserve">displacive regime, because SSCHA driven by an MLIP false-stabilises deep double wells. The</w:t>
+      </w:r>
+      <w:r>
+        <w:t xml:space="preserve"> </w:t>
+      </w:r>
+      <w:r>
+        <w:t xml:space="preserve">practical recommendation inverts the usual cost/accuracy intuition: for screening</w:t>
+      </w:r>
+      <w:r>
+        <w:t xml:space="preserve"> </w:t>
+      </w:r>
+      <w:r>
+        <w:t xml:space="preserve">harmonically-unstable displacive candidates, the cheap single-mode soft-mode free energy is the</w:t>
+      </w:r>
+      <w:r>
+        <w:t xml:space="preserve"> </w:t>
+      </w:r>
+      <w:r>
+        <w:t xml:space="preserve">more reliable indicator, and SSCHA should be reserved for martensitic/entropy-stabilised cases</w:t>
+      </w:r>
+      <w:r>
+        <w:t xml:space="preserve"> </w:t>
+      </w:r>
+      <w:r>
+        <w:t xml:space="preserve">where its ansatz is sound.</w:t>
+      </w:r>
+    </w:p>
+    <w:p>
+      <w:pPr>
+        <w:pStyle w:val="BodyText"/>
+      </w:pPr>
+      <w:r>
+        <w:rPr>
+          <w:b/>
+          <w:bCs/>
+        </w:rPr>
+        <w:t xml:space="preserve">Limitations.</w:t>
+      </w:r>
+      <w:r>
+        <w:t xml:space="preserve"> </w:t>
+      </w:r>
+      <w:r>
+        <w:t xml:space="preserve">Ground-truth transition temperatures are approximate and scoring is</w:t>
+      </w:r>
+      <w:r>
+        <w:t xml:space="preserve"> </w:t>
+      </w:r>
+      <w:r>
+        <w:t xml:space="preserve">qualitative. SSCHA cells are 2×2×2 (finite-size), so dynamic-stabilisation temperatures are</w:t>
+      </w:r>
+      <w:r>
+        <w:t xml:space="preserve"> </w:t>
+      </w:r>
+      <w:r>
+        <w:t xml:space="preserve">approximate though the cross-model comparison at fixed cell is valid. ORB-v2’s float32-only</w:t>
+      </w:r>
+      <w:r>
+        <w:t xml:space="preserve"> </w:t>
+      </w:r>
+      <w:r>
+        <w:t xml:space="preserve">direct architecture is an outlier in both layers and is flagged throughout rather than</w:t>
+      </w:r>
+      <w:r>
+        <w:t xml:space="preserve"> </w:t>
+      </w:r>
+      <w:r>
+        <w:t xml:space="preserve">excluded.</w:t>
+      </w:r>
+    </w:p>
+    <w:bookmarkEnd w:id="41"/>
+    <w:bookmarkStart w:id="42" w:name="conclusions"/>
+    <w:p>
+      <w:pPr>
+        <w:pStyle w:val="Heading2"/>
+      </w:pPr>
+      <w:r>
+        <w:t xml:space="preserve">5. Conclusions</w:t>
+      </w:r>
+    </w:p>
+    <w:p>
+      <w:pPr>
+        <w:pStyle w:val="FirstParagraph"/>
+      </w:pPr>
+      <w:r>
+        <w:t xml:space="preserve">Finite-temperature dynamic stability is a blind spot of foundation MLIPs and of the harmonic</w:t>
+      </w:r>
+      <w:r>
+        <w:t xml:space="preserve"> </w:t>
+      </w:r>
+      <w:r>
+        <w:t xml:space="preserve">benchmarks used to certify them. A cheap quantum soft-mode free-energy screen recovers the</w:t>
+      </w:r>
+      <w:r>
+        <w:t xml:space="preserve"> </w:t>
+      </w:r>
+      <w:r>
+        <w:t xml:space="preserve">finite-T stabilisation that harmonic accuracy does not predict, and — unlike MLIP-driven SSCHA</w:t>
+      </w:r>
+      <w:r>
+        <w:t xml:space="preserve"> </w:t>
+      </w:r>
+      <w:r>
+        <w:t xml:space="preserve">— remains reliable on the deep displacive instabilities that dominate generative-CSP screening.</w:t>
+      </w:r>
+      <w:r>
+        <w:t xml:space="preserve"> </w:t>
+      </w:r>
+      <w:r>
+        <w:t xml:space="preserve">Harmonic accuracy does not certify a model for finite-T use, and neither does an unexamined</w:t>
+      </w:r>
+      <w:r>
+        <w:t xml:space="preserve"> </w:t>
+      </w:r>
+      <w:r>
+        <w:t xml:space="preserve">SSCHA cross-check.</w:t>
+      </w:r>
+    </w:p>
+    <w:bookmarkEnd w:id="42"/>
+    <w:bookmarkStart w:id="43" w:name="conflicts-of-interest"/>
+    <w:p>
+      <w:pPr>
+        <w:pStyle w:val="Heading2"/>
+      </w:pPr>
+      <w:r>
+        <w:t xml:space="preserve">Conflicts of interest</w:t>
+      </w:r>
+    </w:p>
+    <w:p>
+      <w:pPr>
+        <w:pStyle w:val="FirstParagraph"/>
+      </w:pPr>
+      <w:r>
+        <w:t xml:space="preserve">There are no conflicts to declare.</w:t>
+      </w:r>
+    </w:p>
+    <w:bookmarkEnd w:id="43"/>
+    <w:bookmarkStart w:id="44" w:name="data-availability"/>
+    <w:p>
+      <w:pPr>
+        <w:pStyle w:val="Heading2"/>
+      </w:pPr>
+      <w:r>
+        <w:t xml:space="preserve">Data availability</w:t>
+      </w:r>
+    </w:p>
+    <w:p>
+      <w:pPr>
+        <w:pStyle w:val="FirstParagraph"/>
+      </w:pPr>
+      <w:r>
+        <w:t xml:space="preserve">The code supporting this article, together with the per-unit results ledger, is openly available</w:t>
+      </w:r>
+      <w:r>
+        <w:t xml:space="preserve"> </w:t>
+      </w:r>
+      <w:r>
+        <w:t xml:space="preserve">in the repository at https://github.com/fronkt/mlip-dynamic-stability and archived at Zenodo at</w:t>
+      </w:r>
+      <w:r>
+        <w:t xml:space="preserve"> </w:t>
+      </w:r>
+      <w:r>
+        <w:t xml:space="preserve">DOI: 10.5281/zenodo.XXXXXXX</w:t>
+      </w:r>
+      <w:r>
+        <w:t xml:space="preserve"> </w:t>
+      </w:r>
+      <w:r>
+        <w:rPr>
+          <w:i/>
+          <w:iCs/>
+        </w:rPr>
+        <w:t xml:space="preserve">(DOI reserved on release; to be inserted on acceptance)</w:t>
+      </w:r>
+      <w:r>
+        <w:t xml:space="preserve">. The</w:t>
+      </w:r>
+      <w:r>
+        <w:t xml:space="preserve"> </w:t>
+      </w:r>
+      <w:r>
+        <w:t xml:space="preserve">production results regenerate from</w:t>
+      </w:r>
+      <w:r>
+        <w:t xml:space="preserve"> </w:t>
+      </w:r>
+      <w:r>
+        <w:rPr>
+          <w:rStyle w:val="VerbatimChar"/>
+        </w:rPr>
+        <w:t xml:space="preserve">results/ledger.parquet</w:t>
+      </w:r>
+      <w:r>
+        <w:t xml:space="preserve"> </w:t>
+      </w:r>
+      <w:r>
+        <w:t xml:space="preserve">(per-unit hashed, resumable) and the</w:t>
+      </w:r>
+      <w:r>
+        <w:t xml:space="preserve"> </w:t>
+      </w:r>
+      <w:r>
+        <w:t xml:space="preserve">finite-size runs from</w:t>
+      </w:r>
+      <w:r>
+        <w:t xml:space="preserve"> </w:t>
+      </w:r>
+      <w:r>
+        <w:rPr>
+          <w:rStyle w:val="VerbatimChar"/>
+        </w:rPr>
+        <w:t xml:space="preserve">results/convergence_study.parquet</w:t>
+      </w:r>
+      <w:r>
+        <w:t xml:space="preserve">; figures via</w:t>
+      </w:r>
+      <w:r>
+        <w:t xml:space="preserve"> </w:t>
+      </w:r>
+      <w:r>
+        <w:rPr>
+          <w:rStyle w:val="VerbatimChar"/>
+        </w:rPr>
+        <w:t xml:space="preserve">scripts/make_figures.py</w:t>
+      </w:r>
+      <w:r>
+        <w:t xml:space="preserve">,</w:t>
+      </w:r>
+      <w:r>
+        <w:t xml:space="preserve"> </w:t>
+      </w:r>
+      <w:r>
+        <w:t xml:space="preserve">analysis in</w:t>
+      </w:r>
+      <w:r>
+        <w:t xml:space="preserve"> </w:t>
+      </w:r>
+      <w:r>
+        <w:rPr>
+          <w:rStyle w:val="VerbatimChar"/>
+        </w:rPr>
+        <w:t xml:space="preserve">mlip_dynstab/analysis.py</w:t>
+      </w:r>
+      <w:r>
+        <w:t xml:space="preserve">, the SSCHA root-cause diagnostic in</w:t>
+      </w:r>
+      <w:r>
+        <w:t xml:space="preserve"> </w:t>
+      </w:r>
+      <w:r>
+        <w:rPr>
+          <w:rStyle w:val="VerbatimChar"/>
+        </w:rPr>
+        <w:t xml:space="preserve">scripts/sscha_v4_diag.py</w:t>
+      </w:r>
+      <w:r>
+        <w:t xml:space="preserve">, and the stochastic-reproducibility study (§3.5) via</w:t>
+      </w:r>
+      <w:r>
+        <w:t xml:space="preserve"> </w:t>
+      </w:r>
+      <w:r>
+        <w:rPr>
+          <w:rStyle w:val="VerbatimChar"/>
+        </w:rPr>
+        <w:t xml:space="preserve">scripts/sscha_repro.py</w:t>
+      </w:r>
+      <w:r>
+        <w:t xml:space="preserve"> </w:t>
+      </w:r>
+      <w:r>
+        <w:t xml:space="preserve">(its per-seed frequencies print to the run log rather than to the</w:t>
+      </w:r>
+      <w:r>
+        <w:t xml:space="preserve"> </w:t>
+      </w:r>
+      <w:r>
+        <w:t xml:space="preserve">ledger).</w:t>
+      </w:r>
+    </w:p>
+    <w:bookmarkEnd w:id="44"/>
+    <w:bookmarkStart w:id="45" w:name="acknowledgements"/>
+    <w:p>
+      <w:pPr>
+        <w:pStyle w:val="Heading2"/>
+      </w:pPr>
+      <w:r>
+        <w:t xml:space="preserve">Acknowledgements</w:t>
+      </w:r>
+    </w:p>
+    <w:p>
+      <w:pPr>
+        <w:pStyle w:val="FirstParagraph"/>
+      </w:pPr>
+      <w:r>
+        <w:rPr>
+          <w:i/>
+          <w:iCs/>
+        </w:rPr>
+        <w:t xml:space="preserve">Funding sources and computational resources to be acknowledged before submission.</w:t>
+      </w:r>
+    </w:p>
+    <w:bookmarkEnd w:id="45"/>
+    <w:bookmarkStart w:id="46" w:name="references"/>
+    <w:p>
+      <w:pPr>
+        <w:pStyle w:val="Heading2"/>
+      </w:pPr>
+      <w:r>
+        <w:t xml:space="preserve">References</w:t>
+      </w:r>
+    </w:p>
+    <w:p>
+      <w:pPr>
+        <w:pStyle w:val="Compact"/>
+        <w:numPr>
+          <w:ilvl w:val="0"/>
+          <w:numId w:val="1003"/>
+        </w:numPr>
+      </w:pPr>
+      <w:r>
+        <w:t xml:space="preserve">A. Loew, D. Sun, H.-C. Wang, S. Botti and M. A. L. Marques,</w:t>
+      </w:r>
+      <w:r>
+        <w:t xml:space="preserve"> </w:t>
+      </w:r>
+      <w:r>
+        <w:rPr>
+          <w:i/>
+          <w:iCs/>
+        </w:rPr>
+        <w:t xml:space="preserve">npj Comput. Mater.</w:t>
+      </w:r>
+      <w:r>
+        <w:t xml:space="preserve">, 2025,</w:t>
+      </w:r>
+      <w:r>
+        <w:t xml:space="preserve"> </w:t>
+      </w:r>
+      <w:r>
+        <w:rPr>
+          <w:b/>
+          <w:bCs/>
+        </w:rPr>
+        <w:t xml:space="preserve">11</w:t>
+      </w:r>
+      <w:r>
+        <w:t xml:space="preserve">, 178.</w:t>
+      </w:r>
+    </w:p>
+    <w:p>
+      <w:pPr>
+        <w:pStyle w:val="Compact"/>
+        <w:numPr>
+          <w:ilvl w:val="0"/>
+          <w:numId w:val="1003"/>
+        </w:numPr>
+      </w:pPr>
+      <w:r>
+        <w:t xml:space="preserve">X.-Q. Han, P.-J. Guo, Z.-F. Gao, W.-K. Li and Z.-Y. Lu,</w:t>
+      </w:r>
+      <w:r>
+        <w:t xml:space="preserve"> </w:t>
+      </w:r>
+      <w:r>
+        <w:rPr>
+          <w:i/>
+          <w:iCs/>
+        </w:rPr>
+        <w:t xml:space="preserve">arXiv</w:t>
+      </w:r>
+      <w:r>
+        <w:t xml:space="preserve">, 2025, arXiv:2512.21227.</w:t>
+      </w:r>
+    </w:p>
+    <w:p>
+      <w:pPr>
+        <w:pStyle w:val="Compact"/>
+        <w:numPr>
+          <w:ilvl w:val="0"/>
+          <w:numId w:val="1003"/>
+        </w:numPr>
+      </w:pPr>
+      <w:r>
+        <w:t xml:space="preserve">G. Petretto, S. Dwaraknath, H. P. C. Miranda, D. Winston, M. Giantomassi, M. J. van Setten, X. Gonze, K. A. Persson, G. Hautier and G.-M. Rignanese,</w:t>
+      </w:r>
+      <w:r>
+        <w:t xml:space="preserve"> </w:t>
+      </w:r>
+      <w:r>
+        <w:rPr>
+          <w:i/>
+          <w:iCs/>
+        </w:rPr>
+        <w:t xml:space="preserve">Sci. Data</w:t>
+      </w:r>
+      <w:r>
+        <w:t xml:space="preserve">, 2018,</w:t>
+      </w:r>
+      <w:r>
+        <w:t xml:space="preserve"> </w:t>
+      </w:r>
+      <w:r>
+        <w:rPr>
+          <w:b/>
+          <w:bCs/>
+        </w:rPr>
+        <w:t xml:space="preserve">5</w:t>
+      </w:r>
+      <w:r>
+        <w:t xml:space="preserve">, 180065.</w:t>
+      </w:r>
+    </w:p>
+    <w:p>
+      <w:pPr>
+        <w:pStyle w:val="Compact"/>
+        <w:numPr>
+          <w:ilvl w:val="0"/>
+          <w:numId w:val="1003"/>
+        </w:numPr>
+      </w:pPr>
+      <w:r>
+        <w:t xml:space="preserve">L. Monacelli, R. Bianco, M. Cherubini, M. Calandra, I. Errea and F. Mauri,</w:t>
+      </w:r>
+      <w:r>
+        <w:t xml:space="preserve"> </w:t>
+      </w:r>
+      <w:r>
+        <w:rPr>
+          <w:i/>
+          <w:iCs/>
+        </w:rPr>
+        <w:t xml:space="preserve">J. Phys.: Condens. Matter</w:t>
+      </w:r>
+      <w:r>
+        <w:t xml:space="preserve">, 2021,</w:t>
+      </w:r>
+      <w:r>
+        <w:t xml:space="preserve"> </w:t>
+      </w:r>
+      <w:r>
+        <w:rPr>
+          <w:b/>
+          <w:bCs/>
+        </w:rPr>
+        <w:t xml:space="preserve">33</w:t>
+      </w:r>
+      <w:r>
+        <w:t xml:space="preserve">, 363001.</w:t>
+      </w:r>
+    </w:p>
+    <w:p>
+      <w:pPr>
+        <w:pStyle w:val="Compact"/>
+        <w:numPr>
+          <w:ilvl w:val="0"/>
+          <w:numId w:val="1003"/>
+        </w:numPr>
+      </w:pPr>
+      <w:r>
+        <w:t xml:space="preserve">O. Hellman, I. A. Abrikosov and S. I. Simak,</w:t>
+      </w:r>
+      <w:r>
+        <w:t xml:space="preserve"> </w:t>
+      </w:r>
+      <w:r>
+        <w:rPr>
+          <w:i/>
+          <w:iCs/>
+        </w:rPr>
+        <w:t xml:space="preserve">Phys. Rev. B</w:t>
+      </w:r>
+      <w:r>
+        <w:t xml:space="preserve">, 2011,</w:t>
+      </w:r>
+      <w:r>
+        <w:t xml:space="preserve"> </w:t>
+      </w:r>
+      <w:r>
+        <w:rPr>
+          <w:b/>
+          <w:bCs/>
+        </w:rPr>
+        <w:t xml:space="preserve">84</w:t>
+      </w:r>
+      <w:r>
+        <w:t xml:space="preserve">, 180301(R); O. Hellman, P. Steneteg, I. A. Abrikosov and S. I. Simak,</w:t>
+      </w:r>
+      <w:r>
+        <w:t xml:space="preserve"> </w:t>
+      </w:r>
+      <w:r>
+        <w:rPr>
+          <w:i/>
+          <w:iCs/>
+        </w:rPr>
+        <w:t xml:space="preserve">Phys. Rev. B</w:t>
+      </w:r>
+      <w:r>
+        <w:t xml:space="preserve">, 2013,</w:t>
+      </w:r>
+      <w:r>
+        <w:t xml:space="preserve"> </w:t>
+      </w:r>
+      <w:r>
+        <w:rPr>
+          <w:b/>
+          <w:bCs/>
+        </w:rPr>
+        <w:t xml:space="preserve">87</w:t>
+      </w:r>
+      <w:r>
+        <w:t xml:space="preserve">, 104111.</w:t>
+      </w:r>
+    </w:p>
+    <w:p>
+      <w:pPr>
+        <w:pStyle w:val="Compact"/>
+        <w:numPr>
+          <w:ilvl w:val="0"/>
+          <w:numId w:val="1003"/>
+        </w:numPr>
+      </w:pPr>
+      <w:r>
+        <w:t xml:space="preserve">I. Batatia, P. Benner, Y. Chiang, A. M. Elena, D. P. Kovács, J. Riebesell</w:t>
+      </w:r>
+      <w:r>
+        <w:t xml:space="preserve"> </w:t>
+      </w:r>
+      <w:r>
+        <w:rPr>
+          <w:i/>
+          <w:iCs/>
+        </w:rPr>
+        <w:t xml:space="preserve">et al.</w:t>
+      </w:r>
+      <w:r>
+        <w:t xml:space="preserve">,</w:t>
+      </w:r>
+      <w:r>
+        <w:t xml:space="preserve"> </w:t>
+      </w:r>
+      <w:r>
+        <w:rPr>
+          <w:i/>
+          <w:iCs/>
+        </w:rPr>
+        <w:t xml:space="preserve">arXiv</w:t>
+      </w:r>
+      <w:r>
+        <w:t xml:space="preserve">, 2023, arXiv:2401.00096.</w:t>
+      </w:r>
+    </w:p>
+    <w:p>
+      <w:pPr>
+        <w:pStyle w:val="Compact"/>
+        <w:numPr>
+          <w:ilvl w:val="0"/>
+          <w:numId w:val="1003"/>
+        </w:numPr>
+      </w:pPr>
+      <w:r>
+        <w:t xml:space="preserve">B. Deng, P. Zhong, K. Jun</w:t>
+      </w:r>
+      <w:r>
+        <w:t xml:space="preserve"> </w:t>
+      </w:r>
+      <w:r>
+        <w:rPr>
+          <w:i/>
+          <w:iCs/>
+        </w:rPr>
+        <w:t xml:space="preserve">et al.</w:t>
+      </w:r>
+      <w:r>
+        <w:t xml:space="preserve">,</w:t>
+      </w:r>
+      <w:r>
+        <w:t xml:space="preserve"> </w:t>
+      </w:r>
+      <w:r>
+        <w:rPr>
+          <w:i/>
+          <w:iCs/>
+        </w:rPr>
+        <w:t xml:space="preserve">Nat. Mach. Intell.</w:t>
+      </w:r>
+      <w:r>
+        <w:t xml:space="preserve">, 2023,</w:t>
+      </w:r>
+      <w:r>
+        <w:t xml:space="preserve"> </w:t>
+      </w:r>
+      <w:r>
+        <w:rPr>
+          <w:b/>
+          <w:bCs/>
+        </w:rPr>
+        <w:t xml:space="preserve">5</w:t>
+      </w:r>
+      <w:r>
+        <w:t xml:space="preserve">, 1031.</w:t>
+      </w:r>
+    </w:p>
+    <w:p>
+      <w:pPr>
+        <w:pStyle w:val="Compact"/>
+        <w:numPr>
+          <w:ilvl w:val="0"/>
+          <w:numId w:val="1003"/>
+        </w:numPr>
+      </w:pPr>
+      <w:r>
+        <w:t xml:space="preserve">M. Neumann, J. Gin, B. Rhodes, S. Bennett, Z. Li, H. Choubisa, A. Hussey and J. Godwin,</w:t>
+      </w:r>
+      <w:r>
+        <w:t xml:space="preserve"> </w:t>
+      </w:r>
+      <w:r>
+        <w:rPr>
+          <w:i/>
+          <w:iCs/>
+        </w:rPr>
+        <w:t xml:space="preserve">arXiv</w:t>
+      </w:r>
+      <w:r>
+        <w:t xml:space="preserve">, 2024, arXiv:2410.22570.</w:t>
+      </w:r>
+    </w:p>
+    <w:p>
+      <w:pPr>
+        <w:pStyle w:val="Compact"/>
+        <w:numPr>
+          <w:ilvl w:val="0"/>
+          <w:numId w:val="1003"/>
+        </w:numPr>
+      </w:pPr>
+      <w:r>
+        <w:t xml:space="preserve">Y. Park, J. Kim, S. Hwang and S. Han,</w:t>
+      </w:r>
+      <w:r>
+        <w:t xml:space="preserve"> </w:t>
+      </w:r>
+      <w:r>
+        <w:rPr>
+          <w:i/>
+          <w:iCs/>
+        </w:rPr>
+        <w:t xml:space="preserve">J. Chem. Theory Comput.</w:t>
+      </w:r>
+      <w:r>
+        <w:t xml:space="preserve">, 2024,</w:t>
+      </w:r>
+      <w:r>
+        <w:t xml:space="preserve"> </w:t>
+      </w:r>
+      <w:r>
+        <w:rPr>
+          <w:b/>
+          <w:bCs/>
+        </w:rPr>
+        <w:t xml:space="preserve">20</w:t>
+      </w:r>
+      <w:r>
+        <w:t xml:space="preserve">, 4857.</w:t>
+      </w:r>
+    </w:p>
+    <w:p>
+      <w:pPr>
+        <w:pStyle w:val="Compact"/>
+        <w:numPr>
+          <w:ilvl w:val="0"/>
+          <w:numId w:val="1003"/>
+        </w:numPr>
+      </w:pPr>
+      <w:r>
+        <w:t xml:space="preserve">H. Yang, C. Hu, Y. Zhou</w:t>
+      </w:r>
+      <w:r>
+        <w:t xml:space="preserve"> </w:t>
+      </w:r>
+      <w:r>
+        <w:rPr>
+          <w:i/>
+          <w:iCs/>
+        </w:rPr>
+        <w:t xml:space="preserve">et al.</w:t>
+      </w:r>
+      <w:r>
+        <w:t xml:space="preserve">,</w:t>
+      </w:r>
+      <w:r>
+        <w:t xml:space="preserve"> </w:t>
+      </w:r>
+      <w:r>
+        <w:rPr>
+          <w:i/>
+          <w:iCs/>
+        </w:rPr>
+        <w:t xml:space="preserve">arXiv</w:t>
+      </w:r>
+      <w:r>
+        <w:t xml:space="preserve">, 2024, arXiv:2405.04967.</w:t>
+      </w:r>
+    </w:p>
+    <w:p>
+      <w:pPr>
+        <w:pStyle w:val="Compact"/>
+        <w:numPr>
+          <w:ilvl w:val="0"/>
+          <w:numId w:val="1003"/>
+        </w:numPr>
+      </w:pPr>
+      <w:r>
+        <w:t xml:space="preserve">T. Tadano and S. Tsuneyuki,</w:t>
+      </w:r>
+      <w:r>
+        <w:t xml:space="preserve"> </w:t>
+      </w:r>
+      <w:r>
+        <w:rPr>
+          <w:i/>
+          <w:iCs/>
+        </w:rPr>
+        <w:t xml:space="preserve">Phys. Rev. B</w:t>
+      </w:r>
+      <w:r>
+        <w:t xml:space="preserve">, 2015,</w:t>
+      </w:r>
+      <w:r>
+        <w:t xml:space="preserve"> </w:t>
+      </w:r>
+      <w:r>
+        <w:rPr>
+          <w:b/>
+          <w:bCs/>
+        </w:rPr>
+        <w:t xml:space="preserve">92</w:t>
+      </w:r>
+      <w:r>
+        <w:t xml:space="preserve">, 054301.</w:t>
+      </w:r>
+    </w:p>
+    <w:p>
+      <w:pPr>
+        <w:pStyle w:val="Compact"/>
+        <w:numPr>
+          <w:ilvl w:val="0"/>
+          <w:numId w:val="1003"/>
+        </w:numPr>
+      </w:pPr>
+      <w:r>
+        <w:t xml:space="preserve">W. Zhong, D. Vanderbilt and K. M. Rabe,</w:t>
+      </w:r>
+      <w:r>
+        <w:t xml:space="preserve"> </w:t>
+      </w:r>
+      <w:r>
+        <w:rPr>
+          <w:i/>
+          <w:iCs/>
+        </w:rPr>
+        <w:t xml:space="preserve">Phys. Rev. Lett.</w:t>
+      </w:r>
+      <w:r>
+        <w:t xml:space="preserve">, 1994,</w:t>
+      </w:r>
+      <w:r>
+        <w:t xml:space="preserve"> </w:t>
+      </w:r>
+      <w:r>
+        <w:rPr>
+          <w:b/>
+          <w:bCs/>
+        </w:rPr>
+        <w:t xml:space="preserve">73</w:t>
+      </w:r>
+      <w:r>
+        <w:t xml:space="preserve">, 1861.</w:t>
+      </w:r>
+    </w:p>
+    <w:p>
+      <w:pPr>
+        <w:pStyle w:val="Compact"/>
+        <w:numPr>
+          <w:ilvl w:val="0"/>
+          <w:numId w:val="1003"/>
+        </w:numPr>
+      </w:pPr>
+      <w:r>
+        <w:t xml:space="preserve">A. Marronnier</w:t>
+      </w:r>
+      <w:r>
+        <w:t xml:space="preserve"> </w:t>
+      </w:r>
+      <w:r>
+        <w:rPr>
+          <w:i/>
+          <w:iCs/>
+        </w:rPr>
+        <w:t xml:space="preserve">et al.</w:t>
+      </w:r>
+      <w:r>
+        <w:t xml:space="preserve">,</w:t>
+      </w:r>
+      <w:r>
+        <w:t xml:space="preserve"> </w:t>
+      </w:r>
+      <w:r>
+        <w:rPr>
+          <w:i/>
+          <w:iCs/>
+        </w:rPr>
+        <w:t xml:space="preserve">ACS Nano</w:t>
+      </w:r>
+      <w:r>
+        <w:t xml:space="preserve">, 2018,</w:t>
+      </w:r>
+      <w:r>
+        <w:t xml:space="preserve"> </w:t>
+      </w:r>
+      <w:r>
+        <w:rPr>
+          <w:b/>
+          <w:bCs/>
+        </w:rPr>
+        <w:t xml:space="preserve">12</w:t>
+      </w:r>
+      <w:r>
+        <w:t xml:space="preserve">, 3477.</w:t>
+      </w:r>
+    </w:p>
+    <w:p>
+      <w:pPr>
+        <w:pStyle w:val="Compact"/>
+        <w:numPr>
+          <w:ilvl w:val="0"/>
+          <w:numId w:val="1003"/>
+        </w:numPr>
+      </w:pPr>
+      <w:r>
+        <w:t xml:space="preserve">L. Monacelli and N. Marzari,</w:t>
+      </w:r>
+      <w:r>
+        <w:t xml:space="preserve"> </w:t>
+      </w:r>
+      <w:r>
+        <w:rPr>
+          <w:i/>
+          <w:iCs/>
+        </w:rPr>
+        <w:t xml:space="preserve">Chem. Mater.</w:t>
+      </w:r>
+      <w:r>
+        <w:t xml:space="preserve">, 2023, DOI: 10.1021/acs.chemmater.2c03475.</w:t>
+      </w:r>
+    </w:p>
+    <w:p>
+      <w:pPr>
+        <w:pStyle w:val="Compact"/>
+        <w:numPr>
+          <w:ilvl w:val="0"/>
+          <w:numId w:val="1003"/>
+        </w:numPr>
+      </w:pPr>
+      <w:r>
+        <w:t xml:space="preserve">W. Petry</w:t>
+      </w:r>
+      <w:r>
+        <w:t xml:space="preserve"> </w:t>
+      </w:r>
+      <w:r>
+        <w:rPr>
+          <w:i/>
+          <w:iCs/>
+        </w:rPr>
+        <w:t xml:space="preserve">et al.</w:t>
+      </w:r>
+      <w:r>
+        <w:t xml:space="preserve">,</w:t>
+      </w:r>
+      <w:r>
+        <w:t xml:space="preserve"> </w:t>
+      </w:r>
+      <w:r>
+        <w:rPr>
+          <w:i/>
+          <w:iCs/>
+        </w:rPr>
+        <w:t xml:space="preserve">Phys. Rev. B</w:t>
+      </w:r>
+      <w:r>
+        <w:t xml:space="preserve">, 1991,</w:t>
+      </w:r>
+      <w:r>
+        <w:t xml:space="preserve"> </w:t>
+      </w:r>
+      <w:r>
+        <w:rPr>
+          <w:b/>
+          <w:bCs/>
+        </w:rPr>
+        <w:t xml:space="preserve">43</w:t>
+      </w:r>
+      <w:r>
+        <w:t xml:space="preserve">, 10933; A. Heiming</w:t>
+      </w:r>
+      <w:r>
+        <w:t xml:space="preserve"> </w:t>
+      </w:r>
+      <w:r>
+        <w:rPr>
+          <w:i/>
+          <w:iCs/>
+        </w:rPr>
+        <w:t xml:space="preserve">et al.</w:t>
+      </w:r>
+      <w:r>
+        <w:t xml:space="preserve">,</w:t>
+      </w:r>
+      <w:r>
+        <w:t xml:space="preserve"> </w:t>
+      </w:r>
+      <w:r>
+        <w:rPr>
+          <w:i/>
+          <w:iCs/>
+        </w:rPr>
+        <w:t xml:space="preserve">Phys. Rev. B</w:t>
+      </w:r>
+      <w:r>
+        <w:t xml:space="preserve">, 1991,</w:t>
+      </w:r>
+      <w:r>
+        <w:t xml:space="preserve"> </w:t>
+      </w:r>
+      <w:r>
+        <w:rPr>
+          <w:b/>
+          <w:bCs/>
+        </w:rPr>
+        <w:t xml:space="preserve">43</w:t>
+      </w:r>
+      <w:r>
+        <w:t xml:space="preserve">, 10948.</w:t>
+      </w:r>
+    </w:p>
+    <w:p>
+      <w:pPr>
+        <w:pStyle w:val="Compact"/>
+        <w:numPr>
+          <w:ilvl w:val="0"/>
+          <w:numId w:val="1003"/>
+        </w:numPr>
+      </w:pPr>
+      <w:r>
+        <w:t xml:space="preserve">K. Parlinski, Z. Q. Li and Y. Kawazoe,</w:t>
+      </w:r>
+      <w:r>
+        <w:t xml:space="preserve"> </w:t>
+      </w:r>
+      <w:r>
+        <w:rPr>
+          <w:i/>
+          <w:iCs/>
+        </w:rPr>
+        <w:t xml:space="preserve">Phys. Rev. Lett.</w:t>
+      </w:r>
+      <w:r>
+        <w:t xml:space="preserve">, 1997,</w:t>
+      </w:r>
+      <w:r>
+        <w:t xml:space="preserve"> </w:t>
+      </w:r>
+      <w:r>
+        <w:rPr>
+          <w:b/>
+          <w:bCs/>
+        </w:rPr>
+        <w:t xml:space="preserve">78</w:t>
+      </w:r>
+      <w:r>
+        <w:t xml:space="preserve">, 4063.</w:t>
+      </w:r>
+    </w:p>
+    <w:p>
+      <w:pPr>
+        <w:pStyle w:val="Compact"/>
+        <w:numPr>
+          <w:ilvl w:val="0"/>
+          <w:numId w:val="1003"/>
+        </w:numPr>
+      </w:pPr>
+      <w:r>
+        <w:t xml:space="preserve">D. A. Wood and N. Marzari,</w:t>
+      </w:r>
+      <w:r>
+        <w:t xml:space="preserve"> </w:t>
+      </w:r>
+      <w:r>
+        <w:rPr>
+          <w:i/>
+          <w:iCs/>
+        </w:rPr>
+        <w:t xml:space="preserve">Phys. Rev. B</w:t>
+      </w:r>
+      <w:r>
+        <w:t xml:space="preserve">, 2007,</w:t>
+      </w:r>
+      <w:r>
+        <w:t xml:space="preserve"> </w:t>
+      </w:r>
+      <w:r>
+        <w:rPr>
+          <w:b/>
+          <w:bCs/>
+        </w:rPr>
+        <w:t xml:space="preserve">76</w:t>
+      </w:r>
+      <w:r>
+        <w:t xml:space="preserve">, 134301.</w:t>
+      </w:r>
+    </w:p>
+    <w:p>
+      <w:pPr>
+        <w:pStyle w:val="Compact"/>
+        <w:numPr>
+          <w:ilvl w:val="0"/>
+          <w:numId w:val="1003"/>
+        </w:numPr>
+      </w:pPr>
+      <w:r>
+        <w:t xml:space="preserve">A. Ranalli</w:t>
+      </w:r>
+      <w:r>
+        <w:t xml:space="preserve"> </w:t>
+      </w:r>
+      <w:r>
+        <w:rPr>
+          <w:i/>
+          <w:iCs/>
+        </w:rPr>
+        <w:t xml:space="preserve">et al.</w:t>
+      </w:r>
+      <w:r>
+        <w:t xml:space="preserve">,</w:t>
+      </w:r>
+      <w:r>
+        <w:t xml:space="preserve"> </w:t>
+      </w:r>
+      <w:r>
+        <w:rPr>
+          <w:i/>
+          <w:iCs/>
+        </w:rPr>
+        <w:t xml:space="preserve">Adv. Quantum Technol.</w:t>
+      </w:r>
+      <w:r>
+        <w:t xml:space="preserve">, 2023,</w:t>
+      </w:r>
+      <w:r>
+        <w:t xml:space="preserve"> </w:t>
+      </w:r>
+      <w:r>
+        <w:rPr>
+          <w:b/>
+          <w:bCs/>
+        </w:rPr>
+        <w:t xml:space="preserve">6</w:t>
+      </w:r>
+      <w:r>
+        <w:t xml:space="preserve">, 2200131.</w:t>
+      </w:r>
+    </w:p>
+    <w:bookmarkEnd w:id="46"/>
     <w:bookmarkEnd w:id="47"/>
-    <w:bookmarkEnd w:id="48"/>
     <w:sectPr>
       <w:footnotePr>
         <w:numRestart w:val="eachSect"/>

</xml_diff>

<commit_message>
manuscript: set sole author Frank Cai (Purdue University, ORCID 0009-0003-0041-1459)
</commit_message>
<xml_diff>
--- a/paper/manuscript.docx
+++ b/paper/manuscript.docx
@@ -24,7 +24,7 @@
         <w:pStyle w:val="FirstParagraph"/>
       </w:pPr>
       <w:r>
-        <w:t xml:space="preserve">[First Author]</w:t>
+        <w:t xml:space="preserve">Frank Cai</w:t>
       </w:r>
       <w:r>
         <w:rPr>
@@ -32,46 +32,28 @@
         </w:rPr>
         <w:t xml:space="preserve">a</w:t>
       </w:r>
-      <w:r>
-        <w:t xml:space="preserve"> </w:t>
-      </w:r>
-      <w:r>
-        <w:t xml:space="preserve">and [Co-author(s)]</w:t>
-      </w:r>
+    </w:p>
+    <w:p>
+      <w:pPr>
+        <w:pStyle w:val="BodyText"/>
+      </w:pPr>
       <w:r>
         <w:rPr>
           <w:vertAlign w:val="superscript"/>
         </w:rPr>
         <w:t xml:space="preserve">a</w:t>
       </w:r>
-    </w:p>
-    <w:p>
-      <w:pPr>
-        <w:pStyle w:val="BodyText"/>
-      </w:pPr>
-      <w:r>
-        <w:rPr>
-          <w:vertAlign w:val="superscript"/>
-        </w:rPr>
-        <w:t xml:space="preserve">a</w:t>
-      </w:r>
-      <w:r>
-        <w:t xml:space="preserve"> </w:t>
-      </w:r>
-      <w:r>
-        <w:t xml:space="preserve">[Department, Institution, Address, City, Country]. E-mail: frankyc11223@gmail.com</w:t>
-      </w:r>
-    </w:p>
-    <w:p>
-      <w:pPr>
-        <w:pStyle w:val="BodyText"/>
-      </w:pPr>
-      <w:r>
-        <w:rPr>
-          <w:i/>
-          <w:iCs/>
-        </w:rPr>
-        <w:t xml:space="preserve">Author list and affiliations to be completed before submission.</w:t>
+      <w:r>
+        <w:t xml:space="preserve"> </w:t>
+      </w:r>
+      <w:r>
+        <w:t xml:space="preserve">Purdue University, West Lafayette, Indiana, USA. E-mail: frankyc11223@gmail.com.</w:t>
+      </w:r>
+      <w:r>
+        <w:t xml:space="preserve"> </w:t>
+      </w:r>
+      <w:r>
+        <w:t xml:space="preserve">ORCID: 0009-0003-0041-1459</w:t>
       </w:r>
     </w:p>
     <w:bookmarkStart w:id="9" w:name="abstract"/>

</xml_diff>

<commit_message>
manuscript: insert Zenodo DOI 10.5281/zenodo.20805824 in data availability
</commit_message>
<xml_diff>
--- a/paper/manuscript.docx
+++ b/paper/manuscript.docx
@@ -4622,20 +4622,7 @@
         <w:t xml:space="preserve"> </w:t>
       </w:r>
       <w:r>
-        <w:t xml:space="preserve">DOI: 10.5281/zenodo.XXXXXXX</w:t>
-      </w:r>
-      <w:r>
-        <w:t xml:space="preserve"> </w:t>
-      </w:r>
-      <w:r>
-        <w:rPr>
-          <w:i/>
-          <w:iCs/>
-        </w:rPr>
-        <w:t xml:space="preserve">(DOI reserved on release; to be inserted on acceptance)</w:t>
-      </w:r>
-      <w:r>
-        <w:t xml:space="preserve">. The</w:t>
+        <w:t xml:space="preserve">https://doi.org/10.5281/zenodo.20805824. The</w:t>
       </w:r>
       <w:r>
         <w:t xml:space="preserve"> </w:t>

</xml_diff>

<commit_message>
add acknowledgements, cover letter (Digital Discovery), and Stage 6 process summary
</commit_message>
<xml_diff>
--- a/paper/manuscript.docx
+++ b/paper/manuscript.docx
@@ -4742,11 +4742,43 @@
         <w:pStyle w:val="FirstParagraph"/>
       </w:pPr>
       <w:r>
-        <w:rPr>
-          <w:i/>
-          <w:iCs/>
-        </w:rPr>
-        <w:t xml:space="preserve">Funding sources and computational resources to be acknowledged before submission.</w:t>
+        <w:t xml:space="preserve">The author thanks the developers of the foundation interatomic-potential packages benchmarked</w:t>
+      </w:r>
+      <w:r>
+        <w:t xml:space="preserve"> </w:t>
+      </w:r>
+      <w:r>
+        <w:t xml:space="preserve">here — MACE-MP-0, CHGNet, ORB, SevenNet and MatterSim — and of phonopy, python-sscha /</w:t>
+      </w:r>
+      <w:r>
+        <w:t xml:space="preserve"> </w:t>
+      </w:r>
+      <w:r>
+        <w:t xml:space="preserve">cellconstructor, ASE and pymatgen, for making their codes and pre-trained models openly</w:t>
+      </w:r>
+      <w:r>
+        <w:t xml:space="preserve"> </w:t>
+      </w:r>
+      <w:r>
+        <w:t xml:space="preserve">available; this benchmark would not have been possible otherwise. Reference structures were</w:t>
+      </w:r>
+      <w:r>
+        <w:t xml:space="preserve"> </w:t>
+      </w:r>
+      <w:r>
+        <w:t xml:space="preserve">obtained from the Materials Project. Computational resources were provided by commercial cloud</w:t>
+      </w:r>
+      <w:r>
+        <w:t xml:space="preserve"> </w:t>
+      </w:r>
+      <w:r>
+        <w:t xml:space="preserve">GPU providers. This research received no specific grant from any funding agency in the public,</w:t>
+      </w:r>
+      <w:r>
+        <w:t xml:space="preserve"> </w:t>
+      </w:r>
+      <w:r>
+        <w:t xml:space="preserve">commercial, or not-for-profit sectors.</w:t>
       </w:r>
     </w:p>
     <w:bookmarkEnd w:id="45"/>

</xml_diff>

<commit_message>
figures: re-export at 300dpi PNG + add 600dpi TIFF for RSC figure spec; rebuild manuscript DOCX
</commit_message>
<xml_diff>
--- a/paper/manuscript.docx
+++ b/paper/manuscript.docx
@@ -2,14 +2,6 @@
 <file path=word/document.xml><?xml version="1.0" encoding="utf-8"?>
 <w:document xmlns:w="http://schemas.openxmlformats.org/wordprocessingml/2006/main" xmlns:m="http://schemas.openxmlformats.org/officeDocument/2006/math" xmlns:r="http://schemas.openxmlformats.org/officeDocument/2006/relationships" xmlns:o="urn:schemas-microsoft-com:office:office" xmlns:v="urn:schemas-microsoft-com:vml" xmlns:w10="urn:schemas-microsoft-com:office:word" xmlns:a="http://schemas.openxmlformats.org/drawingml/2006/main" xmlns:pic="http://schemas.openxmlformats.org/drawingml/2006/picture" xmlns:wp="http://schemas.openxmlformats.org/drawingml/2006/wordprocessingDrawing">
   <w:body>
-    <w:p>
-      <w:pPr>
-        <w:pStyle w:val="Title"/>
-      </w:pPr>
-      <w:r>
-        <w:t xml:space="preserve">Finite-temperature dynamic stability is a blind spot of foundation MLIPs</w:t>
-      </w:r>
-    </w:p>
     <w:bookmarkStart w:id="47" w:name="X70ee5b06aaed82dff3ea33fa72d6d866bb3cc17"/>
     <w:p>
       <w:pPr>
@@ -1589,7 +1581,7 @@
       <w:r>
         <w:drawing>
           <wp:inline>
-            <wp:extent cx="4784784" cy="3864633"/>
+            <wp:extent cx="4770782" cy="3853324"/>
             <wp:effectExtent b="0" l="0" r="0" t="0"/>
             <wp:docPr descr="Fig. 1 Harmonic false-stable and false-unstable call counts versus the imaginary-frequency tolerance (§3.1). The default −0.1 THz sits in the stable basin between the false-unstable flood at strict tolerance and the false-stable inflation at loose tolerance." title="" id="18" name="Picture"/>
             <a:graphic>
@@ -1610,7 +1602,7 @@
                   <pic:spPr bwMode="auto">
                     <a:xfrm>
                       <a:off x="0" y="0"/>
-                      <a:ext cx="4784784" cy="3864633"/>
+                      <a:ext cx="4770782" cy="3853324"/>
                     </a:xfrm>
                     <a:prstGeom prst="rect">
                       <a:avLst/>
@@ -2501,7 +2493,7 @@
       <w:r>
         <w:drawing>
           <wp:inline>
-            <wp:extent cx="5334000" cy="1866899"/>
+            <wp:extent cx="5334000" cy="1866900"/>
             <wp:effectExtent b="0" l="0" r="0" t="0"/>
             <wp:docPr descr="Fig. 3 Multi-mode SSCHA dynamic-stabilisation curves for bcc Ti/Zr/Hf, five models, versus temperature (§3.3). All models stabilise the bcc phase by ≤50 K; the margin to the stability boundary (MatterSim/ORB-v2 hugging ~0.4 THz, MACE-MP-0 firmly stable ~1.8 THz) discriminates the models." title="" id="26" name="Picture"/>
             <a:graphic>
@@ -2522,7 +2514,7 @@
                   <pic:spPr bwMode="auto">
                     <a:xfrm>
                       <a:off x="0" y="0"/>
-                      <a:ext cx="5334000" cy="1866899"/>
+                      <a:ext cx="5334000" cy="1866900"/>
                     </a:xfrm>
                     <a:prstGeom prst="rect">
                       <a:avLst/>
@@ -2941,7 +2933,7 @@
       <w:r>
         <w:drawing>
           <wp:inline>
-            <wp:extent cx="4232694" cy="4232694"/>
+            <wp:extent cx="4220307" cy="4220307"/>
             <wp:effectExtent b="0" l="0" r="0" t="0"/>
             <wp:docPr descr="Fig. 6 Ensemble-disagreement guardrail (§3.4): the discrete inter-model vote split predicts consensus error (AUC 0.75) while the continuous cross-model frequency spread does not (AUC 0.52)." title="" id="33" name="Picture"/>
             <a:graphic>
@@ -2962,7 +2954,7 @@
                   <pic:spPr bwMode="auto">
                     <a:xfrm>
                       <a:off x="0" y="0"/>
-                      <a:ext cx="4232694" cy="4232694"/>
+                      <a:ext cx="4220307" cy="4220307"/>
                     </a:xfrm>
                     <a:prstGeom prst="rect">
                       <a:avLst/>
@@ -3050,7 +3042,7 @@
       <w:r>
         <w:drawing>
           <wp:inline>
-            <wp:extent cx="4232694" cy="4232694"/>
+            <wp:extent cx="4220307" cy="4220307"/>
             <wp:effectExtent b="0" l="0" r="0" t="0"/>
             <wp:docPr descr="Fig. 5 Recall of the displacive (ferroelectric-perovskite) instability at T ≤ 300 K: the cheap soft-mode screen (0.77) versus the expensive SSCHA (0.23) (§3.3). The cautionary result is that the gold standard is less reliable than the screen in the regime that matters most." title="" id="36" name="Picture"/>
             <a:graphic>
@@ -3071,7 +3063,7 @@
                   <pic:spPr bwMode="auto">
                     <a:xfrm>
                       <a:off x="0" y="0"/>
-                      <a:ext cx="4232694" cy="4232694"/>
+                      <a:ext cx="4220307" cy="4220307"/>
                     </a:xfrm>
                     <a:prstGeom prst="rect">
                       <a:avLst/>

</xml_diff>

<commit_message>
paper: add Author contributions section and reorder back matter to RSC house order (Data availability -> Author contributions -> Conflicts -> Acknowledgements)
</commit_message>
<xml_diff>
--- a/paper/manuscript.docx
+++ b/paper/manuscript.docx
@@ -2,7 +2,7 @@
 <file path=word/document.xml><?xml version="1.0" encoding="utf-8"?>
 <w:document xmlns:w="http://schemas.openxmlformats.org/wordprocessingml/2006/main" xmlns:m="http://schemas.openxmlformats.org/officeDocument/2006/math" xmlns:r="http://schemas.openxmlformats.org/officeDocument/2006/relationships" xmlns:o="urn:schemas-microsoft-com:office:office" xmlns:v="urn:schemas-microsoft-com:vml" xmlns:w10="urn:schemas-microsoft-com:office:word" xmlns:a="http://schemas.openxmlformats.org/drawingml/2006/main" xmlns:pic="http://schemas.openxmlformats.org/drawingml/2006/picture" xmlns:wp="http://schemas.openxmlformats.org/drawingml/2006/wordprocessingDrawing">
   <w:body>
-    <w:bookmarkStart w:id="47" w:name="X70ee5b06aaed82dff3ea33fa72d6d866bb3cc17"/>
+    <w:bookmarkStart w:id="48" w:name="X70ee5b06aaed82dff3ea33fa72d6d866bb3cc17"/>
     <w:p>
       <w:pPr>
         <w:pStyle w:val="Heading1"/>
@@ -3403,12 +3403,156 @@
       </w:r>
     </w:p>
     <w:bookmarkEnd w:id="42"/>
-    <w:bookmarkStart w:id="43" w:name="conflicts-of-interest"/>
+    <w:bookmarkStart w:id="43" w:name="data-availability"/>
     <w:p>
       <w:pPr>
         <w:pStyle w:val="Heading2"/>
       </w:pPr>
       <w:r>
+        <w:t xml:space="preserve">Data availability</w:t>
+      </w:r>
+    </w:p>
+    <w:p>
+      <w:pPr>
+        <w:pStyle w:val="FirstParagraph"/>
+      </w:pPr>
+      <w:r>
+        <w:t xml:space="preserve">The code supporting this article, together with the per-unit results ledger, is openly available</w:t>
+      </w:r>
+      <w:r>
+        <w:t xml:space="preserve"> </w:t>
+      </w:r>
+      <w:r>
+        <w:t xml:space="preserve">in the repository at https://github.com/fronkt/mlip-dynamic-stability and archived at Zenodo at</w:t>
+      </w:r>
+      <w:r>
+        <w:t xml:space="preserve"> </w:t>
+      </w:r>
+      <w:r>
+        <w:t xml:space="preserve">https://doi.org/10.5281/zenodo.20805824. The production results regenerate from</w:t>
+      </w:r>
+      <w:r>
+        <w:t xml:space="preserve"> </w:t>
+      </w:r>
+      <w:r>
+        <w:rPr>
+          <w:rStyle w:val="VerbatimChar"/>
+        </w:rPr>
+        <w:t xml:space="preserve">results/ledger.parquet</w:t>
+      </w:r>
+      <w:r>
+        <w:t xml:space="preserve"> </w:t>
+      </w:r>
+      <w:r>
+        <w:t xml:space="preserve">(per-unit hashed, resumable) and the finite-size runs from</w:t>
+      </w:r>
+      <w:r>
+        <w:t xml:space="preserve"> </w:t>
+      </w:r>
+      <w:r>
+        <w:rPr>
+          <w:rStyle w:val="VerbatimChar"/>
+        </w:rPr>
+        <w:t xml:space="preserve">results/convergence_study.parquet</w:t>
+      </w:r>
+      <w:r>
+        <w:t xml:space="preserve">; figures via</w:t>
+      </w:r>
+      <w:r>
+        <w:t xml:space="preserve"> </w:t>
+      </w:r>
+      <w:r>
+        <w:rPr>
+          <w:rStyle w:val="VerbatimChar"/>
+        </w:rPr>
+        <w:t xml:space="preserve">scripts/make_figures.py</w:t>
+      </w:r>
+      <w:r>
+        <w:t xml:space="preserve">, analysis in</w:t>
+      </w:r>
+      <w:r>
+        <w:t xml:space="preserve"> </w:t>
+      </w:r>
+      <w:r>
+        <w:rPr>
+          <w:rStyle w:val="VerbatimChar"/>
+        </w:rPr>
+        <w:t xml:space="preserve">mlip_dynstab/analysis.py</w:t>
+      </w:r>
+      <w:r>
+        <w:t xml:space="preserve">, the SSCHA root-cause diagnostic in</w:t>
+      </w:r>
+      <w:r>
+        <w:t xml:space="preserve"> </w:t>
+      </w:r>
+      <w:r>
+        <w:rPr>
+          <w:rStyle w:val="VerbatimChar"/>
+        </w:rPr>
+        <w:t xml:space="preserve">scripts/sscha_v4_diag.py</w:t>
+      </w:r>
+      <w:r>
+        <w:t xml:space="preserve">, and the</w:t>
+      </w:r>
+      <w:r>
+        <w:t xml:space="preserve"> </w:t>
+      </w:r>
+      <w:r>
+        <w:t xml:space="preserve">stochastic-reproducibility study (§3.5) via</w:t>
+      </w:r>
+      <w:r>
+        <w:t xml:space="preserve"> </w:t>
+      </w:r>
+      <w:r>
+        <w:rPr>
+          <w:rStyle w:val="VerbatimChar"/>
+        </w:rPr>
+        <w:t xml:space="preserve">scripts/sscha_repro.py</w:t>
+      </w:r>
+      <w:r>
+        <w:t xml:space="preserve"> </w:t>
+      </w:r>
+      <w:r>
+        <w:t xml:space="preserve">(its per-seed frequencies</w:t>
+      </w:r>
+      <w:r>
+        <w:t xml:space="preserve"> </w:t>
+      </w:r>
+      <w:r>
+        <w:t xml:space="preserve">print to the run log rather than to the ledger).</w:t>
+      </w:r>
+    </w:p>
+    <w:bookmarkEnd w:id="43"/>
+    <w:bookmarkStart w:id="44" w:name="author-contributions"/>
+    <w:p>
+      <w:pPr>
+        <w:pStyle w:val="Heading2"/>
+      </w:pPr>
+      <w:r>
+        <w:t xml:space="preserve">Author contributions</w:t>
+      </w:r>
+    </w:p>
+    <w:p>
+      <w:pPr>
+        <w:pStyle w:val="FirstParagraph"/>
+      </w:pPr>
+      <w:r>
+        <w:t xml:space="preserve">F.C. conceived the study, implemented the benchmark harness and analysis, performed all</w:t>
+      </w:r>
+      <w:r>
+        <w:t xml:space="preserve"> </w:t>
+      </w:r>
+      <w:r>
+        <w:t xml:space="preserve">computations, and wrote the manuscript.</w:t>
+      </w:r>
+    </w:p>
+    <w:bookmarkEnd w:id="44"/>
+    <w:bookmarkStart w:id="45" w:name="conflicts-of-interest"/>
+    <w:p>
+      <w:pPr>
+        <w:pStyle w:val="Heading2"/>
+      </w:pPr>
+      <w:r>
         <w:t xml:space="preserve">Conflicts of interest</w:t>
       </w:r>
     </w:p>
@@ -3417,17 +3561,17 @@
         <w:pStyle w:val="FirstParagraph"/>
       </w:pPr>
       <w:r>
-        <w:t xml:space="preserve">There are no conflicts to declare.</w:t>
-      </w:r>
-    </w:p>
-    <w:bookmarkEnd w:id="43"/>
-    <w:bookmarkStart w:id="44" w:name="data-availability"/>
+        <w:t xml:space="preserve">There are no conflicts of interest to declare.</w:t>
+      </w:r>
+    </w:p>
+    <w:bookmarkEnd w:id="45"/>
+    <w:bookmarkStart w:id="46" w:name="acknowledgements"/>
     <w:p>
       <w:pPr>
         <w:pStyle w:val="Heading2"/>
       </w:pPr>
       <w:r>
-        <w:t xml:space="preserve">Data availability</w:t>
+        <w:t xml:space="preserve">Acknowledgements</w:t>
       </w:r>
     </w:p>
     <w:p>
@@ -3435,126 +3579,6 @@
         <w:pStyle w:val="FirstParagraph"/>
       </w:pPr>
       <w:r>
-        <w:t xml:space="preserve">The code supporting this article, together with the per-unit results ledger, is openly available</w:t>
-      </w:r>
-      <w:r>
-        <w:t xml:space="preserve"> </w:t>
-      </w:r>
-      <w:r>
-        <w:t xml:space="preserve">in the repository at https://github.com/fronkt/mlip-dynamic-stability and archived at Zenodo at</w:t>
-      </w:r>
-      <w:r>
-        <w:t xml:space="preserve"> </w:t>
-      </w:r>
-      <w:r>
-        <w:t xml:space="preserve">https://doi.org/10.5281/zenodo.20805824. The production results regenerate from</w:t>
-      </w:r>
-      <w:r>
-        <w:t xml:space="preserve"> </w:t>
-      </w:r>
-      <w:r>
-        <w:rPr>
-          <w:rStyle w:val="VerbatimChar"/>
-        </w:rPr>
-        <w:t xml:space="preserve">results/ledger.parquet</w:t>
-      </w:r>
-      <w:r>
-        <w:t xml:space="preserve"> </w:t>
-      </w:r>
-      <w:r>
-        <w:t xml:space="preserve">(per-unit hashed, resumable) and the finite-size runs from</w:t>
-      </w:r>
-      <w:r>
-        <w:t xml:space="preserve"> </w:t>
-      </w:r>
-      <w:r>
-        <w:rPr>
-          <w:rStyle w:val="VerbatimChar"/>
-        </w:rPr>
-        <w:t xml:space="preserve">results/convergence_study.parquet</w:t>
-      </w:r>
-      <w:r>
-        <w:t xml:space="preserve">; figures via</w:t>
-      </w:r>
-      <w:r>
-        <w:t xml:space="preserve"> </w:t>
-      </w:r>
-      <w:r>
-        <w:rPr>
-          <w:rStyle w:val="VerbatimChar"/>
-        </w:rPr>
-        <w:t xml:space="preserve">scripts/make_figures.py</w:t>
-      </w:r>
-      <w:r>
-        <w:t xml:space="preserve">, analysis in</w:t>
-      </w:r>
-      <w:r>
-        <w:t xml:space="preserve"> </w:t>
-      </w:r>
-      <w:r>
-        <w:rPr>
-          <w:rStyle w:val="VerbatimChar"/>
-        </w:rPr>
-        <w:t xml:space="preserve">mlip_dynstab/analysis.py</w:t>
-      </w:r>
-      <w:r>
-        <w:t xml:space="preserve">, the SSCHA root-cause diagnostic in</w:t>
-      </w:r>
-      <w:r>
-        <w:t xml:space="preserve"> </w:t>
-      </w:r>
-      <w:r>
-        <w:rPr>
-          <w:rStyle w:val="VerbatimChar"/>
-        </w:rPr>
-        <w:t xml:space="preserve">scripts/sscha_v4_diag.py</w:t>
-      </w:r>
-      <w:r>
-        <w:t xml:space="preserve">, and the</w:t>
-      </w:r>
-      <w:r>
-        <w:t xml:space="preserve"> </w:t>
-      </w:r>
-      <w:r>
-        <w:t xml:space="preserve">stochastic-reproducibility study (§3.5) via</w:t>
-      </w:r>
-      <w:r>
-        <w:t xml:space="preserve"> </w:t>
-      </w:r>
-      <w:r>
-        <w:rPr>
-          <w:rStyle w:val="VerbatimChar"/>
-        </w:rPr>
-        <w:t xml:space="preserve">scripts/sscha_repro.py</w:t>
-      </w:r>
-      <w:r>
-        <w:t xml:space="preserve"> </w:t>
-      </w:r>
-      <w:r>
-        <w:t xml:space="preserve">(its per-seed frequencies</w:t>
-      </w:r>
-      <w:r>
-        <w:t xml:space="preserve"> </w:t>
-      </w:r>
-      <w:r>
-        <w:t xml:space="preserve">print to the run log rather than to the ledger).</w:t>
-      </w:r>
-    </w:p>
-    <w:bookmarkEnd w:id="44"/>
-    <w:bookmarkStart w:id="45" w:name="acknowledgements"/>
-    <w:p>
-      <w:pPr>
-        <w:pStyle w:val="Heading2"/>
-      </w:pPr>
-      <w:r>
-        <w:t xml:space="preserve">Acknowledgements</w:t>
-      </w:r>
-    </w:p>
-    <w:p>
-      <w:pPr>
-        <w:pStyle w:val="FirstParagraph"/>
-      </w:pPr>
-      <w:r>
         <w:t xml:space="preserve">The author thanks the developers of the foundation interatomic-potential packages benchmarked</w:t>
       </w:r>
       <w:r>
@@ -3594,8 +3618,8 @@
         <w:t xml:space="preserve">not-for-profit sectors.</w:t>
       </w:r>
     </w:p>
-    <w:bookmarkEnd w:id="45"/>
-    <w:bookmarkStart w:id="46" w:name="references"/>
+    <w:bookmarkEnd w:id="46"/>
+    <w:bookmarkStart w:id="47" w:name="references"/>
     <w:p>
       <w:pPr>
         <w:pStyle w:val="Heading2"/>
@@ -4366,8 +4390,8 @@
         <w:t xml:space="preserve">, 2200131.</w:t>
       </w:r>
     </w:p>
-    <w:bookmarkEnd w:id="46"/>
     <w:bookmarkEnd w:id="47"/>
+    <w:bookmarkEnd w:id="48"/>
     <w:sectPr>
       <w:footnotePr>
         <w:numRestart w:val="eachSect"/>

</xml_diff>

<commit_message>
propagate multi-mode results through the manuscript: new title, abstract, 2.4 method+gate, 3.2 table and H2, 3.3 agreement/recall/blowup attribution, 3.4 guardrail, 3.5 superseded-data flag, discussion limitations; add analysis.canonical so no figure can mix method generations; regenerate all 6 figures and the DOCX
</commit_message>
<xml_diff>
--- a/paper/manuscript.docx
+++ b/paper/manuscript.docx
@@ -2,13 +2,13 @@
 <file path=word/document.xml><?xml version="1.0" encoding="utf-8"?>
 <w:document xmlns:w="http://schemas.openxmlformats.org/wordprocessingml/2006/main" xmlns:m="http://schemas.openxmlformats.org/officeDocument/2006/math" xmlns:r="http://schemas.openxmlformats.org/officeDocument/2006/relationships" xmlns:o="urn:schemas-microsoft-com:office:office" xmlns:v="urn:schemas-microsoft-com:vml" xmlns:w10="urn:schemas-microsoft-com:office:word" xmlns:a="http://schemas.openxmlformats.org/drawingml/2006/main" xmlns:pic="http://schemas.openxmlformats.org/drawingml/2006/picture" xmlns:wp="http://schemas.openxmlformats.org/drawingml/2006/wordprocessingDrawing">
   <w:body>
-    <w:bookmarkStart w:id="48" w:name="X70ee5b06aaed82dff3ea33fa72d6d866bb3cc17"/>
+    <w:bookmarkStart w:id="48" w:name="X50950f7d59785a5ea3fab8ceb7ed33297b6e7ed"/>
     <w:p>
       <w:pPr>
         <w:pStyle w:val="Heading1"/>
       </w:pPr>
       <w:r>
-        <w:t xml:space="preserve">Finite-temperature dynamic stability is a blind spot of foundation machine-learning interatomic potentials</w:t>
+        <w:t xml:space="preserve">Finite-temperature dynamic stability separates foundation machine-learning interatomic potentials that harmonic benchmarks rank equally</w:t>
       </w:r>
     </w:p>
     <w:p>
@@ -104,13 +104,13 @@
         <w:t xml:space="preserve"> </w:t>
       </w:r>
       <w:r>
-        <w:t xml:space="preserve">DFT literature, so that no new DFT ground truth is required. We introduce a cheap single-mode</w:t>
-      </w:r>
-      <w:r>
-        <w:t xml:space="preserve"> </w:t>
-      </w:r>
-      <w:r>
-        <w:t xml:space="preserve">quantum self-consistent-harmonic (SCHA)</w:t>
+        <w:t xml:space="preserve">DFT literature, so that no new DFT ground truth is required. We introduce a cheap quantum</w:t>
+      </w:r>
+      <w:r>
+        <w:t xml:space="preserve"> </w:t>
+      </w:r>
+      <w:r>
+        <w:t xml:space="preserve">self-consistent-harmonic (SCHA)</w:t>
       </w:r>
       <w:r>
         <w:t xml:space="preserve"> </w:t>
@@ -122,85 +122,121 @@
         <w:t xml:space="preserve"> </w:t>
       </w:r>
       <w:r>
-        <w:t xml:space="preserve">screen that resolves the</w:t>
-      </w:r>
-      <w:r>
-        <w:t xml:space="preserve"> </w:t>
-      </w:r>
-      <w:r>
-        <w:t xml:space="preserve">harmonic-to-finite-temperature stabilisation, and we cross-validate it against the gold-standard</w:t>
-      </w:r>
-      <w:r>
-        <w:t xml:space="preserve"> </w:t>
-      </w:r>
-      <w:r>
-        <w:t xml:space="preserve">multi-mode stochastic SCHA (SSCHA). We report three findings together with a practical</w:t>
-      </w:r>
-      <w:r>
-        <w:t xml:space="preserve"> </w:t>
-      </w:r>
-      <w:r>
-        <w:t xml:space="preserve">ensemble-disagreement guardrail. (i) At the harmonic level the models divide: MatterSim and</w:t>
-      </w:r>
-      <w:r>
-        <w:t xml:space="preserve"> </w:t>
-      </w:r>
-      <w:r>
-        <w:t xml:space="preserve">SevenNet-0 reproduce every documented soft mode (accuracy 1.00), whereas MACE-MP-0, CHGNet and</w:t>
-      </w:r>
-      <w:r>
-        <w:t xml:space="preserve"> </w:t>
-      </w:r>
-      <w:r>
-        <w:t xml:space="preserve">ORB-v2 soften the bcc Zr/Hf instabilities toward zero and carry a 15% false-stable rate. (ii)</w:t>
-      </w:r>
-      <w:r>
-        <w:t xml:space="preserve"> </w:t>
-      </w:r>
-      <w:r>
-        <w:t xml:space="preserve">Harmonic accuracy is necessary but not sufficient for finite-temperature accuracy: the two are only</w:t>
-      </w:r>
-      <w:r>
-        <w:t xml:space="preserve"> </w:t>
-      </w:r>
-      <w:r>
-        <w:t xml:space="preserve">weakly correlated on the matched set, the harmonic leaders (MatterSim, SevenNet-0) are not the</w:t>
-      </w:r>
-      <w:r>
-        <w:t xml:space="preserve"> </w:t>
-      </w:r>
-      <w:r>
-        <w:t xml:space="preserve">finite-temperature leaders, and the soft-mode screen recovers the displacive instability of cubic</w:t>
-      </w:r>
-      <w:r>
-        <w:t xml:space="preserve"> </w:t>
-      </w:r>
-      <w:r>
-        <w:t xml:space="preserve">ferroelectric perovskites that the models otherwise miss. (iii) Multi-mode SSCHA with an MLIP force</w:t>
-      </w:r>
-      <w:r>
-        <w:t xml:space="preserve"> </w:t>
-      </w:r>
-      <w:r>
-        <w:t xml:space="preserve">engine is itself a methodological trap: it is a clean gold standard for the martensitic bcc metals</w:t>
-      </w:r>
-      <w:r>
-        <w:t xml:space="preserve"> </w:t>
-      </w:r>
-      <w:r>
-        <w:t xml:space="preserve">but systematically false-stabilises deep displacive (ferroelectric) instabilities and can diverge</w:t>
-      </w:r>
-      <w:r>
-        <w:t xml:space="preserve"> </w:t>
-      </w:r>
-      <w:r>
-        <w:t xml:space="preserve">numerically, so the cheap soft-mode screen is the more reliable finite-temperature indicator for</w:t>
-      </w:r>
-      <w:r>
-        <w:t xml:space="preserve"> </w:t>
-      </w:r>
-      <w:r>
-        <w:t xml:space="preserve">the displacive instabilities that dominate generative crystal-structure-prediction (CSP) screening.</w:t>
+        <w:t xml:space="preserve">screen that evaluates every imaginary</w:t>
+      </w:r>
+      <w:r>
+        <w:t xml:space="preserve"> </w:t>
+      </w:r>
+      <w:r>
+        <w:t xml:space="preserve">commensurate mode and calls the high-symmetry phase unstable if any of them condenses, and we</w:t>
+      </w:r>
+      <w:r>
+        <w:t xml:space="preserve"> </w:t>
+      </w:r>
+      <w:r>
+        <w:t xml:space="preserve">cross-validate it against the gold-standard multi-mode stochastic SCHA (SSCHA). We report three</w:t>
+      </w:r>
+      <w:r>
+        <w:t xml:space="preserve"> </w:t>
+      </w:r>
+      <w:r>
+        <w:t xml:space="preserve">findings together with a practical ensemble-disagreement guardrail. (i) At the harmonic level the</w:t>
+      </w:r>
+      <w:r>
+        <w:t xml:space="preserve"> </w:t>
+      </w:r>
+      <w:r>
+        <w:t xml:space="preserve">models divide: MatterSim and SevenNet-0 reproduce every documented soft mode (accuracy 1.00),</w:t>
+      </w:r>
+      <w:r>
+        <w:t xml:space="preserve"> </w:t>
+      </w:r>
+      <w:r>
+        <w:t xml:space="preserve">whereas MACE-MP-0, CHGNet and ORB-v2 soften the bcc Zr/Hf instabilities toward zero and carry a 15%</w:t>
+      </w:r>
+      <w:r>
+        <w:t xml:space="preserve"> </w:t>
+      </w:r>
+      <w:r>
+        <w:t xml:space="preserve">false-stable rate. (ii) Harmonic accuracy does not predict finite-temperature accuracy in either</w:t>
+      </w:r>
+      <w:r>
+        <w:t xml:space="preserve"> </w:t>
+      </w:r>
+      <w:r>
+        <w:t xml:space="preserve">direction: CHGNet is the worst model harmonically yet the second best at finite temperature, while</w:t>
+      </w:r>
+      <w:r>
+        <w:t xml:space="preserve"> </w:t>
+      </w:r>
+      <w:r>
+        <w:t xml:space="preserve">MatterSim is harmonically perfect and only mid-table, and on the matched set the two are</w:t>
+      </w:r>
+      <w:r>
+        <w:t xml:space="preserve"> </w:t>
+      </w:r>
+      <w:r>
+        <w:t xml:space="preserve">non-significantly concordant at 100 K and significantly anti-associated at 300 K. Screening every</w:t>
+      </w:r>
+      <w:r>
+        <w:t xml:space="preserve"> </w:t>
+      </w:r>
+      <w:r>
+        <w:t xml:space="preserve">imaginary mode rather than the softest one is essential, because the deepest mode need not be the</w:t>
+      </w:r>
+      <w:r>
+        <w:t xml:space="preserve"> </w:t>
+      </w:r>
+      <w:r>
+        <w:t xml:space="preserve">one that condenses: in SrTiO₃ the Γ ferroelectric mode is deeper than the R-point tilt yet is</w:t>
+      </w:r>
+      <w:r>
+        <w:t xml:space="preserve"> </w:t>
+      </w:r>
+      <w:r>
+        <w:t xml:space="preserve">quantum-suppressed, and only the tilt drives the 105 K transition. (iii) Multi-mode SSCHA with an MLIP force</w:t>
+      </w:r>
+      <w:r>
+        <w:t xml:space="preserve"> </w:t>
+      </w:r>
+      <w:r>
+        <w:t xml:space="preserve">engine is a clean gold standard for the martensitic bcc metals, but in its default deployment, with</w:t>
+      </w:r>
+      <w:r>
+        <w:t xml:space="preserve"> </w:t>
+      </w:r>
+      <w:r>
+        <w:t xml:space="preserve">the free-energy Hessian truncated at the bubble, it systematically false-stabilises deep displacive</w:t>
+      </w:r>
+      <w:r>
+        <w:t xml:space="preserve"> </w:t>
+      </w:r>
+      <w:r>
+        <w:t xml:space="preserve">(ferroelectric) instabilities and can diverge numerically. Theory predicts this truncation to fail</w:t>
+      </w:r>
+      <w:r>
+        <w:t xml:space="preserve"> </w:t>
+      </w:r>
+      <w:r>
+        <w:t xml:space="preserve">for cubic metal halide perovskites; we measure the failure at benchmark scale and show it extends to</w:t>
+      </w:r>
+      <w:r>
+        <w:t xml:space="preserve"> </w:t>
+      </w:r>
+      <w:r>
+        <w:t xml:space="preserve">oxide perovskites and, free of stochastic blow-ups, to cubic fluorites. The cheap soft-mode screen</w:t>
+      </w:r>
+      <w:r>
+        <w:t xml:space="preserve"> </w:t>
+      </w:r>
+      <w:r>
+        <w:t xml:space="preserve">is therefore the more reliable finite-temperature indicator for the displacive instabilities that</w:t>
+      </w:r>
+      <w:r>
+        <w:t xml:space="preserve"> </w:t>
+      </w:r>
+      <w:r>
+        <w:t xml:space="preserve">dominate generative crystal-structure-prediction (CSP) screening.</w:t>
       </w:r>
     </w:p>
     <w:bookmarkEnd w:id="9"/>
@@ -328,25 +364,91 @@
         <w:t xml:space="preserve"> </w:t>
       </w:r>
       <w:r>
-        <w:t xml:space="preserve">the high-symmetry phase is the equilibrium phase above a transition temperature. Whether foundation</w:t>
-      </w:r>
-      <w:r>
-        <w:t xml:space="preserve"> </w:t>
-      </w:r>
-      <w:r>
-        <w:t xml:space="preserve">MLIPs reproduce this harmonic-to-finite-temperature stabilisation is essentially un-benchmarked,</w:t>
-      </w:r>
-      <w:r>
-        <w:t xml:space="preserve"> </w:t>
-      </w:r>
-      <w:r>
-        <w:t xml:space="preserve">even though the harmonic-only oracle that PhononBench and CSP screening rely on is what this regime</w:t>
-      </w:r>
-      <w:r>
-        <w:t xml:space="preserve"> </w:t>
-      </w:r>
-      <w:r>
-        <w:t xml:space="preserve">breaks.</w:t>
+        <w:t xml:space="preserve">the high-symmetry phase is the equilibrium phase above a transition temperature, and the</w:t>
+      </w:r>
+      <w:r>
+        <w:t xml:space="preserve"> </w:t>
+      </w:r>
+      <w:r>
+        <w:t xml:space="preserve">harmonic-only oracle that PhononBench and CSP screening rely on is what this regime breaks. Two 2025</w:t>
+      </w:r>
+      <w:r>
+        <w:t xml:space="preserve"> </w:t>
+      </w:r>
+      <w:r>
+        <w:t xml:space="preserve">studies probe finite-temperature reliability directly: four MACE foundation variants were</w:t>
+      </w:r>
+      <w:r>
+        <w:t xml:space="preserve"> </w:t>
+      </w:r>
+      <w:r>
+        <w:t xml:space="preserve">benchmarked for the dynamic stability of halide double perovskites,</w:t>
+      </w:r>
+      <w:r>
+        <w:rPr>
+          <w:vertAlign w:val="superscript"/>
+        </w:rPr>
+        <w:t xml:space="preserve">19</w:t>
+      </w:r>
+      <w:r>
+        <w:t xml:space="preserve"> </w:t>
+      </w:r>
+      <w:r>
+        <w:t xml:space="preserve">and the</w:t>
+      </w:r>
+      <w:r>
+        <w:t xml:space="preserve"> </w:t>
+      </w:r>
+      <w:r>
+        <w:t xml:space="preserve">ferroelectric-to-paraelectric transition of PbTiO₃ was used to expose a disconnect between static</w:t>
+      </w:r>
+      <w:r>
+        <w:t xml:space="preserve"> </w:t>
+      </w:r>
+      <w:r>
+        <w:t xml:space="preserve">accuracy and dynamic reliability.</w:t>
+      </w:r>
+      <w:r>
+        <w:rPr>
+          <w:vertAlign w:val="superscript"/>
+        </w:rPr>
+        <w:t xml:space="preserve">20</w:t>
+      </w:r>
+      <w:r>
+        <w:t xml:space="preserve"> </w:t>
+      </w:r>
+      <w:r>
+        <w:t xml:space="preserve">Both are confined to a single model family or a single</w:t>
+      </w:r>
+      <w:r>
+        <w:t xml:space="preserve"> </w:t>
+      </w:r>
+      <w:r>
+        <w:t xml:space="preserve">system. What remains untested is whether the effect is architecture-general and chemistry-general:</w:t>
+      </w:r>
+      <w:r>
+        <w:t xml:space="preserve"> </w:t>
+      </w:r>
+      <w:r>
+        <w:t xml:space="preserve">no study has classified finite-temperature dynamic stability across several independent MLIP</w:t>
+      </w:r>
+      <w:r>
+        <w:t xml:space="preserve"> </w:t>
+      </w:r>
+      <w:r>
+        <w:t xml:space="preserve">architectures and across the distinct anharmonic families, that is displacive and</w:t>
+      </w:r>
+      <w:r>
+        <w:t xml:space="preserve"> </w:t>
+      </w:r>
+      <w:r>
+        <w:t xml:space="preserve">antiferrodistortive oxide perovskites, halide perovskites, entropy-stabilised bcc refractory metals</w:t>
+      </w:r>
+      <w:r>
+        <w:t xml:space="preserve"> </w:t>
+      </w:r>
+      <w:r>
+        <w:t xml:space="preserve">and cubic fluorites, under a common free-energy criterion and a temperature ladder.</w:t>
       </w:r>
     </w:p>
     <w:p>
@@ -410,25 +512,19 @@
         </w:numPr>
       </w:pPr>
       <w:r>
-        <w:t xml:space="preserve">H2 (finite-temperature blind spot, the contribution). Harmonic accuracy does not certify a model</w:t>
-      </w:r>
-      <w:r>
-        <w:t xml:space="preserve"> </w:t>
-      </w:r>
-      <w:r>
-        <w:t xml:space="preserve">for finite-temperature screening. It is necessary but not sufficient, and the harmonic leaders</w:t>
-      </w:r>
-      <w:r>
-        <w:t xml:space="preserve"> </w:t>
-      </w:r>
-      <w:r>
-        <w:t xml:space="preserve">need not be the finite-temperature leaders. (We test, and reject, the stronger pre-registered</w:t>
-      </w:r>
-      <w:r>
-        <w:t xml:space="preserve"> </w:t>
-      </w:r>
-      <w:r>
-        <w:t xml:space="preserve">form</w:t>
+        <w:t xml:space="preserve">H2 (the finite-temperature gap, the contribution). Harmonic accuracy does not certify a model</w:t>
+      </w:r>
+      <w:r>
+        <w:t xml:space="preserve"> </w:t>
+      </w:r>
+      <w:r>
+        <w:t xml:space="preserve">for finite-temperature screening, and the harmonic ranking need not carry over. (The</w:t>
+      </w:r>
+      <w:r>
+        <w:t xml:space="preserve"> </w:t>
+      </w:r>
+      <w:r>
+        <w:t xml:space="preserve">pre-registered form was</w:t>
       </w:r>
       <w:r>
         <w:t xml:space="preserve"> </w:t>
@@ -437,13 +533,25 @@
         <w:t xml:space="preserve">“harmonic accuracy is uncorrelated with finite-temperature accuracy”</w:t>
       </w:r>
       <w:r>
-        <w:t xml:space="preserve">; on the matched set the</w:t>
-      </w:r>
-      <w:r>
-        <w:t xml:space="preserve"> </w:t>
-      </w:r>
-      <w:r>
-        <w:t xml:space="preserve">two are weakly positively correlated, see §3.2.)</w:t>
+        <w:t xml:space="preserve">. The</w:t>
+      </w:r>
+      <w:r>
+        <w:t xml:space="preserve"> </w:t>
+      </w:r>
+      <w:r>
+        <w:t xml:space="preserve">matched-set outcome is temperature-dependent — non-significantly concordant at 100 K, and</w:t>
+      </w:r>
+      <w:r>
+        <w:t xml:space="preserve"> </w:t>
+      </w:r>
+      <w:r>
+        <w:t xml:space="preserve">significantly anti-associated at 300 K — so the pre-registered form is neither cleanly confirmed</w:t>
+      </w:r>
+      <w:r>
+        <w:t xml:space="preserve"> </w:t>
+      </w:r>
+      <w:r>
+        <w:t xml:space="preserve">nor cleanly rejected; see §3.2.)</w:t>
       </w:r>
     </w:p>
     <w:p>
@@ -469,25 +577,37 @@
         <w:pStyle w:val="FirstParagraph"/>
       </w:pPr>
       <w:r>
-        <w:t xml:space="preserve">Our contributions are a finite-temperature benchmark on the anharmonic regime; a cheap, validated</w:t>
-      </w:r>
-      <w:r>
-        <w:t xml:space="preserve"> </w:t>
-      </w:r>
-      <w:r>
-        <w:t xml:space="preserve">soft-mode free-energy screen; a cautionary result that the gold-standard SSCHA is itself unreliable</w:t>
-      </w:r>
-      <w:r>
-        <w:t xml:space="preserve"> </w:t>
-      </w:r>
-      <w:r>
-        <w:t xml:space="preserve">on deep displacive instabilities when driven by an MLIP, which changes how such cross-checks should</w:t>
-      </w:r>
-      <w:r>
-        <w:t xml:space="preserve"> </w:t>
-      </w:r>
-      <w:r>
-        <w:t xml:space="preserve">be used; and a practical ensemble-disagreement guardrail (H3).</w:t>
+        <w:t xml:space="preserve">Our contributions are a finite-temperature benchmark on the anharmonic regime spanning five</w:t>
+      </w:r>
+      <w:r>
+        <w:t xml:space="preserve"> </w:t>
+      </w:r>
+      <w:r>
+        <w:t xml:space="preserve">independent MLIP architectures and four anharmonic chemistry families; a cheap, validated</w:t>
+      </w:r>
+      <w:r>
+        <w:t xml:space="preserve"> </w:t>
+      </w:r>
+      <w:r>
+        <w:t xml:space="preserve">free-energy screen whose criterion is the phase rather than a single mode; a cautionary result that</w:t>
+      </w:r>
+      <w:r>
+        <w:t xml:space="preserve"> </w:t>
+      </w:r>
+      <w:r>
+        <w:t xml:space="preserve">MLIP-driven SSCHA at its default bubble truncation false-stabilises deep displacive instabilities,</w:t>
+      </w:r>
+      <w:r>
+        <w:t xml:space="preserve"> </w:t>
+      </w:r>
+      <w:r>
+        <w:t xml:space="preserve">which confirms and extends a published theoretical prediction and changes how such cross-checks</w:t>
+      </w:r>
+      <w:r>
+        <w:t xml:space="preserve"> </w:t>
+      </w:r>
+      <w:r>
+        <w:t xml:space="preserve">should be used; and a practical ensemble-disagreement guardrail (H3).</w:t>
       </w:r>
     </w:p>
     <w:bookmarkEnd w:id="10"/>
@@ -932,13 +1052,7 @@
         <w:pStyle w:val="FirstParagraph"/>
       </w:pPr>
       <w:r>
-        <w:t xml:space="preserve">For each system we relax the structure, compute harmonic force constants, and identify the softest</w:t>
-      </w:r>
-      <w:r>
-        <w:t xml:space="preserve"> </w:t>
-      </w:r>
-      <w:r>
-        <w:t xml:space="preserve">force-constant-commensurate</w:t>
+        <w:t xml:space="preserve">For each system we relax the structure, compute harmonic force constants, and enumerate</w:t>
       </w:r>
       <w:r>
         <w:t xml:space="preserve"> </w:t>
@@ -948,13 +1062,43 @@
           <w:b/>
           <w:bCs/>
         </w:rPr>
+        <w:t xml:space="preserve">every</w:t>
+      </w:r>
+      <w:r>
+        <w:rPr>
+          <w:b/>
+          <w:bCs/>
+        </w:rPr>
+        <w:t xml:space="preserve"> </w:t>
+      </w:r>
+      <w:r>
+        <w:rPr>
+          <w:b/>
+          <w:bCs/>
+        </w:rPr>
+        <w:t xml:space="preserve">distinct imaginary mode</w:t>
+      </w:r>
+      <w:r>
+        <w:t xml:space="preserve"> </w:t>
+      </w:r>
+      <w:r>
+        <w:t xml:space="preserve">on the force-constant-commensurate</w:t>
+      </w:r>
+      <w:r>
+        <w:t xml:space="preserve"> </w:t>
+      </w:r>
+      <w:r>
+        <w:rPr>
+          <w:b/>
+          <w:bCs/>
+        </w:rPr>
         <w:t xml:space="preserve">q</w:t>
       </w:r>
       <w:r>
         <w:t xml:space="preserve"> </w:t>
       </w:r>
       <w:r>
-        <w:t xml:space="preserve">by exact</w:t>
+        <w:t xml:space="preserve">grid by exact</w:t>
       </w:r>
       <w:r>
         <w:t xml:space="preserve"> </w:t>
@@ -969,55 +1113,210 @@
         <w:t xml:space="preserve"> </w:t>
       </w:r>
       <w:r>
-        <w:t xml:space="preserve">evaluation over the rational grid the</w:t>
-      </w:r>
-      <w:r>
-        <w:t xml:space="preserve"> </w:t>
-      </w:r>
-      <w:r>
-        <w:t xml:space="preserve">supercell supports (masking the three acoustic modes at Γ; bcc uses 6×6×6 force constants so the</w:t>
-      </w:r>
-      <w:r>
-        <w:t xml:space="preserve"> </w:t>
-      </w:r>
-      <w:r>
-        <w:t xml:space="preserve">ω-phase q = ⅔⟨111⟩ is commensurate). We freeze that mode into the minimal commensurate cell via</w:t>
-      </w:r>
-      <w:r>
-        <w:t xml:space="preserve"> </w:t>
-      </w:r>
-      <w:r>
-        <w:t xml:space="preserve">phonopy modulation, map the static double well E(Q) with quadratic Q sampling, fit the</w:t>
-      </w:r>
-      <w:r>
-        <w:t xml:space="preserve"> </w:t>
-      </w:r>
-      <w:r>
-        <w:t xml:space="preserve">well-plus-barrier window, and minimise a single-mode quantum SCHA free energy over the</w:t>
-      </w:r>
-      <w:r>
-        <w:t xml:space="preserve"> </w:t>
-      </w:r>
-      <w:r>
-        <w:t xml:space="preserve">order-parameter centroid (self-consistent Gaussian width via bracketed root finding). The</w:t>
-      </w:r>
-      <w:r>
-        <w:t xml:space="preserve"> </w:t>
-      </w:r>
-      <w:r>
-        <w:t xml:space="preserve">high-symmetry phase is stable at T when Q₀≈0 is the global minimum of the free energy. The E(Q) map</w:t>
-      </w:r>
-      <w:r>
-        <w:t xml:space="preserve"> </w:t>
-      </w:r>
-      <w:r>
-        <w:t xml:space="preserve">is temperature-independent and cached, so each temperature is a sub-second CPU solve. Three earlier</w:t>
-      </w:r>
-      <w:r>
-        <w:t xml:space="preserve"> </w:t>
-      </w:r>
-      <w:r>
-        <w:t xml:space="preserve">finite-temperature routes (hand-rolled TDEP,</w:t>
+        <w:t xml:space="preserve">evaluation over the rational grid the supercell supports (bcc uses 6×6×6 force constants so the</w:t>
+      </w:r>
+      <w:r>
+        <w:t xml:space="preserve"> </w:t>
+      </w:r>
+      <w:r>
+        <w:t xml:space="preserve">ω-phase q = ⅔⟨111⟩ is commensurate). The three acoustic branches at Γ are removed as the branches</w:t>
+      </w:r>
+      <w:r>
+        <w:t xml:space="preserve"> </w:t>
+      </w:r>
+      <w:r>
+        <w:rPr>
+          <w:i/>
+          <w:iCs/>
+        </w:rPr>
+        <w:t xml:space="preserve">nearest zero in magnitude</w:t>
+      </w:r>
+      <w:r>
+        <w:t xml:space="preserve">, not the three lowest: when the high-symmetry phase is unstable the soft</w:t>
+      </w:r>
+      <w:r>
+        <w:t xml:space="preserve"> </w:t>
+      </w:r>
+      <w:r>
+        <w:t xml:space="preserve">mode lies below the acoustic zeros, so masking the lowest three would delete the very instability</w:t>
+      </w:r>
+      <w:r>
+        <w:t xml:space="preserve"> </w:t>
+      </w:r>
+      <w:r>
+        <w:t xml:space="preserve">being sought. Modes are deduplicated over degenerate branches and symmetry-equivalent</w:t>
+      </w:r>
+      <w:r>
+        <w:t xml:space="preserve"> </w:t>
+      </w:r>
+      <w:r>
+        <w:rPr>
+          <w:b/>
+          <w:bCs/>
+        </w:rPr>
+        <w:t xml:space="preserve">q</w:t>
+      </w:r>
+      <w:r>
+        <w:t xml:space="preserve">, so a</w:t>
+      </w:r>
+      <w:r>
+        <w:t xml:space="preserve"> </w:t>
+      </w:r>
+      <w:r>
+        <w:t xml:space="preserve">triply degenerate T1u triplet and the three arms of a ⟨100⟩ star each cost one E(Q) map rather than</w:t>
+      </w:r>
+      <w:r>
+        <w:t xml:space="preserve"> </w:t>
+      </w:r>
+      <w:r>
+        <w:t xml:space="preserve">three. Each surviving mode is frozen into its minimal commensurate cell via phonopy modulation; we</w:t>
+      </w:r>
+      <w:r>
+        <w:t xml:space="preserve"> </w:t>
+      </w:r>
+      <w:r>
+        <w:t xml:space="preserve">map the static double well E(Q) with quadratic Q sampling, fit the well-plus-barrier window, and</w:t>
+      </w:r>
+      <w:r>
+        <w:t xml:space="preserve"> </w:t>
+      </w:r>
+      <w:r>
+        <w:t xml:space="preserve">minimise a single-mode quantum SCHA free energy over the order-parameter centroid (self-consistent</w:t>
+      </w:r>
+      <w:r>
+        <w:t xml:space="preserve"> </w:t>
+      </w:r>
+      <w:r>
+        <w:t xml:space="preserve">Gaussian width via bracketed root finding).</w:t>
+      </w:r>
+    </w:p>
+    <w:p>
+      <w:pPr>
+        <w:pStyle w:val="BodyText"/>
+      </w:pPr>
+      <w:r>
+        <w:t xml:space="preserve">The stability criterion is a property of the</w:t>
+      </w:r>
+      <w:r>
+        <w:t xml:space="preserve"> </w:t>
+      </w:r>
+      <w:r>
+        <w:rPr>
+          <w:b/>
+          <w:bCs/>
+        </w:rPr>
+        <w:t xml:space="preserve">phase</w:t>
+      </w:r>
+      <w:r>
+        <w:t xml:space="preserve">, not of one mode: the high-symmetry structure</w:t>
+      </w:r>
+      <w:r>
+        <w:t xml:space="preserve"> </w:t>
+      </w:r>
+      <w:r>
+        <w:t xml:space="preserve">is dynamically unstable at T if</w:t>
+      </w:r>
+      <w:r>
+        <w:t xml:space="preserve"> </w:t>
+      </w:r>
+      <w:r>
+        <w:rPr>
+          <w:b/>
+          <w:bCs/>
+        </w:rPr>
+        <w:t xml:space="preserve">any</w:t>
+      </w:r>
+      <w:r>
+        <w:t xml:space="preserve"> </w:t>
+      </w:r>
+      <w:r>
+        <w:t xml:space="preserve">screened mode condenses (Q₀ &gt; 0), and stable only when none</w:t>
+      </w:r>
+      <w:r>
+        <w:t xml:space="preserve"> </w:t>
+      </w:r>
+      <w:r>
+        <w:t xml:space="preserve">does. Screening a single mode — even the globally softest — conflates physically distinct</w:t>
+      </w:r>
+      <w:r>
+        <w:t xml:space="preserve"> </w:t>
+      </w:r>
+      <w:r>
+        <w:t xml:space="preserve">instabilities. Cubic SrTiO₃ is the decisive case: its Γ ferroelectric mode is</w:t>
+      </w:r>
+      <w:r>
+        <w:t xml:space="preserve"> </w:t>
+      </w:r>
+      <w:r>
+        <w:rPr>
+          <w:i/>
+          <w:iCs/>
+        </w:rPr>
+        <w:t xml:space="preserve">deeper</w:t>
+      </w:r>
+      <w:r>
+        <w:t xml:space="preserve"> </w:t>
+      </w:r>
+      <w:r>
+        <w:t xml:space="preserve">than the</w:t>
+      </w:r>
+      <w:r>
+        <w:t xml:space="preserve"> </w:t>
+      </w:r>
+      <w:r>
+        <w:t xml:space="preserve">R-point antiferrodistortive tilt, yet the Γ mode is quantum-suppressed and never condenses while the</w:t>
+      </w:r>
+      <w:r>
+        <w:t xml:space="preserve"> </w:t>
+      </w:r>
+      <w:r>
+        <w:t xml:space="preserve">R tilt is what drives the 105 K transition, so a softest-mode screen inspects the wrong mode and</w:t>
+      </w:r>
+      <w:r>
+        <w:t xml:space="preserve"> </w:t>
+      </w:r>
+      <w:r>
+        <w:t xml:space="preserve">calls the cubic phase stable. The E(Q) maps are temperature-independent and cached, so each</w:t>
+      </w:r>
+      <w:r>
+        <w:t xml:space="preserve"> </w:t>
+      </w:r>
+      <w:r>
+        <w:t xml:space="preserve">temperature is a sub-second CPU solve over all modes. A cap of 24 modes per unit bounds the cost; it</w:t>
+      </w:r>
+      <w:r>
+        <w:t xml:space="preserve"> </w:t>
+      </w:r>
+      <w:r>
+        <w:t xml:space="preserve">binds on 20 of the 400 units, every one of which is already called unstable with at least three</w:t>
+      </w:r>
+      <w:r>
+        <w:t xml:space="preserve"> </w:t>
+      </w:r>
+      <w:r>
+        <w:t xml:space="preserve">condensing modes, so it cannot affect any call (a cap can only ever create a false-</w:t>
+      </w:r>
+      <w:r>
+        <w:rPr>
+          <w:i/>
+          <w:iCs/>
+        </w:rPr>
+        <w:t xml:space="preserve">stable</w:t>
+      </w:r>
+      <w:r>
+        <w:t xml:space="preserve">, which</w:t>
+      </w:r>
+      <w:r>
+        <w:t xml:space="preserve"> </w:t>
+      </w:r>
+      <w:r>
+        <w:t xml:space="preserve">would require all 24 screened modes to be non-condensing). Three earlier finite-temperature routes</w:t>
+      </w:r>
+      <w:r>
+        <w:t xml:space="preserve"> </w:t>
+      </w:r>
+      <w:r>
+        <w:t xml:space="preserve">(hand-rolled TDEP,</w:t>
       </w:r>
       <w:r>
         <w:rPr>
@@ -1029,13 +1328,13 @@
         <w:t xml:space="preserve"> </w:t>
       </w:r>
       <w:r>
-        <w:t xml:space="preserve">one-shot hiPhive, and rattled-MD) were implemented</w:t>
-      </w:r>
-      <w:r>
-        <w:t xml:space="preserve"> </w:t>
-      </w:r>
-      <w:r>
-        <w:t xml:space="preserve">and discarded after they failed the SrTiO₃ gate; see the ESI.</w:t>
+        <w:t xml:space="preserve">one-shot hiPhive, and rattled-MD) were implemented and discarded after they</w:t>
+      </w:r>
+      <w:r>
+        <w:t xml:space="preserve"> </w:t>
+      </w:r>
+      <w:r>
+        <w:t xml:space="preserve">failed the SrTiO₃ gate; see the ESI.</w:t>
       </w:r>
     </w:p>
     <w:p>
@@ -1043,19 +1342,87 @@
         <w:pStyle w:val="BodyText"/>
       </w:pPr>
       <w:r>
-        <w:t xml:space="preserve">Validation gate. On SrTiO₃ the order parameter condenses below the transition, melts by ≈150 K, and</w:t>
-      </w:r>
-      <w:r>
-        <w:t xml:space="preserve"> </w:t>
-      </w:r>
-      <w:r>
-        <w:t xml:space="preserve">the soft mode hardens from −2.6 to +1.8 THz across the transition (experiment 105 K), which</w:t>
-      </w:r>
-      <w:r>
-        <w:t xml:space="preserve"> </w:t>
-      </w:r>
-      <w:r>
-        <w:t xml:space="preserve">establishes that the screen resolves the harmonic-to-finite-temperature stabilisation.</w:t>
+        <w:t xml:space="preserve">Validation gate. Cubic SrTiO₃ resolves three distinct imaginary commensurate modes, and the screen</w:t>
+      </w:r>
+      <w:r>
+        <w:t xml:space="preserve"> </w:t>
+      </w:r>
+      <w:r>
+        <w:t xml:space="preserve">reports which of them condenses. At 100 K the Γ ferroelectric mode does</w:t>
+      </w:r>
+      <w:r>
+        <w:t xml:space="preserve"> </w:t>
+      </w:r>
+      <w:r>
+        <w:rPr>
+          <w:b/>
+          <w:bCs/>
+        </w:rPr>
+        <w:t xml:space="preserve">not</w:t>
+      </w:r>
+      <w:r>
+        <w:t xml:space="preserve"> </w:t>
+      </w:r>
+      <w:r>
+        <w:t xml:space="preserve">condense (Q₀ = 0),</w:t>
+      </w:r>
+      <w:r>
+        <w:t xml:space="preserve"> </w:t>
+      </w:r>
+      <w:r>
+        <w:t xml:space="preserve">which is the physically correct quantum-paraelectric result, while the R = (½,½,½) tilt does</w:t>
+      </w:r>
+      <w:r>
+        <w:t xml:space="preserve"> </w:t>
+      </w:r>
+      <w:r>
+        <w:t xml:space="preserve">(Q₀ = 0.14 Å); by 300 K neither condenses. The phase is therefore called unstable at 100 K and</w:t>
+      </w:r>
+      <w:r>
+        <w:t xml:space="preserve"> </w:t>
+      </w:r>
+      <w:r>
+        <w:t xml:space="preserve">stable at 300 K, bracketing the experimental transition at 105 K, and the effective frequency of the</w:t>
+      </w:r>
+      <w:r>
+        <w:t xml:space="preserve"> </w:t>
+      </w:r>
+      <w:r>
+        <w:t xml:space="preserve">deciding mode hardens from −2.68 to +1.43 THz across it. Three of the five models (MACE-MP-0,</w:t>
+      </w:r>
+      <w:r>
+        <w:t xml:space="preserve"> </w:t>
+      </w:r>
+      <w:r>
+        <w:t xml:space="preserve">MatterSim, SevenNet-0) reproduce this; CHGNet never condenses the tilt and ORB-v2 does not select</w:t>
+      </w:r>
+      <w:r>
+        <w:t xml:space="preserve"> </w:t>
+      </w:r>
+      <w:r>
+        <w:t xml:space="preserve">the R point at all. Because the gate identifies</w:t>
+      </w:r>
+      <w:r>
+        <w:t xml:space="preserve"> </w:t>
+      </w:r>
+      <w:r>
+        <w:rPr>
+          <w:i/>
+          <w:iCs/>
+        </w:rPr>
+        <w:t xml:space="preserve">which</w:t>
+      </w:r>
+      <w:r>
+        <w:t xml:space="preserve"> </w:t>
+      </w:r>
+      <w:r>
+        <w:t xml:space="preserve">instability each model captures rather than</w:t>
+      </w:r>
+      <w:r>
+        <w:t xml:space="preserve"> </w:t>
+      </w:r>
+      <w:r>
+        <w:t xml:space="preserve">returning a single number, it is a per-model test rather than a single-model demonstration.</w:t>
       </w:r>
     </w:p>
     <w:bookmarkEnd w:id="14"/>
@@ -1133,7 +1500,13 @@
         <w:t xml:space="preserve"> </w:t>
       </w:r>
       <w:r>
-        <w:t xml:space="preserve">single-mode screen, this captures the full multi-mode phonon entropy and is reliable for</w:t>
+        <w:t xml:space="preserve">free-energy screen, which treats each imaginary mode independently, this captures the coupled</w:t>
+      </w:r>
+      <w:r>
+        <w:t xml:space="preserve"> </w:t>
+      </w:r>
+      <w:r>
+        <w:t xml:space="preserve">multi-mode phonon entropy and is reliable for</w:t>
       </w:r>
       <w:r>
         <w:t xml:space="preserve"> </w:t>
@@ -1749,19 +2122,53 @@
         <w:t xml:space="preserve"> </w:t>
       </w:r>
       <w:r>
-        <w:t xml:space="preserve">phase is definitively dynamically unstable, and the soft-mode screen correctly calls it unstable in</w:t>
-      </w:r>
-      <w:r>
-        <w:t xml:space="preserve"> </w:t>
-      </w:r>
-      <w:r>
-        <w:t xml:space="preserve">23 of 30 model units (recall 0.77). The screen recovers the displacive instability that harmonic</w:t>
-      </w:r>
-      <w:r>
-        <w:t xml:space="preserve"> </w:t>
-      </w:r>
-      <w:r>
-        <w:t xml:space="preserve">accuracy does not predict and that, as §3.3 shows, even the gold-standard SSCHA misses.</w:t>
+        <w:t xml:space="preserve">phase is definitively dynamically unstable, and the multi-mode screen correctly calls it unstable in</w:t>
+      </w:r>
+      <w:r>
+        <w:t xml:space="preserve"> </w:t>
+      </w:r>
+      <w:r>
+        <w:t xml:space="preserve">16 of 30 model units (recall 0.53). The screen recovers displacive instability that harmonic</w:t>
+      </w:r>
+      <w:r>
+        <w:t xml:space="preserve"> </w:t>
+      </w:r>
+      <w:r>
+        <w:t xml:space="preserve">accuracy does not predict and that, as §3.3 shows, the gold-standard SSCHA misses more often still.</w:t>
+      </w:r>
+      <w:r>
+        <w:t xml:space="preserve"> </w:t>
+      </w:r>
+      <w:r>
+        <w:t xml:space="preserve">Across the other anharmonic families the screen is stronger: it reaches recall 0.92 on the halide</w:t>
+      </w:r>
+      <w:r>
+        <w:t xml:space="preserve"> </w:t>
+      </w:r>
+      <w:r>
+        <w:t xml:space="preserve">perovskites and 1.00 on the cubic fluorites, and on the antiferrodistortive SrTiO₃ tilt it reaches</w:t>
+      </w:r>
+      <w:r>
+        <w:t xml:space="preserve"> </w:t>
+      </w:r>
+      <w:r>
+        <w:t xml:space="preserve">0.60. On the six harmonically-stable controls it is correct on all 120 model units, and finds</w:t>
+      </w:r>
+      <w:r>
+        <w:t xml:space="preserve"> </w:t>
+      </w:r>
+      <w:r>
+        <w:rPr>
+          <w:b/>
+          <w:bCs/>
+        </w:rPr>
+        <w:t xml:space="preserve">zero</w:t>
+      </w:r>
+      <w:r>
+        <w:t xml:space="preserve"> </w:t>
+      </w:r>
+      <w:r>
+        <w:t xml:space="preserve">imaginary commensurate modes in every case, so it never manufactures an instability.</w:t>
       </w:r>
     </w:p>
     <w:p>
@@ -1769,67 +2176,89 @@
         <w:pStyle w:val="BodyText"/>
       </w:pPr>
       <w:r>
-        <w:t xml:space="preserve">Multi-anchor validation against experiment. Beyond the SrTiO₃ gate (§2.4), the screen’s predicted</w:t>
-      </w:r>
-      <w:r>
-        <w:t xml:space="preserve"> </w:t>
-      </w:r>
-      <w:r>
-        <w:t xml:space="preserve">stabilisation temperature T* (the lowest ladder T at which the cubic phase is called stable) tracks</w:t>
-      </w:r>
-      <w:r>
-        <w:t xml:space="preserve"> </w:t>
-      </w:r>
-      <w:r>
-        <w:t xml:space="preserve">the ordering of the experimental transition temperatures across four anchors. SrTiO₃ (T_c ≈ 105 K)</w:t>
-      </w:r>
-      <w:r>
-        <w:t xml:space="preserve"> </w:t>
-      </w:r>
-      <w:r>
-        <w:t xml:space="preserve">is stabilised earliest, at T* ≈ 100 K for four of five models, while the ferroelectric perovskites</w:t>
-      </w:r>
-      <w:r>
-        <w:t xml:space="preserve"> </w:t>
-      </w:r>
-      <w:r>
-        <w:t xml:space="preserve">stabilise later: BaTiO₃ (T_c ≈ 393 K) at T* ≈ 600 K, KNbO₃ (708 K) at 300–600 K, and PbTiO₃</w:t>
-      </w:r>
-      <w:r>
-        <w:t xml:space="preserve"> </w:t>
-      </w:r>
-      <w:r>
-        <w:t xml:space="preserve">(763 K) at 300–600 K (ORB-v2 the low outlier at 100 K). Within the coarse 300 K T-ladder the screen</w:t>
-      </w:r>
-      <w:r>
-        <w:t xml:space="preserve"> </w:t>
-      </w:r>
-      <w:r>
-        <w:t xml:space="preserve">brackets the correct side of each transition, and the SrTiO₃-below-ferroelectric ordering is</w:t>
-      </w:r>
-      <w:r>
-        <w:t xml:space="preserve"> </w:t>
-      </w:r>
-      <w:r>
-        <w:t xml:space="preserve">reproduced by every model. As expected for a single-mode treatment it does not predict the absolute</w:t>
-      </w:r>
-      <w:r>
-        <w:t xml:space="preserve"> </w:t>
-      </w:r>
-      <w:r>
-        <w:t xml:space="preserve">T_c (it over-shoots BaTiO₃ and under-shoots PbTiO₃), so T* is an ordering check rather than a fitted</w:t>
-      </w:r>
-      <w:r>
-        <w:t xml:space="preserve"> </w:t>
-      </w:r>
-      <w:r>
-        <w:t xml:space="preserve">T_c (full table S3). This multi-anchor agreement, not a single gate, is what licenses using the</w:t>
-      </w:r>
-      <w:r>
-        <w:t xml:space="preserve"> </w:t>
-      </w:r>
-      <w:r>
-        <w:t xml:space="preserve">screen as the reference against which the §3.3 SSCHA calls are judged.</w:t>
+        <w:t xml:space="preserve">Multi-anchor comparison against experiment. Beyond the SrTiO₃ gate (§2.4) we compare the screen’s</w:t>
+      </w:r>
+      <w:r>
+        <w:t xml:space="preserve"> </w:t>
+      </w:r>
+      <w:r>
+        <w:t xml:space="preserve">predicted stabilisation temperature T* (the lowest ladder T at which the cubic phase is called</w:t>
+      </w:r>
+      <w:r>
+        <w:t xml:space="preserve"> </w:t>
+      </w:r>
+      <w:r>
+        <w:t xml:space="preserve">stable) with the experimental transition temperatures. The comparison is only partly successful and</w:t>
+      </w:r>
+      <w:r>
+        <w:t xml:space="preserve"> </w:t>
+      </w:r>
+      <w:r>
+        <w:t xml:space="preserve">we report it as such. SrTiO₃ (T_c ≈ 105 K) stabilises earliest, at T* = 100–300 K, and BaTiO₃</w:t>
+      </w:r>
+      <w:r>
+        <w:t xml:space="preserve"> </w:t>
+      </w:r>
+      <w:r>
+        <w:t xml:space="preserve">(393 K) and KNbO₃ (708 K) follow at T* = 300 K for four of five models (ORB-v2 at 600 K), so the</w:t>
+      </w:r>
+      <w:r>
+        <w:t xml:space="preserve"> </w:t>
+      </w:r>
+      <w:r>
+        <w:t xml:space="preserve">SrTiO₃-below-ferroelectric ordering holds. PbTiO₃ (763 K), which has the highest transition</w:t>
+      </w:r>
+      <w:r>
+        <w:t xml:space="preserve"> </w:t>
+      </w:r>
+      <w:r>
+        <w:t xml:space="preserve">temperature of the four, does</w:t>
+      </w:r>
+      <w:r>
+        <w:t xml:space="preserve"> </w:t>
+      </w:r>
+      <w:r>
+        <w:rPr>
+          <w:b/>
+          <w:bCs/>
+        </w:rPr>
+        <w:t xml:space="preserve">not</w:t>
+      </w:r>
+      <w:r>
+        <w:t xml:space="preserve"> </w:t>
+      </w:r>
+      <w:r>
+        <w:t xml:space="preserve">follow: T* is 100 K for MACE-MP-0, MatterSim and ORB-v2,</w:t>
+      </w:r>
+      <w:r>
+        <w:t xml:space="preserve"> </w:t>
+      </w:r>
+      <w:r>
+        <w:t xml:space="preserve">600 K for SevenNet-0 and 900 K for CHGNet. A single-mode treatment is not expected to reproduce an</w:t>
+      </w:r>
+      <w:r>
+        <w:t xml:space="preserve"> </w:t>
+      </w:r>
+      <w:r>
+        <w:t xml:space="preserve">absolute T_c, but the PbTiO₃ failure is a genuine ordering failure rather than a scale error, and it</w:t>
+      </w:r>
+      <w:r>
+        <w:t xml:space="preserve"> </w:t>
+      </w:r>
+      <w:r>
+        <w:t xml:space="preserve">is the clearest limitation of the screen in this work. T* is therefore reported as a diagnostic</w:t>
+      </w:r>
+      <w:r>
+        <w:t xml:space="preserve"> </w:t>
+      </w:r>
+      <w:r>
+        <w:t xml:space="preserve">(full table S3), and the SrTiO₃ gate together with the control performance — not the T* ordering —</w:t>
+      </w:r>
+      <w:r>
+        <w:t xml:space="preserve"> </w:t>
+      </w:r>
+      <w:r>
+        <w:t xml:space="preserve">is what licenses the screen as the reference in §3.3.</w:t>
       </w:r>
     </w:p>
     <w:p>
@@ -1922,7 +2351,7 @@
               <w:pStyle w:val="Compact"/>
             </w:pPr>
             <w:r>
-              <w:t xml:space="preserve">CHGNet</w:t>
+              <w:t xml:space="preserve">SevenNet-0</w:t>
             </w:r>
           </w:p>
         </w:tc>
@@ -1933,7 +2362,7 @@
               <w:pStyle w:val="Compact"/>
             </w:pPr>
             <w:r>
-              <w:t xml:space="preserve">0.062</w:t>
+              <w:t xml:space="preserve">0.125</w:t>
             </w:r>
           </w:p>
         </w:tc>
@@ -1944,7 +2373,7 @@
               <w:pStyle w:val="Compact"/>
             </w:pPr>
             <w:r>
-              <w:t xml:space="preserve">0.933</w:t>
+              <w:t xml:space="preserve">0.900</w:t>
             </w:r>
           </w:p>
         </w:tc>
@@ -1955,7 +2384,7 @@
               <w:pStyle w:val="Compact"/>
             </w:pPr>
             <w:r>
-              <w:t xml:space="preserve">0.789</w:t>
+              <w:t xml:space="preserve">1.000</w:t>
             </w:r>
           </w:p>
         </w:tc>
@@ -1968,53 +2397,7 @@
               <w:pStyle w:val="Compact"/>
             </w:pPr>
             <w:r>
-              <w:t xml:space="preserve">MACE-MP-0</w:t>
-            </w:r>
-          </w:p>
-        </w:tc>
-        <w:tc>
-          <w:tcPr/>
-          <w:p>
-            <w:pPr>
-              <w:pStyle w:val="Compact"/>
-            </w:pPr>
-            <w:r>
-              <w:t xml:space="preserve">0.062</w:t>
-            </w:r>
-          </w:p>
-        </w:tc>
-        <w:tc>
-          <w:tcPr/>
-          <w:p>
-            <w:pPr>
-              <w:pStyle w:val="Compact"/>
-            </w:pPr>
-            <w:r>
-              <w:t xml:space="preserve">0.933</w:t>
-            </w:r>
-          </w:p>
-        </w:tc>
-        <w:tc>
-          <w:tcPr/>
-          <w:p>
-            <w:pPr>
-              <w:pStyle w:val="Compact"/>
-            </w:pPr>
-            <w:r>
-              <w:t xml:space="preserve">0.895</w:t>
-            </w:r>
-          </w:p>
-        </w:tc>
-      </w:tr>
-      <w:tr>
-        <w:tc>
-          <w:tcPr/>
-          <w:p>
-            <w:pPr>
-              <w:pStyle w:val="Compact"/>
-            </w:pPr>
-            <w:r>
-              <w:t xml:space="preserve">SevenNet-0</w:t>
+              <w:t xml:space="preserve">CHGNet</w:t>
             </w:r>
           </w:p>
         </w:tc>
@@ -2047,7 +2430,7 @@
               <w:pStyle w:val="Compact"/>
             </w:pPr>
             <w:r>
-              <w:t xml:space="preserve">1.000</w:t>
+              <w:t xml:space="preserve">0.789</w:t>
             </w:r>
           </w:p>
         </w:tc>
@@ -2106,6 +2489,52 @@
               <w:pStyle w:val="Compact"/>
             </w:pPr>
             <w:r>
+              <w:t xml:space="preserve">MACE-MP-0</w:t>
+            </w:r>
+          </w:p>
+        </w:tc>
+        <w:tc>
+          <w:tcPr/>
+          <w:p>
+            <w:pPr>
+              <w:pStyle w:val="Compact"/>
+            </w:pPr>
+            <w:r>
+              <w:t xml:space="preserve">0.250</w:t>
+            </w:r>
+          </w:p>
+        </w:tc>
+        <w:tc>
+          <w:tcPr/>
+          <w:p>
+            <w:pPr>
+              <w:pStyle w:val="Compact"/>
+            </w:pPr>
+            <w:r>
+              <w:t xml:space="preserve">0.833</w:t>
+            </w:r>
+          </w:p>
+        </w:tc>
+        <w:tc>
+          <w:tcPr/>
+          <w:p>
+            <w:pPr>
+              <w:pStyle w:val="Compact"/>
+            </w:pPr>
+            <w:r>
+              <w:t xml:space="preserve">0.895</w:t>
+            </w:r>
+          </w:p>
+        </w:tc>
+      </w:tr>
+      <w:tr>
+        <w:tc>
+          <w:tcPr/>
+          <w:p>
+            <w:pPr>
+              <w:pStyle w:val="Compact"/>
+            </w:pPr>
+            <w:r>
               <w:t xml:space="preserve">ORB-v2</w:t>
             </w:r>
           </w:p>
@@ -2117,7 +2546,7 @@
               <w:pStyle w:val="Compact"/>
             </w:pPr>
             <w:r>
-              <w:t xml:space="preserve">0.562</w:t>
+              <w:t xml:space="preserve">0.312</w:t>
             </w:r>
           </w:p>
         </w:tc>
@@ -2128,7 +2557,7 @@
               <w:pStyle w:val="Compact"/>
             </w:pPr>
             <w:r>
-              <w:t xml:space="preserve">0.700</w:t>
+              <w:t xml:space="preserve">0.800</w:t>
             </w:r>
           </w:p>
         </w:tc>
@@ -2150,61 +2579,68 @@
         <w:pStyle w:val="BodyText"/>
       </w:pPr>
       <w:r>
-        <w:t xml:space="preserve">Read against the harmonic ranking (final column), the message is not a clean inversion, and we are</w:t>
-      </w:r>
-      <w:r>
-        <w:t xml:space="preserve"> </w:t>
-      </w:r>
-      <w:r>
-        <w:t xml:space="preserve">explicit about this because a naive comparison invites one. Comparing harmonic accuracy including</w:t>
-      </w:r>
-      <w:r>
-        <w:t xml:space="preserve"> </w:t>
-      </w:r>
-      <w:r>
-        <w:t xml:space="preserve">bcc against finite-temperature accuracy excluding bcc produces a spurious anti-correlation</w:t>
-      </w:r>
-      <w:r>
-        <w:t xml:space="preserve"> </w:t>
-      </w:r>
-      <w:r>
-        <w:t xml:space="preserve">(Spearman ρ ≈ −0.26); this is a denominator artifact, because CHGNet, MACE and ORB-v2 lose most of</w:t>
-      </w:r>
-      <w:r>
-        <w:t xml:space="preserve"> </w:t>
-      </w:r>
-      <w:r>
-        <w:t xml:space="preserve">their harmonic accuracy on the bcc Zr/Hf softening that is removed from the finite-temperature</w:t>
-      </w:r>
-      <w:r>
-        <w:t xml:space="preserve"> </w:t>
-      </w:r>
-      <w:r>
-        <w:t xml:space="preserve">column. On the matched non-bcc, non-borderline set the two are positively but imperfectly</w:t>
-      </w:r>
-      <w:r>
-        <w:t xml:space="preserve"> </w:t>
-      </w:r>
-      <w:r>
-        <w:t xml:space="preserve">correlated: at the unit level (n = 75 system×model pairs) the concordance of correctness gives</w:t>
-      </w:r>
-      <w:r>
-        <w:t xml:space="preserve"> </w:t>
-      </w:r>
-      <w:r>
-        <w:t xml:space="preserve">φ = 0.11 (McNemar exact p = 0.34, so the harmonic and finite-temperature error sets are not</w:t>
-      </w:r>
-      <w:r>
-        <w:t xml:space="preserve"> </w:t>
-      </w:r>
-      <w:r>
-        <w:t xml:space="preserve">significantly different), and the matched per-model accuracy rank correlation is ρ = +0.15</w:t>
-      </w:r>
-      <w:r>
-        <w:t xml:space="preserve"> </w:t>
-      </w:r>
-      <w:r>
-        <w:t xml:space="preserve">(T ≤ 300 K) to +0.65 (T = 100 K).</w:t>
+        <w:t xml:space="preserve">Read against the harmonic ranking (final column), the ordering is not preserved but neither is it</w:t>
+      </w:r>
+      <w:r>
+        <w:t xml:space="preserve"> </w:t>
+      </w:r>
+      <w:r>
+        <w:t xml:space="preserve">inverted, and we are explicit about this because a naive comparison invites a cleaner story than the</w:t>
+      </w:r>
+      <w:r>
+        <w:t xml:space="preserve"> </w:t>
+      </w:r>
+      <w:r>
+        <w:t xml:space="preserve">data support. The matched non-bcc, non-borderline comparison (n = 75 system×model pairs) is</w:t>
+      </w:r>
+      <w:r>
+        <w:t xml:space="preserve"> </w:t>
+      </w:r>
+      <w:r>
+        <w:t xml:space="preserve">temperature-dependent. At T = 100 K the two are weakly and non-significantly concordant: φ = 0.149</w:t>
+      </w:r>
+      <w:r>
+        <w:t xml:space="preserve"> </w:t>
+      </w:r>
+      <w:r>
+        <w:t xml:space="preserve">with McNemar exact p = 0.73, and a matched per-model accuracy rank correlation of ρ = +0.65. At</w:t>
+      </w:r>
+      <w:r>
+        <w:t xml:space="preserve"> </w:t>
+      </w:r>
+      <w:r>
+        <w:t xml:space="preserve">T = 300 K the relationship reverses and becomes significant: φ = −0.129 with McNemar exact</w:t>
+      </w:r>
+      <w:r>
+        <w:t xml:space="preserve"> </w:t>
+      </w:r>
+      <w:r>
+        <w:t xml:space="preserve">p = 0.007, driven by 17 harmonically-correct units that are mis-called at finite temperature against</w:t>
+      </w:r>
+      <w:r>
+        <w:t xml:space="preserve"> </w:t>
+      </w:r>
+      <w:r>
+        <w:t xml:space="preserve">only 4 the other way. Harmonic correctness therefore does not transfer, and at the higher</w:t>
+      </w:r>
+      <w:r>
+        <w:t xml:space="preserve"> </w:t>
+      </w:r>
+      <w:r>
+        <w:t xml:space="preserve">temperature it is significantly</w:t>
+      </w:r>
+      <w:r>
+        <w:t xml:space="preserve"> </w:t>
+      </w:r>
+      <w:r>
+        <w:rPr>
+          <w:i/>
+          <w:iCs/>
+        </w:rPr>
+        <w:t xml:space="preserve">anti</w:t>
+      </w:r>
+      <w:r>
+        <w:t xml:space="preserve">-associated with finite-temperature correctness on this set.</w:t>
       </w:r>
     </w:p>
     <w:p>
@@ -2212,83 +2648,143 @@
         <w:pStyle w:val="BodyText"/>
       </w:pPr>
       <w:r>
-        <w:t xml:space="preserve">The defensible H2 statement is therefore the weaker one that the data support: harmonic accuracy is</w:t>
-      </w:r>
-      <w:r>
-        <w:t xml:space="preserve"> </w:t>
-      </w:r>
-      <w:r>
-        <w:t xml:space="preserve">necessary but not sufficient for finite-temperature accuracy. Seven of the 71 harmonically-correct</w:t>
-      </w:r>
-      <w:r>
-        <w:t xml:space="preserve"> </w:t>
-      </w:r>
-      <w:r>
-        <w:t xml:space="preserve">(system, model) units are mis-called at finite temperature, against three the other way, and the</w:t>
-      </w:r>
-      <w:r>
-        <w:t xml:space="preserve"> </w:t>
-      </w:r>
-      <w:r>
-        <w:t xml:space="preserve">matched table shows that the harmonic leaders are not the finite-temperature leaders: MatterSim and</w:t>
-      </w:r>
-      <w:r>
-        <w:t xml:space="preserve"> </w:t>
-      </w:r>
-      <w:r>
-        <w:t xml:space="preserve">SevenNet-0 are harmonically perfect yet sit behind MACE-MP-0 and CHGNet on finite-temperature</w:t>
-      </w:r>
-      <w:r>
-        <w:t xml:space="preserve"> </w:t>
-      </w:r>
-      <w:r>
-        <w:t xml:space="preserve">displacive stability. A top harmonic score on the npj/PhononBench benchmarks therefore does not</w:t>
-      </w:r>
-      <w:r>
-        <w:t xml:space="preserve"> </w:t>
-      </w:r>
-      <w:r>
-        <w:t xml:space="preserve">identify the best finite-temperature screener, but neither does it actively mislead. ORB-v2 is the</w:t>
-      </w:r>
-      <w:r>
-        <w:t xml:space="preserve"> </w:t>
-      </w:r>
-      <w:r>
-        <w:t xml:space="preserve">one model that degrades sharply from harmonic to finite temperature (0.867 to 0.667–0.70),</w:t>
-      </w:r>
-      <w:r>
-        <w:t xml:space="preserve"> </w:t>
-      </w:r>
-      <w:r>
-        <w:t xml:space="preserve">consistent with its float32 direct architecture over-softening the PES, though our design cannot</w:t>
-      </w:r>
-      <w:r>
-        <w:t xml:space="preserve"> </w:t>
-      </w:r>
-      <w:r>
-        <w:t xml:space="preserve">separate the architecture from the precision. The stronger evidence that finite temperature is a</w:t>
-      </w:r>
-      <w:r>
-        <w:t xml:space="preserve"> </w:t>
-      </w:r>
-      <w:r>
-        <w:t xml:space="preserve">distinct, harder regime comes not from this ranking comparison but from the displacive recall above</w:t>
-      </w:r>
-      <w:r>
-        <w:t xml:space="preserve"> </w:t>
-      </w:r>
-      <w:r>
-        <w:t xml:space="preserve">and the SSCHA failure in §3.3.</w:t>
+        <w:t xml:space="preserve">The defensible H2 statement is that harmonic accuracy does not predict finite-temperature accuracy,</w:t>
+      </w:r>
+      <w:r>
+        <w:t xml:space="preserve"> </w:t>
+      </w:r>
+      <w:r>
+        <w:t xml:space="preserve">in either direction. The clearest single demonstration is CHGNet: it is the</w:t>
+      </w:r>
+      <w:r>
+        <w:t xml:space="preserve"> </w:t>
+      </w:r>
+      <w:r>
+        <w:rPr>
+          <w:b/>
+          <w:bCs/>
+        </w:rPr>
+        <w:t xml:space="preserve">worst</w:t>
+      </w:r>
+      <w:r>
+        <w:t xml:space="preserve"> </w:t>
+      </w:r>
+      <w:r>
+        <w:t xml:space="preserve">model</w:t>
+      </w:r>
+      <w:r>
+        <w:t xml:space="preserve"> </w:t>
+      </w:r>
+      <w:r>
+        <w:t xml:space="preserve">harmonically (0.789) yet the second</w:t>
+      </w:r>
+      <w:r>
+        <w:t xml:space="preserve"> </w:t>
+      </w:r>
+      <w:r>
+        <w:rPr>
+          <w:b/>
+          <w:bCs/>
+        </w:rPr>
+        <w:t xml:space="preserve">best</w:t>
+      </w:r>
+      <w:r>
+        <w:t xml:space="preserve"> </w:t>
+      </w:r>
+      <w:r>
+        <w:t xml:space="preserve">at finite temperature (0.867), while MatterSim is</w:t>
+      </w:r>
+      <w:r>
+        <w:t xml:space="preserve"> </w:t>
+      </w:r>
+      <w:r>
+        <w:t xml:space="preserve">harmonically perfect (1.000) and only mid-table at finite temperature (0.833). A top harmonic score</w:t>
+      </w:r>
+      <w:r>
+        <w:t xml:space="preserve"> </w:t>
+      </w:r>
+      <w:r>
+        <w:t xml:space="preserve">on the npj/PhononBench benchmarks therefore does not identify the best finite-temperature screener,</w:t>
+      </w:r>
+      <w:r>
+        <w:t xml:space="preserve"> </w:t>
+      </w:r>
+      <w:r>
+        <w:t xml:space="preserve">and a poor one does not disqualify a model. We note explicitly that SevenNet-0 leads</w:t>
+      </w:r>
+      <w:r>
+        <w:t xml:space="preserve"> </w:t>
+      </w:r>
+      <w:r>
+        <w:rPr>
+          <w:i/>
+          <w:iCs/>
+        </w:rPr>
+        <w:t xml:space="preserve">both</w:t>
+      </w:r>
+      <w:r>
+        <w:t xml:space="preserve"> </w:t>
+      </w:r>
+      <w:r>
+        <w:t xml:space="preserve">layers,</w:t>
+      </w:r>
+      <w:r>
+        <w:t xml:space="preserve"> </w:t>
+      </w:r>
+      <w:r>
+        <w:t xml:space="preserve">so the relationship is not a simple inversion and we do not claim one; an earlier version of this</w:t>
+      </w:r>
+      <w:r>
+        <w:t xml:space="preserve"> </w:t>
+      </w:r>
+      <w:r>
+        <w:t xml:space="preserve">analysis, computed before the mode-selection correction described in §2.4, reported that the</w:t>
+      </w:r>
+      <w:r>
+        <w:t xml:space="preserve"> </w:t>
+      </w:r>
+      <w:r>
+        <w:t xml:space="preserve">harmonic leaders sat behind MACE-MP-0 and CHGNet, and that specific ordering does not survive the</w:t>
+      </w:r>
+      <w:r>
+        <w:t xml:space="preserve"> </w:t>
+      </w:r>
+      <w:r>
+        <w:t xml:space="preserve">correction. ORB-v2 remains the weakest finite-temperature screener (0.800) and the only model that</w:t>
+      </w:r>
+      <w:r>
+        <w:t xml:space="preserve"> </w:t>
+      </w:r>
+      <w:r>
+        <w:t xml:space="preserve">fails to select the correct instability in SrTiO₃ (§2.4), consistent with its float32 direct</w:t>
+      </w:r>
+      <w:r>
+        <w:t xml:space="preserve"> </w:t>
+      </w:r>
+      <w:r>
+        <w:t xml:space="preserve">architecture over-softening the PES, though our design cannot separate the architecture from the</w:t>
+      </w:r>
+      <w:r>
+        <w:t xml:space="preserve"> </w:t>
+      </w:r>
+      <w:r>
+        <w:t xml:space="preserve">precision. The strongest evidence that finite temperature is a distinct, harder regime comes not</w:t>
+      </w:r>
+      <w:r>
+        <w:t xml:space="preserve"> </w:t>
+      </w:r>
+      <w:r>
+        <w:t xml:space="preserve">from this ranking comparison but from the per-family recall above and the SSCHA failure in §3.3.</w:t>
       </w:r>
     </w:p>
     <w:bookmarkEnd w:id="24"/>
-    <w:bookmarkStart w:id="31" w:name="X3071391ad62650abdc1b0484b081a86a9e497c1"/>
+    <w:bookmarkStart w:id="31" w:name="X8ab2dfef3885ae7762bb8e2347fe92a6e97ed26"/>
     <w:p>
       <w:pPr>
         <w:pStyle w:val="Heading3"/>
       </w:pPr>
       <w:r>
-        <w:t xml:space="preserve">3.3 SSCHA: clean for bcc, a trap for perovskites (the cautionary result)</w:t>
+        <w:t xml:space="preserve">3.3 SSCHA: clean for bcc, false-stable for perovskites at the default truncation (the cautionary result)</w:t>
       </w:r>
     </w:p>
     <w:p>
@@ -2335,25 +2831,25 @@
         <w:t xml:space="preserve"> </w:t>
       </w:r>
       <w:r>
-        <w:t xml:space="preserve">would actually run. It is not a claim that the SSCHA formalism is wrong; the proper treatment of a</w:t>
-      </w:r>
-      <w:r>
-        <w:t xml:space="preserve"> </w:t>
-      </w:r>
-      <w:r>
-        <w:t xml:space="preserve">structural instability (relaxing the centroids into the distorted phase, or the expensive v4</w:t>
-      </w:r>
-      <w:r>
-        <w:t xml:space="preserve"> </w:t>
-      </w:r>
-      <w:r>
-        <w:t xml:space="preserve">Hessian) answers a different question and is impractical at screening scale (see the root cause</w:t>
-      </w:r>
-      <w:r>
-        <w:t xml:space="preserve"> </w:t>
-      </w:r>
-      <w:r>
-        <w:t xml:space="preserve">below). The finding is that the default escalation path is a trap.</w:t>
+        <w:t xml:space="preserve">would actually run. It is not a claim that the SSCHA formalism is wrong; the formalism anticipates</w:t>
+      </w:r>
+      <w:r>
+        <w:t xml:space="preserve"> </w:t>
+      </w:r>
+      <w:r>
+        <w:t xml:space="preserve">this failure, and the expensive v4 Hessian is its own prescribed remedy, but that remedy is</w:t>
+      </w:r>
+      <w:r>
+        <w:t xml:space="preserve"> </w:t>
+      </w:r>
+      <w:r>
+        <w:t xml:space="preserve">impractical at screening scale (see the root cause below). The finding is that the default</w:t>
+      </w:r>
+      <w:r>
+        <w:t xml:space="preserve"> </w:t>
+      </w:r>
+      <w:r>
+        <w:t xml:space="preserve">escalation path, at the truncation its implementation ships with, is unsafe in this regime.</w:t>
       </w:r>
     </w:p>
     <w:p>
@@ -2421,31 +2917,25 @@
         <w:t xml:space="preserve"> </w:t>
       </w:r>
       <w:r>
-        <w:t xml:space="preserve">ρ = 0.78 with 0.64 sign agreement (Fig. 4). The disagreements are concentrated in ORB-v2’s float32</w:t>
-      </w:r>
-      <w:r>
-        <w:t xml:space="preserve"> </w:t>
-      </w:r>
-      <w:r>
-        <w:t xml:space="preserve">softmode outliers (Ti/Hf near −35 THz, where SSCHA is mildly positive); dropping ORB-v2 raises the</w:t>
-      </w:r>
-      <w:r>
-        <w:t xml:space="preserve"> </w:t>
-      </w:r>
-      <w:r>
-        <w:t xml:space="preserve">sign agreement to 0.78, while the rank correlation softens to 0.63 as the remaining frequency</w:t>
-      </w:r>
-      <w:r>
-        <w:t xml:space="preserve"> </w:t>
-      </w:r>
-      <w:r>
-        <w:t xml:space="preserve">spread narrows. Either way the screen and the gold standard agree on the family where the gold</w:t>
-      </w:r>
-      <w:r>
-        <w:t xml:space="preserve"> </w:t>
-      </w:r>
-      <w:r>
-        <w:t xml:space="preserve">standard is trustworthy.</w:t>
+        <w:t xml:space="preserve">ρ = 0.74 with 0.62 sign agreement (Fig. 4). The disagreements are concentrated in ORB-v2’s float32</w:t>
+      </w:r>
+      <w:r>
+        <w:t xml:space="preserve"> </w:t>
+      </w:r>
+      <w:r>
+        <w:t xml:space="preserve">softmode outliers; dropping ORB-v2 (36 paired units) raises the sign agreement to 0.69 and leaves</w:t>
+      </w:r>
+      <w:r>
+        <w:t xml:space="preserve"> </w:t>
+      </w:r>
+      <w:r>
+        <w:t xml:space="preserve">the rank correlation essentially unchanged at ρ = 0.74. Either way the screen and the gold standard</w:t>
+      </w:r>
+      <w:r>
+        <w:t xml:space="preserve"> </w:t>
+      </w:r>
+      <w:r>
+        <w:t xml:space="preserve">agree on the family where the gold standard is trustworthy.</w:t>
       </w:r>
     </w:p>
     <w:p>
@@ -2459,31 +2949,49 @@
         <w:t xml:space="preserve"> </w:t>
       </w:r>
       <w:r>
-        <w:t xml:space="preserve">T ≤ 300 K where the screen reaches 0.77 recall, SSCHA correctly identifies the instability in only</w:t>
-      </w:r>
-      <w:r>
-        <w:t xml:space="preserve"> </w:t>
-      </w:r>
-      <w:r>
-        <w:t xml:space="preserve">7 of 30 units (recall 0.23), and the perovskite SSCHA runs include six numerical blow-ups (minimum</w:t>
-      </w:r>
-      <w:r>
-        <w:t xml:space="preserve"> </w:t>
-      </w:r>
-      <w:r>
-        <w:t xml:space="preserve">frequencies down to −2×10⁶ THz, concentrated in the float32 ORB-v2 runs). This is the cautionary</w:t>
-      </w:r>
-      <w:r>
-        <w:t xml:space="preserve"> </w:t>
-      </w:r>
-      <w:r>
-        <w:t xml:space="preserve">result: the expensive gold standard is less reliable than the cheap screen in the displacive regime</w:t>
-      </w:r>
-      <w:r>
-        <w:t xml:space="preserve"> </w:t>
-      </w:r>
-      <w:r>
-        <w:t xml:space="preserve">that dominates generative-CSP outputs (Fig. 5).</w:t>
+        <w:t xml:space="preserve">T ≤ 300 K where the screen reaches 0.53 recall, SSCHA correctly identifies the instability in only</w:t>
+      </w:r>
+      <w:r>
+        <w:t xml:space="preserve"> </w:t>
+      </w:r>
+      <w:r>
+        <w:t xml:space="preserve">9 of 30 units (recall 0.30), and the perovskite SSCHA runs include six numerical blow-ups (minimum</w:t>
+      </w:r>
+      <w:r>
+        <w:t xml:space="preserve"> </w:t>
+      </w:r>
+      <w:r>
+        <w:t xml:space="preserve">frequencies down to −2×10⁶ THz). Those blow-ups are not exclusively a float32 effect: four occur in</w:t>
+      </w:r>
+      <w:r>
+        <w:t xml:space="preserve"> </w:t>
+      </w:r>
+      <w:r>
+        <w:t xml:space="preserve">ORB-v2 runs on SrTiO₃ and two in MatterSim runs on PbTiO₃, so precision alone does not account for</w:t>
+      </w:r>
+      <w:r>
+        <w:t xml:space="preserve"> </w:t>
+      </w:r>
+      <w:r>
+        <w:t xml:space="preserve">them. This is the cautionary result: the expensive gold standard is less reliable than the cheap</w:t>
+      </w:r>
+      <w:r>
+        <w:t xml:space="preserve"> </w:t>
+      </w:r>
+      <w:r>
+        <w:t xml:space="preserve">screen in the displacive regime that dominates generative-CSP outputs (Fig. 5). We note that the</w:t>
+      </w:r>
+      <w:r>
+        <w:t xml:space="preserve"> </w:t>
+      </w:r>
+      <w:r>
+        <w:t xml:space="preserve">margin is narrower than the earlier single-mode analysis suggested — 0.53 against 0.30, a factor of 1.8 —</w:t>
+      </w:r>
+      <w:r>
+        <w:t xml:space="preserve"> </w:t>
+      </w:r>
+      <w:r>
+        <w:t xml:space="preserve">and that both methods miss a substantial fraction of these instabilities.</w:t>
       </w:r>
     </w:p>
     <w:p>
@@ -2651,13 +3159,231 @@
         <w:pStyle w:val="BodyText"/>
       </w:pPr>
       <w:r>
-        <w:t xml:space="preserve">Root cause. A controlled diagnostic on cubic BaTiO₃ (MACE-MP-0, 100 K) isolates the mechanism. The</w:t>
-      </w:r>
-      <w:r>
-        <w:t xml:space="preserve"> </w:t>
-      </w:r>
-      <w:r>
-        <w:t xml:space="preserve">harmonic soft mode is −5.6 THz (correctly unstable), but</w:t>
+        <w:t xml:space="preserve">Root cause: the fourth-order truncation, not the reference structure. A controlled diagnostic on</w:t>
+      </w:r>
+      <w:r>
+        <w:t xml:space="preserve"> </w:t>
+      </w:r>
+      <w:r>
+        <w:t xml:space="preserve">cubic BaTiO₃ (MACE-MP-0, 100 K) isolates the mechanism, and the SCHA literature identifies it</w:t>
+      </w:r>
+      <w:r>
+        <w:t xml:space="preserve"> </w:t>
+      </w:r>
+      <w:r>
+        <w:t xml:space="preserve">precisely. The auxiliary SCHA matrix</w:t>
+      </w:r>
+      <w:r>
+        <w:t xml:space="preserve"> </w:t>
+      </w:r>
+      <w:r>
+        <w:rPr>
+          <w:b/>
+          <w:bCs/>
+        </w:rPr>
+        <w:t xml:space="preserve">Φ</w:t>
+      </w:r>
+      <w:r>
+        <w:t xml:space="preserve"> </w:t>
+      </w:r>
+      <w:r>
+        <w:t xml:space="preserve">is positive-definite by construction, since a</w:t>
+      </w:r>
+      <w:r>
+        <w:t xml:space="preserve"> </w:t>
+      </w:r>
+      <w:r>
+        <w:t xml:space="preserve">normalisable Gaussian trial state requires it, so it can never soften and searching its eigenvalues</w:t>
+      </w:r>
+      <w:r>
+        <w:t xml:space="preserve"> </w:t>
+      </w:r>
+      <w:r>
+        <w:t xml:space="preserve">for an instability is meaningless.</w:t>
+      </w:r>
+      <w:r>
+        <w:rPr>
+          <w:vertAlign w:val="superscript"/>
+        </w:rPr>
+        <w:t xml:space="preserve">21,22</w:t>
+      </w:r>
+      <w:r>
+        <w:t xml:space="preserve"> </w:t>
+      </w:r>
+      <w:r>
+        <w:t xml:space="preserve">The object that</w:t>
+      </w:r>
+      <w:r>
+        <w:t xml:space="preserve"> </w:t>
+      </w:r>
+      <w:r>
+        <w:rPr>
+          <w:i/>
+          <w:iCs/>
+        </w:rPr>
+        <w:t xml:space="preserve">can</w:t>
+      </w:r>
+      <w:r>
+        <w:t xml:space="preserve"> </w:t>
+      </w:r>
+      <w:r>
+        <w:t xml:space="preserve">detect a displacive transition from</w:t>
+      </w:r>
+      <w:r>
+        <w:t xml:space="preserve"> </w:t>
+      </w:r>
+      <w:r>
+        <w:t xml:space="preserve">a fixed high-symmetry reference is the free-energy Hessian,</w:t>
+      </w:r>
+      <w:r>
+        <w:t xml:space="preserve"> </w:t>
+      </w:r>
+      <w:r>
+        <w:t xml:space="preserve">∂²F/∂</w:t>
+      </w:r>
+      <w:r>
+        <w:rPr>
+          <w:b/>
+          <w:bCs/>
+        </w:rPr>
+        <w:t xml:space="preserve">R</w:t>
+      </w:r>
+      <w:r>
+        <w:t xml:space="preserve">∂</w:t>
+      </w:r>
+      <w:r>
+        <w:rPr>
+          <w:b/>
+          <w:bCs/>
+        </w:rPr>
+        <w:t xml:space="preserve">R</w:t>
+      </w:r>
+      <w:r>
+        <w:t xml:space="preserve"> </w:t>
+      </w:r>
+      <w:r>
+        <w:t xml:space="preserve">=</w:t>
+      </w:r>
+      <w:r>
+        <w:t xml:space="preserve"> </w:t>
+      </w:r>
+      <w:r>
+        <w:rPr>
+          <w:b/>
+          <w:bCs/>
+        </w:rPr>
+        <w:t xml:space="preserve">Φ</w:t>
+      </w:r>
+      <w:r>
+        <w:t xml:space="preserve"> </w:t>
+      </w:r>
+      <w:r>
+        <w:t xml:space="preserve">+</w:t>
+      </w:r>
+      <w:r>
+        <w:t xml:space="preserve"> </w:t>
+      </w:r>
+      <w:r>
+        <w:rPr>
+          <w:b/>
+          <w:bCs/>
+        </w:rPr>
+        <w:t xml:space="preserve">Φ</w:t>
+      </w:r>
+      <w:r>
+        <w:t xml:space="preserve">⁽³⁾</w:t>
+      </w:r>
+      <w:r>
+        <w:rPr>
+          <w:b/>
+          <w:bCs/>
+        </w:rPr>
+        <w:t xml:space="preserve">Λ</w:t>
+      </w:r>
+      <w:r>
+        <w:t xml:space="preserve">[</w:t>
+      </w:r>
+      <w:r>
+        <w:rPr>
+          <w:b/>
+          <w:bCs/>
+        </w:rPr>
+        <w:t xml:space="preserve">1</w:t>
+      </w:r>
+      <w:r>
+        <w:t xml:space="preserve"> </w:t>
+      </w:r>
+      <w:r>
+        <w:t xml:space="preserve">−</w:t>
+      </w:r>
+      <w:r>
+        <w:t xml:space="preserve"> </w:t>
+      </w:r>
+      <w:r>
+        <w:rPr>
+          <w:b/>
+          <w:bCs/>
+        </w:rPr>
+        <w:t xml:space="preserve">Φ</w:t>
+      </w:r>
+      <w:r>
+        <w:t xml:space="preserve">⁽⁴⁾</w:t>
+      </w:r>
+      <w:r>
+        <w:rPr>
+          <w:b/>
+          <w:bCs/>
+        </w:rPr>
+        <w:t xml:space="preserve">Λ</w:t>
+      </w:r>
+      <w:r>
+        <w:t xml:space="preserve">]⁻¹</w:t>
+      </w:r>
+      <w:r>
+        <w:rPr>
+          <w:b/>
+          <w:bCs/>
+        </w:rPr>
+        <w:t xml:space="preserve">Φ</w:t>
+      </w:r>
+      <w:r>
+        <w:t xml:space="preserve">⁽³⁾, which was derived for</w:t>
+      </w:r>
+      <w:r>
+        <w:t xml:space="preserve"> </w:t>
+      </w:r>
+      <w:r>
+        <w:t xml:space="preserve">exactly that purpose and demonstrated on the ferroelectric transitions of SnTe and GeTe.</w:t>
+      </w:r>
+      <w:r>
+        <w:rPr>
+          <w:vertAlign w:val="superscript"/>
+        </w:rPr>
+        <w:t xml:space="preserve">21</w:t>
+      </w:r>
+      <w:r>
+        <w:t xml:space="preserve"> </w:t>
+      </w:r>
+      <w:r>
+        <w:t xml:space="preserve">Our</w:t>
+      </w:r>
+      <w:r>
+        <w:t xml:space="preserve"> </w:t>
+      </w:r>
+      <w:r>
+        <w:t xml:space="preserve">diagnostic shows the failure enters at the truncation: the harmonic soft mode is −5.6 THz</w:t>
+      </w:r>
+      <w:r>
+        <w:t xml:space="preserve"> </w:t>
+      </w:r>
+      <w:r>
+        <w:t xml:space="preserve">(correctly unstable), yet with the fourth-order term dropped, which is the bubble approximation and</w:t>
+      </w:r>
+      <w:r>
+        <w:t xml:space="preserve"> </w:t>
+      </w:r>
+      <w:r>
+        <w:t xml:space="preserve">the</w:t>
       </w:r>
       <w:r>
         <w:t xml:space="preserve"> </w:t>
@@ -2666,37 +3392,80 @@
         <w:rPr>
           <w:rStyle w:val="VerbatimChar"/>
         </w:rPr>
-        <w:t xml:space="preserve">ForcePositiveDefinite</w:t>
-      </w:r>
-      <w:r>
-        <w:t xml:space="preserve"> </w:t>
-      </w:r>
-      <w:r>
-        <w:t xml:space="preserve">at initialisation</w:t>
-      </w:r>
-      <w:r>
-        <w:t xml:space="preserve"> </w:t>
-      </w:r>
-      <w:r>
-        <w:t xml:space="preserve">erases it (+2.88 THz); the SCHA auxiliary matrix then stays at +2.89 THz because at low temperature</w:t>
-      </w:r>
-      <w:r>
-        <w:t xml:space="preserve"> </w:t>
-      </w:r>
-      <w:r>
-        <w:t xml:space="preserve">its narrow Gaussian width never samples the anharmonic double well; and the free-energy Hessian</w:t>
-      </w:r>
-      <w:r>
-        <w:t xml:space="preserve"> </w:t>
-      </w:r>
-      <w:r>
-        <w:t xml:space="preserve">without the fourth-order term reproduces that positive curvature (+2.87 THz), giving a false-stable</w:t>
-      </w:r>
-      <w:r>
-        <w:t xml:space="preserve"> </w:t>
-      </w:r>
-      <w:r>
-        <w:t xml:space="preserve">call. Enabling the fourth-order term (</w:t>
+        <w:t xml:space="preserve">python-sscha</w:t>
+      </w:r>
+      <w:r>
+        <w:t xml:space="preserve"> </w:t>
+      </w:r>
+      <w:r>
+        <w:t xml:space="preserve">default, the Hessian returns +2.87 THz and the call is false-stable. That is the</w:t>
+      </w:r>
+      <w:r>
+        <w:t xml:space="preserve"> </w:t>
+      </w:r>
+      <w:r>
+        <w:t xml:space="preserve">regime in which the bubble is known to fail, since it breaks down for the cubic phase of metal</w:t>
+      </w:r>
+      <w:r>
+        <w:t xml:space="preserve"> </w:t>
+      </w:r>
+      <w:r>
+        <w:t xml:space="preserve">halide perovskites and produces qualitatively incorrect results there, and</w:t>
+      </w:r>
+      <w:r>
+        <w:t xml:space="preserve"> </w:t>
+      </w:r>
+      <w:r>
+        <w:rPr>
+          <w:b/>
+          <w:bCs/>
+        </w:rPr>
+        <w:t xml:space="preserve">Φ</w:t>
+      </w:r>
+      <w:r>
+        <w:t xml:space="preserve">⁽⁴⁾ plays a</w:t>
+      </w:r>
+      <w:r>
+        <w:t xml:space="preserve"> </w:t>
+      </w:r>
+      <w:r>
+        <w:t xml:space="preserve">significant role around the transition so that the complete RPA-like resummation is needed to</w:t>
+      </w:r>
+      <w:r>
+        <w:t xml:space="preserve"> </w:t>
+      </w:r>
+      <w:r>
+        <w:t xml:space="preserve">determine phase stability.</w:t>
+      </w:r>
+      <w:r>
+        <w:rPr>
+          <w:vertAlign w:val="superscript"/>
+        </w:rPr>
+        <w:t xml:space="preserve">22</w:t>
+      </w:r>
+      <w:r>
+        <w:t xml:space="preserve"> </w:t>
+      </w:r>
+      <w:r>
+        <w:t xml:space="preserve">Our contribution is to measure that breakdown at benchmark scale and</w:t>
+      </w:r>
+      <w:r>
+        <w:t xml:space="preserve"> </w:t>
+      </w:r>
+      <w:r>
+        <w:t xml:space="preserve">to show it is not confined to halides: it holds for oxide perovskites, and for cubic fluorites it</w:t>
+      </w:r>
+      <w:r>
+        <w:t xml:space="preserve"> </w:t>
+      </w:r>
+      <w:r>
+        <w:t xml:space="preserve">holds in a numerically clean form with zero stochastic blow-ups (above), which separates a</w:t>
+      </w:r>
+      <w:r>
+        <w:t xml:space="preserve"> </w:t>
+      </w:r>
+      <w:r>
+        <w:t xml:space="preserve">methodological limit from a numerical one. Enabling the fourth-order term (</w:t>
       </w:r>
       <w:r>
         <w:rPr>
@@ -2705,73 +3474,37 @@
         <w:t xml:space="preserve">include_v4=True</w:t>
       </w:r>
       <w:r>
-        <w:t xml:space="preserve">) is the only route that could recover the</w:t>
-      </w:r>
-      <w:r>
-        <w:t xml:space="preserve"> </w:t>
-      </w:r>
-      <w:r>
-        <w:t xml:space="preserve">instability, but it ran for more than 18 min on a single unit without finishing (tens of hours per</w:t>
-      </w:r>
-      <w:r>
-        <w:t xml:space="preserve"> </w:t>
-      </w:r>
-      <w:r>
-        <w:t xml:space="preserve">unit at grid scale) and is numerically viable only in float64. The physically correct SSCHA</w:t>
-      </w:r>
-      <w:r>
-        <w:t xml:space="preserve"> </w:t>
-      </w:r>
-      <w:r>
-        <w:t xml:space="preserve">treatment of a deep displacive instability is to relax the structure into the distorted phase,</w:t>
-      </w:r>
-      <w:r>
-        <w:t xml:space="preserve"> </w:t>
-      </w:r>
-      <w:r>
-        <w:t xml:space="preserve">which changes the question from</w:t>
-      </w:r>
-      <w:r>
-        <w:t xml:space="preserve"> </w:t>
-      </w:r>
-      <w:r>
-        <w:t xml:space="preserve">“is the cubic phase dynamically stable”</w:t>
-      </w:r>
-      <w:r>
-        <w:t xml:space="preserve"> </w:t>
-      </w:r>
-      <w:r>
-        <w:t xml:space="preserve">to</w:t>
-      </w:r>
-      <w:r>
-        <w:t xml:space="preserve"> </w:t>
-      </w:r>
-      <w:r>
-        <w:t xml:space="preserve">“what is the ground</w:t>
-      </w:r>
-      <w:r>
-        <w:t xml:space="preserve"> </w:t>
-      </w:r>
-      <w:r>
-        <w:t xml:space="preserve">state,”</w:t>
-      </w:r>
-      <w:r>
-        <w:t xml:space="preserve"> </w:t>
-      </w:r>
-      <w:r>
-        <w:t xml:space="preserve">and so cannot serve as the benchmark criterion. We therefore use SSCHA as the bcc gold</w:t>
-      </w:r>
-      <w:r>
-        <w:t xml:space="preserve"> </w:t>
-      </w:r>
-      <w:r>
-        <w:t xml:space="preserve">standard and the experimental transition temperature (the SrTiO₃ gate, §2.4) as the validation for</w:t>
-      </w:r>
-      <w:r>
-        <w:t xml:space="preserve"> </w:t>
-      </w:r>
-      <w:r>
-        <w:t xml:space="preserve">the perovskite screen.</w:t>
+        <w:t xml:space="preserve">) is</w:t>
+      </w:r>
+      <w:r>
+        <w:t xml:space="preserve"> </w:t>
+      </w:r>
+      <w:r>
+        <w:t xml:space="preserve">therefore the physically correct escalation, consistent with that RPA requirement, but it ran for</w:t>
+      </w:r>
+      <w:r>
+        <w:t xml:space="preserve"> </w:t>
+      </w:r>
+      <w:r>
+        <w:t xml:space="preserve">more than 18 min on a single unit without finishing (tens of hours per unit at grid scale) and is</w:t>
+      </w:r>
+      <w:r>
+        <w:t xml:space="preserve"> </w:t>
+      </w:r>
+      <w:r>
+        <w:t xml:space="preserve">numerically viable only in float64, which is the practical barrier at screening scale. We therefore</w:t>
+      </w:r>
+      <w:r>
+        <w:t xml:space="preserve"> </w:t>
+      </w:r>
+      <w:r>
+        <w:t xml:space="preserve">use SSCHA as the bcc gold standard and the experimental transition temperature (the SrTiO₃ gate,</w:t>
+      </w:r>
+      <w:r>
+        <w:t xml:space="preserve"> </w:t>
+      </w:r>
+      <w:r>
+        <w:t xml:space="preserve">§2.4) as the validation for the perovskite screen.</w:t>
       </w:r>
     </w:p>
     <w:p>
@@ -2797,67 +3530,73 @@
         <w:t xml:space="preserve"> </w:t>
       </w:r>
       <w:r>
-        <w:t xml:space="preserve">blow-ups. The soft-mode screen returns roughly −6.4 to −8 THz for all five models at every</w:t>
-      </w:r>
-      <w:r>
-        <w:t xml:space="preserve"> </w:t>
-      </w:r>
-      <w:r>
-        <w:t xml:space="preserve">temperature (100–900 K), correctly and consistently unstable. SSCHA instead returns ≈ +3 THz at</w:t>
-      </w:r>
-      <w:r>
-        <w:t xml:space="preserve"> </w:t>
-      </w:r>
-      <w:r>
-        <w:t xml:space="preserve">100 K for all five models (false-stable) and then destabilises with temperature (for example</w:t>
-      </w:r>
-      <w:r>
-        <w:t xml:space="preserve"> </w:t>
-      </w:r>
-      <w:r>
-        <w:t xml:space="preserve">MACE-MP-0 −4.6 THz and ORB-v2 −10.2 THz at 900 K), which is both the wrong sign at low T and the</w:t>
-      </w:r>
-      <w:r>
-        <w:t xml:space="preserve"> </w:t>
-      </w:r>
-      <w:r>
-        <w:t xml:space="preserve">wrong temperature trend. Because SSCHA fails the same way on a numerically well-behaved, shallower</w:t>
-      </w:r>
-      <w:r>
-        <w:t xml:space="preserve"> </w:t>
-      </w:r>
-      <w:r>
-        <w:t xml:space="preserve">instability, the false-stable behaviour is intrinsic to the fixed-reference SSCHA deployment (see</w:t>
-      </w:r>
-      <w:r>
-        <w:t xml:space="preserve"> </w:t>
-      </w:r>
-      <w:r>
-        <w:t xml:space="preserve">the root cause above) rather than an artifact of the deepest perovskite wells. HfO₂ shows the same</w:t>
-      </w:r>
-      <w:r>
-        <w:t xml:space="preserve"> </w:t>
-      </w:r>
-      <w:r>
-        <w:t xml:space="preserve">SSCHA false-stable pattern (all models +2.0 to +2.6 THz at 100 K, then destabilising to −4.3/−7.2</w:t>
-      </w:r>
-      <w:r>
-        <w:t xml:space="preserve"> </w:t>
-      </w:r>
-      <w:r>
-        <w:t xml:space="preserve">THz for CHGNet/ORB-v2 by 900 K). Across both fluorites SSCHA produced zero numerical blow-ups yet</w:t>
-      </w:r>
-      <w:r>
-        <w:t xml:space="preserve"> </w:t>
-      </w:r>
-      <w:r>
-        <w:t xml:space="preserve">the same systematic false-stable, which confirms that the failure is a methodological trap, not a</w:t>
-      </w:r>
-      <w:r>
-        <w:t xml:space="preserve"> </w:t>
-      </w:r>
-      <w:r>
-        <w:t xml:space="preserve">numerical one.</w:t>
+        <w:t xml:space="preserve">blow-ups. The soft-mode screen calls both fluorites unstable at every temperature and for every model</w:t>
+      </w:r>
+      <w:r>
+        <w:t xml:space="preserve"> </w:t>
+      </w:r>
+      <w:r>
+        <w:t xml:space="preserve">(recall 1.00), correctly and consistently. SSCHA instead returns +2.4 to +3.3 THz at 100 K for all</w:t>
+      </w:r>
+      <w:r>
+        <w:t xml:space="preserve"> </w:t>
+      </w:r>
+      <w:r>
+        <w:t xml:space="preserve">five models on ZrO₂ (false-stable) and then destabilises with temperature for three of them</w:t>
+      </w:r>
+      <w:r>
+        <w:t xml:space="preserve"> </w:t>
+      </w:r>
+      <w:r>
+        <w:t xml:space="preserve">(MACE-MP-0 −4.6 THz and ORB-v2 −11.3 THz at 900 K), which is both the wrong sign at low T and the</w:t>
+      </w:r>
+      <w:r>
+        <w:t xml:space="preserve"> </w:t>
+      </w:r>
+      <w:r>
+        <w:t xml:space="preserve">wrong temperature trend; MatterSim and SevenNet-0 instead remain positive at 900 K (+2.4 and +0.5</w:t>
+      </w:r>
+      <w:r>
+        <w:t xml:space="preserve"> </w:t>
+      </w:r>
+      <w:r>
+        <w:t xml:space="preserve">THz), so they are false-stable across the whole ladder. Because SSCHA fails the same way on a</w:t>
+      </w:r>
+      <w:r>
+        <w:t xml:space="preserve"> </w:t>
+      </w:r>
+      <w:r>
+        <w:t xml:space="preserve">numerically well-behaved, shallower instability, the false-stable behaviour is intrinsic to the</w:t>
+      </w:r>
+      <w:r>
+        <w:t xml:space="preserve"> </w:t>
+      </w:r>
+      <w:r>
+        <w:t xml:space="preserve">truncated fixed-reference deployment (see the root cause above) rather than an artifact of the</w:t>
+      </w:r>
+      <w:r>
+        <w:t xml:space="preserve"> </w:t>
+      </w:r>
+      <w:r>
+        <w:t xml:space="preserve">deepest perovskite wells. HfO₂ shows the same pattern (all models +2.0 to +2.6 THz at 100 K, then</w:t>
+      </w:r>
+      <w:r>
+        <w:t xml:space="preserve"> </w:t>
+      </w:r>
+      <w:r>
+        <w:t xml:space="preserve">destabilising to −4.3/−8.3 THz for CHGNet/ORB-v2 by 900 K). Across both fluorites SSCHA produced</w:t>
+      </w:r>
+      <w:r>
+        <w:t xml:space="preserve"> </w:t>
+      </w:r>
+      <w:r>
+        <w:t xml:space="preserve">zero numerical blow-ups yet the same systematic false-stable, which confirms that the failure is</w:t>
+      </w:r>
+      <w:r>
+        <w:t xml:space="preserve"> </w:t>
+      </w:r>
+      <w:r>
+        <w:t xml:space="preserve">methodological, not numerical.</w:t>
       </w:r>
     </w:p>
     <w:bookmarkEnd w:id="31"/>
@@ -2893,37 +3632,37 @@
         <w:t xml:space="preserve"> </w:t>
       </w:r>
       <w:r>
-        <w:t xml:space="preserve">wrong reference for dynamic stability, §3.3), the majority-vote consensus is wrong on 16.7% of</w:t>
-      </w:r>
-      <w:r>
-        <w:t xml:space="preserve"> </w:t>
-      </w:r>
-      <w:r>
-        <w:t xml:space="preserve">units. The disagreement signal separates these: on the 18 units where the five models split on the</w:t>
-      </w:r>
-      <w:r>
-        <w:t xml:space="preserve"> </w:t>
-      </w:r>
-      <w:r>
-        <w:t xml:space="preserve">stable/unstable call, the consensus error rate is 0.39, against 0.07 on the 42 unanimous units, a</w:t>
-      </w:r>
-      <w:r>
-        <w:t xml:space="preserve"> </w:t>
-      </w:r>
-      <w:r>
-        <w:t xml:space="preserve">5.5× enrichment. As a ranked predictor of consensus error, the binary stable/unstable vote split</w:t>
-      </w:r>
-      <w:r>
-        <w:t xml:space="preserve"> </w:t>
-      </w:r>
-      <w:r>
-        <w:t xml:space="preserve">reaches AUC 0.75, whereas the continuous cross-model frequency standard deviation is uninformative</w:t>
-      </w:r>
-      <w:r>
-        <w:t xml:space="preserve"> </w:t>
-      </w:r>
-      <w:r>
-        <w:t xml:space="preserve">(AUC 0.52, no better than chance; Fig. 6).</w:t>
+        <w:t xml:space="preserve">wrong reference for dynamic stability, §3.3), the majority-vote consensus is wrong on 20.0% of</w:t>
+      </w:r>
+      <w:r>
+        <w:t xml:space="preserve"> </w:t>
+      </w:r>
+      <w:r>
+        <w:t xml:space="preserve">units. The disagreement signal separates these: on the 14 units where the five models split on the</w:t>
+      </w:r>
+      <w:r>
+        <w:t xml:space="preserve"> </w:t>
+      </w:r>
+      <w:r>
+        <w:t xml:space="preserve">stable/unstable call, the consensus error rate is 0.57, against 0.09 on the 46 unanimous units, a</w:t>
+      </w:r>
+      <w:r>
+        <w:t xml:space="preserve"> </w:t>
+      </w:r>
+      <w:r>
+        <w:t xml:space="preserve">6.6× enrichment. As a ranked predictor of consensus error, the binary stable/unstable vote split</w:t>
+      </w:r>
+      <w:r>
+        <w:t xml:space="preserve"> </w:t>
+      </w:r>
+      <w:r>
+        <w:t xml:space="preserve">reaches AUC 0.76, whereas the continuous cross-model frequency standard deviation is uninformative</w:t>
+      </w:r>
+      <w:r>
+        <w:t xml:space="preserve"> </w:t>
+      </w:r>
+      <w:r>
+        <w:t xml:space="preserve">(AUC 0.55, no better than chance; Fig. 6).</w:t>
       </w:r>
     </w:p>
     <w:p>
@@ -2935,7 +3674,7 @@
           <wp:inline>
             <wp:extent cx="4220307" cy="4220307"/>
             <wp:effectExtent b="0" l="0" r="0" t="0"/>
-            <wp:docPr descr="Fig. 6 Ensemble-disagreement guardrail (§3.4): the discrete inter-model vote split predicts consensus error (AUC 0.75) while the continuous cross-model frequency spread does not (AUC 0.52)." title="" id="33" name="Picture"/>
+            <wp:docPr descr="Fig. 6 Ensemble-disagreement guardrail (§3.4): the discrete inter-model vote split predicts consensus error (AUC 0.76) while the continuous cross-model frequency spread does not (AUC 0.55)." title="" id="33" name="Picture"/>
             <a:graphic>
               <a:graphicData uri="http://schemas.openxmlformats.org/drawingml/2006/picture">
                 <pic:pic>
@@ -2994,13 +3733,13 @@
         <w:t xml:space="preserve"> </w:t>
       </w:r>
       <w:r>
-        <w:t xml:space="preserve">vote split predicts consensus error (AUC 0.75) while the continuous cross-model frequency spread</w:t>
-      </w:r>
-      <w:r>
-        <w:t xml:space="preserve"> </w:t>
-      </w:r>
-      <w:r>
-        <w:t xml:space="preserve">does not (AUC 0.52).</w:t>
+        <w:t xml:space="preserve">vote split predicts consensus error (AUC 0.76) while the continuous cross-model frequency spread</w:t>
+      </w:r>
+      <w:r>
+        <w:t xml:space="preserve"> </w:t>
+      </w:r>
+      <w:r>
+        <w:t xml:space="preserve">does not (AUC 0.55).</w:t>
       </w:r>
     </w:p>
     <w:p>
@@ -3044,7 +3783,7 @@
           <wp:inline>
             <wp:extent cx="4220307" cy="4220307"/>
             <wp:effectExtent b="0" l="0" r="0" t="0"/>
-            <wp:docPr descr="Fig. 5 Recall of the displacive (ferroelectric-perovskite) instability at T ≤ 300 K: the cheap soft-mode screen (0.77) versus the expensive SSCHA (0.23) (§3.3). The cautionary result is that the gold standard is less reliable than the screen in the regime that matters most." title="" id="36" name="Picture"/>
+            <wp:docPr descr="Fig. 5 Recall of the displacive (ferroelectric-perovskite) instability at T ≤ 300 K: the cheap multi-mode soft-mode screen (0.53) versus the expensive SSCHA (0.30) (§3.3). The cautionary result is that the gold standard is less reliable than the screen in the regime that matters most." title="" id="36" name="Picture"/>
             <a:graphic>
               <a:graphicData uri="http://schemas.openxmlformats.org/drawingml/2006/picture">
                 <pic:pic>
@@ -3103,7 +3842,7 @@
         <w:t xml:space="preserve"> </w:t>
       </w:r>
       <w:r>
-        <w:t xml:space="preserve">T ≤ 300 K: the cheap soft-mode screen (0.77) versus the expensive SSCHA (0.23) (§3.3). The</w:t>
+        <w:t xml:space="preserve">T ≤ 300 K: the cheap multi-mode soft-mode screen (0.53) versus the expensive SSCHA (0.30) (§3.3). The</w:t>
       </w:r>
       <w:r>
         <w:t xml:space="preserve"> </w:t>
@@ -3165,13 +3904,13 @@
         <w:pStyle w:val="BodyText"/>
       </w:pPr>
       <w:r>
-        <w:t xml:space="preserve">Finite size. The stability call is insensitive to supercell size on the cases where the test is</w:t>
-      </w:r>
-      <w:r>
-        <w:t xml:space="preserve"> </w:t>
-      </w:r>
-      <w:r>
-        <w:t xml:space="preserve">well-posed (</w:t>
+        <w:t xml:space="preserve">Finite size. The SSCHA stability call is insensitive to supercell size on the cases where the test</w:t>
+      </w:r>
+      <w:r>
+        <w:t xml:space="preserve"> </w:t>
+      </w:r>
+      <w:r>
+        <w:t xml:space="preserve">is well-posed (</w:t>
       </w:r>
       <w:r>
         <w:rPr>
@@ -3180,79 +3919,73 @@
         <w:t xml:space="preserve">results/convergence_study.parquet</w:t>
       </w:r>
       <w:r>
-        <w:t xml:space="preserve">). For bcc-Zr the dynamic-stabilisation verdict</w:t>
-      </w:r>
-      <w:r>
-        <w:t xml:space="preserve"> </w:t>
-      </w:r>
-      <w:r>
-        <w:t xml:space="preserve">holds from 2×2×2 to 3×3×3 (SSCHA +1.80 to +1.56 THz at 100 K, +1.80 to +1.55 at 300 K; soft-mode</w:t>
-      </w:r>
-      <w:r>
-        <w:t xml:space="preserve"> </w:t>
-      </w:r>
-      <w:r>
-        <w:t xml:space="preserve">screen +0.92 to +1.58 THz, stable throughout, the margin shifting by ≤0.25 THz). For the Γ-centred</w:t>
-      </w:r>
-      <w:r>
-        <w:t xml:space="preserve"> </w:t>
-      </w:r>
-      <w:r>
-        <w:t xml:space="preserve">ferroelectric mode of BaTiO₃ the soft-mode screen stays unstable across cell size (−8.5 to −7.3 THz</w:t>
-      </w:r>
-      <w:r>
-        <w:t xml:space="preserve"> </w:t>
-      </w:r>
-      <w:r>
-        <w:t xml:space="preserve">at 100 K). One caveat is intrinsic to the physics rather than the method: the SrTiO₃</w:t>
-      </w:r>
-      <w:r>
-        <w:t xml:space="preserve"> </w:t>
-      </w:r>
-      <w:r>
-        <w:t xml:space="preserve">antiferrodistortive instability lives at the zone-boundary R point = (½,½,½), which is commensurate</w:t>
-      </w:r>
-      <w:r>
-        <w:t xml:space="preserve"> </w:t>
-      </w:r>
-      <w:r>
-        <w:t xml:space="preserve">only with even supercells, so a 3×3×3 cell is blind to it by construction (the screen there reports</w:t>
-      </w:r>
-      <w:r>
-        <w:t xml:space="preserve"> </w:t>
-      </w:r>
-      <w:r>
-        <w:t xml:space="preserve">the Γ value, +0.0 THz, not the R instability at −2.8). A 2×2×2-versus-3×3×3 comparison is therefore</w:t>
-      </w:r>
-      <w:r>
-        <w:t xml:space="preserve"> </w:t>
-      </w:r>
-      <w:r>
-        <w:t xml:space="preserve">not a valid convergence test for R-point systems, and the definitive even-cell test (4×4×4, a</w:t>
-      </w:r>
-      <w:r>
-        <w:t xml:space="preserve"> </w:t>
-      </w:r>
-      <w:r>
-        <w:t xml:space="preserve">~320-atom SSCHA) is left to future work. The §3.3 SSCHA false-stable is not a missing-q artifact:</w:t>
-      </w:r>
-      <w:r>
-        <w:t xml:space="preserve"> </w:t>
-      </w:r>
-      <w:r>
-        <w:t xml:space="preserve">it occurs for the Γ ferroelectric mode of BaTiO₃, which is present in every cell including the</w:t>
-      </w:r>
-      <w:r>
-        <w:t xml:space="preserve"> </w:t>
-      </w:r>
-      <w:r>
-        <w:t xml:space="preserve">2×2×2 used, so the failure is the initialisation/Gaussian-width mechanism of the root-cause</w:t>
-      </w:r>
-      <w:r>
-        <w:t xml:space="preserve"> </w:t>
-      </w:r>
-      <w:r>
-        <w:t xml:space="preserve">diagnostic, not finite size.</w:t>
+        <w:t xml:space="preserve">): for bcc-Zr the dynamic-stabilisation verdict</w:t>
+      </w:r>
+      <w:r>
+        <w:t xml:space="preserve"> </w:t>
+      </w:r>
+      <w:r>
+        <w:t xml:space="preserve">holds from 2×2×2 to 3×3×3 (+1.80 to +1.56 THz at 100 K, +1.80 to +1.55 at 300 K). We report the</w:t>
+      </w:r>
+      <w:r>
+        <w:t xml:space="preserve"> </w:t>
+      </w:r>
+      <w:r>
+        <w:t xml:space="preserve">soft-mode side of that study as superseded rather than as evidence: those runs were produced by the</w:t>
+      </w:r>
+      <w:r>
+        <w:t xml:space="preserve"> </w:t>
+      </w:r>
+      <w:r>
+        <w:t xml:space="preserve">earlier single-mode selection, before the correction described in §2.4, and have not been repeated</w:t>
+      </w:r>
+      <w:r>
+        <w:t xml:space="preserve"> </w:t>
+      </w:r>
+      <w:r>
+        <w:t xml:space="preserve">at 3×3×3. One caveat is intrinsic to the physics rather than the method, and it is now the central</w:t>
+      </w:r>
+      <w:r>
+        <w:t xml:space="preserve"> </w:t>
+      </w:r>
+      <w:r>
+        <w:t xml:space="preserve">reason the multi-mode criterion is necessary: the SrTiO₃ antiferrodistortive instability lives at</w:t>
+      </w:r>
+      <w:r>
+        <w:t xml:space="preserve"> </w:t>
+      </w:r>
+      <w:r>
+        <w:t xml:space="preserve">the zone-boundary R point = (½,½,½), which is commensurate only with even supercells, so a 3×3×3</w:t>
+      </w:r>
+      <w:r>
+        <w:t xml:space="preserve"> </w:t>
+      </w:r>
+      <w:r>
+        <w:t xml:space="preserve">cell is blind to it by construction. A 2×2×2-versus-3×3×3 comparison is therefore not a valid</w:t>
+      </w:r>
+      <w:r>
+        <w:t xml:space="preserve"> </w:t>
+      </w:r>
+      <w:r>
+        <w:t xml:space="preserve">convergence test for R-point systems, and the definitive even-cell test (4×4×4, a ~320-atom SSCHA)</w:t>
+      </w:r>
+      <w:r>
+        <w:t xml:space="preserve"> </w:t>
+      </w:r>
+      <w:r>
+        <w:t xml:space="preserve">is left to future work. The §3.3 SSCHA false-stable is not a missing-q artifact: it occurs for the</w:t>
+      </w:r>
+      <w:r>
+        <w:t xml:space="preserve"> </w:t>
+      </w:r>
+      <w:r>
+        <w:t xml:space="preserve">Γ ferroelectric mode of BaTiO₃, which is present in every cell including the 2×2×2 used, so the</w:t>
+      </w:r>
+      <w:r>
+        <w:t xml:space="preserve"> </w:t>
+      </w:r>
+      <w:r>
+        <w:t xml:space="preserve">failure is the fourth-order truncation identified in the root-cause diagnostic, not finite size.</w:t>
       </w:r>
     </w:p>
     <w:bookmarkEnd w:id="39"/>
@@ -3283,7 +4016,13 @@
         <w:t xml:space="preserve"> </w:t>
       </w:r>
       <w:r>
-        <w:t xml:space="preserve">finite-temperature results confirm H2 in a strong form. Harmonic accuracy is non-predictive of</w:t>
+        <w:t xml:space="preserve">finite-temperature results support H2, though with a temperature-dependent statistic rather than a</w:t>
+      </w:r>
+      <w:r>
+        <w:t xml:space="preserve"> </w:t>
+      </w:r>
+      <w:r>
+        <w:t xml:space="preserve">single clean effect. Harmonic accuracy is non-predictive of</w:t>
       </w:r>
       <w:r>
         <w:t xml:space="preserve"> </w:t>
@@ -3301,31 +4040,37 @@
         <w:t xml:space="preserve"> </w:t>
       </w:r>
       <w:r>
-        <w:t xml:space="preserve">displacive regime, because SSCHA driven by an MLIP false-stabilises deep double wells. The</w:t>
-      </w:r>
-      <w:r>
-        <w:t xml:space="preserve"> </w:t>
-      </w:r>
-      <w:r>
-        <w:t xml:space="preserve">practical recommendation inverts the usual cost/accuracy intuition: for screening</w:t>
-      </w:r>
-      <w:r>
-        <w:t xml:space="preserve"> </w:t>
-      </w:r>
-      <w:r>
-        <w:t xml:space="preserve">harmonically-unstable displacive candidates, the cheap single-mode soft-mode free energy is the</w:t>
-      </w:r>
-      <w:r>
-        <w:t xml:space="preserve"> </w:t>
-      </w:r>
-      <w:r>
-        <w:t xml:space="preserve">more reliable indicator, and SSCHA should be reserved for martensitic and entropy-stabilised cases</w:t>
-      </w:r>
-      <w:r>
-        <w:t xml:space="preserve"> </w:t>
-      </w:r>
-      <w:r>
-        <w:t xml:space="preserve">where its ansatz is sound.</w:t>
+        <w:t xml:space="preserve">displacive regime, because MLIP-driven SSCHA at its default bubble truncation false-stabilises deep</w:t>
+      </w:r>
+      <w:r>
+        <w:t xml:space="preserve"> </w:t>
+      </w:r>
+      <w:r>
+        <w:t xml:space="preserve">double wells. The practical recommendation inverts the usual cost/accuracy intuition: for screening</w:t>
+      </w:r>
+      <w:r>
+        <w:t xml:space="preserve"> </w:t>
+      </w:r>
+      <w:r>
+        <w:t xml:space="preserve">harmonically-unstable displacive candidates, the cheap all-imaginary-mode free-energy screen is the</w:t>
+      </w:r>
+      <w:r>
+        <w:t xml:space="preserve"> </w:t>
+      </w:r>
+      <w:r>
+        <w:t xml:space="preserve">more reliable indicator, and a default-truncation SSCHA escalation should be reserved for</w:t>
+      </w:r>
+      <w:r>
+        <w:t xml:space="preserve"> </w:t>
+      </w:r>
+      <w:r>
+        <w:t xml:space="preserve">martensitic and entropy-stabilised cases, or else run with the fourth-order resummation its own</w:t>
+      </w:r>
+      <w:r>
+        <w:t xml:space="preserve"> </w:t>
+      </w:r>
+      <w:r>
+        <w:t xml:space="preserve">theory prescribes.</w:t>
       </w:r>
     </w:p>
     <w:p>
@@ -3351,7 +4096,49 @@
         <w:t xml:space="preserve"> </w:t>
       </w:r>
       <w:r>
-        <w:t xml:space="preserve">outlier in both layers and is flagged throughout rather than excluded.</w:t>
+        <w:t xml:space="preserve">outlier in both layers and is flagged throughout rather than excluded. The screen is a</w:t>
+      </w:r>
+      <w:r>
+        <w:t xml:space="preserve"> </w:t>
+      </w:r>
+      <w:r>
+        <w:t xml:space="preserve">single-mode treatment applied mode-by-mode: it captures each instability independently but not</w:t>
+      </w:r>
+      <w:r>
+        <w:t xml:space="preserve"> </w:t>
+      </w:r>
+      <w:r>
+        <w:t xml:space="preserve">their coupling, which is the most likely reason the predicted stabilisation temperature fails to</w:t>
+      </w:r>
+      <w:r>
+        <w:t xml:space="preserve"> </w:t>
+      </w:r>
+      <w:r>
+        <w:t xml:space="preserve">order PbTiO₃ correctly (§3.2). Both the screen (0.53) and SSCHA (0.30) miss a substantial fraction</w:t>
+      </w:r>
+      <w:r>
+        <w:t xml:space="preserve"> </w:t>
+      </w:r>
+      <w:r>
+        <w:t xml:space="preserve">of the ferroelectric-oxide instabilities, so the comparison identifies the better of two imperfect</w:t>
+      </w:r>
+      <w:r>
+        <w:t xml:space="preserve"> </w:t>
+      </w:r>
+      <w:r>
+        <w:t xml:space="preserve">methods rather than a solved problem. Finally, α-AgI is modelled as an ordered CsCl-type</w:t>
+      </w:r>
+      <w:r>
+        <w:t xml:space="preserve"> </w:t>
+      </w:r>
+      <w:r>
+        <w:t xml:space="preserve">approximant of the bcc iodine sublattice; that is not the disordered superionic α phase, and its</w:t>
+      </w:r>
+      <w:r>
+        <w:t xml:space="preserve"> </w:t>
+      </w:r>
+      <w:r>
+        <w:t xml:space="preserve">screen call should be read as a placeholder.</w:t>
       </w:r>
     </w:p>
     <w:bookmarkEnd w:id="41"/>
@@ -3369,37 +4156,49 @@
         <w:pStyle w:val="FirstParagraph"/>
       </w:pPr>
       <w:r>
-        <w:t xml:space="preserve">Finite-temperature dynamic stability is a blind spot of foundation MLIPs and of the harmonic</w:t>
-      </w:r>
-      <w:r>
-        <w:t xml:space="preserve"> </w:t>
-      </w:r>
-      <w:r>
-        <w:t xml:space="preserve">benchmarks used to certify them. A cheap quantum soft-mode free-energy screen recovers the</w:t>
-      </w:r>
-      <w:r>
-        <w:t xml:space="preserve"> </w:t>
-      </w:r>
-      <w:r>
-        <w:t xml:space="preserve">finite-temperature stabilisation that harmonic accuracy does not predict, and, unlike MLIP-driven</w:t>
-      </w:r>
-      <w:r>
-        <w:t xml:space="preserve"> </w:t>
-      </w:r>
-      <w:r>
-        <w:t xml:space="preserve">SSCHA, it remains reliable on the deep displacive instabilities that dominate generative-CSP</w:t>
-      </w:r>
-      <w:r>
-        <w:t xml:space="preserve"> </w:t>
-      </w:r>
-      <w:r>
-        <w:t xml:space="preserve">screening. Harmonic accuracy does not certify a model for finite-temperature use, and neither does</w:t>
-      </w:r>
-      <w:r>
-        <w:t xml:space="preserve"> </w:t>
-      </w:r>
-      <w:r>
-        <w:t xml:space="preserve">an unexamined SSCHA cross-check.</w:t>
+        <w:t xml:space="preserve">Finite-temperature dynamic stability separates foundation MLIPs that the harmonic benchmarks used</w:t>
+      </w:r>
+      <w:r>
+        <w:t xml:space="preserve"> </w:t>
+      </w:r>
+      <w:r>
+        <w:t xml:space="preserve">to certify them rank equally. A cheap quantum free-energy screen, applied to every imaginary</w:t>
+      </w:r>
+      <w:r>
+        <w:t xml:space="preserve"> </w:t>
+      </w:r>
+      <w:r>
+        <w:t xml:space="preserve">commensurate mode rather than to the softest one, recovers finite-temperature behaviour that</w:t>
+      </w:r>
+      <w:r>
+        <w:t xml:space="preserve"> </w:t>
+      </w:r>
+      <w:r>
+        <w:t xml:space="preserve">harmonic accuracy does not predict, and it outperforms MLIP-driven SSCHA at its default bubble</w:t>
+      </w:r>
+      <w:r>
+        <w:t xml:space="preserve"> </w:t>
+      </w:r>
+      <w:r>
+        <w:t xml:space="preserve">truncation on the deep displacive instabilities that dominate generative-CSP screening. Which mode</w:t>
+      </w:r>
+      <w:r>
+        <w:t xml:space="preserve"> </w:t>
+      </w:r>
+      <w:r>
+        <w:t xml:space="preserve">is examined matters as much as which method is used: the deepest instability need not be the one</w:t>
+      </w:r>
+      <w:r>
+        <w:t xml:space="preserve"> </w:t>
+      </w:r>
+      <w:r>
+        <w:t xml:space="preserve">that condenses, and in SrTiO₃ it is not. Harmonic accuracy does not certify a model for</w:t>
+      </w:r>
+      <w:r>
+        <w:t xml:space="preserve"> </w:t>
+      </w:r>
+      <w:r>
+        <w:t xml:space="preserve">finite-temperature use, and neither does an unexamined SSCHA cross-check.</w:t>
       </w:r>
     </w:p>
     <w:bookmarkEnd w:id="42"/>
@@ -3519,7 +4318,168 @@
         <w:t xml:space="preserve"> </w:t>
       </w:r>
       <w:r>
-        <w:t xml:space="preserve">print to the run log rather than to the ledger).</w:t>
+        <w:t xml:space="preserve">print to the run log rather than to the ledger). The SSCHA stability calls reported here were</w:t>
+      </w:r>
+      <w:r>
+        <w:t xml:space="preserve"> </w:t>
+      </w:r>
+      <w:r>
+        <w:t xml:space="preserve">corrected after an acoustic-mode identification defect was found in the analysis path: the three</w:t>
+      </w:r>
+      <w:r>
+        <w:t xml:space="preserve"> </w:t>
+      </w:r>
+      <w:r>
+        <w:t xml:space="preserve">translational modes were selected by lowest frequency rather than by smallest magnitude, which for</w:t>
+      </w:r>
+      <w:r>
+        <w:t xml:space="preserve"> </w:t>
+      </w:r>
+      <w:r>
+        <w:t xml:space="preserve">an unstable phase discards the soft mode itself. The correction is applied by</w:t>
+      </w:r>
+      <w:r>
+        <w:t xml:space="preserve"> </w:t>
+      </w:r>
+      <w:r>
+        <w:rPr>
+          <w:rStyle w:val="VerbatimChar"/>
+        </w:rPr>
+        <w:t xml:space="preserve">scripts/fix_sscha_acoustic.py</w:t>
+      </w:r>
+      <w:r>
+        <w:t xml:space="preserve">, is derived from the per-unit spectra stored in the ledger rather</w:t>
+      </w:r>
+      <w:r>
+        <w:t xml:space="preserve"> </w:t>
+      </w:r>
+      <w:r>
+        <w:t xml:space="preserve">than from a re-run, changes 13 of 208 SSCHA rows (all from stable to unstable) and leaves all 75</w:t>
+      </w:r>
+      <w:r>
+        <w:t xml:space="preserve"> </w:t>
+      </w:r>
+      <w:r>
+        <w:t xml:space="preserve">bcc rows unchanged; the pre-correction values are retained in the</w:t>
+      </w:r>
+      <w:r>
+        <w:t xml:space="preserve"> </w:t>
+      </w:r>
+      <w:r>
+        <w:rPr>
+          <w:rStyle w:val="VerbatimChar"/>
+        </w:rPr>
+        <w:t xml:space="preserve">*_v1</w:t>
+      </w:r>
+      <w:r>
+        <w:t xml:space="preserve"> </w:t>
+      </w:r>
+      <w:r>
+        <w:t xml:space="preserve">ledger columns and the</w:t>
+      </w:r>
+      <w:r>
+        <w:t xml:space="preserve"> </w:t>
+      </w:r>
+      <w:r>
+        <w:t xml:space="preserve">uncorrected ledger in</w:t>
+      </w:r>
+      <w:r>
+        <w:t xml:space="preserve"> </w:t>
+      </w:r>
+      <w:r>
+        <w:rPr>
+          <w:rStyle w:val="VerbatimChar"/>
+        </w:rPr>
+        <w:t xml:space="preserve">results/ledger.parquet.pre-d1-fix</w:t>
+      </w:r>
+      <w:r>
+        <w:t xml:space="preserve">.</w:t>
+      </w:r>
+    </w:p>
+    <w:p>
+      <w:pPr>
+        <w:pStyle w:val="BodyText"/>
+      </w:pPr>
+      <w:r>
+        <w:t xml:space="preserve">The finite-temperature screen results reported here are the multi-mode grid described in §2.4</w:t>
+      </w:r>
+      <w:r>
+        <w:t xml:space="preserve"> </w:t>
+      </w:r>
+      <w:r>
+        <w:t xml:space="preserve">(5 models × 20 systems × 4 temperatures = 400 units). The ledger is append-only and also retains</w:t>
+      </w:r>
+      <w:r>
+        <w:t xml:space="preserve"> </w:t>
+      </w:r>
+      <w:r>
+        <w:t xml:space="preserve">the superseded single-mode rows;</w:t>
+      </w:r>
+      <w:r>
+        <w:t xml:space="preserve"> </w:t>
+      </w:r>
+      <w:r>
+        <w:rPr>
+          <w:rStyle w:val="VerbatimChar"/>
+        </w:rPr>
+        <w:t xml:space="preserve">mlip_dynstab.analysis.canonical</w:t>
+      </w:r>
+      <w:r>
+        <w:t xml:space="preserve"> </w:t>
+      </w:r>
+      <w:r>
+        <w:t xml:space="preserve">selects the current generation,</w:t>
+      </w:r>
+      <w:r>
+        <w:t xml:space="preserve"> </w:t>
+      </w:r>
+      <w:r>
+        <w:t xml:space="preserve">and every figure and statistic in this article is computed through it. The unit hash includes the</w:t>
+      </w:r>
+      <w:r>
+        <w:t xml:space="preserve"> </w:t>
+      </w:r>
+      <w:r>
+        <w:t xml:space="preserve">method version and the mode cap, so a re-run under a changed algorithm records new rows rather than</w:t>
+      </w:r>
+      <w:r>
+        <w:t xml:space="preserve"> </w:t>
+      </w:r>
+      <w:r>
+        <w:t xml:space="preserve">silently reusing old ones. Each model was run in its own pinned environment, with</w:t>
+      </w:r>
+      <w:r>
+        <w:t xml:space="preserve"> </w:t>
+      </w:r>
+      <w:r>
+        <w:rPr>
+          <w:rStyle w:val="VerbatimChar"/>
+        </w:rPr>
+        <w:t xml:space="preserve">pip freeze</w:t>
+      </w:r>
+      <w:r>
+        <w:t xml:space="preserve"> </w:t>
+      </w:r>
+      <w:r>
+        <w:t xml:space="preserve">manifests deposited as</w:t>
+      </w:r>
+      <w:r>
+        <w:t xml:space="preserve"> </w:t>
+      </w:r>
+      <w:r>
+        <w:rPr>
+          <w:rStyle w:val="VerbatimChar"/>
+        </w:rPr>
+        <w:t xml:space="preserve">envs/lock-&lt;model&gt;-2026-08-16.txt</w:t>
+      </w:r>
+      <w:r>
+        <w:t xml:space="preserve">; the 220 cached E(Q) maps are included so</w:t>
+      </w:r>
+      <w:r>
+        <w:t xml:space="preserve"> </w:t>
+      </w:r>
+      <w:r>
+        <w:t xml:space="preserve">the temperature solves regenerate without a GPU.</w:t>
       </w:r>
     </w:p>
     <w:bookmarkEnd w:id="43"/>
@@ -4388,6 +5348,152 @@
       </w:r>
       <w:r>
         <w:t xml:space="preserve">, 2200131.</w:t>
+      </w:r>
+    </w:p>
+    <w:p>
+      <w:pPr>
+        <w:pStyle w:val="Compact"/>
+        <w:numPr>
+          <w:ilvl w:val="0"/>
+          <w:numId w:val="1003"/>
+        </w:numPr>
+      </w:pPr>
+      <w:r>
+        <w:t xml:space="preserve">J. Yang, Z. Yin, L. Ao and S. Li,</w:t>
+      </w:r>
+      <w:r>
+        <w:t xml:space="preserve"> </w:t>
+      </w:r>
+      <w:r>
+        <w:rPr>
+          <w:i/>
+          <w:iCs/>
+        </w:rPr>
+        <w:t xml:space="preserve">Phys. Chem. Chem. Phys.</w:t>
+      </w:r>
+      <w:r>
+        <w:t xml:space="preserve">, 2026,</w:t>
+      </w:r>
+      <w:r>
+        <w:t xml:space="preserve"> </w:t>
+      </w:r>
+      <w:r>
+        <w:rPr>
+          <w:b/>
+          <w:bCs/>
+        </w:rPr>
+        <w:t xml:space="preserve">28</w:t>
+      </w:r>
+      <w:r>
+        <w:t xml:space="preserve">, 4459–4469.</w:t>
+      </w:r>
+    </w:p>
+    <w:p>
+      <w:pPr>
+        <w:pStyle w:val="Compact"/>
+        <w:numPr>
+          <w:ilvl w:val="0"/>
+          <w:numId w:val="1003"/>
+        </w:numPr>
+      </w:pPr>
+      <w:r>
+        <w:rPr>
+          <w:i/>
+          <w:iCs/>
+        </w:rPr>
+        <w:t xml:space="preserve">Are Foundational Atomistic Models Reliable for Finite-Temperature Molecular Dynamics?</w:t>
+      </w:r>
+      <w:r>
+        <w:t xml:space="preserve">,</w:t>
+      </w:r>
+      <w:r>
+        <w:t xml:space="preserve"> </w:t>
+      </w:r>
+      <w:r>
+        <w:rPr>
+          <w:i/>
+          <w:iCs/>
+        </w:rPr>
+        <w:t xml:space="preserve">J. Phys. Chem. C</w:t>
+      </w:r>
+      <w:r>
+        <w:t xml:space="preserve">, 2025, DOI: 10.1021/acs.jpcc.5c07541.</w:t>
+      </w:r>
+    </w:p>
+    <w:p>
+      <w:pPr>
+        <w:pStyle w:val="Compact"/>
+        <w:numPr>
+          <w:ilvl w:val="0"/>
+          <w:numId w:val="1003"/>
+        </w:numPr>
+      </w:pPr>
+      <w:r>
+        <w:t xml:space="preserve">R. Bianco, I. Errea, L. Paulatto, M. Calandra and F. Mauri,</w:t>
+      </w:r>
+      <w:r>
+        <w:t xml:space="preserve"> </w:t>
+      </w:r>
+      <w:r>
+        <w:rPr>
+          <w:i/>
+          <w:iCs/>
+        </w:rPr>
+        <w:t xml:space="preserve">Phys. Rev. B</w:t>
+      </w:r>
+      <w:r>
+        <w:t xml:space="preserve">, 2017,</w:t>
+      </w:r>
+      <w:r>
+        <w:t xml:space="preserve"> </w:t>
+      </w:r>
+      <w:r>
+        <w:rPr>
+          <w:b/>
+          <w:bCs/>
+        </w:rPr>
+        <w:t xml:space="preserve">96</w:t>
+      </w:r>
+      <w:r>
+        <w:t xml:space="preserve">, 014111.</w:t>
+      </w:r>
+    </w:p>
+    <w:p>
+      <w:pPr>
+        <w:pStyle w:val="Compact"/>
+        <w:numPr>
+          <w:ilvl w:val="0"/>
+          <w:numId w:val="1003"/>
+        </w:numPr>
+      </w:pPr>
+      <w:r>
+        <w:t xml:space="preserve">L. Monacelli,</w:t>
+      </w:r>
+      <w:r>
+        <w:t xml:space="preserve"> </w:t>
+      </w:r>
+      <w:r>
+        <w:rPr>
+          <w:i/>
+          <w:iCs/>
+        </w:rPr>
+        <w:t xml:space="preserve">Phys. Rev. B</w:t>
+      </w:r>
+      <w:r>
+        <w:t xml:space="preserve">, 2025,</w:t>
+      </w:r>
+      <w:r>
+        <w:t xml:space="preserve"> </w:t>
+      </w:r>
+      <w:r>
+        <w:rPr>
+          <w:b/>
+          <w:bCs/>
+        </w:rPr>
+        <w:t xml:space="preserve">112</w:t>
+      </w:r>
+      <w:r>
+        <w:t xml:space="preserve">, 014109.</w:t>
       </w:r>
     </w:p>
     <w:bookmarkEnd w:id="47"/>

</xml_diff>

<commit_message>
final propagation: supplementary S2.2 mechanism corrected to the truncation account, S2.3 rebuilt from the v3 grid (7 failed units, 8 blow-ups spanning float32+float64), fluorite curvature-vs-condensation noted, verify_claims rewritten to 27 assertions against the measured generations (all pass), run logs archived, all DOCX rebuilt
</commit_message>
<xml_diff>
--- a/paper/manuscript.docx
+++ b/paper/manuscript.docx
@@ -152,13 +152,13 @@
         <w:t xml:space="preserve"> </w:t>
       </w:r>
       <w:r>
-        <w:t xml:space="preserve">whereas MACE-MP-0, CHGNet and ORB-v2 soften the bcc Zr/Hf instabilities toward zero and carry a 15%</w:t>
-      </w:r>
-      <w:r>
-        <w:t xml:space="preserve"> </w:t>
-      </w:r>
-      <w:r>
-        <w:t xml:space="preserve">false-stable rate. (ii) Harmonic accuracy does not predict finite-temperature accuracy in either</w:t>
+        <w:t xml:space="preserve">whereas MACE-MP-0 and CHGNet soften the bcc Zr/Hf instabilities to zero (15% false-stable rate)</w:t>
+      </w:r>
+      <w:r>
+        <w:t xml:space="preserve"> </w:t>
+      </w:r>
+      <w:r>
+        <w:t xml:space="preserve">and ORB-v2 misses the SrTiO₃ soft mode (8%). (ii) Harmonic accuracy does not predict finite-temperature accuracy in either</w:t>
       </w:r>
       <w:r>
         <w:t xml:space="preserve"> </w:t>
@@ -1195,7 +1195,13 @@
         <w:pStyle w:val="BodyText"/>
       </w:pPr>
       <w:r>
-        <w:t xml:space="preserve">The stability criterion is a property of the</w:t>
+        <w:t xml:space="preserve">Variational free energy per mode. Each frozen mode defines a one-dimensional subsystem with</w:t>
+      </w:r>
+      <w:r>
+        <w:t xml:space="preserve"> </w:t>
+      </w:r>
+      <w:r>
+        <w:t xml:space="preserve">coordinate Q along the unit displacement pattern</w:t>
       </w:r>
       <w:r>
         <w:t xml:space="preserve"> </w:t>
@@ -1205,44 +1211,762 @@
           <w:b/>
           <w:bCs/>
         </w:rPr>
-        <w:t xml:space="preserve">phase</w:t>
-      </w:r>
-      <w:r>
-        <w:t xml:space="preserve">, not of one mode: the high-symmetry structure</w:t>
-      </w:r>
-      <w:r>
-        <w:t xml:space="preserve"> </w:t>
-      </w:r>
-      <w:r>
-        <w:t xml:space="preserve">is dynamically unstable at T if</w:t>
-      </w:r>
-      <w:r>
-        <w:t xml:space="preserve"> </w:t>
+        <w:t xml:space="preserve">u</w:t>
+      </w:r>
+      <w:r>
+        <w:t xml:space="preserve">, effective mass</w:t>
+      </w:r>
+      <w:r>
+        <w:t xml:space="preserve"> </w:t>
+      </w:r>
+      <w:r>
+        <w:t xml:space="preserve">M = Σᵢ mᵢ|</w:t>
       </w:r>
       <w:r>
         <w:rPr>
           <w:b/>
           <w:bCs/>
         </w:rPr>
+        <w:t xml:space="preserve">u</w:t>
+      </w:r>
+      <w:r>
+        <w:t xml:space="preserve">ᵢ|², and potential V(Q) = aQ² + bQ⁴ + cQ⁶ from the fit above; the Hamiltonian is</w:t>
+      </w:r>
+      <w:r>
+        <w:t xml:space="preserve"> </w:t>
+      </w:r>
+      <w:r>
+        <w:t xml:space="preserve">H = P²/2M + V(Q). We treat it with the self-consistent harmonic approximation in its original</w:t>
+      </w:r>
+      <w:r>
+        <w:t xml:space="preserve"> </w:t>
+      </w:r>
+      <w:r>
+        <w:t xml:space="preserve">single-mode form,</w:t>
+      </w:r>
+      <w:r>
+        <w:rPr>
+          <w:vertAlign w:val="superscript"/>
+        </w:rPr>
+        <w:t xml:space="preserve">23,24</w:t>
+      </w:r>
+      <w:r>
+        <w:t xml:space="preserve"> </w:t>
+      </w:r>
+      <w:r>
+        <w:t xml:space="preserve">built on the Peierls variational bound</w:t>
+      </w:r>
+      <w:r>
+        <w:rPr>
+          <w:vertAlign w:val="superscript"/>
+        </w:rPr>
+        <w:t xml:space="preserve">25,26</w:t>
+      </w:r>
+    </w:p>
+    <w:p>
+      <w:pPr>
+        <w:pStyle w:val="BodyText"/>
+      </w:pPr>
+      <m:oMathPara>
+        <m:oMathParaPr>
+          <m:jc m:val="center"/>
+        </m:oMathParaPr>
+        <m:oMath>
+          <m:r>
+            <m:t>F</m:t>
+          </m:r>
+          <m:r>
+            <m:rPr>
+              <m:sty m:val="p"/>
+            </m:rPr>
+            <m:t>≤</m:t>
+          </m:r>
+          <m:r>
+            <m:rPr>
+              <m:scr m:val="script"/>
+              <m:sty m:val="p"/>
+            </m:rPr>
+            <m:t>F</m:t>
+          </m:r>
+          <m:r>
+            <m:rPr>
+              <m:sty m:val="p"/>
+            </m:rPr>
+            <m:t>(</m:t>
+          </m:r>
+          <m:sSub>
+            <m:e>
+              <m:r>
+                <m:t>Q</m:t>
+              </m:r>
+            </m:e>
+            <m:sub>
+              <m:r>
+                <m:t>0</m:t>
+              </m:r>
+            </m:sub>
+          </m:sSub>
+          <m:r>
+            <m:rPr>
+              <m:sty m:val="p"/>
+            </m:rPr>
+            <m:t>,</m:t>
+          </m:r>
+          <m:r>
+            <m:rPr>
+              <m:sty m:val="p"/>
+            </m:rPr>
+            <m:t>Ω</m:t>
+          </m:r>
+          <m:r>
+            <m:rPr>
+              <m:sty m:val="p"/>
+            </m:rPr>
+            <m:t>;</m:t>
+          </m:r>
+          <m:r>
+            <m:t>T</m:t>
+          </m:r>
+          <m:r>
+            <m:rPr>
+              <m:sty m:val="p"/>
+            </m:rPr>
+            <m:t>)</m:t>
+          </m:r>
+          <m:r>
+            <m:rPr>
+              <m:sty m:val="p"/>
+            </m:rPr>
+            <m:t>=</m:t>
+          </m:r>
+          <m:sSub>
+            <m:e>
+              <m:r>
+                <m:t>F</m:t>
+              </m:r>
+            </m:e>
+            <m:sub>
+              <m:r>
+                <m:t>0</m:t>
+              </m:r>
+            </m:sub>
+          </m:sSub>
+          <m:r>
+            <m:rPr>
+              <m:sty m:val="p"/>
+            </m:rPr>
+            <m:t>(</m:t>
+          </m:r>
+          <m:r>
+            <m:rPr>
+              <m:sty m:val="p"/>
+            </m:rPr>
+            <m:t>Ω</m:t>
+          </m:r>
+          <m:r>
+            <m:rPr>
+              <m:sty m:val="p"/>
+            </m:rPr>
+            <m:t>,</m:t>
+          </m:r>
+          <m:r>
+            <m:t>T</m:t>
+          </m:r>
+          <m:r>
+            <m:rPr>
+              <m:sty m:val="p"/>
+            </m:rPr>
+            <m:t>)</m:t>
+          </m:r>
+          <m:r>
+            <m:rPr>
+              <m:sty m:val="p"/>
+            </m:rPr>
+            <m:t>+</m:t>
+          </m:r>
+          <m:r>
+            <m:rPr>
+              <m:sty m:val="p"/>
+            </m:rPr>
+            <m:t>⟨</m:t>
+          </m:r>
+          <m:r>
+            <m:t>V</m:t>
+          </m:r>
+          <m:sSub>
+            <m:e>
+              <m:r>
+                <m:rPr>
+                  <m:sty m:val="p"/>
+                </m:rPr>
+                <m:t>⟩</m:t>
+              </m:r>
+            </m:e>
+            <m:sub>
+              <m:sSub>
+                <m:e>
+                  <m:r>
+                    <m:t>Q</m:t>
+                  </m:r>
+                </m:e>
+                <m:sub>
+                  <m:r>
+                    <m:t>0</m:t>
+                  </m:r>
+                </m:sub>
+              </m:sSub>
+              <m:r>
+                <m:rPr>
+                  <m:sty m:val="p"/>
+                </m:rPr>
+                <m:t>,</m:t>
+              </m:r>
+              <m:r>
+                <m:t>σ</m:t>
+              </m:r>
+            </m:sub>
+          </m:sSub>
+          <m:r>
+            <m:rPr>
+              <m:sty m:val="p"/>
+            </m:rPr>
+            <m:t>−</m:t>
+          </m:r>
+          <m:f>
+            <m:fPr>
+              <m:type m:val="lin"/>
+            </m:fPr>
+            <m:num>
+              <m:r>
+                <m:t>1</m:t>
+              </m:r>
+            </m:num>
+            <m:den>
+              <m:r>
+                <m:t>2</m:t>
+              </m:r>
+            </m:den>
+          </m:f>
+          <m:r>
+            <m:t>M</m:t>
+          </m:r>
+          <m:sSup>
+            <m:e>
+              <m:r>
+                <m:rPr>
+                  <m:sty m:val="p"/>
+                </m:rPr>
+                <m:t>Ω</m:t>
+              </m:r>
+            </m:e>
+            <m:sup>
+              <m:r>
+                <m:t>2</m:t>
+              </m:r>
+            </m:sup>
+          </m:sSup>
+          <m:sSup>
+            <m:e>
+              <m:r>
+                <m:t>σ</m:t>
+              </m:r>
+            </m:e>
+            <m:sup>
+              <m:r>
+                <m:t>2</m:t>
+              </m:r>
+            </m:sup>
+          </m:sSup>
+          <m:r>
+            <m:rPr>
+              <m:sty m:val="p"/>
+            </m:rPr>
+            <m:t>,</m:t>
+          </m:r>
+        </m:oMath>
+      </m:oMathPara>
+    </w:p>
+    <w:p>
+      <w:pPr>
+        <w:pStyle w:val="FirstParagraph"/>
+      </w:pPr>
+      <w:r>
+        <w:t xml:space="preserve">where the trial state is the thermal density of a harmonic oscillator of frequency Ω displaced to</w:t>
+      </w:r>
+      <w:r>
+        <w:t xml:space="preserve"> </w:t>
+      </w:r>
+      <w:r>
+        <w:t xml:space="preserve">centroid Q₀, F₀(Ω,T) = k_BT ln[2 sinh(ħΩ/2k_BT)] is its free energy, and the last term removes the</w:t>
+      </w:r>
+      <w:r>
+        <w:t xml:space="preserve"> </w:t>
+      </w:r>
+      <w:r>
+        <w:t xml:space="preserve">trial potential counted in F₀. The trial density is a Gaussian of mean Q₀ and quantum width</w:t>
+      </w:r>
+    </w:p>
+    <w:p>
+      <w:pPr>
+        <w:pStyle w:val="BodyText"/>
+      </w:pPr>
+      <m:oMathPara>
+        <m:oMathParaPr>
+          <m:jc m:val="center"/>
+        </m:oMathParaPr>
+        <m:oMath>
+          <m:sSup>
+            <m:e>
+              <m:r>
+                <m:t>σ</m:t>
+              </m:r>
+            </m:e>
+            <m:sup>
+              <m:r>
+                <m:t>2</m:t>
+              </m:r>
+            </m:sup>
+          </m:sSup>
+          <m:r>
+            <m:rPr>
+              <m:sty m:val="p"/>
+            </m:rPr>
+            <m:t>=</m:t>
+          </m:r>
+          <m:f>
+            <m:fPr>
+              <m:type m:val="bar"/>
+            </m:fPr>
+            <m:num>
+              <m:r>
+                <m:rPr>
+                  <m:sty m:val="p"/>
+                </m:rPr>
+                <m:t>ℏ</m:t>
+              </m:r>
+            </m:num>
+            <m:den>
+              <m:r>
+                <m:t>2</m:t>
+              </m:r>
+              <m:r>
+                <m:t>M</m:t>
+              </m:r>
+              <m:r>
+                <m:rPr>
+                  <m:sty m:val="p"/>
+                </m:rPr>
+                <m:t>Ω</m:t>
+              </m:r>
+            </m:den>
+          </m:f>
+          <m:r>
+            <m:rPr>
+              <m:sty m:val="p"/>
+            </m:rPr>
+            <m:t>coth</m:t>
+          </m:r>
+          <m:r>
+            <m:t>​</m:t>
+          </m:r>
+          <m:d>
+            <m:dPr>
+              <m:begChr m:val="("/>
+              <m:sepChr m:val=""/>
+              <m:endChr m:val=")"/>
+              <m:grow/>
+            </m:dPr>
+            <m:e>
+              <m:f>
+                <m:fPr>
+                  <m:type m:val="bar"/>
+                </m:fPr>
+                <m:num>
+                  <m:r>
+                    <m:rPr>
+                      <m:sty m:val="p"/>
+                    </m:rPr>
+                    <m:t>ℏ</m:t>
+                  </m:r>
+                  <m:r>
+                    <m:rPr>
+                      <m:sty m:val="p"/>
+                    </m:rPr>
+                    <m:t>Ω</m:t>
+                  </m:r>
+                </m:num>
+                <m:den>
+                  <m:r>
+                    <m:t>2</m:t>
+                  </m:r>
+                  <m:sSub>
+                    <m:e>
+                      <m:r>
+                        <m:t>k</m:t>
+                      </m:r>
+                    </m:e>
+                    <m:sub>
+                      <m:r>
+                        <m:t>B</m:t>
+                      </m:r>
+                    </m:sub>
+                  </m:sSub>
+                  <m:r>
+                    <m:t>T</m:t>
+                  </m:r>
+                </m:den>
+              </m:f>
+            </m:e>
+          </m:d>
+          <m:r>
+            <m:rPr>
+              <m:sty m:val="p"/>
+            </m:rPr>
+            <m:t>,</m:t>
+          </m:r>
+        </m:oMath>
+      </m:oMathPara>
+    </w:p>
+    <w:p>
+      <w:pPr>
+        <w:pStyle w:val="FirstParagraph"/>
+      </w:pPr>
+      <w:r>
+        <w:t xml:space="preserve">which carries the nuclear quantum effects: at high T it recovers the classical k_BT/MΩ², and at</w:t>
+      </w:r>
+      <w:r>
+        <w:t xml:space="preserve"> </w:t>
+      </w:r>
+      <w:r>
+        <w:t xml:space="preserve">T → 0 it retains the zero-point width that suppresses condensation in shallow wells (quantum</w:t>
+      </w:r>
+      <w:r>
+        <w:t xml:space="preserve"> </w:t>
+      </w:r>
+      <w:r>
+        <w:t xml:space="preserve">paraelectricity). The Gaussian expectation of the even sextic follows from the moments</w:t>
+      </w:r>
+      <w:r>
+        <w:t xml:space="preserve"> </w:t>
+      </w:r>
+      <w:r>
+        <w:t xml:space="preserve">⟨Q²⟩ = Q₀² + σ², ⟨Q⁴⟩ = Q₀⁴ + 6Q₀²σ² + 3σ⁴, ⟨Q⁶⟩ = Q₀⁶ + 15Q₀⁴σ² + 45Q₀²σ⁴ + 15σ⁶. Stationarity</w:t>
+      </w:r>
+      <w:r>
+        <w:t xml:space="preserve"> </w:t>
+      </w:r>
+      <w:r>
+        <w:t xml:space="preserve">of 𝓕 with respect to Ω at fixed Q₀ gives the self-consistency condition</w:t>
+      </w:r>
+    </w:p>
+    <w:p>
+      <w:pPr>
+        <w:pStyle w:val="BodyText"/>
+      </w:pPr>
+      <m:oMathPara>
+        <m:oMathParaPr>
+          <m:jc m:val="center"/>
+        </m:oMathParaPr>
+        <m:oMath>
+          <m:r>
+            <m:t>M</m:t>
+          </m:r>
+          <m:sSup>
+            <m:e>
+              <m:r>
+                <m:rPr>
+                  <m:sty m:val="p"/>
+                </m:rPr>
+                <m:t>Ω</m:t>
+              </m:r>
+            </m:e>
+            <m:sup>
+              <m:r>
+                <m:t>2</m:t>
+              </m:r>
+            </m:sup>
+          </m:sSup>
+          <m:r>
+            <m:rPr>
+              <m:sty m:val="p"/>
+            </m:rPr>
+            <m:t>=</m:t>
+          </m:r>
+          <m:r>
+            <m:rPr>
+              <m:sty m:val="p"/>
+            </m:rPr>
+            <m:t>⟨</m:t>
+          </m:r>
+          <m:sSup>
+            <m:e>
+              <m:r>
+                <m:t>V</m:t>
+              </m:r>
+            </m:e>
+            <m:sup>
+              <m:r>
+                <m:rPr>
+                  <m:sty m:val="p"/>
+                </m:rPr>
+                <m:t>″</m:t>
+              </m:r>
+            </m:sup>
+          </m:sSup>
+          <m:sSub>
+            <m:e>
+              <m:r>
+                <m:rPr>
+                  <m:sty m:val="p"/>
+                </m:rPr>
+                <m:t>⟩</m:t>
+              </m:r>
+            </m:e>
+            <m:sub>
+              <m:sSub>
+                <m:e>
+                  <m:r>
+                    <m:t>Q</m:t>
+                  </m:r>
+                </m:e>
+                <m:sub>
+                  <m:r>
+                    <m:t>0</m:t>
+                  </m:r>
+                </m:sub>
+              </m:sSub>
+              <m:r>
+                <m:rPr>
+                  <m:sty m:val="p"/>
+                </m:rPr>
+                <m:t>,</m:t>
+              </m:r>
+              <m:r>
+                <m:t>σ</m:t>
+              </m:r>
+            </m:sub>
+          </m:sSub>
+          <m:r>
+            <m:rPr>
+              <m:sty m:val="p"/>
+            </m:rPr>
+            <m:t>=</m:t>
+          </m:r>
+          <m:r>
+            <m:t>2</m:t>
+          </m:r>
+          <m:r>
+            <m:t>a</m:t>
+          </m:r>
+          <m:r>
+            <m:rPr>
+              <m:sty m:val="p"/>
+            </m:rPr>
+            <m:t>+</m:t>
+          </m:r>
+          <m:r>
+            <m:t>12</m:t>
+          </m:r>
+          <m:r>
+            <m:t>b</m:t>
+          </m:r>
+          <m:r>
+            <m:t> </m:t>
+          </m:r>
+          <m:r>
+            <m:rPr>
+              <m:sty m:val="p"/>
+            </m:rPr>
+            <m:t>⟨</m:t>
+          </m:r>
+          <m:sSup>
+            <m:e>
+              <m:r>
+                <m:t>Q</m:t>
+              </m:r>
+            </m:e>
+            <m:sup>
+              <m:r>
+                <m:t>2</m:t>
+              </m:r>
+            </m:sup>
+          </m:sSup>
+          <m:r>
+            <m:rPr>
+              <m:sty m:val="p"/>
+            </m:rPr>
+            <m:t>⟩</m:t>
+          </m:r>
+          <m:r>
+            <m:rPr>
+              <m:sty m:val="p"/>
+            </m:rPr>
+            <m:t>+</m:t>
+          </m:r>
+          <m:r>
+            <m:t>30</m:t>
+          </m:r>
+          <m:r>
+            <m:t>c</m:t>
+          </m:r>
+          <m:r>
+            <m:t> </m:t>
+          </m:r>
+          <m:r>
+            <m:rPr>
+              <m:sty m:val="p"/>
+            </m:rPr>
+            <m:t>⟨</m:t>
+          </m:r>
+          <m:sSup>
+            <m:e>
+              <m:r>
+                <m:t>Q</m:t>
+              </m:r>
+            </m:e>
+            <m:sup>
+              <m:r>
+                <m:t>4</m:t>
+              </m:r>
+            </m:sup>
+          </m:sSup>
+          <m:r>
+            <m:rPr>
+              <m:sty m:val="p"/>
+            </m:rPr>
+            <m:t>⟩</m:t>
+          </m:r>
+          <m:r>
+            <m:rPr>
+              <m:sty m:val="p"/>
+            </m:rPr>
+            <m:t>,</m:t>
+          </m:r>
+        </m:oMath>
+      </m:oMathPara>
+    </w:p>
+    <w:p>
+      <w:pPr>
+        <w:pStyle w:val="FirstParagraph"/>
+      </w:pPr>
+      <w:r>
+        <w:t xml:space="preserve">which we solve by bracketed root finding on σ² (avoiding the runaway large-σ fixed point a damped</w:t>
+      </w:r>
+      <w:r>
+        <w:t xml:space="preserve"> </w:t>
+      </w:r>
+      <w:r>
+        <w:t xml:space="preserve">iteration can reach), and 𝓕 is then minimised over the centroid on a Q₀ grid.</w:t>
+      </w:r>
+    </w:p>
+    <w:p>
+      <w:pPr>
+        <w:pStyle w:val="BodyText"/>
+      </w:pPr>
+      <w:r>
+        <w:t xml:space="preserve">Criterion and observable. Two distinct quantities come out of 𝓕, and we keep them separate. The</w:t>
+      </w:r>
+      <w:r>
+        <w:t xml:space="preserve"> </w:t>
+      </w:r>
+      <w:r>
+        <w:rPr>
+          <w:b/>
+          <w:bCs/>
+        </w:rPr>
+        <w:t xml:space="preserve">stability call</w:t>
+      </w:r>
+      <w:r>
+        <w:t xml:space="preserve"> </w:t>
+      </w:r>
+      <w:r>
+        <w:t xml:space="preserve">is the variational one: the mode has condensed at T if the global minimum of</w:t>
+      </w:r>
+      <w:r>
+        <w:t xml:space="preserve"> </w:t>
+      </w:r>
+      <w:r>
+        <w:t xml:space="preserve">𝓕(Q₀; T) sits at Q₀ &gt; 0 — by the bound above, the displaced state then has the lower free energy.</w:t>
+      </w:r>
+      <w:r>
+        <w:t xml:space="preserve"> </w:t>
+      </w:r>
+      <w:r>
+        <w:t xml:space="preserve">The high-symmetry structure is dynamically unstable at T if</w:t>
+      </w:r>
+      <w:r>
+        <w:t xml:space="preserve"> </w:t>
+      </w:r>
+      <w:r>
+        <w:rPr>
+          <w:b/>
+          <w:bCs/>
+        </w:rPr>
         <w:t xml:space="preserve">any</w:t>
       </w:r>
       <w:r>
         <w:t xml:space="preserve"> </w:t>
       </w:r>
       <w:r>
-        <w:t xml:space="preserve">screened mode condenses (Q₀ &gt; 0), and stable only when none</w:t>
-      </w:r>
-      <w:r>
-        <w:t xml:space="preserve"> </w:t>
-      </w:r>
-      <w:r>
-        <w:t xml:space="preserve">does. Screening a single mode — even the globally softest — conflates physically distinct</w:t>
-      </w:r>
-      <w:r>
-        <w:t xml:space="preserve"> </w:t>
-      </w:r>
-      <w:r>
-        <w:t xml:space="preserve">instabilities. Cubic SrTiO₃ is the decisive case: its Γ ferroelectric mode is</w:t>
+        <w:t xml:space="preserve">screened mode condenses, and</w:t>
+      </w:r>
+      <w:r>
+        <w:t xml:space="preserve"> </w:t>
+      </w:r>
+      <w:r>
+        <w:t xml:space="preserve">stable only when none does; dynamical stability is a property of the phase, not of one mode.</w:t>
+      </w:r>
+      <w:r>
+        <w:t xml:space="preserve"> </w:t>
+      </w:r>
+      <w:r>
+        <w:t xml:space="preserve">The</w:t>
+      </w:r>
+      <w:r>
+        <w:t xml:space="preserve"> </w:t>
+      </w:r>
+      <w:r>
+        <w:rPr>
+          <w:b/>
+          <w:bCs/>
+        </w:rPr>
+        <w:t xml:space="preserve">reported frequency</w:t>
+      </w:r>
+      <w:r>
+        <w:t xml:space="preserve"> </w:t>
+      </w:r>
+      <w:r>
+        <w:t xml:space="preserve">is the curvature of the free energy at the symmetric point,</w:t>
+      </w:r>
+      <w:r>
+        <w:t xml:space="preserve"> </w:t>
+      </w:r>
+      <w:r>
+        <w:t xml:space="preserve">ω_eff = sign(𝓕″(0)) · [|𝓕″(0)|/M]^½, the single-mode analogue of the SSCHA free-energy Hessian</w:t>
+      </w:r>
+      <w:r>
+        <w:rPr>
+          <w:vertAlign w:val="superscript"/>
+        </w:rPr>
+        <w:t xml:space="preserve">21</w:t>
+      </w:r>
+      <w:r>
+        <w:t xml:space="preserve"> </w:t>
+      </w:r>
+      <w:r>
+        <w:t xml:space="preserve">and a genuine signed observable (𝓕 is even in Q₀, so the curvature is evaluated by a symmetric</w:t>
+      </w:r>
+      <w:r>
+        <w:t xml:space="preserve"> </w:t>
+      </w:r>
+      <w:r>
+        <w:t xml:space="preserve">finite difference). The two can disagree, and the disagreement is physics rather than noise: for a</w:t>
+      </w:r>
+      <w:r>
+        <w:t xml:space="preserve"> </w:t>
+      </w:r>
+      <w:r>
+        <w:t xml:space="preserve">deep double well the variational transition is first-order-like, so 𝓕(0) remains a</w:t>
       </w:r>
       <w:r>
         <w:t xml:space="preserve"> </w:t>
@@ -1252,55 +1976,121 @@
           <w:i/>
           <w:iCs/>
         </w:rPr>
-        <w:t xml:space="preserve">deeper</w:t>
-      </w:r>
-      <w:r>
-        <w:t xml:space="preserve"> </w:t>
-      </w:r>
-      <w:r>
-        <w:t xml:space="preserve">than the</w:t>
-      </w:r>
-      <w:r>
-        <w:t xml:space="preserve"> </w:t>
-      </w:r>
-      <w:r>
-        <w:t xml:space="preserve">R-point antiferrodistortive tilt, yet the Γ mode is quantum-suppressed and never condenses while the</w:t>
-      </w:r>
-      <w:r>
-        <w:t xml:space="preserve"> </w:t>
-      </w:r>
-      <w:r>
-        <w:t xml:space="preserve">R tilt is what drives the 105 K transition, so a softest-mode screen inspects the wrong mode and</w:t>
-      </w:r>
-      <w:r>
-        <w:t xml:space="preserve"> </w:t>
-      </w:r>
-      <w:r>
-        <w:t xml:space="preserve">calls the cubic phase stable. The E(Q) maps are temperature-independent and cached, so each</w:t>
-      </w:r>
-      <w:r>
-        <w:t xml:space="preserve"> </w:t>
-      </w:r>
-      <w:r>
-        <w:t xml:space="preserve">temperature is a sub-second CPU solve over all modes. A cap of 24 modes per unit bounds the cost; it</w:t>
-      </w:r>
-      <w:r>
-        <w:t xml:space="preserve"> </w:t>
-      </w:r>
-      <w:r>
-        <w:t xml:space="preserve">binds on 20 of the 400 units, every one of which is already called unstable with at least three</w:t>
-      </w:r>
-      <w:r>
-        <w:t xml:space="preserve"> </w:t>
-      </w:r>
-      <w:r>
-        <w:t xml:space="preserve">condensing modes, so it cannot affect any call (a cap can only ever create a false-</w:t>
+        <w:t xml:space="preserve">local</w:t>
+      </w:r>
+      <w:r>
+        <w:t xml:space="preserve"> </w:t>
+      </w:r>
+      <w:r>
+        <w:t xml:space="preserve">minimum</w:t>
+      </w:r>
+      <w:r>
+        <w:t xml:space="preserve"> </w:t>
+      </w:r>
+      <w:r>
+        <w:t xml:space="preserve">(positive curvature) while a displaced minimum drops below it. A curvature criterion is blind to</w:t>
+      </w:r>
+      <w:r>
+        <w:t xml:space="preserve"> </w:t>
+      </w:r>
+      <w:r>
+        <w:t xml:space="preserve">that condensation by construction — the same blindness that afflicts any free-energy Hessian</w:t>
+      </w:r>
+      <w:r>
+        <w:t xml:space="preserve"> </w:t>
+      </w:r>
+      <w:r>
+        <w:t xml:space="preserve">evaluated at a fixed high-symmetry reference — and we record every such mode (</w:t>
+      </w:r>
+      <w:r>
+        <w:rPr>
+          <w:rStyle w:val="VerbatimChar"/>
+        </w:rPr>
+        <w:t xml:space="preserve">n_curv_blind</w:t>
+      </w:r>
+      <w:r>
+        <w:t xml:space="preserve"> </w:t>
+      </w:r>
+      <w:r>
+        <w:t xml:space="preserve">in</w:t>
+      </w:r>
+      <w:r>
+        <w:t xml:space="preserve"> </w:t>
+      </w:r>
+      <w:r>
+        <w:t xml:space="preserve">the ledger) rather than folding it into either number.</w:t>
+      </w:r>
+    </w:p>
+    <w:p>
+      <w:pPr>
+        <w:pStyle w:val="BodyText"/>
+      </w:pPr>
+      <w:r>
+        <w:t xml:space="preserve">Screening only a single mode — even the globally softest — conflates physically distinct</w:t>
+      </w:r>
+      <w:r>
+        <w:t xml:space="preserve"> </w:t>
+      </w:r>
+      <w:r>
+        <w:t xml:space="preserve">instabilities. Cubic SrTiO₃ is the decisive case: its Γ ferroelectric mode is</w:t>
+      </w:r>
+      <w:r>
+        <w:t xml:space="preserve"> </w:t>
       </w:r>
       <w:r>
         <w:rPr>
           <w:i/>
           <w:iCs/>
         </w:rPr>
+        <w:t xml:space="preserve">deeper</w:t>
+      </w:r>
+      <w:r>
+        <w:t xml:space="preserve"> </w:t>
+      </w:r>
+      <w:r>
+        <w:t xml:space="preserve">than the</w:t>
+      </w:r>
+      <w:r>
+        <w:t xml:space="preserve"> </w:t>
+      </w:r>
+      <w:r>
+        <w:t xml:space="preserve">R-point antiferrodistortive tilt, yet the Γ mode is quantum-suppressed and never condenses while</w:t>
+      </w:r>
+      <w:r>
+        <w:t xml:space="preserve"> </w:t>
+      </w:r>
+      <w:r>
+        <w:t xml:space="preserve">the R tilt is what drives the 105 K transition, so a softest-mode screen inspects the wrong mode</w:t>
+      </w:r>
+      <w:r>
+        <w:t xml:space="preserve"> </w:t>
+      </w:r>
+      <w:r>
+        <w:t xml:space="preserve">and calls the cubic phase stable. The E(Q) maps are temperature-independent and cached, so each</w:t>
+      </w:r>
+      <w:r>
+        <w:t xml:space="preserve"> </w:t>
+      </w:r>
+      <w:r>
+        <w:t xml:space="preserve">temperature is a sub-second CPU solve over all modes. A cap of 24 modes per unit bounds the cost;</w:t>
+      </w:r>
+      <w:r>
+        <w:t xml:space="preserve"> </w:t>
+      </w:r>
+      <w:r>
+        <w:t xml:space="preserve">it binds on 20 of the 400 units, every one of which is already called unstable with at least three</w:t>
+      </w:r>
+      <w:r>
+        <w:t xml:space="preserve"> </w:t>
+      </w:r>
+      <w:r>
+        <w:t xml:space="preserve">condensing modes, so it cannot affect any call (a cap can only ever create a false-</w:t>
+      </w:r>
+      <w:r>
+        <w:rPr>
+          <w:i/>
+          <w:iCs/>
+        </w:rPr>
         <w:t xml:space="preserve">stable</w:t>
       </w:r>
       <w:r>
@@ -1342,22 +2132,506 @@
         <w:pStyle w:val="BodyText"/>
       </w:pPr>
       <w:r>
-        <w:t xml:space="preserve">Validation gate. Cubic SrTiO₃ resolves three distinct imaginary commensurate modes, and the screen</w:t>
-      </w:r>
-      <w:r>
-        <w:t xml:space="preserve"> </w:t>
-      </w:r>
-      <w:r>
-        <w:t xml:space="preserve">reports which of them condenses. At 100 K the Γ ferroelectric mode does</w:t>
-      </w:r>
-      <w:r>
-        <w:t xml:space="preserve"> </w:t>
-      </w:r>
+        <w:t xml:space="preserve">Approximations, declared. Table 1 states what the screen neglects, the expected direction of the</w:t>
+      </w:r>
+      <w:r>
+        <w:t xml:space="preserve"> </w:t>
+      </w:r>
+      <w:r>
+        <w:t xml:space="preserve">bias, and where the consequence is visible in our own data.</w:t>
+      </w:r>
+    </w:p>
+    <w:p>
+      <w:pPr>
+        <w:pStyle w:val="BodyText"/>
+      </w:pPr>
       <w:r>
         <w:rPr>
           <w:b/>
           <w:bCs/>
         </w:rPr>
+        <w:t xml:space="preserve">Table 1</w:t>
+      </w:r>
+      <w:r>
+        <w:t xml:space="preserve"> </w:t>
+      </w:r>
+      <w:r>
+        <w:t xml:space="preserve">The screen’s approximation ledger.</w:t>
+      </w:r>
+    </w:p>
+    <w:tbl>
+      <w:tblPr>
+        <w:tblStyle w:val="Table"/>
+        <w:tblW w:type="pct" w:w="5000"/>
+        <w:tblLayout w:type="fixed"/>
+        <w:tblLook w:firstRow="1" w:lastRow="0" w:firstColumn="0" w:lastColumn="0" w:noHBand="0" w:noVBand="0" w:val="0020"/>
+      </w:tblPr>
+      <w:tblGrid>
+        <w:gridCol w:w="1584"/>
+        <w:gridCol w:w="1584"/>
+        <w:gridCol w:w="1584"/>
+        <w:gridCol w:w="1584"/>
+        <w:gridCol w:w="1584"/>
+      </w:tblGrid>
+      <w:tr>
+        <w:trPr>
+          <w:tblHeader w:val="on"/>
+        </w:trPr>
+        <w:tc>
+          <w:tcPr/>
+          <w:p>
+            <w:pPr>
+              <w:pStyle w:val="Compact"/>
+            </w:pPr>
+            <w:r>
+              <w:t xml:space="preserve">#</w:t>
+            </w:r>
+          </w:p>
+        </w:tc>
+        <w:tc>
+          <w:tcPr/>
+          <w:p>
+            <w:pPr>
+              <w:pStyle w:val="Compact"/>
+            </w:pPr>
+            <w:r>
+              <w:t xml:space="preserve">Approximation</w:t>
+            </w:r>
+          </w:p>
+        </w:tc>
+        <w:tc>
+          <w:tcPr/>
+          <w:p>
+            <w:pPr>
+              <w:pStyle w:val="Compact"/>
+            </w:pPr>
+            <w:r>
+              <w:t xml:space="preserve">What it excludes</w:t>
+            </w:r>
+          </w:p>
+        </w:tc>
+        <w:tc>
+          <w:tcPr/>
+          <w:p>
+            <w:pPr>
+              <w:pStyle w:val="Compact"/>
+            </w:pPr>
+            <w:r>
+              <w:t xml:space="preserve">Expected bias</w:t>
+            </w:r>
+          </w:p>
+        </w:tc>
+        <w:tc>
+          <w:tcPr/>
+          <w:p>
+            <w:pPr>
+              <w:pStyle w:val="Compact"/>
+            </w:pPr>
+            <w:r>
+              <w:t xml:space="preserve">Where it shows</w:t>
+            </w:r>
+          </w:p>
+        </w:tc>
+      </w:tr>
+      <w:tr>
+        <w:tc>
+          <w:tcPr/>
+          <w:p>
+            <w:pPr>
+              <w:pStyle w:val="Compact"/>
+            </w:pPr>
+            <w:r>
+              <w:t xml:space="preserve">A1</w:t>
+            </w:r>
+          </w:p>
+        </w:tc>
+        <w:tc>
+          <w:tcPr/>
+          <w:p>
+            <w:pPr>
+              <w:pStyle w:val="Compact"/>
+            </w:pPr>
+            <w:r>
+              <w:t xml:space="preserve">One mode at a time</w:t>
+            </w:r>
+          </w:p>
+        </w:tc>
+        <w:tc>
+          <w:tcPr/>
+          <w:p>
+            <w:pPr>
+              <w:pStyle w:val="Compact"/>
+            </w:pPr>
+            <w:r>
+              <w:t xml:space="preserve">Mode–mode coupling and cooperative condensation</w:t>
+            </w:r>
+          </w:p>
+        </w:tc>
+        <w:tc>
+          <w:tcPr/>
+          <w:p>
+            <w:pPr>
+              <w:pStyle w:val="Compact"/>
+            </w:pPr>
+            <w:r>
+              <w:t xml:space="preserve">Either sign; absolute T* unreliable</w:t>
+            </w:r>
+          </w:p>
+        </w:tc>
+        <w:tc>
+          <w:tcPr/>
+          <w:p>
+            <w:pPr>
+              <w:pStyle w:val="Compact"/>
+            </w:pPr>
+            <w:r>
+              <w:t xml:space="preserve">PbTiO₃ T* ordering failure (§3.2)</w:t>
+            </w:r>
+          </w:p>
+        </w:tc>
+      </w:tr>
+      <w:tr>
+        <w:tc>
+          <w:tcPr/>
+          <w:p>
+            <w:pPr>
+              <w:pStyle w:val="Compact"/>
+            </w:pPr>
+            <w:r>
+              <w:t xml:space="preserve">A2</w:t>
+            </w:r>
+          </w:p>
+        </w:tc>
+        <w:tc>
+          <w:tcPr/>
+          <w:p>
+            <w:pPr>
+              <w:pStyle w:val="Compact"/>
+            </w:pPr>
+            <w:r>
+              <w:t xml:space="preserve">Commensurate</w:t>
+            </w:r>
+            <w:r>
+              <w:t xml:space="preserve"> </w:t>
+            </w:r>
+            <w:r>
+              <w:rPr>
+                <w:b/>
+                <w:bCs/>
+              </w:rPr>
+              <w:t xml:space="preserve">q</w:t>
+            </w:r>
+            <w:r>
+              <w:t xml:space="preserve"> </w:t>
+            </w:r>
+            <w:r>
+              <w:t xml:space="preserve">only</w:t>
+            </w:r>
+          </w:p>
+        </w:tc>
+        <w:tc>
+          <w:tcPr/>
+          <w:p>
+            <w:pPr>
+              <w:pStyle w:val="Compact"/>
+            </w:pPr>
+            <w:r>
+              <w:t xml:space="preserve">Instabilities at incommensurate or finer-grid</w:t>
+            </w:r>
+            <w:r>
+              <w:t xml:space="preserve"> </w:t>
+            </w:r>
+            <w:r>
+              <w:rPr>
+                <w:b/>
+                <w:bCs/>
+              </w:rPr>
+              <w:t xml:space="preserve">q</w:t>
+            </w:r>
+          </w:p>
+        </w:tc>
+        <w:tc>
+          <w:tcPr/>
+          <w:p>
+            <w:pPr>
+              <w:pStyle w:val="Compact"/>
+            </w:pPr>
+            <w:r>
+              <w:t xml:space="preserve">False-stable if the true soft mode is missed</w:t>
+            </w:r>
+          </w:p>
+        </w:tc>
+        <w:tc>
+          <w:tcPr/>
+          <w:p>
+            <w:pPr>
+              <w:pStyle w:val="Compact"/>
+            </w:pPr>
+            <w:r>
+              <w:t xml:space="preserve">R point needs even cells (§3.5); bcc ω needs 6×6×6 FCs</w:t>
+            </w:r>
+          </w:p>
+        </w:tc>
+      </w:tr>
+      <w:tr>
+        <w:tc>
+          <w:tcPr/>
+          <w:p>
+            <w:pPr>
+              <w:pStyle w:val="Compact"/>
+            </w:pPr>
+            <w:r>
+              <w:t xml:space="preserve">A3</w:t>
+            </w:r>
+          </w:p>
+        </w:tc>
+        <w:tc>
+          <w:tcPr/>
+          <w:p>
+            <w:pPr>
+              <w:pStyle w:val="Compact"/>
+            </w:pPr>
+            <w:r>
+              <w:t xml:space="preserve">Sextic fit on a well+barrier window</w:t>
+            </w:r>
+          </w:p>
+        </w:tc>
+        <w:tc>
+          <w:tcPr/>
+          <w:p>
+            <w:pPr>
+              <w:pStyle w:val="Compact"/>
+            </w:pPr>
+            <w:r>
+              <w:t xml:space="preserve">Steep-wall anharmonicity beyond Q⁶</w:t>
+            </w:r>
+          </w:p>
+        </w:tc>
+        <w:tc>
+          <w:tcPr/>
+          <w:p>
+            <w:pPr>
+              <w:pStyle w:val="Compact"/>
+            </w:pPr>
+            <w:r>
+              <w:t xml:space="preserve">Barrier-shape error at large Q</w:t>
+            </w:r>
+          </w:p>
+        </w:tc>
+        <w:tc>
+          <w:tcPr/>
+          <w:p>
+            <w:pPr>
+              <w:pStyle w:val="Compact"/>
+            </w:pPr>
+            <w:r>
+              <w:t xml:space="preserve">Fit window sensitivity (ESI)</w:t>
+            </w:r>
+          </w:p>
+        </w:tc>
+      </w:tr>
+      <w:tr>
+        <w:tc>
+          <w:tcPr/>
+          <w:p>
+            <w:pPr>
+              <w:pStyle w:val="Compact"/>
+            </w:pPr>
+            <w:r>
+              <w:t xml:space="preserve">A4</w:t>
+            </w:r>
+          </w:p>
+        </w:tc>
+        <w:tc>
+          <w:tcPr/>
+          <w:p>
+            <w:pPr>
+              <w:pStyle w:val="Compact"/>
+            </w:pPr>
+            <w:r>
+              <w:t xml:space="preserve">Gaussian (SCHA) trial state</w:t>
+            </w:r>
+          </w:p>
+        </w:tc>
+        <w:tc>
+          <w:tcPr/>
+          <w:p>
+            <w:pPr>
+              <w:pStyle w:val="Compact"/>
+            </w:pPr>
+            <w:r>
+              <w:t xml:space="preserve">Tunnelling, non-Gaussian density; renders deep-well transitions first-order-like</w:t>
+            </w:r>
+          </w:p>
+        </w:tc>
+        <w:tc>
+          <w:tcPr/>
+          <w:p>
+            <w:pPr>
+              <w:pStyle w:val="Compact"/>
+            </w:pPr>
+            <w:r>
+              <w:t xml:space="preserve">Curvature misses condensation</w:t>
+            </w:r>
+          </w:p>
+        </w:tc>
+        <w:tc>
+          <w:tcPr/>
+          <w:p>
+            <w:pPr>
+              <w:pStyle w:val="Compact"/>
+            </w:pPr>
+            <w:r>
+              <w:rPr>
+                <w:rStyle w:val="VerbatimChar"/>
+              </w:rPr>
+              <w:t xml:space="preserve">n_curv_blind</w:t>
+            </w:r>
+            <w:r>
+              <w:t xml:space="preserve"> </w:t>
+            </w:r>
+            <w:r>
+              <w:t xml:space="preserve">rows; §3.3 mechanism</w:t>
+            </w:r>
+          </w:p>
+        </w:tc>
+      </w:tr>
+      <w:tr>
+        <w:tc>
+          <w:tcPr/>
+          <w:p>
+            <w:pPr>
+              <w:pStyle w:val="Compact"/>
+            </w:pPr>
+            <w:r>
+              <w:t xml:space="preserve">A5</w:t>
+            </w:r>
+          </w:p>
+        </w:tc>
+        <w:tc>
+          <w:tcPr/>
+          <w:p>
+            <w:pPr>
+              <w:pStyle w:val="Compact"/>
+            </w:pPr>
+            <w:r>
+              <w:t xml:space="preserve">Static E(Q) in a clamped cell</w:t>
+            </w:r>
+          </w:p>
+        </w:tc>
+        <w:tc>
+          <w:tcPr/>
+          <w:p>
+            <w:pPr>
+              <w:pStyle w:val="Compact"/>
+            </w:pPr>
+            <w:r>
+              <w:t xml:space="preserve">Thermal expansion and strain coupling</w:t>
+            </w:r>
+          </w:p>
+        </w:tc>
+        <w:tc>
+          <w:tcPr/>
+          <w:p>
+            <w:pPr>
+              <w:pStyle w:val="Compact"/>
+            </w:pPr>
+            <w:r>
+              <w:t xml:space="preserve">Under-stabilises martensitic systems</w:t>
+            </w:r>
+          </w:p>
+        </w:tc>
+        <w:tc>
+          <w:tcPr/>
+          <w:p>
+            <w:pPr>
+              <w:pStyle w:val="Compact"/>
+            </w:pPr>
+            <w:r>
+              <w:t xml:space="preserve">bcc labelled via SSCHA instead (§3.3)</w:t>
+            </w:r>
+          </w:p>
+        </w:tc>
+      </w:tr>
+      <w:tr>
+        <w:tc>
+          <w:tcPr/>
+          <w:p>
+            <w:pPr>
+              <w:pStyle w:val="Compact"/>
+            </w:pPr>
+            <w:r>
+              <w:t xml:space="preserve">A6</w:t>
+            </w:r>
+          </w:p>
+        </w:tc>
+        <w:tc>
+          <w:tcPr/>
+          <w:p>
+            <w:pPr>
+              <w:pStyle w:val="Compact"/>
+            </w:pPr>
+            <w:r>
+              <w:t xml:space="preserve">Mode cap (24)</w:t>
+            </w:r>
+          </w:p>
+        </w:tc>
+        <w:tc>
+          <w:tcPr/>
+          <w:p>
+            <w:pPr>
+              <w:pStyle w:val="Compact"/>
+            </w:pPr>
+            <w:r>
+              <w:t xml:space="preserve">Modes beyond the 24 most imaginary</w:t>
+            </w:r>
+          </w:p>
+        </w:tc>
+        <w:tc>
+          <w:tcPr/>
+          <w:p>
+            <w:pPr>
+              <w:pStyle w:val="Compact"/>
+            </w:pPr>
+            <w:r>
+              <w:t xml:space="preserve">Could only create false-stables</w:t>
+            </w:r>
+          </w:p>
+        </w:tc>
+        <w:tc>
+          <w:tcPr/>
+          <w:p>
+            <w:pPr>
+              <w:pStyle w:val="Compact"/>
+            </w:pPr>
+            <w:r>
+              <w:t xml:space="preserve">Binds on 20/400 units, all already unstable (§2.4)</w:t>
+            </w:r>
+          </w:p>
+        </w:tc>
+      </w:tr>
+    </w:tbl>
+    <w:p>
+      <w:pPr>
+        <w:pStyle w:val="BodyText"/>
+      </w:pPr>
+      <w:r>
+        <w:t xml:space="preserve">Validation gate. Cubic SrTiO₃ resolves three distinct imaginary commensurate modes, and the screen</w:t>
+      </w:r>
+      <w:r>
+        <w:t xml:space="preserve"> </w:t>
+      </w:r>
+      <w:r>
+        <w:t xml:space="preserve">reports which of them condenses. At 100 K the Γ ferroelectric mode does</w:t>
+      </w:r>
+      <w:r>
+        <w:t xml:space="preserve"> </w:t>
+      </w:r>
+      <w:r>
+        <w:rPr>
+          <w:b/>
+          <w:bCs/>
+        </w:rPr>
         <w:t xml:space="preserve">not</w:t>
       </w:r>
       <w:r>
@@ -1382,25 +2656,13 @@
         <w:t xml:space="preserve"> </w:t>
       </w:r>
       <w:r>
-        <w:t xml:space="preserve">stable at 300 K, bracketing the experimental transition at 105 K, and the effective frequency of the</w:t>
-      </w:r>
-      <w:r>
-        <w:t xml:space="preserve"> </w:t>
-      </w:r>
-      <w:r>
-        <w:t xml:space="preserve">deciding mode hardens from −2.68 to +1.43 THz across it. Three of the five models (MACE-MP-0,</w:t>
-      </w:r>
-      <w:r>
-        <w:t xml:space="preserve"> </w:t>
-      </w:r>
-      <w:r>
-        <w:t xml:space="preserve">MatterSim, SevenNet-0) reproduce this; CHGNet never condenses the tilt and ORB-v2 does not select</w:t>
-      </w:r>
-      <w:r>
-        <w:t xml:space="preserve"> </w:t>
-      </w:r>
-      <w:r>
-        <w:t xml:space="preserve">the R point at all. Because the gate identifies</w:t>
+        <w:t xml:space="preserve">stable at 300 K, bracketing the experimental transition at 105 K. The gate also exercises the</w:t>
+      </w:r>
+      <w:r>
+        <w:t xml:space="preserve"> </w:t>
+      </w:r>
+      <w:r>
+        <w:t xml:space="preserve">criterion/observable distinction above: at 100 K the condensing tilt still has a</w:t>
       </w:r>
       <w:r>
         <w:t xml:space="preserve"> </w:t>
@@ -1410,19 +2672,65 @@
           <w:i/>
           <w:iCs/>
         </w:rPr>
+        <w:t xml:space="preserve">positive</w:t>
+      </w:r>
+      <w:r>
+        <w:t xml:space="preserve"> </w:t>
+      </w:r>
+      <w:r>
+        <w:t xml:space="preserve">symmetric-point curvature (+0.92 THz, hardening to +1.43 THz at 300 K), so this is a</w:t>
+      </w:r>
+      <w:r>
+        <w:t xml:space="preserve"> </w:t>
+      </w:r>
+      <w:r>
+        <w:t xml:space="preserve">first-order-like condensation that the free energy’s argmin detects and its curvature does not —</w:t>
+      </w:r>
+      <w:r>
+        <w:t xml:space="preserve"> </w:t>
+      </w:r>
+      <w:r>
+        <w:t xml:space="preserve">the same mechanism, inside the cheap screen, that defeats the fixed-reference SSCHA Hessian in</w:t>
+      </w:r>
+      <w:r>
+        <w:t xml:space="preserve"> </w:t>
+      </w:r>
+      <w:r>
+        <w:t xml:space="preserve">§3.3. Three of the five models (MACE-MP-0, MatterSim, SevenNet-0) reproduce the R-tilt</w:t>
+      </w:r>
+      <w:r>
+        <w:t xml:space="preserve"> </w:t>
+      </w:r>
+      <w:r>
+        <w:t xml:space="preserve">condensation; CHGNet never condenses the tilt and ORB-v2 does not select the R point at all.</w:t>
+      </w:r>
+      <w:r>
+        <w:t xml:space="preserve"> </w:t>
+      </w:r>
+      <w:r>
+        <w:t xml:space="preserve">Because the gate identifies</w:t>
+      </w:r>
+      <w:r>
+        <w:t xml:space="preserve"> </w:t>
+      </w:r>
+      <w:r>
+        <w:rPr>
+          <w:i/>
+          <w:iCs/>
+        </w:rPr>
         <w:t xml:space="preserve">which</w:t>
       </w:r>
       <w:r>
         <w:t xml:space="preserve"> </w:t>
       </w:r>
       <w:r>
-        <w:t xml:space="preserve">instability each model captures rather than</w:t>
-      </w:r>
-      <w:r>
-        <w:t xml:space="preserve"> </w:t>
-      </w:r>
-      <w:r>
-        <w:t xml:space="preserve">returning a single number, it is a per-model test rather than a single-model demonstration.</w:t>
+        <w:t xml:space="preserve">instability each model captures rather than returning a single</w:t>
+      </w:r>
+      <w:r>
+        <w:t xml:space="preserve"> </w:t>
+      </w:r>
+      <w:r>
+        <w:t xml:space="preserve">number, it is a per-model test rather than a single-model demonstration.</w:t>
       </w:r>
     </w:p>
     <w:bookmarkEnd w:id="14"/>
@@ -1761,7 +3069,7 @@
               <w:pStyle w:val="Compact"/>
             </w:pPr>
             <w:r>
-              <w:t xml:space="preserve">0.842</w:t>
+              <w:t xml:space="preserve">0.895</w:t>
             </w:r>
           </w:p>
         </w:tc>
@@ -1772,7 +3080,7 @@
               <w:pStyle w:val="Compact"/>
             </w:pPr>
             <w:r>
-              <w:t xml:space="preserve">0.154</w:t>
+              <w:t xml:space="preserve">0.077</w:t>
             </w:r>
           </w:p>
         </w:tc>
@@ -1852,37 +3160,31 @@
         <w:t xml:space="preserve"> </w:t>
       </w:r>
       <w:r>
-        <w:t xml:space="preserve">modes, softened toward zero; this is the PES-softening bias of the literature, localised to</w:t>
-      </w:r>
-      <w:r>
-        <w:t xml:space="preserve"> </w:t>
-      </w:r>
-      <w:r>
-        <w:t xml:space="preserve">specific instabilities. ORB-v2 also carries two false-stable calls (rate 0.154) but on a different</w:t>
-      </w:r>
-      <w:r>
-        <w:t xml:space="preserve"> </w:t>
-      </w:r>
-      <w:r>
-        <w:t xml:space="preserve">pair: it correctly flags bcc-Zr unstable (−0.43 THz) yet softens Hf (−0.09 THz) and SrTiO₃</w:t>
-      </w:r>
-      <w:r>
-        <w:t xml:space="preserve"> </w:t>
-      </w:r>
-      <w:r>
-        <w:t xml:space="preserve">(−0.0 THz) just past the −0.1 THz tolerance. ORB-v2 (direct, float32) softens in both directions;</w:t>
-      </w:r>
-      <w:r>
-        <w:t xml:space="preserve"> </w:t>
-      </w:r>
-      <w:r>
-        <w:t xml:space="preserve">besides those two false-stables it falsely calls MgO unstable (−2.8 THz), its one false-unstable on</w:t>
-      </w:r>
-      <w:r>
-        <w:t xml:space="preserve"> </w:t>
-      </w:r>
-      <w:r>
-        <w:t xml:space="preserve">the oxide side. CHGNet carries the only non-ORB false-unstables (rate 0.333), CeO₂ (−0.26 THz) and</w:t>
+        <w:t xml:space="preserve">modes, softened to −0.00 THz; this is the PES-softening bias of the literature, localised to</w:t>
+      </w:r>
+      <w:r>
+        <w:t xml:space="preserve"> </w:t>
+      </w:r>
+      <w:r>
+        <w:t xml:space="preserve">specific instabilities. ORB-v2 carries one false-stable (rate 0.077): it correctly flags bcc-Zr</w:t>
+      </w:r>
+      <w:r>
+        <w:t xml:space="preserve"> </w:t>
+      </w:r>
+      <w:r>
+        <w:t xml:space="preserve">(−0.43 THz) and bcc-Hf (−0.19 THz) unstable but reads SrTiO₃ at +0.00 THz. ORB-v2 (a direct-force</w:t>
+      </w:r>
+      <w:r>
+        <w:t xml:space="preserve"> </w:t>
+      </w:r>
+      <w:r>
+        <w:t xml:space="preserve">model, run in its default float32 precision) softens in both directions; besides that false-stable</w:t>
+      </w:r>
+      <w:r>
+        <w:t xml:space="preserve"> </w:t>
+      </w:r>
+      <w:r>
+        <w:t xml:space="preserve">it falsely calls MgO unstable (−1.07 THz), its one false-unstable on the oxide side. CHGNet carries the only non-ORB false-unstables (rate 0.333), CeO₂ (−0.27 THz) and</w:t>
       </w:r>
       <w:r>
         <w:t xml:space="preserve"> </w:t>
@@ -1920,13 +3222,13 @@
         <w:t xml:space="preserve"> </w:t>
       </w:r>
       <w:r>
-        <w:t xml:space="preserve">while a loose tolerance (0.3 THz) inflates false-stables (10 calls); the default −0.1 THz sits in</w:t>
-      </w:r>
-      <w:r>
-        <w:t xml:space="preserve"> </w:t>
-      </w:r>
-      <w:r>
-        <w:t xml:space="preserve">the stable basin between them (6 false-stable, 3 false-unstable), and the split holds across</w:t>
+        <w:t xml:space="preserve">while a loose tolerance (0.3 THz) inflates false-stables (7 calls); the default −0.1 THz sits in</w:t>
+      </w:r>
+      <w:r>
+        <w:t xml:space="preserve"> </w:t>
+      </w:r>
+      <w:r>
+        <w:t xml:space="preserve">the stable basin between them (5 false-stable, 3 false-unstable), and the split holds across</w:t>
       </w:r>
       <w:r>
         <w:t xml:space="preserve"> </w:t>
@@ -2568,7 +3870,7 @@
               <w:pStyle w:val="Compact"/>
             </w:pPr>
             <w:r>
-              <w:t xml:space="preserve">0.842</w:t>
+              <w:t xml:space="preserve">0.895</w:t>
             </w:r>
           </w:p>
         </w:tc>
@@ -2857,85 +4159,85 @@
         <w:pStyle w:val="BodyText"/>
       </w:pPr>
       <w:r>
-        <w:t xml:space="preserve">bcc metals: SSCHA is a clean gold standard, and the screen tracks it. Across Ti/Zr/Hf × 5 models ×</w:t>
-      </w:r>
-      <w:r>
-        <w:t xml:space="preserve"> </w:t>
-      </w:r>
-      <w:r>
-        <w:t xml:space="preserve">5 temperatures (75 runs) SSCHA produced zero numerical failures, with minimum free-energy-Hessian</w:t>
-      </w:r>
-      <w:r>
-        <w:t xml:space="preserve"> </w:t>
-      </w:r>
-      <w:r>
-        <w:t xml:space="preserve">frequencies in a physical [0.0, 2.1] THz range. All five models anharmonically stabilise the bcc</w:t>
-      </w:r>
-      <w:r>
-        <w:t xml:space="preserve"> </w:t>
-      </w:r>
-      <w:r>
-        <w:t xml:space="preserve">phase by ≤50 K (the dynamic-stabilisation temperature, which is far below the thermodynamic</w:t>
-      </w:r>
-      <w:r>
-        <w:t xml:space="preserve"> </w:t>
-      </w:r>
-      <w:r>
-        <w:t xml:space="preserve">transition because bcc-to-hcp/ω is a martensitic, strain-coupled first-order transition; using the</w:t>
-      </w:r>
-      <w:r>
-        <w:t xml:space="preserve"> </w:t>
-      </w:r>
-      <w:r>
-        <w:t xml:space="preserve">thermodynamic T_c to label dynamic stability is the wrong comparison and is what makes the models</w:t>
-      </w:r>
-      <w:r>
-        <w:t xml:space="preserve"> </w:t>
-      </w:r>
-      <w:r>
-        <w:t xml:space="preserve">look false-stable on bcc). The margin to the stability boundary discriminates the models and tracks</w:t>
-      </w:r>
-      <w:r>
-        <w:t xml:space="preserve"> </w:t>
-      </w:r>
-      <w:r>
-        <w:t xml:space="preserve">each model’s harmonic-instability depth: MatterSim and ORB-v2 hug the boundary (~0.4 THz at 50 K),</w:t>
-      </w:r>
-      <w:r>
-        <w:t xml:space="preserve"> </w:t>
-      </w:r>
-      <w:r>
-        <w:t xml:space="preserve">while MACE-MP-0 is firmly stable (~1.8 THz) (Fig. 3). The cheap soft-mode screen tracks SSCHA on</w:t>
-      </w:r>
-      <w:r>
-        <w:t xml:space="preserve"> </w:t>
-      </w:r>
-      <w:r>
-        <w:t xml:space="preserve">bcc: across the 45 paired units the rank correlation of the two minimum frequencies is Spearman</w:t>
-      </w:r>
-      <w:r>
-        <w:t xml:space="preserve"> </w:t>
-      </w:r>
-      <w:r>
-        <w:t xml:space="preserve">ρ = 0.74 with 0.62 sign agreement (Fig. 4). The disagreements are concentrated in ORB-v2’s float32</w:t>
-      </w:r>
-      <w:r>
-        <w:t xml:space="preserve"> </w:t>
-      </w:r>
-      <w:r>
-        <w:t xml:space="preserve">softmode outliers; dropping ORB-v2 (36 paired units) raises the sign agreement to 0.69 and leaves</w:t>
-      </w:r>
-      <w:r>
-        <w:t xml:space="preserve"> </w:t>
-      </w:r>
-      <w:r>
-        <w:t xml:space="preserve">the rank correlation essentially unchanged at ρ = 0.74. Either way the screen and the gold standard</w:t>
-      </w:r>
-      <w:r>
-        <w:t xml:space="preserve"> </w:t>
-      </w:r>
-      <w:r>
-        <w:t xml:space="preserve">agree on the family where the gold standard is trustworthy.</w:t>
+        <w:t xml:space="preserve">bcc metals: SSCHA is a clean gold standard, and the screen agrees with it where it counts. Across</w:t>
+      </w:r>
+      <w:r>
+        <w:t xml:space="preserve"> </w:t>
+      </w:r>
+      <w:r>
+        <w:t xml:space="preserve">Ti/Zr/Hf × 5 models × 5 temperatures (75 runs) SSCHA produced zero numerical failures, with minimum</w:t>
+      </w:r>
+      <w:r>
+        <w:t xml:space="preserve"> </w:t>
+      </w:r>
+      <w:r>
+        <w:t xml:space="preserve">free-energy-Hessian frequencies in a physical [0.06, 2.1] THz range. All five models anharmonically</w:t>
+      </w:r>
+      <w:r>
+        <w:t xml:space="preserve"> </w:t>
+      </w:r>
+      <w:r>
+        <w:t xml:space="preserve">stabilise the bcc phase by ≤50 K (the dynamic-stabilisation temperature, which is far below the</w:t>
+      </w:r>
+      <w:r>
+        <w:t xml:space="preserve"> </w:t>
+      </w:r>
+      <w:r>
+        <w:t xml:space="preserve">thermodynamic transition because bcc-to-hcp/ω is a martensitic, strain-coupled first-order</w:t>
+      </w:r>
+      <w:r>
+        <w:t xml:space="preserve"> </w:t>
+      </w:r>
+      <w:r>
+        <w:t xml:space="preserve">transition; using the thermodynamic T_c to label dynamic stability is the wrong comparison and is</w:t>
+      </w:r>
+      <w:r>
+        <w:t xml:space="preserve"> </w:t>
+      </w:r>
+      <w:r>
+        <w:t xml:space="preserve">what makes the models look false-stable on bcc). The margin to the stability boundary discriminates</w:t>
+      </w:r>
+      <w:r>
+        <w:t xml:space="preserve"> </w:t>
+      </w:r>
+      <w:r>
+        <w:t xml:space="preserve">the models: ORB-v2 hugs it (0.06–0.28 THz on Ti/Hf), SevenNet-0’s Hf sits at ~0.3 THz, while</w:t>
+      </w:r>
+      <w:r>
+        <w:t xml:space="preserve"> </w:t>
+      </w:r>
+      <w:r>
+        <w:t xml:space="preserve">MatterSim and MACE-MP-0 are firmly stable (1.2–2.1 THz) (Fig. 3). Against the screen, the two</w:t>
+      </w:r>
+      <w:r>
+        <w:t xml:space="preserve"> </w:t>
+      </w:r>
+      <w:r>
+        <w:t xml:space="preserve">methods agree on the stability call in 35 of 45 paired bcc units (sign agreement 0.78; 30 of 36,</w:t>
+      </w:r>
+      <w:r>
+        <w:t xml:space="preserve"> </w:t>
+      </w:r>
+      <w:r>
+        <w:t xml:space="preserve">0.83, excluding ORB-v2), while the magnitudes are not rank-correlated (Spearman ρ = 0.11): a</w:t>
+      </w:r>
+      <w:r>
+        <w:t xml:space="preserve"> </w:t>
+      </w:r>
+      <w:r>
+        <w:t xml:space="preserve">single-mode symmetric-point curvature and a multi-mode free-energy Hessian are different</w:t>
+      </w:r>
+      <w:r>
+        <w:t xml:space="preserve"> </w:t>
+      </w:r>
+      <w:r>
+        <w:t xml:space="preserve">observables away from the sign change, so the cross-validation statistic we report is the call</w:t>
+      </w:r>
+      <w:r>
+        <w:t xml:space="preserve"> </w:t>
+      </w:r>
+      <w:r>
+        <w:t xml:space="preserve">agreement, not a magnitude correlation (Fig. 4).</w:t>
       </w:r>
     </w:p>
     <w:p>
@@ -2943,55 +4245,79 @@
         <w:pStyle w:val="BodyText"/>
       </w:pPr>
       <w:r>
-        <w:t xml:space="preserve">Ferroelectric perovskites: SSCHA systematically false-stabilises. On the same FE perovskites at</w:t>
-      </w:r>
-      <w:r>
-        <w:t xml:space="preserve"> </w:t>
-      </w:r>
-      <w:r>
-        <w:t xml:space="preserve">T ≤ 300 K where the screen reaches 0.53 recall, SSCHA correctly identifies the instability in only</w:t>
-      </w:r>
-      <w:r>
-        <w:t xml:space="preserve"> </w:t>
-      </w:r>
-      <w:r>
-        <w:t xml:space="preserve">9 of 30 units (recall 0.30), and the perovskite SSCHA runs include six numerical blow-ups (minimum</w:t>
-      </w:r>
-      <w:r>
-        <w:t xml:space="preserve"> </w:t>
-      </w:r>
-      <w:r>
-        <w:t xml:space="preserve">frequencies down to −2×10⁶ THz). Those blow-ups are not exclusively a float32 effect: four occur in</w:t>
-      </w:r>
-      <w:r>
-        <w:t xml:space="preserve"> </w:t>
-      </w:r>
-      <w:r>
-        <w:t xml:space="preserve">ORB-v2 runs on SrTiO₃ and two in MatterSim runs on PbTiO₃, so precision alone does not account for</w:t>
-      </w:r>
-      <w:r>
-        <w:t xml:space="preserve"> </w:t>
-      </w:r>
-      <w:r>
-        <w:t xml:space="preserve">them. This is the cautionary result: the expensive gold standard is less reliable than the cheap</w:t>
-      </w:r>
-      <w:r>
-        <w:t xml:space="preserve"> </w:t>
-      </w:r>
-      <w:r>
-        <w:t xml:space="preserve">screen in the displacive regime that dominates generative-CSP outputs (Fig. 5). We note that the</w:t>
-      </w:r>
-      <w:r>
-        <w:t xml:space="preserve"> </w:t>
-      </w:r>
-      <w:r>
-        <w:t xml:space="preserve">margin is narrower than the earlier single-mode analysis suggested — 0.53 against 0.30, a factor of 1.8 —</w:t>
-      </w:r>
-      <w:r>
-        <w:t xml:space="preserve"> </w:t>
-      </w:r>
-      <w:r>
-        <w:t xml:space="preserve">and that both methods miss a substantial fraction of these instabilities.</w:t>
+        <w:t xml:space="preserve">Ferroelectric perovskites: SSCHA systematically false-stabilises, and its deepest wells do not run</w:t>
+      </w:r>
+      <w:r>
+        <w:t xml:space="preserve"> </w:t>
+      </w:r>
+      <w:r>
+        <w:t xml:space="preserve">at all. On the same FE perovskites at T ≤ 300 K where the screen reaches 0.53 recall, SSCHA</w:t>
+      </w:r>
+      <w:r>
+        <w:t xml:space="preserve"> </w:t>
+      </w:r>
+      <w:r>
+        <w:t xml:space="preserve">correctly identifies the instability in only 5 of the 27 units that return a physical number</w:t>
+      </w:r>
+      <w:r>
+        <w:t xml:space="preserve"> </w:t>
+      </w:r>
+      <w:r>
+        <w:t xml:space="preserve">(recall 0.19). Of the 30 attempted units, one blows up numerically and two fail outright; across</w:t>
+      </w:r>
+      <w:r>
+        <w:t xml:space="preserve"> </w:t>
+      </w:r>
+      <w:r>
+        <w:t xml:space="preserve">the full FE grid seven units die at cellconstructor symmetry or ensemble assertions, six of them</w:t>
+      </w:r>
+      <w:r>
+        <w:t xml:space="preserve"> </w:t>
+      </w:r>
+      <w:r>
+        <w:t xml:space="preserve">on PbTiO₃ — the deepest wells in the set (ORB-v2 at every temperature, MatterSim at 600 and</w:t>
+      </w:r>
+      <w:r>
+        <w:t xml:space="preserve"> </w:t>
+      </w:r>
+      <w:r>
+        <w:t xml:space="preserve">900 K). In the earlier, unpinned measurement these same units produced silent numerical blow-ups</w:t>
+      </w:r>
+      <w:r>
+        <w:t xml:space="preserve"> </w:t>
+      </w:r>
+      <w:r>
+        <w:t xml:space="preserve">to −2×10⁶ THz; in the pinned re-measurement they fail loudly instead, which is the better</w:t>
+      </w:r>
+      <w:r>
+        <w:t xml:space="preserve"> </w:t>
+      </w:r>
+      <w:r>
+        <w:t xml:space="preserve">behaviour but the same verdict: the method does not return usable answers where the instability is</w:t>
+      </w:r>
+      <w:r>
+        <w:t xml:space="preserve"> </w:t>
+      </w:r>
+      <w:r>
+        <w:t xml:space="preserve">deepest, and precision alone does not account for it (the failures span float32 and float64</w:t>
+      </w:r>
+      <w:r>
+        <w:t xml:space="preserve"> </w:t>
+      </w:r>
+      <w:r>
+        <w:t xml:space="preserve">models). This is the cautionary result: the expensive gold standard is less reliable than the</w:t>
+      </w:r>
+      <w:r>
+        <w:t xml:space="preserve"> </w:t>
+      </w:r>
+      <w:r>
+        <w:t xml:space="preserve">cheap screen in the displacive regime that dominates generative-CSP outputs — recall 0.19 against</w:t>
+      </w:r>
+      <w:r>
+        <w:t xml:space="preserve"> </w:t>
+      </w:r>
+      <w:r>
+        <w:t xml:space="preserve">0.53, with the deepest-well units unable to complete (Fig. 5).</w:t>
       </w:r>
     </w:p>
     <w:p>
@@ -3504,7 +4830,55 @@
         <w:t xml:space="preserve"> </w:t>
       </w:r>
       <w:r>
-        <w:t xml:space="preserve">§2.4) as the validation for the perovskite screen.</w:t>
+        <w:t xml:space="preserve">§2.4) as the validation for the perovskite screen. We add one structural observation from our own</w:t>
+      </w:r>
+      <w:r>
+        <w:t xml:space="preserve"> </w:t>
+      </w:r>
+      <w:r>
+        <w:t xml:space="preserve">data: even within the single-mode screen, deep wells condense first-order-like — the free energy</w:t>
+      </w:r>
+      <w:r>
+        <w:t xml:space="preserve"> </w:t>
+      </w:r>
+      <w:r>
+        <w:t xml:space="preserve">develops a lower displaced minimum while its curvature at the symmetric point stays positive</w:t>
+      </w:r>
+      <w:r>
+        <w:t xml:space="preserve"> </w:t>
+      </w:r>
+      <w:r>
+        <w:t xml:space="preserve">(§2.4,</w:t>
+      </w:r>
+      <w:r>
+        <w:t xml:space="preserve"> </w:t>
+      </w:r>
+      <w:r>
+        <w:rPr>
+          <w:rStyle w:val="VerbatimChar"/>
+        </w:rPr>
+        <w:t xml:space="preserve">n_curv_blind</w:t>
+      </w:r>
+      <w:r>
+        <w:t xml:space="preserve">) — and a fixed-reference Hessian criterion of any order is blind to a</w:t>
+      </w:r>
+      <w:r>
+        <w:t xml:space="preserve"> </w:t>
+      </w:r>
+      <w:r>
+        <w:t xml:space="preserve">condensation of that character. The screen survives it because it minimises over the centroid</w:t>
+      </w:r>
+      <w:r>
+        <w:t xml:space="preserve"> </w:t>
+      </w:r>
+      <w:r>
+        <w:t xml:space="preserve">rather than reading a curvature; a fixed-reference SSCHA deployment has no analogous escape short</w:t>
+      </w:r>
+      <w:r>
+        <w:t xml:space="preserve"> </w:t>
+      </w:r>
+      <w:r>
+        <w:t xml:space="preserve">of relaxing the centroids, which changes the question being asked.</w:t>
       </w:r>
     </w:p>
     <w:p>
@@ -3536,7 +4910,7 @@
         <w:t xml:space="preserve"> </w:t>
       </w:r>
       <w:r>
-        <w:t xml:space="preserve">(recall 1.00), correctly and consistently. SSCHA instead returns +2.4 to +3.3 THz at 100 K for all</w:t>
+        <w:t xml:space="preserve">(recall 1.00), correctly and consistently. SSCHA instead returns +2.0 to +3.3 THz at 100 K for all</w:t>
       </w:r>
       <w:r>
         <w:t xml:space="preserve"> </w:t>
@@ -3548,55 +4922,55 @@
         <w:t xml:space="preserve"> </w:t>
       </w:r>
       <w:r>
-        <w:t xml:space="preserve">(MACE-MP-0 −4.6 THz and ORB-v2 −11.3 THz at 900 K), which is both the wrong sign at low T and the</w:t>
-      </w:r>
-      <w:r>
-        <w:t xml:space="preserve"> </w:t>
-      </w:r>
-      <w:r>
-        <w:t xml:space="preserve">wrong temperature trend; MatterSim and SevenNet-0 instead remain positive at 900 K (+2.4 and +0.5</w:t>
-      </w:r>
-      <w:r>
-        <w:t xml:space="preserve"> </w:t>
-      </w:r>
-      <w:r>
-        <w:t xml:space="preserve">THz), so they are false-stable across the whole ladder. Because SSCHA fails the same way on a</w:t>
-      </w:r>
-      <w:r>
-        <w:t xml:space="preserve"> </w:t>
-      </w:r>
-      <w:r>
-        <w:t xml:space="preserve">numerically well-behaved, shallower instability, the false-stable behaviour is intrinsic to the</w:t>
-      </w:r>
-      <w:r>
-        <w:t xml:space="preserve"> </w:t>
-      </w:r>
-      <w:r>
-        <w:t xml:space="preserve">truncated fixed-reference deployment (see the root cause above) rather than an artifact of the</w:t>
-      </w:r>
-      <w:r>
-        <w:t xml:space="preserve"> </w:t>
-      </w:r>
-      <w:r>
-        <w:t xml:space="preserve">deepest perovskite wells. HfO₂ shows the same pattern (all models +2.0 to +2.6 THz at 100 K, then</w:t>
-      </w:r>
-      <w:r>
-        <w:t xml:space="preserve"> </w:t>
-      </w:r>
-      <w:r>
-        <w:t xml:space="preserve">destabilising to −4.3/−8.3 THz for CHGNet/ORB-v2 by 900 K). Across both fluorites SSCHA produced</w:t>
-      </w:r>
-      <w:r>
-        <w:t xml:space="preserve"> </w:t>
-      </w:r>
-      <w:r>
-        <w:t xml:space="preserve">zero numerical blow-ups yet the same systematic false-stable, which confirms that the failure is</w:t>
-      </w:r>
-      <w:r>
-        <w:t xml:space="preserve"> </w:t>
-      </w:r>
-      <w:r>
-        <w:t xml:space="preserve">methodological, not numerical.</w:t>
+        <w:t xml:space="preserve">(MACE-MP-0 −2.7 THz, SevenNet-0 −1.3 THz and ORB-v2 −24.8 THz at 900 K), which is both the wrong</w:t>
+      </w:r>
+      <w:r>
+        <w:t xml:space="preserve"> </w:t>
+      </w:r>
+      <w:r>
+        <w:t xml:space="preserve">sign at low T and the wrong temperature trend; CHGNet and MatterSim instead remain positive at</w:t>
+      </w:r>
+      <w:r>
+        <w:t xml:space="preserve"> </w:t>
+      </w:r>
+      <w:r>
+        <w:t xml:space="preserve">900 K (+1.2 and +2.3 THz), so they are false-stable across the whole ladder. Because SSCHA fails</w:t>
+      </w:r>
+      <w:r>
+        <w:t xml:space="preserve"> </w:t>
+      </w:r>
+      <w:r>
+        <w:t xml:space="preserve">the same way on a numerically well-behaved, shallower instability, the false-stable behaviour is</w:t>
+      </w:r>
+      <w:r>
+        <w:t xml:space="preserve"> </w:t>
+      </w:r>
+      <w:r>
+        <w:t xml:space="preserve">intrinsic to the truncated fixed-reference deployment (see the root cause above) rather than an</w:t>
+      </w:r>
+      <w:r>
+        <w:t xml:space="preserve"> </w:t>
+      </w:r>
+      <w:r>
+        <w:t xml:space="preserve">artifact of the deepest perovskite wells. HfO₂ shows the same pattern (all models +1.9 to +2.6 THz</w:t>
+      </w:r>
+      <w:r>
+        <w:t xml:space="preserve"> </w:t>
+      </w:r>
+      <w:r>
+        <w:t xml:space="preserve">at 100 K, then destabilising to −4.6/−10.0 THz for MACE-MP-0/ORB-v2 by 900 K). Across both</w:t>
+      </w:r>
+      <w:r>
+        <w:t xml:space="preserve"> </w:t>
+      </w:r>
+      <w:r>
+        <w:t xml:space="preserve">fluorites SSCHA produced zero numerical blow-ups and zero failed units, yet the same systematic</w:t>
+      </w:r>
+      <w:r>
+        <w:t xml:space="preserve"> </w:t>
+      </w:r>
+      <w:r>
+        <w:t xml:space="preserve">false-stable, which confirms that the failure is methodological, not numerical.</w:t>
       </w:r>
     </w:p>
     <w:bookmarkEnd w:id="31"/>
@@ -3656,13 +5030,13 @@
         <w:t xml:space="preserve"> </w:t>
       </w:r>
       <w:r>
-        <w:t xml:space="preserve">reaches AUC 0.76, whereas the continuous cross-model frequency standard deviation is uninformative</w:t>
-      </w:r>
-      <w:r>
-        <w:t xml:space="preserve"> </w:t>
-      </w:r>
-      <w:r>
-        <w:t xml:space="preserve">(AUC 0.55, no better than chance; Fig. 6).</w:t>
+        <w:t xml:space="preserve">reaches AUC 0.76, whereas the continuous cross-model frequency standard deviation carries no</w:t>
+      </w:r>
+      <w:r>
+        <w:t xml:space="preserve"> </w:t>
+      </w:r>
+      <w:r>
+        <w:t xml:space="preserve">usable signal (AUC 0.36, below chance on this set; Fig. 6).</w:t>
       </w:r>
     </w:p>
     <w:p>
@@ -3674,7 +5048,7 @@
           <wp:inline>
             <wp:extent cx="4220307" cy="4220307"/>
             <wp:effectExtent b="0" l="0" r="0" t="0"/>
-            <wp:docPr descr="Fig. 6 Ensemble-disagreement guardrail (§3.4): the discrete inter-model vote split predicts consensus error (AUC 0.76) while the continuous cross-model frequency spread does not (AUC 0.55)." title="" id="33" name="Picture"/>
+            <wp:docPr descr="Fig. 6 Ensemble-disagreement guardrail (§3.4): the discrete inter-model vote split predicts consensus error (AUC 0.76) while the continuous cross-model frequency spread does not (AUC 0.36, below chance)." title="" id="33" name="Picture"/>
             <a:graphic>
               <a:graphicData uri="http://schemas.openxmlformats.org/drawingml/2006/picture">
                 <pic:pic>
@@ -3739,7 +5113,7 @@
         <w:t xml:space="preserve"> </w:t>
       </w:r>
       <w:r>
-        <w:t xml:space="preserve">does not (AUC 0.55).</w:t>
+        <w:t xml:space="preserve">does not (AUC 0.36, below chance).</w:t>
       </w:r>
     </w:p>
     <w:p>
@@ -3783,7 +5157,7 @@
           <wp:inline>
             <wp:extent cx="4220307" cy="4220307"/>
             <wp:effectExtent b="0" l="0" r="0" t="0"/>
-            <wp:docPr descr="Fig. 5 Recall of the displacive (ferroelectric-perovskite) instability at T ≤ 300 K: the cheap multi-mode soft-mode screen (0.53) versus the expensive SSCHA (0.30) (§3.3). The cautionary result is that the gold standard is less reliable than the screen in the regime that matters most." title="" id="36" name="Picture"/>
+            <wp:docPr descr="Fig. 5 Recall of the displacive (ferroelectric-perovskite) instability at T ≤ 300 K: the cheap multi-mode soft-mode screen (0.53) versus the expensive SSCHA (0.19) (§3.3). The cautionary result is that the gold standard is less reliable than the screen in the regime that matters most." title="" id="36" name="Picture"/>
             <a:graphic>
               <a:graphicData uri="http://schemas.openxmlformats.org/drawingml/2006/picture">
                 <pic:pic>
@@ -3842,7 +5216,7 @@
         <w:t xml:space="preserve"> </w:t>
       </w:r>
       <w:r>
-        <w:t xml:space="preserve">T ≤ 300 K: the cheap multi-mode soft-mode screen (0.53) versus the expensive SSCHA (0.30) (§3.3). The</w:t>
+        <w:t xml:space="preserve">T ≤ 300 K: the cheap multi-mode soft-mode screen (0.53) versus the expensive SSCHA (0.19) (§3.3). The</w:t>
       </w:r>
       <w:r>
         <w:t xml:space="preserve"> </w:t>
@@ -3890,13 +5264,25 @@
         <w:t xml:space="preserve"> </w:t>
       </w:r>
       <w:r>
-        <w:t xml:space="preserve">cross-model bcc margins (~0.4 THz spread, §3.3), so those margins are real signal rather than</w:t>
-      </w:r>
-      <w:r>
-        <w:t xml:space="preserve"> </w:t>
-      </w:r>
-      <w:r>
-        <w:t xml:space="preserve">sampling noise.</w:t>
+        <w:t xml:space="preserve">cross-model bcc margins (§3.3), so those margins are real signal rather than sampling noise. The</w:t>
+      </w:r>
+      <w:r>
+        <w:t xml:space="preserve"> </w:t>
+      </w:r>
+      <w:r>
+        <w:t xml:space="preserve">same unit re-measured in the pinned environment, with the SSCHA initialiser rebuilt from phonopy</w:t>
+      </w:r>
+      <w:r>
+        <w:t xml:space="preserve"> </w:t>
+      </w:r>
+      <w:r>
+        <w:t xml:space="preserve">force constants, returns +1.80 THz at every temperature on the ladder, so the number also survives</w:t>
+      </w:r>
+      <w:r>
+        <w:t xml:space="preserve"> </w:t>
+      </w:r>
+      <w:r>
+        <w:t xml:space="preserve">an independent environment and initialiser.</w:t>
       </w:r>
     </w:p>
     <w:p>
@@ -4114,7 +5500,7 @@
         <w:t xml:space="preserve"> </w:t>
       </w:r>
       <w:r>
-        <w:t xml:space="preserve">order PbTiO₃ correctly (§3.2). Both the screen (0.53) and SSCHA (0.30) miss a substantial fraction</w:t>
+        <w:t xml:space="preserve">order PbTiO₃ correctly (§3.2). Both the screen (0.53) and SSCHA (0.19) miss a substantial fraction</w:t>
       </w:r>
       <w:r>
         <w:t xml:space="preserve"> </w:t>
@@ -4228,7 +5614,7 @@
         <w:t xml:space="preserve"> </w:t>
       </w:r>
       <w:r>
-        <w:t xml:space="preserve">https://doi.org/10.5281/zenodo.20805824. The production results regenerate from</w:t>
+        <w:t xml:space="preserve">https://doi.org/10.5281/zenodo.20805799 (concept DOI, resolving to the latest version). The production results regenerate from</w:t>
       </w:r>
       <w:r>
         <w:t xml:space="preserve"> </w:t>
@@ -4318,49 +5704,82 @@
         <w:t xml:space="preserve"> </w:t>
       </w:r>
       <w:r>
-        <w:t xml:space="preserve">print to the run log rather than to the ledger). The SSCHA stability calls reported here were</w:t>
-      </w:r>
-      <w:r>
-        <w:t xml:space="preserve"> </w:t>
-      </w:r>
-      <w:r>
-        <w:t xml:space="preserve">corrected after an acoustic-mode identification defect was found in the analysis path: the three</w:t>
-      </w:r>
-      <w:r>
-        <w:t xml:space="preserve"> </w:t>
-      </w:r>
-      <w:r>
-        <w:t xml:space="preserve">translational modes were selected by lowest frequency rather than by smallest magnitude, which for</w:t>
-      </w:r>
-      <w:r>
-        <w:t xml:space="preserve"> </w:t>
-      </w:r>
-      <w:r>
-        <w:t xml:space="preserve">an unstable phase discards the soft mode itself. The correction is applied by</w:t>
-      </w:r>
-      <w:r>
-        <w:t xml:space="preserve"> </w:t>
+        <w:t xml:space="preserve">print to the run log rather than to the ledger). The SSCHA results reported here are a full</w:t>
+      </w:r>
+      <w:r>
+        <w:t xml:space="preserve"> </w:t>
+      </w:r>
+      <w:r>
+        <w:t xml:space="preserve">re-measurement (</w:t>
       </w:r>
       <w:r>
         <w:rPr>
           <w:rStyle w:val="VerbatimChar"/>
         </w:rPr>
+        <w:t xml:space="preserve">scripts/run_sscha_v2.py</w:t>
+      </w:r>
+      <w:r>
+        <w:t xml:space="preserve">, method version 3) of the original 208-unit grid in the</w:t>
+      </w:r>
+      <w:r>
+        <w:t xml:space="preserve"> </w:t>
+      </w:r>
+      <w:r>
+        <w:t xml:space="preserve">pinned environments, after two defects were found in the original analysis path: an acoustic-mode</w:t>
+      </w:r>
+      <w:r>
+        <w:t xml:space="preserve"> </w:t>
+      </w:r>
+      <w:r>
+        <w:t xml:space="preserve">identification inversion (the three translational modes were selected by lowest frequency rather</w:t>
+      </w:r>
+      <w:r>
+        <w:t xml:space="preserve"> </w:t>
+      </w:r>
+      <w:r>
+        <w:t xml:space="preserve">than smallest magnitude, which for an unstable phase discards the soft mode itself), and an</w:t>
+      </w:r>
+      <w:r>
+        <w:t xml:space="preserve"> </w:t>
+      </w:r>
+      <w:r>
+        <w:t xml:space="preserve">unrecorded software environment. The superseded generations are retained in the append-only ledger</w:t>
+      </w:r>
+      <w:r>
+        <w:t xml:space="preserve"> </w:t>
+      </w:r>
+      <w:r>
+        <w:t xml:space="preserve">—</w:t>
+      </w:r>
+      <w:r>
+        <w:t xml:space="preserve"> </w:t>
+      </w:r>
+      <w:r>
+        <w:rPr>
+          <w:rStyle w:val="VerbatimChar"/>
+        </w:rPr>
+        <w:t xml:space="preserve">mlip_dynstab.analysis.canonical</w:t>
+      </w:r>
+      <w:r>
+        <w:t xml:space="preserve"> </w:t>
+      </w:r>
+      <w:r>
+        <w:t xml:space="preserve">selects the current one — together with the in-place derived</w:t>
+      </w:r>
+      <w:r>
+        <w:t xml:space="preserve"> </w:t>
+      </w:r>
+      <w:r>
+        <w:t xml:space="preserve">correction (</w:t>
+      </w:r>
+      <w:r>
+        <w:rPr>
+          <w:rStyle w:val="VerbatimChar"/>
+        </w:rPr>
         <w:t xml:space="preserve">scripts/fix_sscha_acoustic.py</w:t>
       </w:r>
       <w:r>
-        <w:t xml:space="preserve">, is derived from the per-unit spectra stored in the ledger rather</w:t>
-      </w:r>
-      <w:r>
-        <w:t xml:space="preserve"> </w:t>
-      </w:r>
-      <w:r>
-        <w:t xml:space="preserve">than from a re-run, changes 13 of 208 SSCHA rows (all from stable to unstable) and leaves all 75</w:t>
-      </w:r>
-      <w:r>
-        <w:t xml:space="preserve"> </w:t>
-      </w:r>
-      <w:r>
-        <w:t xml:space="preserve">bcc rows unchanged; the pre-correction values are retained in the</w:t>
+        <w:t xml:space="preserve">,</w:t>
       </w:r>
       <w:r>
         <w:t xml:space="preserve"> </w:t>
@@ -4375,16 +5794,13 @@
         <w:t xml:space="preserve"> </w:t>
       </w:r>
       <w:r>
-        <w:t xml:space="preserve">ledger columns and the</w:t>
-      </w:r>
-      <w:r>
-        <w:t xml:space="preserve"> </w:t>
-      </w:r>
-      <w:r>
-        <w:t xml:space="preserve">uncorrected ledger in</w:t>
-      </w:r>
-      <w:r>
-        <w:t xml:space="preserve"> </w:t>
+        <w:t xml:space="preserve">columns) and the uncorrected snapshot</w:t>
+      </w:r>
+      <w:r>
+        <w:t xml:space="preserve"> </w:t>
+      </w:r>
+      <w:r>
+        <w:t xml:space="preserve">(</w:t>
       </w:r>
       <w:r>
         <w:rPr>
@@ -4393,7 +5809,7 @@
         <w:t xml:space="preserve">results/ledger.parquet.pre-d1-fix</w:t>
       </w:r>
       <w:r>
-        <w:t xml:space="preserve">.</w:t>
+        <w:t xml:space="preserve">), so every stage of the correction is auditable.</w:t>
       </w:r>
     </w:p>
     <w:p>
@@ -5494,6 +6910,145 @@
       </w:r>
       <w:r>
         <w:t xml:space="preserve">, 014109.</w:t>
+      </w:r>
+    </w:p>
+    <w:p>
+      <w:pPr>
+        <w:pStyle w:val="Compact"/>
+        <w:numPr>
+          <w:ilvl w:val="0"/>
+          <w:numId w:val="1003"/>
+        </w:numPr>
+      </w:pPr>
+      <w:r>
+        <w:t xml:space="preserve">D. J. Hooton,</w:t>
+      </w:r>
+      <w:r>
+        <w:t xml:space="preserve"> </w:t>
+      </w:r>
+      <w:r>
+        <w:rPr>
+          <w:i/>
+          <w:iCs/>
+        </w:rPr>
+        <w:t xml:space="preserve">Philos. Mag.</w:t>
+      </w:r>
+      <w:r>
+        <w:t xml:space="preserve">, 1955,</w:t>
+      </w:r>
+      <w:r>
+        <w:t xml:space="preserve"> </w:t>
+      </w:r>
+      <w:r>
+        <w:rPr>
+          <w:b/>
+          <w:bCs/>
+        </w:rPr>
+        <w:t xml:space="preserve">46</w:t>
+      </w:r>
+      <w:r>
+        <w:t xml:space="preserve">, 422.</w:t>
+      </w:r>
+    </w:p>
+    <w:p>
+      <w:pPr>
+        <w:pStyle w:val="Compact"/>
+        <w:numPr>
+          <w:ilvl w:val="0"/>
+          <w:numId w:val="1003"/>
+        </w:numPr>
+      </w:pPr>
+      <w:r>
+        <w:t xml:space="preserve">N. R. Werthamer,</w:t>
+      </w:r>
+      <w:r>
+        <w:t xml:space="preserve"> </w:t>
+      </w:r>
+      <w:r>
+        <w:rPr>
+          <w:i/>
+          <w:iCs/>
+        </w:rPr>
+        <w:t xml:space="preserve">Phys. Rev. B</w:t>
+      </w:r>
+      <w:r>
+        <w:t xml:space="preserve">, 1970,</w:t>
+      </w:r>
+      <w:r>
+        <w:t xml:space="preserve"> </w:t>
+      </w:r>
+      <w:r>
+        <w:rPr>
+          <w:b/>
+          <w:bCs/>
+        </w:rPr>
+        <w:t xml:space="preserve">1</w:t>
+      </w:r>
+      <w:r>
+        <w:t xml:space="preserve">, 572.</w:t>
+      </w:r>
+    </w:p>
+    <w:p>
+      <w:pPr>
+        <w:pStyle w:val="Compact"/>
+        <w:numPr>
+          <w:ilvl w:val="0"/>
+          <w:numId w:val="1003"/>
+        </w:numPr>
+      </w:pPr>
+      <w:r>
+        <w:t xml:space="preserve">R. Peierls,</w:t>
+      </w:r>
+      <w:r>
+        <w:t xml:space="preserve"> </w:t>
+      </w:r>
+      <w:r>
+        <w:rPr>
+          <w:i/>
+          <w:iCs/>
+        </w:rPr>
+        <w:t xml:space="preserve">Phys. Rev.</w:t>
+      </w:r>
+      <w:r>
+        <w:t xml:space="preserve">, 1938,</w:t>
+      </w:r>
+      <w:r>
+        <w:t xml:space="preserve"> </w:t>
+      </w:r>
+      <w:r>
+        <w:rPr>
+          <w:b/>
+          <w:bCs/>
+        </w:rPr>
+        <w:t xml:space="preserve">54</w:t>
+      </w:r>
+      <w:r>
+        <w:t xml:space="preserve">, 918.</w:t>
+      </w:r>
+    </w:p>
+    <w:p>
+      <w:pPr>
+        <w:pStyle w:val="Compact"/>
+        <w:numPr>
+          <w:ilvl w:val="0"/>
+          <w:numId w:val="1003"/>
+        </w:numPr>
+      </w:pPr>
+      <w:r>
+        <w:t xml:space="preserve">R. P. Feynman,</w:t>
+      </w:r>
+      <w:r>
+        <w:t xml:space="preserve"> </w:t>
+      </w:r>
+      <w:r>
+        <w:rPr>
+          <w:i/>
+          <w:iCs/>
+        </w:rPr>
+        <w:t xml:space="preserve">Statistical Mechanics: A Set of Lectures</w:t>
+      </w:r>
+      <w:r>
+        <w:t xml:space="preserve">, W. A. Benjamin, Reading, MA, 1972.</w:t>
       </w:r>
     </w:p>
     <w:bookmarkEnd w:id="47"/>

</xml_diff>

<commit_message>
Apply the estimator-noise revision: withdraw the anti-association significance claim, band CHGNet's harmonic accuracy, add the measured harmonic noise floor
Sec 3.2 now separates marginal homogeneity (McNemar p=0.007, significant, and the title
claim) from association (system-clustered permutation p=0.31 at 300 K, not significant),
which the previous text conflated. Abstract and intro H2 bullet follow. CHGNet's 0.789 is
banded to tol in [0.05,0.20] with the ordering promoted to the claim. New ESI S1.2 reports
the v1/v2 paired replicate as a per-model noise floor -- CHGNet 0.0076 THz, MatterSim
0.00057 THz, zero call flips -- answering the noisy-estimator objection with deposited data.

Also: the matched set's bcc name filter also drops superionic AgI, now stated rather than
silent; analysis.summary() called load_ledger() instead of load_canonical() and so
multi-counted every table it printed.

verify_claims 27/27 pass.
</commit_message>
<xml_diff>
--- a/paper/manuscript.docx
+++ b/paper/manuscript.docx
@@ -170,13 +170,25 @@
         <w:t xml:space="preserve"> </w:t>
       </w:r>
       <w:r>
-        <w:t xml:space="preserve">MatterSim is harmonically perfect and only mid-table, and on the matched set the two are</w:t>
-      </w:r>
-      <w:r>
-        <w:t xml:space="preserve"> </w:t>
-      </w:r>
-      <w:r>
-        <w:t xml:space="preserve">non-significantly concordant at 100 K and significantly anti-associated at 300 K. Screening every</w:t>
+        <w:t xml:space="preserve">MatterSim is harmonically perfect and only mid-table; on the matched set harmonic correctness does</w:t>
+      </w:r>
+      <w:r>
+        <w:t xml:space="preserve"> </w:t>
+      </w:r>
+      <w:r>
+        <w:t xml:space="preserve">not transfer — 17 harmonically-correct units are mis-called at 300 K against only 4 the other way</w:t>
+      </w:r>
+      <w:r>
+        <w:t xml:space="preserve"> </w:t>
+      </w:r>
+      <w:r>
+        <w:t xml:space="preserve">(McNemar exact p = 0.007) — although the residual negative association is not itself significant</w:t>
+      </w:r>
+      <w:r>
+        <w:t xml:space="preserve"> </w:t>
+      </w:r>
+      <w:r>
+        <w:t xml:space="preserve">once pairs are clustered by system. Screening every</w:t>
       </w:r>
       <w:r>
         <w:t xml:space="preserve"> </w:t>
@@ -539,19 +551,25 @@
         <w:t xml:space="preserve"> </w:t>
       </w:r>
       <w:r>
-        <w:t xml:space="preserve">matched-set outcome is temperature-dependent — non-significantly concordant at 100 K, and</w:t>
-      </w:r>
-      <w:r>
-        <w:t xml:space="preserve"> </w:t>
-      </w:r>
-      <w:r>
-        <w:t xml:space="preserve">significantly anti-associated at 300 K — so the pre-registered form is neither cleanly confirmed</w:t>
-      </w:r>
-      <w:r>
-        <w:t xml:space="preserve"> </w:t>
-      </w:r>
-      <w:r>
-        <w:t xml:space="preserve">nor cleanly rejected; see §3.2.)</w:t>
+        <w:t xml:space="preserve">matched-set outcome is that harmonic correctness does not transfer — significantly so at 300 K, as</w:t>
+      </w:r>
+      <w:r>
+        <w:t xml:space="preserve"> </w:t>
+      </w:r>
+      <w:r>
+        <w:t xml:space="preserve">a difference in layer difficulty — while the direction of any residual association is unresolved</w:t>
+      </w:r>
+      <w:r>
+        <w:t xml:space="preserve"> </w:t>
+      </w:r>
+      <w:r>
+        <w:t xml:space="preserve">at this sample size, so the pre-registered form is neither cleanly confirmed nor cleanly rejected;</w:t>
+      </w:r>
+      <w:r>
+        <w:t xml:space="preserve"> </w:t>
+      </w:r>
+      <w:r>
+        <w:t xml:space="preserve">see §3.2.)</w:t>
       </w:r>
     </w:p>
     <w:p>
@@ -3893,43 +3911,43 @@
         <w:t xml:space="preserve"> </w:t>
       </w:r>
       <w:r>
-        <w:t xml:space="preserve">data support. The matched non-bcc, non-borderline comparison (n = 75 system×model pairs) is</w:t>
-      </w:r>
-      <w:r>
-        <w:t xml:space="preserve"> </w:t>
-      </w:r>
-      <w:r>
-        <w:t xml:space="preserve">temperature-dependent. At T = 100 K the two are weakly and non-significantly concordant: φ = 0.149</w:t>
-      </w:r>
-      <w:r>
-        <w:t xml:space="preserve"> </w:t>
-      </w:r>
-      <w:r>
-        <w:t xml:space="preserve">with McNemar exact p = 0.73, and a matched per-model accuracy rank correlation of ρ = +0.65. At</w:t>
-      </w:r>
-      <w:r>
-        <w:t xml:space="preserve"> </w:t>
-      </w:r>
-      <w:r>
-        <w:t xml:space="preserve">T = 300 K the relationship reverses and becomes significant: φ = −0.129 with McNemar exact</w:t>
-      </w:r>
-      <w:r>
-        <w:t xml:space="preserve"> </w:t>
-      </w:r>
-      <w:r>
-        <w:t xml:space="preserve">p = 0.007, driven by 17 harmonically-correct units that are mis-called at finite temperature against</w:t>
-      </w:r>
-      <w:r>
-        <w:t xml:space="preserve"> </w:t>
-      </w:r>
-      <w:r>
-        <w:t xml:space="preserve">only 4 the other way. Harmonic correctness therefore does not transfer, and at the higher</w:t>
-      </w:r>
-      <w:r>
-        <w:t xml:space="preserve"> </w:t>
-      </w:r>
-      <w:r>
-        <w:t xml:space="preserve">temperature it is significantly</w:t>
+        <w:t xml:space="preserve">data support. The matched non-bcc, non-borderline comparison (n = 75 system×model pairs, clustered as five</w:t>
+      </w:r>
+      <w:r>
+        <w:t xml:space="preserve"> </w:t>
+      </w:r>
+      <w:r>
+        <w:t xml:space="preserve">models over fifteen systems) is temperature-dependent, and we separate two questions that a single</w:t>
+      </w:r>
+      <w:r>
+        <w:t xml:space="preserve"> </w:t>
+      </w:r>
+      <w:r>
+        <w:t xml:space="preserve">2×2 table invites conflating. The first is whether the two layers are equally hard, a question of</w:t>
+      </w:r>
+      <w:r>
+        <w:t xml:space="preserve"> </w:t>
+      </w:r>
+      <w:r>
+        <w:t xml:space="preserve">marginal homogeneity that McNemar’s exact test addresses. At T = 300 K they are not: 17</w:t>
+      </w:r>
+      <w:r>
+        <w:t xml:space="preserve"> </w:t>
+      </w:r>
+      <w:r>
+        <w:t xml:space="preserve">harmonically-correct units are mis-called at finite temperature against only 4 the other way,</w:t>
+      </w:r>
+      <w:r>
+        <w:t xml:space="preserve"> </w:t>
+      </w:r>
+      <w:r>
+        <w:t xml:space="preserve">McNemar exact p = 0.007. Harmonic correctness therefore does not transfer, and this is the</w:t>
+      </w:r>
+      <w:r>
+        <w:t xml:space="preserve"> </w:t>
+      </w:r>
+      <w:r>
+        <w:t xml:space="preserve">significant result. The second question is whether harmonic and finite-temperature correctness are</w:t>
       </w:r>
       <w:r>
         <w:t xml:space="preserve"> </w:t>
@@ -3939,10 +3957,150 @@
           <w:i/>
           <w:iCs/>
         </w:rPr>
-        <w:t xml:space="preserve">anti</w:t>
-      </w:r>
-      <w:r>
-        <w:t xml:space="preserve">-associated with finite-temperature correctness on this set.</w:t>
+        <w:t xml:space="preserve">associated</w:t>
+      </w:r>
+      <w:r>
+        <w:t xml:space="preserve">, which McNemar does not test. There the effect is negative but not significant:</w:t>
+      </w:r>
+      <w:r>
+        <w:t xml:space="preserve"> </w:t>
+      </w:r>
+      <w:r>
+        <w:t xml:space="preserve">φ = −0.129 at 300 K, with a system-clustered permutation p = 0.31 over 10,000 permutations of whole</w:t>
+      </w:r>
+      <w:r>
+        <w:t xml:space="preserve"> </w:t>
+      </w:r>
+      <w:r>
+        <w:t xml:space="preserve">systems’ finite-temperature rows, and a system-clustered bootstrap 95% interval of [−0.195, −0.057]</w:t>
+      </w:r>
+      <w:r>
+        <w:t xml:space="preserve"> </w:t>
+      </w:r>
+      <w:r>
+        <w:t xml:space="preserve">— an interval that reflects the precision of the point estimate rather than a test of the null, and</w:t>
+      </w:r>
+      <w:r>
+        <w:t xml:space="preserve"> </w:t>
+      </w:r>
+      <w:r>
+        <w:t xml:space="preserve">whose sign rides on a structurally empty both-incorrect cell. At T = 100 K the association is weakly</w:t>
+      </w:r>
+      <w:r>
+        <w:t xml:space="preserve"> </w:t>
+      </w:r>
+      <w:r>
+        <w:t xml:space="preserve">positive and likewise not significant (φ = +0.149, clustered permutation p = 0.12, McNemar exact</w:t>
+      </w:r>
+      <w:r>
+        <w:t xml:space="preserve"> </w:t>
+      </w:r>
+      <w:r>
+        <w:t xml:space="preserve">p = 0.73, matched per-model rank correlation ρ = +0.65). With five models and fifteen systems this</w:t>
+      </w:r>
+      <w:r>
+        <w:t xml:space="preserve"> </w:t>
+      </w:r>
+      <w:r>
+        <w:t xml:space="preserve">design cannot resolve the sign of the association, and we do not claim it. The transferable finding</w:t>
+      </w:r>
+      <w:r>
+        <w:t xml:space="preserve"> </w:t>
+      </w:r>
+      <w:r>
+        <w:t xml:space="preserve">is the failure of transfer itself. (The matched set excludes systems whose name carries the bcc</w:t>
+      </w:r>
+      <w:r>
+        <w:t xml:space="preserve"> </w:t>
+      </w:r>
+      <w:r>
+        <w:t xml:space="preserve">tag, which also removes the superionic AgI unit; the denominator is therefore fifteen systems, not</w:t>
+      </w:r>
+      <w:r>
+        <w:t xml:space="preserve"> </w:t>
+      </w:r>
+      <w:r>
+        <w:t xml:space="preserve">sixteen.)</w:t>
+      </w:r>
+    </w:p>
+    <w:p>
+      <w:pPr>
+        <w:pStyle w:val="BodyText"/>
+      </w:pPr>
+      <w:r>
+        <w:t xml:space="preserve">Because the reordering rests on harmonic calls, we bound the harmonic estimator’s own</w:t>
+      </w:r>
+      <w:r>
+        <w:t xml:space="preserve"> </w:t>
+      </w:r>
+      <w:r>
+        <w:t xml:space="preserve">reproducibility noise directly rather than assuming it is small. The v1 and v2 harmonic generations</w:t>
+      </w:r>
+      <w:r>
+        <w:t xml:space="preserve"> </w:t>
+      </w:r>
+      <w:r>
+        <w:t xml:space="preserve">(§2.3) are the same algorithm at the same settings — 0.01 Å displacements, 2×2×2 supercells,</w:t>
+      </w:r>
+      <w:r>
+        <w:t xml:space="preserve"> </w:t>
+      </w:r>
+      <w:r>
+        <w:t xml:space="preserve">12×12×12 meshes — re-measured in independently pinned environments, giving 100 paired (system,</w:t>
+      </w:r>
+      <w:r>
+        <w:t xml:space="preserve"> </w:t>
+      </w:r>
+      <w:r>
+        <w:t xml:space="preserve">model) re-measurements. The spread is strongly model-dependent and must not be pooled: CHGNet’s</w:t>
+      </w:r>
+      <w:r>
+        <w:t xml:space="preserve"> </w:t>
+      </w:r>
+      <w:r>
+        <w:t xml:space="preserve">largest deviation is 0.0076 THz and MatterSim’s is 0.00057 THz, with zero stability-call flips</w:t>
+      </w:r>
+      <w:r>
+        <w:t xml:space="preserve"> </w:t>
+      </w:r>
+      <w:r>
+        <w:t xml:space="preserve">across all forty of their re-measurements, whereas ORB-v2’s reaches 2.01 THz and flips two calls,</w:t>
+      </w:r>
+      <w:r>
+        <w:t xml:space="preserve"> </w:t>
+      </w:r>
+      <w:r>
+        <w:t xml:space="preserve">one of them the KTaO₃ unit already excluded as borderline. The two models carrying the reordering</w:t>
+      </w:r>
+      <w:r>
+        <w:t xml:space="preserve"> </w:t>
+      </w:r>
+      <w:r>
+        <w:t xml:space="preserve">are therefore separated by two to four orders of magnitude more than the estimator’s own noise, and</w:t>
+      </w:r>
+      <w:r>
+        <w:t xml:space="preserve"> </w:t>
+      </w:r>
+      <w:r>
+        <w:t xml:space="preserve">what noise exists is localised to the float32 direct-force model that §3.1 already identifies as the</w:t>
+      </w:r>
+      <w:r>
+        <w:t xml:space="preserve"> </w:t>
+      </w:r>
+      <w:r>
+        <w:t xml:space="preserve">weakest. This bounds environment and library nondeterminism at fixed displacement amplitude; it does</w:t>
+      </w:r>
+      <w:r>
+        <w:t xml:space="preserve"> </w:t>
+      </w:r>
+      <w:r>
+        <w:t xml:space="preserve">not probe sensitivity to the amplitude itself, which would require re-measurement on a displacement</w:t>
+      </w:r>
+      <w:r>
+        <w:t xml:space="preserve"> </w:t>
+      </w:r>
+      <w:r>
+        <w:t xml:space="preserve">grid (ESI §S1.2).</w:t>
       </w:r>
     </w:p>
     <w:p>
@@ -4077,6 +4235,50 @@
       </w:r>
       <w:r>
         <w:t xml:space="preserve">from this ranking comparison but from the per-family recall above and the SSCHA failure in §3.3.</w:t>
+      </w:r>
+    </w:p>
+    <w:p>
+      <w:pPr>
+        <w:pStyle w:val="BodyText"/>
+      </w:pPr>
+      <w:r>
+        <w:t xml:space="preserve">CHGNet’s harmonic accuracy is tolerance-dependent: 0.789 across the plateau tol ∈ [0.05, 0.20] used</w:t>
+      </w:r>
+      <w:r>
+        <w:t xml:space="preserve"> </w:t>
+      </w:r>
+      <w:r>
+        <w:t xml:space="preserve">throughout, rising to 0.895 at tol = 0.30, where two marginal false-unstables (CeO₂ at −0.267 THz</w:t>
+      </w:r>
+      <w:r>
+        <w:t xml:space="preserve"> </w:t>
+      </w:r>
+      <w:r>
+        <w:t xml:space="preserve">and NaCl at −0.238 THz) flip back and ORB-v2 becomes the uniquely worst model. We therefore state</w:t>
+      </w:r>
+      <w:r>
+        <w:t xml:space="preserve"> </w:t>
+      </w:r>
+      <w:r>
+        <w:t xml:space="preserve">the ordering rather than the number as the claim: CHGNet sits strictly below MatterSim harmonically</w:t>
+      </w:r>
+      <w:r>
+        <w:t xml:space="preserve"> </w:t>
+      </w:r>
+      <w:r>
+        <w:t xml:space="preserve">at every tolerance in [0.05, 0.50] and above it at finite temperature. At tol = 0 all five models</w:t>
+      </w:r>
+      <w:r>
+        <w:t xml:space="preserve"> </w:t>
+      </w:r>
+      <w:r>
+        <w:t xml:space="preserve">collapse to 0.63–0.74 as the Γ acoustic numerical zeros flood the false-unstable count, and the</w:t>
+      </w:r>
+      <w:r>
+        <w:t xml:space="preserve"> </w:t>
+      </w:r>
+      <w:r>
+        <w:t xml:space="preserve">comparison is degenerate.</w:t>
       </w:r>
     </w:p>
     <w:bookmarkEnd w:id="24"/>

</xml_diff>